<commit_message>
adding the day 3 program in the css
</commit_message>
<xml_diff>
--- a/Web_Development Notes Scratch to pro.docx
+++ b/Web_Development Notes Scratch to pro.docx
@@ -366,7 +366,7 @@
           <w:color w:val="434343"/>
         </w:rPr>
         <w:sectPr>
-          <w:headerReference w:type="default" r:id="rId7"/>
+          <w:headerReference w:type="default" r:id="rId8"/>
           <w:pgSz w:w="11909" w:h="16834"/>
           <w:pgMar w:top="1440" w:right="1440" w:bottom="1440" w:left="1559" w:header="720" w:footer="720" w:gutter="0"/>
           <w:pgNumType w:start="1"/>
@@ -4340,7 +4340,7 @@
       <w:r>
         <w:t xml:space="preserve"> links and whatever in that </w:t>
       </w:r>
-      <w:hyperlink r:id="rId8">
+      <w:hyperlink r:id="rId9">
         <w:r>
           <w:rPr>
             <w:color w:val="1155CC"/>
@@ -6666,7 +6666,7 @@
         </w:rPr>
         <w:t xml:space="preserve"> in HTML stands for Scalable Vector Graphics. It acts as a dedicated container used to draw two-dimensional, vector-based graphics directly inside a webpage. [</w:t>
       </w:r>
-      <w:hyperlink r:id="rId9" w:history="1">
+      <w:hyperlink r:id="rId10" w:history="1">
         <w:r>
           <w:rPr>
             <w:rFonts w:eastAsia="Times New Roman"/>
@@ -6686,7 +6686,7 @@
         </w:rPr>
         <w:t xml:space="preserve">, </w:t>
       </w:r>
-      <w:hyperlink r:id="rId10" w:history="1">
+      <w:hyperlink r:id="rId11" w:history="1">
         <w:r>
           <w:rPr>
             <w:rFonts w:eastAsia="Times New Roman"/>
@@ -6706,7 +6706,7 @@
         </w:rPr>
         <w:t xml:space="preserve">, </w:t>
       </w:r>
-      <w:hyperlink r:id="rId11" w:history="1">
+      <w:hyperlink r:id="rId12" w:history="1">
         <w:r>
           <w:rPr>
             <w:rFonts w:eastAsia="Times New Roman"/>
@@ -6726,7 +6726,7 @@
         </w:rPr>
         <w:t xml:space="preserve">, </w:t>
       </w:r>
-      <w:hyperlink r:id="rId12" w:history="1">
+      <w:hyperlink r:id="rId13" w:history="1">
         <w:r>
           <w:rPr>
             <w:rFonts w:eastAsia="Times New Roman"/>
@@ -6800,7 +6800,7 @@
         </w:rPr>
         <w:t>. [</w:t>
       </w:r>
-      <w:hyperlink r:id="rId13" w:history="1">
+      <w:hyperlink r:id="rId14" w:history="1">
         <w:r>
           <w:rPr>
             <w:rFonts w:eastAsia="Times New Roman"/>
@@ -6820,7 +6820,7 @@
         </w:rPr>
         <w:t xml:space="preserve">, </w:t>
       </w:r>
-      <w:hyperlink r:id="rId14" w:history="1">
+      <w:hyperlink r:id="rId15" w:history="1">
         <w:r>
           <w:rPr>
             <w:rFonts w:eastAsia="Times New Roman"/>
@@ -6840,7 +6840,7 @@
         </w:rPr>
         <w:t xml:space="preserve">, </w:t>
       </w:r>
-      <w:hyperlink r:id="rId15" w:history="1">
+      <w:hyperlink r:id="rId16" w:history="1">
         <w:r>
           <w:rPr>
             <w:rFonts w:eastAsia="Times New Roman"/>
@@ -6860,7 +6860,7 @@
         </w:rPr>
         <w:t xml:space="preserve">, </w:t>
       </w:r>
-      <w:hyperlink r:id="rId16" w:history="1">
+      <w:hyperlink r:id="rId17" w:history="1">
         <w:r>
           <w:rPr>
             <w:rFonts w:eastAsia="Times New Roman"/>
@@ -6880,7 +6880,7 @@
         </w:rPr>
         <w:t xml:space="preserve">, </w:t>
       </w:r>
-      <w:hyperlink r:id="rId17" w:history="1">
+      <w:hyperlink r:id="rId18" w:history="1">
         <w:r>
           <w:rPr>
             <w:rFonts w:eastAsia="Times New Roman"/>
@@ -6900,7 +6900,7 @@
         </w:rPr>
         <w:t xml:space="preserve">, </w:t>
       </w:r>
-      <w:hyperlink r:id="rId18" w:history="1">
+      <w:hyperlink r:id="rId19" w:history="1">
         <w:r>
           <w:rPr>
             <w:rFonts w:eastAsia="Times New Roman"/>
@@ -9121,6 +9121,3221 @@
           <w:sz w:val="24"/>
           <w:szCs w:val="24"/>
         </w:rPr>
+      </w:pPr>
+    </w:p>
+    <w:p>
+      <w:pPr>
+        <w:rPr>
+          <w:sz w:val="24"/>
+          <w:szCs w:val="24"/>
+        </w:rPr>
+      </w:pPr>
+    </w:p>
+    <w:p>
+      <w:pPr>
+        <w:pStyle w:val="NoSpacing"/>
+        <w:rPr>
+          <w:b/>
+        </w:rPr>
+      </w:pPr>
+      <w:r>
+        <w:rPr>
+          <w:b/>
+        </w:rPr>
+        <w:lastRenderedPageBreak/>
+        <w:t>Date</w:t>
+      </w:r>
+      <w:proofErr w:type="gramStart"/>
+      <w:r>
+        <w:rPr>
+          <w:b/>
+        </w:rPr>
+        <w:t>:28</w:t>
+      </w:r>
+      <w:proofErr w:type="gramEnd"/>
+      <w:r>
+        <w:rPr>
+          <w:b/>
+        </w:rPr>
+        <w:t xml:space="preserve"> sep,2026</w:t>
+      </w:r>
+    </w:p>
+    <w:p>
+      <w:pPr>
+        <w:pStyle w:val="NoSpacing"/>
+        <w:rPr>
+          <w:b/>
+        </w:rPr>
+      </w:pPr>
+    </w:p>
+    <w:p>
+      <w:pPr>
+        <w:rPr>
+          <w:rFonts w:ascii="Bodoni MT Black" w:hAnsi="Bodoni MT Black"/>
+          <w:b/>
+          <w:sz w:val="36"/>
+          <w:szCs w:val="36"/>
+        </w:rPr>
+      </w:pPr>
+      <w:proofErr w:type="spellStart"/>
+      <w:r>
+        <w:rPr>
+          <w:rFonts w:ascii="Bodoni MT Black" w:hAnsi="Bodoni MT Black"/>
+          <w:b/>
+          <w:sz w:val="36"/>
+          <w:szCs w:val="36"/>
+        </w:rPr>
+        <w:t>Css</w:t>
+      </w:r>
+      <w:proofErr w:type="spellEnd"/>
+      <w:r>
+        <w:rPr>
+          <w:rFonts w:ascii="Bodoni MT Black" w:hAnsi="Bodoni MT Black"/>
+          <w:b/>
+          <w:sz w:val="36"/>
+          <w:szCs w:val="36"/>
+        </w:rPr>
+        <w:t xml:space="preserve"> selectors</w:t>
+      </w:r>
+      <w:r>
+        <w:rPr>
+          <w:rFonts w:ascii="Bodoni MT Black" w:hAnsi="Bodoni MT Black"/>
+          <w:b/>
+          <w:sz w:val="36"/>
+          <w:szCs w:val="36"/>
+        </w:rPr>
+        <w:t>:</w:t>
+      </w:r>
+    </w:p>
+    <w:p>
+      <w:pPr>
+        <w:pStyle w:val="NoSpacing"/>
+      </w:pPr>
+      <w:r>
+        <w:t xml:space="preserve">    </w:t>
+      </w:r>
+      <w:proofErr w:type="spellStart"/>
+      <w:r>
+        <w:t>Selecters</w:t>
+      </w:r>
+      <w:proofErr w:type="spellEnd"/>
+      <w:r>
+        <w:t xml:space="preserve"> are those </w:t>
+      </w:r>
+      <w:proofErr w:type="gramStart"/>
+      <w:r>
+        <w:t>that  are</w:t>
+      </w:r>
+      <w:proofErr w:type="gramEnd"/>
+      <w:r>
+        <w:t xml:space="preserve"> select to apply the style by using the </w:t>
+      </w:r>
+      <w:proofErr w:type="spellStart"/>
+      <w:r>
+        <w:t>css</w:t>
+      </w:r>
+      <w:proofErr w:type="spellEnd"/>
+      <w:r>
+        <w:t>.</w:t>
+      </w:r>
+    </w:p>
+    <w:p>
+      <w:pPr>
+        <w:pStyle w:val="NoSpacing"/>
+      </w:pPr>
+      <w:r>
+        <w:t xml:space="preserve">There are many </w:t>
+      </w:r>
+      <w:proofErr w:type="spellStart"/>
+      <w:r>
+        <w:t>selecters</w:t>
+      </w:r>
+      <w:proofErr w:type="spellEnd"/>
+      <w:r>
+        <w:t xml:space="preserve"> </w:t>
+      </w:r>
+      <w:r>
+        <w:t xml:space="preserve">in the </w:t>
+      </w:r>
+      <w:proofErr w:type="spellStart"/>
+      <w:r>
+        <w:t>css</w:t>
+      </w:r>
+      <w:proofErr w:type="spellEnd"/>
+    </w:p>
+    <w:p>
+      <w:pPr>
+        <w:pStyle w:val="NoSpacing"/>
+      </w:pPr>
+      <w:r>
+        <w:t xml:space="preserve"> </w:t>
+      </w:r>
+      <w:proofErr w:type="spellStart"/>
+      <w:r>
+        <w:t>Selecters</w:t>
+      </w:r>
+      <w:proofErr w:type="spellEnd"/>
+      <w:r>
+        <w:t xml:space="preserve"> are used to design are apply changes to the specific </w:t>
+      </w:r>
+      <w:proofErr w:type="gramStart"/>
+      <w:r>
+        <w:t>point .</w:t>
+      </w:r>
+      <w:proofErr w:type="gramEnd"/>
+      <w:r>
+        <w:t xml:space="preserve"> </w:t>
+      </w:r>
+    </w:p>
+    <w:p>
+      <w:pPr>
+        <w:shd w:val="clear" w:color="auto" w:fill="00002C"/>
+        <w:spacing w:line="285" w:lineRule="atLeast"/>
+        <w:rPr>
+          <w:rFonts w:ascii="Consolas" w:eastAsia="Times New Roman" w:hAnsi="Consolas" w:cs="Times New Roman"/>
+          <w:color w:val="FFFFFF"/>
+          <w:sz w:val="21"/>
+          <w:szCs w:val="21"/>
+        </w:rPr>
+      </w:pPr>
+      <w:r>
+        <w:rPr>
+          <w:rFonts w:ascii="Consolas" w:eastAsia="Times New Roman" w:hAnsi="Consolas" w:cs="Times New Roman"/>
+          <w:color w:val="FFFFFF"/>
+          <w:sz w:val="21"/>
+          <w:szCs w:val="21"/>
+        </w:rPr>
+        <w:t> &lt;</w:t>
+      </w:r>
+      <w:proofErr w:type="gramStart"/>
+      <w:r>
+        <w:rPr>
+          <w:rFonts w:ascii="Consolas" w:eastAsia="Times New Roman" w:hAnsi="Consolas" w:cs="Times New Roman"/>
+          <w:color w:val="FF0077"/>
+          <w:sz w:val="21"/>
+          <w:szCs w:val="21"/>
+        </w:rPr>
+        <w:t>style</w:t>
+      </w:r>
+      <w:proofErr w:type="gramEnd"/>
+      <w:r>
+        <w:rPr>
+          <w:rFonts w:ascii="Consolas" w:eastAsia="Times New Roman" w:hAnsi="Consolas" w:cs="Times New Roman"/>
+          <w:color w:val="FFFFFF"/>
+          <w:sz w:val="21"/>
+          <w:szCs w:val="21"/>
+        </w:rPr>
+        <w:t>&gt;</w:t>
+      </w:r>
+    </w:p>
+    <w:p>
+      <w:pPr>
+        <w:shd w:val="clear" w:color="auto" w:fill="00002C"/>
+        <w:spacing w:line="285" w:lineRule="atLeast"/>
+        <w:rPr>
+          <w:rFonts w:ascii="Consolas" w:eastAsia="Times New Roman" w:hAnsi="Consolas" w:cs="Times New Roman"/>
+          <w:color w:val="FFFFFF"/>
+          <w:sz w:val="21"/>
+          <w:szCs w:val="21"/>
+        </w:rPr>
+      </w:pPr>
+      <w:r>
+        <w:rPr>
+          <w:rFonts w:ascii="Consolas" w:eastAsia="Times New Roman" w:hAnsi="Consolas" w:cs="Times New Roman"/>
+          <w:color w:val="FFFFFF"/>
+          <w:sz w:val="21"/>
+          <w:szCs w:val="21"/>
+        </w:rPr>
+        <w:t xml:space="preserve">        </w:t>
+      </w:r>
+      <w:proofErr w:type="gramStart"/>
+      <w:r>
+        <w:rPr>
+          <w:rFonts w:ascii="Consolas" w:eastAsia="Times New Roman" w:hAnsi="Consolas" w:cs="Times New Roman"/>
+          <w:color w:val="FF0077"/>
+          <w:sz w:val="21"/>
+          <w:szCs w:val="21"/>
+        </w:rPr>
+        <w:t>div</w:t>
+      </w:r>
+      <w:r>
+        <w:rPr>
+          <w:rFonts w:ascii="Consolas" w:eastAsia="Times New Roman" w:hAnsi="Consolas" w:cs="Times New Roman"/>
+          <w:color w:val="FFFFFF"/>
+          <w:sz w:val="21"/>
+          <w:szCs w:val="21"/>
+        </w:rPr>
+        <w:t>{</w:t>
+      </w:r>
+      <w:proofErr w:type="gramEnd"/>
+    </w:p>
+    <w:p>
+      <w:pPr>
+        <w:shd w:val="clear" w:color="auto" w:fill="00002C"/>
+        <w:spacing w:line="285" w:lineRule="atLeast"/>
+        <w:rPr>
+          <w:rFonts w:ascii="Consolas" w:eastAsia="Times New Roman" w:hAnsi="Consolas" w:cs="Times New Roman"/>
+          <w:color w:val="FFFFFF"/>
+          <w:sz w:val="21"/>
+          <w:szCs w:val="21"/>
+        </w:rPr>
+      </w:pPr>
+      <w:r>
+        <w:rPr>
+          <w:rFonts w:ascii="Consolas" w:eastAsia="Times New Roman" w:hAnsi="Consolas" w:cs="Times New Roman"/>
+          <w:color w:val="FFFFFF"/>
+          <w:sz w:val="21"/>
+          <w:szCs w:val="21"/>
+        </w:rPr>
+        <w:t xml:space="preserve">            </w:t>
+      </w:r>
+      <w:proofErr w:type="gramStart"/>
+      <w:r>
+        <w:rPr>
+          <w:rFonts w:ascii="Consolas" w:eastAsia="Times New Roman" w:hAnsi="Consolas" w:cs="Times New Roman"/>
+          <w:color w:val="FFFFFF"/>
+          <w:sz w:val="21"/>
+          <w:szCs w:val="21"/>
+        </w:rPr>
+        <w:t>color</w:t>
+      </w:r>
+      <w:proofErr w:type="gramEnd"/>
+      <w:r>
+        <w:rPr>
+          <w:rFonts w:ascii="Consolas" w:eastAsia="Times New Roman" w:hAnsi="Consolas" w:cs="Times New Roman"/>
+          <w:color w:val="FFFFFF"/>
+          <w:sz w:val="21"/>
+          <w:szCs w:val="21"/>
+        </w:rPr>
+        <w:t xml:space="preserve">: </w:t>
+      </w:r>
+      <w:r>
+        <w:rPr>
+          <w:rFonts w:ascii="Consolas" w:eastAsia="Times New Roman" w:hAnsi="Consolas" w:cs="Times New Roman"/>
+          <w:color w:val="FF7E34"/>
+          <w:sz w:val="21"/>
+          <w:szCs w:val="21"/>
+        </w:rPr>
+        <w:t>aqua</w:t>
+      </w:r>
+      <w:r>
+        <w:rPr>
+          <w:rFonts w:ascii="Consolas" w:eastAsia="Times New Roman" w:hAnsi="Consolas" w:cs="Times New Roman"/>
+          <w:color w:val="FFFFFF"/>
+          <w:sz w:val="21"/>
+          <w:szCs w:val="21"/>
+        </w:rPr>
+        <w:t>;</w:t>
+      </w:r>
+    </w:p>
+    <w:p>
+      <w:pPr>
+        <w:shd w:val="clear" w:color="auto" w:fill="00002C"/>
+        <w:spacing w:line="285" w:lineRule="atLeast"/>
+        <w:rPr>
+          <w:rFonts w:ascii="Consolas" w:eastAsia="Times New Roman" w:hAnsi="Consolas" w:cs="Times New Roman"/>
+          <w:color w:val="FFFFFF"/>
+          <w:sz w:val="21"/>
+          <w:szCs w:val="21"/>
+        </w:rPr>
+      </w:pPr>
+      <w:r>
+        <w:rPr>
+          <w:rFonts w:ascii="Consolas" w:eastAsia="Times New Roman" w:hAnsi="Consolas" w:cs="Times New Roman"/>
+          <w:color w:val="FFFFFF"/>
+          <w:sz w:val="21"/>
+          <w:szCs w:val="21"/>
+        </w:rPr>
+        <w:t>        }</w:t>
+      </w:r>
+    </w:p>
+    <w:p>
+      <w:pPr>
+        <w:pStyle w:val="NoSpacing"/>
+      </w:pPr>
+      <w:r>
+        <w:t xml:space="preserve">See this example here we use the style to give </w:t>
+      </w:r>
+      <w:proofErr w:type="spellStart"/>
+      <w:r>
+        <w:t>colour</w:t>
+      </w:r>
+      <w:proofErr w:type="spellEnd"/>
+      <w:r>
+        <w:t xml:space="preserve"> and  mentioned that which is in the div give the color aqua but the drawback of this is the if we made the another div is automatically got this color . </w:t>
+      </w:r>
+      <w:proofErr w:type="gramStart"/>
+      <w:r>
+        <w:t>which</w:t>
+      </w:r>
+      <w:proofErr w:type="gramEnd"/>
+      <w:r>
+        <w:t xml:space="preserve"> maybe we don’t want so at this condition we use the selectors to assign the specific thing to specific type.</w:t>
+      </w:r>
+    </w:p>
+    <w:p>
+      <w:pPr>
+        <w:shd w:val="clear" w:color="auto" w:fill="00002C"/>
+        <w:spacing w:line="285" w:lineRule="atLeast"/>
+        <w:rPr>
+          <w:rFonts w:ascii="Consolas" w:eastAsia="Times New Roman" w:hAnsi="Consolas" w:cs="Times New Roman"/>
+          <w:color w:val="FFFFFF"/>
+          <w:sz w:val="21"/>
+          <w:szCs w:val="21"/>
+        </w:rPr>
+      </w:pPr>
+      <w:r>
+        <w:rPr>
+          <w:rFonts w:ascii="Consolas" w:eastAsia="Times New Roman" w:hAnsi="Consolas" w:cs="Times New Roman"/>
+          <w:color w:val="FFFFFF"/>
+          <w:sz w:val="21"/>
+          <w:szCs w:val="21"/>
+        </w:rPr>
+        <w:t> &lt;</w:t>
+      </w:r>
+      <w:r>
+        <w:rPr>
+          <w:rFonts w:ascii="Consolas" w:eastAsia="Times New Roman" w:hAnsi="Consolas" w:cs="Times New Roman"/>
+          <w:color w:val="FF0077"/>
+          <w:sz w:val="21"/>
+          <w:szCs w:val="21"/>
+        </w:rPr>
+        <w:t>div</w:t>
+      </w:r>
+      <w:r>
+        <w:rPr>
+          <w:rFonts w:ascii="Consolas" w:eastAsia="Times New Roman" w:hAnsi="Consolas" w:cs="Times New Roman"/>
+          <w:color w:val="FFFFFF"/>
+          <w:sz w:val="21"/>
+          <w:szCs w:val="21"/>
+        </w:rPr>
+        <w:t xml:space="preserve"> </w:t>
+      </w:r>
+      <w:r>
+        <w:rPr>
+          <w:rFonts w:ascii="Consolas" w:eastAsia="Times New Roman" w:hAnsi="Consolas" w:cs="Times New Roman"/>
+          <w:color w:val="00FFF2"/>
+          <w:sz w:val="21"/>
+          <w:szCs w:val="21"/>
+        </w:rPr>
+        <w:t>class</w:t>
+      </w:r>
+      <w:r>
+        <w:rPr>
+          <w:rFonts w:ascii="Consolas" w:eastAsia="Times New Roman" w:hAnsi="Consolas" w:cs="Times New Roman"/>
+          <w:color w:val="FFFFFF"/>
+          <w:sz w:val="21"/>
+          <w:szCs w:val="21"/>
+        </w:rPr>
+        <w:t xml:space="preserve"> = "</w:t>
+      </w:r>
+      <w:r>
+        <w:rPr>
+          <w:rFonts w:ascii="Consolas" w:eastAsia="Times New Roman" w:hAnsi="Consolas" w:cs="Times New Roman"/>
+          <w:color w:val="EEFF00"/>
+          <w:sz w:val="21"/>
+          <w:szCs w:val="21"/>
+        </w:rPr>
+        <w:t>red</w:t>
+      </w:r>
+      <w:r>
+        <w:rPr>
+          <w:rFonts w:ascii="Consolas" w:eastAsia="Times New Roman" w:hAnsi="Consolas" w:cs="Times New Roman"/>
+          <w:color w:val="FFFFFF"/>
+          <w:sz w:val="21"/>
+          <w:szCs w:val="21"/>
+        </w:rPr>
+        <w:t>"&gt;</w:t>
+      </w:r>
+    </w:p>
+    <w:p>
+      <w:pPr>
+        <w:shd w:val="clear" w:color="auto" w:fill="00002C"/>
+        <w:spacing w:line="285" w:lineRule="atLeast"/>
+        <w:rPr>
+          <w:rFonts w:ascii="Consolas" w:eastAsia="Times New Roman" w:hAnsi="Consolas" w:cs="Times New Roman"/>
+          <w:color w:val="FFFFFF"/>
+          <w:sz w:val="21"/>
+          <w:szCs w:val="21"/>
+        </w:rPr>
+      </w:pPr>
+      <w:r>
+        <w:rPr>
+          <w:rFonts w:ascii="Consolas" w:eastAsia="Times New Roman" w:hAnsi="Consolas" w:cs="Times New Roman"/>
+          <w:color w:val="FFFFFF"/>
+          <w:sz w:val="21"/>
+          <w:szCs w:val="21"/>
+        </w:rPr>
+        <w:t>    I am a div &lt;/</w:t>
+      </w:r>
+      <w:r>
+        <w:rPr>
+          <w:rFonts w:ascii="Consolas" w:eastAsia="Times New Roman" w:hAnsi="Consolas" w:cs="Times New Roman"/>
+          <w:color w:val="FF0077"/>
+          <w:sz w:val="21"/>
+          <w:szCs w:val="21"/>
+        </w:rPr>
+        <w:t>div</w:t>
+      </w:r>
+      <w:r>
+        <w:rPr>
+          <w:rFonts w:ascii="Consolas" w:eastAsia="Times New Roman" w:hAnsi="Consolas" w:cs="Times New Roman"/>
+          <w:color w:val="FFFFFF"/>
+          <w:sz w:val="21"/>
+          <w:szCs w:val="21"/>
+        </w:rPr>
+        <w:t>&gt;</w:t>
+      </w:r>
+    </w:p>
+    <w:p>
+      <w:pPr>
+        <w:pStyle w:val="NoSpacing"/>
+      </w:pPr>
+    </w:p>
+    <w:p>
+      <w:pPr>
+        <w:shd w:val="clear" w:color="auto" w:fill="00002C"/>
+        <w:spacing w:line="285" w:lineRule="atLeast"/>
+        <w:rPr>
+          <w:rFonts w:ascii="Consolas" w:eastAsia="Times New Roman" w:hAnsi="Consolas" w:cs="Times New Roman"/>
+          <w:color w:val="FFFFFF"/>
+          <w:sz w:val="21"/>
+          <w:szCs w:val="21"/>
+        </w:rPr>
+      </w:pPr>
+      <w:r>
+        <w:rPr>
+          <w:rFonts w:ascii="Consolas" w:eastAsia="Times New Roman" w:hAnsi="Consolas" w:cs="Times New Roman"/>
+          <w:color w:val="FFFFFF"/>
+          <w:sz w:val="21"/>
+          <w:szCs w:val="21"/>
+        </w:rPr>
+        <w:t>  &lt;</w:t>
+      </w:r>
+      <w:proofErr w:type="gramStart"/>
+      <w:r>
+        <w:rPr>
+          <w:rFonts w:ascii="Consolas" w:eastAsia="Times New Roman" w:hAnsi="Consolas" w:cs="Times New Roman"/>
+          <w:color w:val="FF0077"/>
+          <w:sz w:val="21"/>
+          <w:szCs w:val="21"/>
+        </w:rPr>
+        <w:t>style</w:t>
+      </w:r>
+      <w:proofErr w:type="gramEnd"/>
+      <w:r>
+        <w:rPr>
+          <w:rFonts w:ascii="Consolas" w:eastAsia="Times New Roman" w:hAnsi="Consolas" w:cs="Times New Roman"/>
+          <w:color w:val="FFFFFF"/>
+          <w:sz w:val="21"/>
+          <w:szCs w:val="21"/>
+        </w:rPr>
+        <w:t>&gt;</w:t>
+      </w:r>
+    </w:p>
+    <w:p>
+      <w:pPr>
+        <w:shd w:val="clear" w:color="auto" w:fill="00002C"/>
+        <w:spacing w:line="285" w:lineRule="atLeast"/>
+        <w:rPr>
+          <w:rFonts w:ascii="Consolas" w:eastAsia="Times New Roman" w:hAnsi="Consolas" w:cs="Times New Roman"/>
+          <w:color w:val="FFFFFF"/>
+          <w:sz w:val="21"/>
+          <w:szCs w:val="21"/>
+        </w:rPr>
+      </w:pPr>
+      <w:r>
+        <w:rPr>
+          <w:rFonts w:ascii="Consolas" w:eastAsia="Times New Roman" w:hAnsi="Consolas" w:cs="Times New Roman"/>
+          <w:color w:val="FFFFFF"/>
+          <w:sz w:val="21"/>
+          <w:szCs w:val="21"/>
+        </w:rPr>
+        <w:t xml:space="preserve">        </w:t>
+      </w:r>
+      <w:r>
+        <w:rPr>
+          <w:rFonts w:ascii="Consolas" w:eastAsia="Times New Roman" w:hAnsi="Consolas" w:cs="Times New Roman"/>
+          <w:i/>
+          <w:iCs/>
+          <w:color w:val="838383"/>
+          <w:sz w:val="21"/>
+          <w:szCs w:val="21"/>
+        </w:rPr>
+        <w:t xml:space="preserve">/* </w:t>
+      </w:r>
+      <w:proofErr w:type="gramStart"/>
+      <w:r>
+        <w:rPr>
+          <w:rFonts w:ascii="Consolas" w:eastAsia="Times New Roman" w:hAnsi="Consolas" w:cs="Times New Roman"/>
+          <w:i/>
+          <w:iCs/>
+          <w:color w:val="838383"/>
+          <w:sz w:val="21"/>
+          <w:szCs w:val="21"/>
+        </w:rPr>
+        <w:t>div{</w:t>
+      </w:r>
+      <w:proofErr w:type="gramEnd"/>
+    </w:p>
+    <w:p>
+      <w:pPr>
+        <w:shd w:val="clear" w:color="auto" w:fill="00002C"/>
+        <w:spacing w:line="285" w:lineRule="atLeast"/>
+        <w:rPr>
+          <w:rFonts w:ascii="Consolas" w:eastAsia="Times New Roman" w:hAnsi="Consolas" w:cs="Times New Roman"/>
+          <w:color w:val="FFFFFF"/>
+          <w:sz w:val="21"/>
+          <w:szCs w:val="21"/>
+        </w:rPr>
+      </w:pPr>
+      <w:r>
+        <w:rPr>
+          <w:rFonts w:ascii="Consolas" w:eastAsia="Times New Roman" w:hAnsi="Consolas" w:cs="Times New Roman"/>
+          <w:i/>
+          <w:iCs/>
+          <w:color w:val="838383"/>
+          <w:sz w:val="21"/>
+          <w:szCs w:val="21"/>
+        </w:rPr>
+        <w:t xml:space="preserve">            </w:t>
+      </w:r>
+      <w:proofErr w:type="gramStart"/>
+      <w:r>
+        <w:rPr>
+          <w:rFonts w:ascii="Consolas" w:eastAsia="Times New Roman" w:hAnsi="Consolas" w:cs="Times New Roman"/>
+          <w:i/>
+          <w:iCs/>
+          <w:color w:val="838383"/>
+          <w:sz w:val="21"/>
+          <w:szCs w:val="21"/>
+        </w:rPr>
+        <w:t>color</w:t>
+      </w:r>
+      <w:proofErr w:type="gramEnd"/>
+      <w:r>
+        <w:rPr>
+          <w:rFonts w:ascii="Consolas" w:eastAsia="Times New Roman" w:hAnsi="Consolas" w:cs="Times New Roman"/>
+          <w:i/>
+          <w:iCs/>
+          <w:color w:val="838383"/>
+          <w:sz w:val="21"/>
+          <w:szCs w:val="21"/>
+        </w:rPr>
+        <w:t>: aqua;</w:t>
+      </w:r>
+    </w:p>
+    <w:p>
+      <w:pPr>
+        <w:shd w:val="clear" w:color="auto" w:fill="00002C"/>
+        <w:spacing w:line="285" w:lineRule="atLeast"/>
+        <w:rPr>
+          <w:rFonts w:ascii="Consolas" w:eastAsia="Times New Roman" w:hAnsi="Consolas" w:cs="Times New Roman"/>
+          <w:color w:val="FFFFFF"/>
+          <w:sz w:val="21"/>
+          <w:szCs w:val="21"/>
+        </w:rPr>
+      </w:pPr>
+      <w:r>
+        <w:rPr>
+          <w:rFonts w:ascii="Consolas" w:eastAsia="Times New Roman" w:hAnsi="Consolas" w:cs="Times New Roman"/>
+          <w:i/>
+          <w:iCs/>
+          <w:color w:val="838383"/>
+          <w:sz w:val="21"/>
+          <w:szCs w:val="21"/>
+        </w:rPr>
+        <w:t>        } */</w:t>
+      </w:r>
+    </w:p>
+    <w:p>
+      <w:pPr>
+        <w:shd w:val="clear" w:color="auto" w:fill="00002C"/>
+        <w:spacing w:line="285" w:lineRule="atLeast"/>
+        <w:rPr>
+          <w:rFonts w:ascii="Consolas" w:eastAsia="Times New Roman" w:hAnsi="Consolas" w:cs="Times New Roman"/>
+          <w:color w:val="FFFFFF"/>
+          <w:sz w:val="21"/>
+          <w:szCs w:val="21"/>
+        </w:rPr>
+      </w:pPr>
+      <w:r>
+        <w:rPr>
+          <w:rFonts w:ascii="Consolas" w:eastAsia="Times New Roman" w:hAnsi="Consolas" w:cs="Times New Roman"/>
+          <w:i/>
+          <w:iCs/>
+          <w:color w:val="838383"/>
+          <w:sz w:val="21"/>
+          <w:szCs w:val="21"/>
+        </w:rPr>
+        <w:t xml:space="preserve">/*class </w:t>
+      </w:r>
+      <w:proofErr w:type="spellStart"/>
+      <w:r>
+        <w:rPr>
+          <w:rFonts w:ascii="Consolas" w:eastAsia="Times New Roman" w:hAnsi="Consolas" w:cs="Times New Roman"/>
+          <w:i/>
+          <w:iCs/>
+          <w:color w:val="838383"/>
+          <w:sz w:val="21"/>
+          <w:szCs w:val="21"/>
+        </w:rPr>
+        <w:t>selecter</w:t>
+      </w:r>
+      <w:proofErr w:type="spellEnd"/>
+      <w:r>
+        <w:rPr>
+          <w:rFonts w:ascii="Consolas" w:eastAsia="Times New Roman" w:hAnsi="Consolas" w:cs="Times New Roman"/>
+          <w:i/>
+          <w:iCs/>
+          <w:color w:val="838383"/>
+          <w:sz w:val="21"/>
+          <w:szCs w:val="21"/>
+        </w:rPr>
+        <w:t>*/</w:t>
+      </w:r>
+    </w:p>
+    <w:p>
+      <w:pPr>
+        <w:shd w:val="clear" w:color="auto" w:fill="00002C"/>
+        <w:spacing w:line="285" w:lineRule="atLeast"/>
+        <w:rPr>
+          <w:rFonts w:ascii="Consolas" w:eastAsia="Times New Roman" w:hAnsi="Consolas" w:cs="Times New Roman"/>
+          <w:color w:val="FFFFFF"/>
+          <w:sz w:val="21"/>
+          <w:szCs w:val="21"/>
+        </w:rPr>
+      </w:pPr>
+      <w:r>
+        <w:rPr>
+          <w:rFonts w:ascii="Consolas" w:eastAsia="Times New Roman" w:hAnsi="Consolas" w:cs="Times New Roman"/>
+          <w:color w:val="FFFFFF"/>
+          <w:sz w:val="21"/>
+          <w:szCs w:val="21"/>
+        </w:rPr>
+        <w:t>        .</w:t>
+      </w:r>
+      <w:proofErr w:type="gramStart"/>
+      <w:r>
+        <w:rPr>
+          <w:rFonts w:ascii="Consolas" w:eastAsia="Times New Roman" w:hAnsi="Consolas" w:cs="Times New Roman"/>
+          <w:color w:val="FFCB6B"/>
+          <w:sz w:val="21"/>
+          <w:szCs w:val="21"/>
+        </w:rPr>
+        <w:t>red</w:t>
+      </w:r>
+      <w:r>
+        <w:rPr>
+          <w:rFonts w:ascii="Consolas" w:eastAsia="Times New Roman" w:hAnsi="Consolas" w:cs="Times New Roman"/>
+          <w:color w:val="FFFFFF"/>
+          <w:sz w:val="21"/>
+          <w:szCs w:val="21"/>
+        </w:rPr>
+        <w:t>{</w:t>
+      </w:r>
+      <w:proofErr w:type="gramEnd"/>
+    </w:p>
+    <w:p>
+      <w:pPr>
+        <w:shd w:val="clear" w:color="auto" w:fill="00002C"/>
+        <w:spacing w:line="285" w:lineRule="atLeast"/>
+        <w:rPr>
+          <w:rFonts w:ascii="Consolas" w:eastAsia="Times New Roman" w:hAnsi="Consolas" w:cs="Times New Roman"/>
+          <w:color w:val="FFFFFF"/>
+          <w:sz w:val="21"/>
+          <w:szCs w:val="21"/>
+        </w:rPr>
+      </w:pPr>
+      <w:r>
+        <w:rPr>
+          <w:rFonts w:ascii="Consolas" w:eastAsia="Times New Roman" w:hAnsi="Consolas" w:cs="Times New Roman"/>
+          <w:color w:val="FFFFFF"/>
+          <w:sz w:val="21"/>
+          <w:szCs w:val="21"/>
+        </w:rPr>
+        <w:t xml:space="preserve">            </w:t>
+      </w:r>
+      <w:proofErr w:type="gramStart"/>
+      <w:r>
+        <w:rPr>
+          <w:rFonts w:ascii="Consolas" w:eastAsia="Times New Roman" w:hAnsi="Consolas" w:cs="Times New Roman"/>
+          <w:color w:val="FFFFFF"/>
+          <w:sz w:val="21"/>
+          <w:szCs w:val="21"/>
+        </w:rPr>
+        <w:t>background-color</w:t>
+      </w:r>
+      <w:proofErr w:type="gramEnd"/>
+      <w:r>
+        <w:rPr>
+          <w:rFonts w:ascii="Consolas" w:eastAsia="Times New Roman" w:hAnsi="Consolas" w:cs="Times New Roman"/>
+          <w:color w:val="FFFFFF"/>
+          <w:sz w:val="21"/>
+          <w:szCs w:val="21"/>
+        </w:rPr>
+        <w:t xml:space="preserve">: </w:t>
+      </w:r>
+      <w:proofErr w:type="spellStart"/>
+      <w:r>
+        <w:rPr>
+          <w:rFonts w:ascii="Consolas" w:eastAsia="Times New Roman" w:hAnsi="Consolas" w:cs="Times New Roman"/>
+          <w:color w:val="FF7E34"/>
+          <w:sz w:val="21"/>
+          <w:szCs w:val="21"/>
+        </w:rPr>
+        <w:t>blueviolet</w:t>
+      </w:r>
+      <w:proofErr w:type="spellEnd"/>
+      <w:r>
+        <w:rPr>
+          <w:rFonts w:ascii="Consolas" w:eastAsia="Times New Roman" w:hAnsi="Consolas" w:cs="Times New Roman"/>
+          <w:color w:val="FFFFFF"/>
+          <w:sz w:val="21"/>
+          <w:szCs w:val="21"/>
+        </w:rPr>
+        <w:t>;</w:t>
+      </w:r>
+    </w:p>
+    <w:p>
+      <w:pPr>
+        <w:shd w:val="clear" w:color="auto" w:fill="00002C"/>
+        <w:spacing w:line="285" w:lineRule="atLeast"/>
+        <w:rPr>
+          <w:rFonts w:ascii="Consolas" w:eastAsia="Times New Roman" w:hAnsi="Consolas" w:cs="Times New Roman"/>
+          <w:color w:val="FFFFFF"/>
+          <w:sz w:val="21"/>
+          <w:szCs w:val="21"/>
+        </w:rPr>
+      </w:pPr>
+      <w:r>
+        <w:rPr>
+          <w:rFonts w:ascii="Consolas" w:eastAsia="Times New Roman" w:hAnsi="Consolas" w:cs="Times New Roman"/>
+          <w:color w:val="FFFFFF"/>
+          <w:sz w:val="21"/>
+          <w:szCs w:val="21"/>
+        </w:rPr>
+        <w:t>        }</w:t>
+      </w:r>
+    </w:p>
+    <w:p>
+      <w:pPr>
+        <w:shd w:val="clear" w:color="auto" w:fill="00002C"/>
+        <w:spacing w:line="285" w:lineRule="atLeast"/>
+        <w:rPr>
+          <w:rFonts w:ascii="Consolas" w:eastAsia="Times New Roman" w:hAnsi="Consolas" w:cs="Times New Roman"/>
+          <w:color w:val="FFFFFF"/>
+          <w:sz w:val="21"/>
+          <w:szCs w:val="21"/>
+        </w:rPr>
+      </w:pPr>
+      <w:r>
+        <w:rPr>
+          <w:rFonts w:ascii="Consolas" w:eastAsia="Times New Roman" w:hAnsi="Consolas" w:cs="Times New Roman"/>
+          <w:color w:val="FFFFFF"/>
+          <w:sz w:val="21"/>
+          <w:szCs w:val="21"/>
+        </w:rPr>
+        <w:t>    &lt;/</w:t>
+      </w:r>
+      <w:r>
+        <w:rPr>
+          <w:rFonts w:ascii="Consolas" w:eastAsia="Times New Roman" w:hAnsi="Consolas" w:cs="Times New Roman"/>
+          <w:color w:val="FF0077"/>
+          <w:sz w:val="21"/>
+          <w:szCs w:val="21"/>
+        </w:rPr>
+        <w:t>style</w:t>
+      </w:r>
+      <w:r>
+        <w:rPr>
+          <w:rFonts w:ascii="Consolas" w:eastAsia="Times New Roman" w:hAnsi="Consolas" w:cs="Times New Roman"/>
+          <w:color w:val="FFFFFF"/>
+          <w:sz w:val="21"/>
+          <w:szCs w:val="21"/>
+        </w:rPr>
+        <w:t>&gt;</w:t>
+      </w:r>
+    </w:p>
+    <w:p>
+      <w:pPr>
+        <w:pStyle w:val="NoSpacing"/>
+      </w:pPr>
+      <w:r>
+        <w:t xml:space="preserve"> Then here we use the class </w:t>
+      </w:r>
+      <w:proofErr w:type="spellStart"/>
+      <w:r>
+        <w:t>selecters</w:t>
+      </w:r>
+      <w:proofErr w:type="spellEnd"/>
+      <w:r>
+        <w:t xml:space="preserve"> to differ the one div from the another div one div ha class red so we that div by .</w:t>
+      </w:r>
+      <w:proofErr w:type="gramStart"/>
+      <w:r>
+        <w:t>red .</w:t>
+      </w:r>
+      <w:proofErr w:type="gramEnd"/>
+      <w:r>
+        <w:t xml:space="preserve"> </w:t>
+      </w:r>
+    </w:p>
+    <w:p>
+      <w:pPr>
+        <w:pStyle w:val="NoSpacing"/>
+      </w:pPr>
+      <w:r>
+        <w:t xml:space="preserve"> And another div by the simple div.</w:t>
+      </w:r>
+    </w:p>
+    <w:p>
+      <w:pPr>
+        <w:shd w:val="clear" w:color="auto" w:fill="00002C"/>
+        <w:spacing w:line="285" w:lineRule="atLeast"/>
+        <w:rPr>
+          <w:rFonts w:ascii="Consolas" w:eastAsia="Times New Roman" w:hAnsi="Consolas" w:cs="Times New Roman"/>
+          <w:color w:val="FFFFFF"/>
+          <w:sz w:val="21"/>
+          <w:szCs w:val="21"/>
+        </w:rPr>
+      </w:pPr>
+      <w:r>
+        <w:rPr>
+          <w:rFonts w:ascii="Consolas" w:eastAsia="Times New Roman" w:hAnsi="Consolas" w:cs="Times New Roman"/>
+          <w:color w:val="FFFFFF"/>
+          <w:sz w:val="21"/>
+          <w:szCs w:val="21"/>
+        </w:rPr>
+        <w:t>  &lt;</w:t>
+      </w:r>
+      <w:r>
+        <w:rPr>
+          <w:rFonts w:ascii="Consolas" w:eastAsia="Times New Roman" w:hAnsi="Consolas" w:cs="Times New Roman"/>
+          <w:color w:val="FF0077"/>
+          <w:sz w:val="21"/>
+          <w:szCs w:val="21"/>
+        </w:rPr>
+        <w:t>div</w:t>
+      </w:r>
+      <w:r>
+        <w:rPr>
+          <w:rFonts w:ascii="Consolas" w:eastAsia="Times New Roman" w:hAnsi="Consolas" w:cs="Times New Roman"/>
+          <w:color w:val="FFFFFF"/>
+          <w:sz w:val="21"/>
+          <w:szCs w:val="21"/>
+        </w:rPr>
+        <w:t xml:space="preserve"> </w:t>
+      </w:r>
+      <w:r>
+        <w:rPr>
+          <w:rFonts w:ascii="Consolas" w:eastAsia="Times New Roman" w:hAnsi="Consolas" w:cs="Times New Roman"/>
+          <w:color w:val="00FFF2"/>
+          <w:sz w:val="21"/>
+          <w:szCs w:val="21"/>
+        </w:rPr>
+        <w:t>class</w:t>
+      </w:r>
+      <w:r>
+        <w:rPr>
+          <w:rFonts w:ascii="Consolas" w:eastAsia="Times New Roman" w:hAnsi="Consolas" w:cs="Times New Roman"/>
+          <w:color w:val="FFFFFF"/>
+          <w:sz w:val="21"/>
+          <w:szCs w:val="21"/>
+        </w:rPr>
+        <w:t xml:space="preserve"> = "</w:t>
+      </w:r>
+      <w:r>
+        <w:rPr>
+          <w:rFonts w:ascii="Consolas" w:eastAsia="Times New Roman" w:hAnsi="Consolas" w:cs="Times New Roman"/>
+          <w:color w:val="EEFF00"/>
+          <w:sz w:val="21"/>
+          <w:szCs w:val="21"/>
+        </w:rPr>
+        <w:t>red</w:t>
+      </w:r>
+      <w:r>
+        <w:rPr>
+          <w:rFonts w:ascii="Consolas" w:eastAsia="Times New Roman" w:hAnsi="Consolas" w:cs="Times New Roman"/>
+          <w:color w:val="FFFFFF"/>
+          <w:sz w:val="21"/>
+          <w:szCs w:val="21"/>
+        </w:rPr>
+        <w:t>"&gt;</w:t>
+      </w:r>
+    </w:p>
+    <w:p>
+      <w:pPr>
+        <w:shd w:val="clear" w:color="auto" w:fill="00002C"/>
+        <w:spacing w:line="285" w:lineRule="atLeast"/>
+        <w:rPr>
+          <w:rFonts w:ascii="Consolas" w:eastAsia="Times New Roman" w:hAnsi="Consolas" w:cs="Times New Roman"/>
+          <w:color w:val="FFFFFF"/>
+          <w:sz w:val="21"/>
+          <w:szCs w:val="21"/>
+        </w:rPr>
+      </w:pPr>
+      <w:r>
+        <w:rPr>
+          <w:rFonts w:ascii="Consolas" w:eastAsia="Times New Roman" w:hAnsi="Consolas" w:cs="Times New Roman"/>
+          <w:color w:val="FFFFFF"/>
+          <w:sz w:val="21"/>
+          <w:szCs w:val="21"/>
+        </w:rPr>
+        <w:t>    I am a div &lt;/</w:t>
+      </w:r>
+      <w:r>
+        <w:rPr>
+          <w:rFonts w:ascii="Consolas" w:eastAsia="Times New Roman" w:hAnsi="Consolas" w:cs="Times New Roman"/>
+          <w:color w:val="FF0077"/>
+          <w:sz w:val="21"/>
+          <w:szCs w:val="21"/>
+        </w:rPr>
+        <w:t>div</w:t>
+      </w:r>
+      <w:r>
+        <w:rPr>
+          <w:rFonts w:ascii="Consolas" w:eastAsia="Times New Roman" w:hAnsi="Consolas" w:cs="Times New Roman"/>
+          <w:color w:val="FFFFFF"/>
+          <w:sz w:val="21"/>
+          <w:szCs w:val="21"/>
+        </w:rPr>
+        <w:t>&gt;</w:t>
+      </w:r>
+    </w:p>
+    <w:p>
+      <w:pPr>
+        <w:shd w:val="clear" w:color="auto" w:fill="00002C"/>
+        <w:spacing w:line="285" w:lineRule="atLeast"/>
+        <w:rPr>
+          <w:rFonts w:ascii="Consolas" w:eastAsia="Times New Roman" w:hAnsi="Consolas" w:cs="Times New Roman"/>
+          <w:color w:val="FFFFFF"/>
+          <w:sz w:val="21"/>
+          <w:szCs w:val="21"/>
+        </w:rPr>
+      </w:pPr>
+      <w:r>
+        <w:rPr>
+          <w:rFonts w:ascii="Consolas" w:eastAsia="Times New Roman" w:hAnsi="Consolas" w:cs="Times New Roman"/>
+          <w:color w:val="FFFFFF"/>
+          <w:sz w:val="21"/>
+          <w:szCs w:val="21"/>
+        </w:rPr>
+        <w:t>    &lt;</w:t>
+      </w:r>
+      <w:proofErr w:type="gramStart"/>
+      <w:r>
+        <w:rPr>
+          <w:rFonts w:ascii="Consolas" w:eastAsia="Times New Roman" w:hAnsi="Consolas" w:cs="Times New Roman"/>
+          <w:color w:val="FF0077"/>
+          <w:sz w:val="21"/>
+          <w:szCs w:val="21"/>
+        </w:rPr>
+        <w:t>div</w:t>
+      </w:r>
+      <w:proofErr w:type="gramEnd"/>
+      <w:r>
+        <w:rPr>
+          <w:rFonts w:ascii="Consolas" w:eastAsia="Times New Roman" w:hAnsi="Consolas" w:cs="Times New Roman"/>
+          <w:color w:val="FFFFFF"/>
+          <w:sz w:val="21"/>
+          <w:szCs w:val="21"/>
+        </w:rPr>
+        <w:t xml:space="preserve">&gt; </w:t>
+      </w:r>
+      <w:proofErr w:type="spellStart"/>
+      <w:r>
+        <w:rPr>
+          <w:rFonts w:ascii="Consolas" w:eastAsia="Times New Roman" w:hAnsi="Consolas" w:cs="Times New Roman"/>
+          <w:color w:val="FFFFFF"/>
+          <w:sz w:val="21"/>
+          <w:szCs w:val="21"/>
+        </w:rPr>
+        <w:t>im</w:t>
+      </w:r>
+      <w:proofErr w:type="spellEnd"/>
+      <w:r>
+        <w:rPr>
+          <w:rFonts w:ascii="Consolas" w:eastAsia="Times New Roman" w:hAnsi="Consolas" w:cs="Times New Roman"/>
+          <w:color w:val="FFFFFF"/>
+          <w:sz w:val="21"/>
+          <w:szCs w:val="21"/>
+        </w:rPr>
+        <w:t xml:space="preserve"> not a div&lt;/</w:t>
+      </w:r>
+      <w:r>
+        <w:rPr>
+          <w:rFonts w:ascii="Consolas" w:eastAsia="Times New Roman" w:hAnsi="Consolas" w:cs="Times New Roman"/>
+          <w:color w:val="FF0077"/>
+          <w:sz w:val="21"/>
+          <w:szCs w:val="21"/>
+        </w:rPr>
+        <w:t>div</w:t>
+      </w:r>
+      <w:r>
+        <w:rPr>
+          <w:rFonts w:ascii="Consolas" w:eastAsia="Times New Roman" w:hAnsi="Consolas" w:cs="Times New Roman"/>
+          <w:color w:val="FFFFFF"/>
+          <w:sz w:val="21"/>
+          <w:szCs w:val="21"/>
+        </w:rPr>
+        <w:t>&gt;</w:t>
+      </w:r>
+    </w:p>
+    <w:p>
+      <w:pPr>
+        <w:pStyle w:val="NoSpacing"/>
+      </w:pPr>
+      <w:r>
+        <w:t xml:space="preserve">Here </w:t>
+      </w:r>
+      <w:proofErr w:type="gramStart"/>
+      <w:r>
+        <w:t>above  see</w:t>
+      </w:r>
+      <w:proofErr w:type="gramEnd"/>
+      <w:r>
+        <w:t xml:space="preserve"> that one div is with the class red and the another div is with simple type.</w:t>
+      </w:r>
+    </w:p>
+    <w:p>
+      <w:pPr>
+        <w:pStyle w:val="NoSpacing"/>
+      </w:pPr>
+      <w:r>
+        <w:t xml:space="preserve">We use these </w:t>
+      </w:r>
+      <w:proofErr w:type="spellStart"/>
+      <w:r>
+        <w:t>selecter</w:t>
+      </w:r>
+      <w:proofErr w:type="spellEnd"/>
+      <w:r>
+        <w:t xml:space="preserve"> to assign </w:t>
+      </w:r>
+      <w:proofErr w:type="gramStart"/>
+      <w:r>
+        <w:t>the our</w:t>
+      </w:r>
+      <w:proofErr w:type="gramEnd"/>
+      <w:r>
+        <w:t xml:space="preserve"> wanted properties to the </w:t>
+      </w:r>
+      <w:r>
+        <w:t>specific div or class.</w:t>
+      </w:r>
+    </w:p>
+    <w:p>
+      <w:pPr>
+        <w:pStyle w:val="NoSpacing"/>
+      </w:pPr>
+      <w:r>
+        <w:t xml:space="preserve">We can also use another type of the </w:t>
+      </w:r>
+      <w:proofErr w:type="spellStart"/>
+      <w:r>
+        <w:t>selecter</w:t>
+      </w:r>
+      <w:proofErr w:type="spellEnd"/>
+      <w:r>
+        <w:t xml:space="preserve"> see below</w:t>
+      </w:r>
+    </w:p>
+    <w:p>
+      <w:pPr>
+        <w:shd w:val="clear" w:color="auto" w:fill="00002C"/>
+        <w:spacing w:line="285" w:lineRule="atLeast"/>
+        <w:rPr>
+          <w:rFonts w:ascii="Consolas" w:eastAsia="Times New Roman" w:hAnsi="Consolas" w:cs="Times New Roman"/>
+          <w:color w:val="FFFFFF"/>
+          <w:sz w:val="21"/>
+          <w:szCs w:val="21"/>
+        </w:rPr>
+      </w:pPr>
+      <w:proofErr w:type="gramStart"/>
+      <w:r>
+        <w:rPr>
+          <w:rFonts w:ascii="Consolas" w:eastAsia="Times New Roman" w:hAnsi="Consolas" w:cs="Times New Roman"/>
+          <w:i/>
+          <w:iCs/>
+          <w:color w:val="838383"/>
+          <w:sz w:val="21"/>
+          <w:szCs w:val="21"/>
+        </w:rPr>
+        <w:t>s</w:t>
+      </w:r>
+      <w:proofErr w:type="gramEnd"/>
+      <w:r>
+        <w:rPr>
+          <w:rFonts w:ascii="Consolas" w:eastAsia="Times New Roman" w:hAnsi="Consolas" w:cs="Times New Roman"/>
+          <w:i/>
+          <w:iCs/>
+          <w:color w:val="838383"/>
+          <w:sz w:val="21"/>
+          <w:szCs w:val="21"/>
+        </w:rPr>
+        <w:t xml:space="preserve"> </w:t>
+      </w:r>
+      <w:proofErr w:type="spellStart"/>
+      <w:r>
+        <w:rPr>
+          <w:rFonts w:ascii="Consolas" w:eastAsia="Times New Roman" w:hAnsi="Consolas" w:cs="Times New Roman"/>
+          <w:i/>
+          <w:iCs/>
+          <w:color w:val="838383"/>
+          <w:sz w:val="21"/>
+          <w:szCs w:val="21"/>
+        </w:rPr>
+        <w:t>selecter</w:t>
+      </w:r>
+      <w:proofErr w:type="spellEnd"/>
+      <w:r>
+        <w:rPr>
+          <w:rFonts w:ascii="Consolas" w:eastAsia="Times New Roman" w:hAnsi="Consolas" w:cs="Times New Roman"/>
+          <w:i/>
+          <w:iCs/>
+          <w:color w:val="838383"/>
+          <w:sz w:val="21"/>
+          <w:szCs w:val="21"/>
+        </w:rPr>
+        <w:t>*/</w:t>
+      </w:r>
+    </w:p>
+    <w:p>
+      <w:pPr>
+        <w:shd w:val="clear" w:color="auto" w:fill="00002C"/>
+        <w:spacing w:line="285" w:lineRule="atLeast"/>
+        <w:rPr>
+          <w:rFonts w:ascii="Consolas" w:eastAsia="Times New Roman" w:hAnsi="Consolas" w:cs="Times New Roman"/>
+          <w:color w:val="FFFFFF"/>
+          <w:sz w:val="21"/>
+          <w:szCs w:val="21"/>
+        </w:rPr>
+      </w:pPr>
+      <w:r>
+        <w:rPr>
+          <w:rFonts w:ascii="Consolas" w:eastAsia="Times New Roman" w:hAnsi="Consolas" w:cs="Times New Roman"/>
+          <w:color w:val="FFFFFF"/>
+          <w:sz w:val="21"/>
+          <w:szCs w:val="21"/>
+        </w:rPr>
+        <w:t>        .</w:t>
+      </w:r>
+      <w:proofErr w:type="gramStart"/>
+      <w:r>
+        <w:rPr>
+          <w:rFonts w:ascii="Consolas" w:eastAsia="Times New Roman" w:hAnsi="Consolas" w:cs="Times New Roman"/>
+          <w:color w:val="FFCB6B"/>
+          <w:sz w:val="21"/>
+          <w:szCs w:val="21"/>
+        </w:rPr>
+        <w:t>red</w:t>
+      </w:r>
+      <w:r>
+        <w:rPr>
+          <w:rFonts w:ascii="Consolas" w:eastAsia="Times New Roman" w:hAnsi="Consolas" w:cs="Times New Roman"/>
+          <w:color w:val="FFFFFF"/>
+          <w:sz w:val="21"/>
+          <w:szCs w:val="21"/>
+        </w:rPr>
+        <w:t>{</w:t>
+      </w:r>
+      <w:proofErr w:type="gramEnd"/>
+    </w:p>
+    <w:p>
+      <w:pPr>
+        <w:shd w:val="clear" w:color="auto" w:fill="00002C"/>
+        <w:spacing w:line="285" w:lineRule="atLeast"/>
+        <w:rPr>
+          <w:rFonts w:ascii="Consolas" w:eastAsia="Times New Roman" w:hAnsi="Consolas" w:cs="Times New Roman"/>
+          <w:color w:val="FFFFFF"/>
+          <w:sz w:val="21"/>
+          <w:szCs w:val="21"/>
+        </w:rPr>
+      </w:pPr>
+      <w:r>
+        <w:rPr>
+          <w:rFonts w:ascii="Consolas" w:eastAsia="Times New Roman" w:hAnsi="Consolas" w:cs="Times New Roman"/>
+          <w:color w:val="FFFFFF"/>
+          <w:sz w:val="21"/>
+          <w:szCs w:val="21"/>
+        </w:rPr>
+        <w:t xml:space="preserve">            </w:t>
+      </w:r>
+      <w:proofErr w:type="gramStart"/>
+      <w:r>
+        <w:rPr>
+          <w:rFonts w:ascii="Consolas" w:eastAsia="Times New Roman" w:hAnsi="Consolas" w:cs="Times New Roman"/>
+          <w:color w:val="FFFFFF"/>
+          <w:sz w:val="21"/>
+          <w:szCs w:val="21"/>
+        </w:rPr>
+        <w:t>background-color</w:t>
+      </w:r>
+      <w:proofErr w:type="gramEnd"/>
+      <w:r>
+        <w:rPr>
+          <w:rFonts w:ascii="Consolas" w:eastAsia="Times New Roman" w:hAnsi="Consolas" w:cs="Times New Roman"/>
+          <w:color w:val="FFFFFF"/>
+          <w:sz w:val="21"/>
+          <w:szCs w:val="21"/>
+        </w:rPr>
+        <w:t xml:space="preserve">: </w:t>
+      </w:r>
+      <w:proofErr w:type="spellStart"/>
+      <w:r>
+        <w:rPr>
+          <w:rFonts w:ascii="Consolas" w:eastAsia="Times New Roman" w:hAnsi="Consolas" w:cs="Times New Roman"/>
+          <w:color w:val="FF7E34"/>
+          <w:sz w:val="21"/>
+          <w:szCs w:val="21"/>
+        </w:rPr>
+        <w:t>blueviolet</w:t>
+      </w:r>
+      <w:proofErr w:type="spellEnd"/>
+      <w:r>
+        <w:rPr>
+          <w:rFonts w:ascii="Consolas" w:eastAsia="Times New Roman" w:hAnsi="Consolas" w:cs="Times New Roman"/>
+          <w:color w:val="FFFFFF"/>
+          <w:sz w:val="21"/>
+          <w:szCs w:val="21"/>
+        </w:rPr>
+        <w:t>;</w:t>
+      </w:r>
+    </w:p>
+    <w:p>
+      <w:pPr>
+        <w:shd w:val="clear" w:color="auto" w:fill="00002C"/>
+        <w:spacing w:line="285" w:lineRule="atLeast"/>
+        <w:rPr>
+          <w:rFonts w:ascii="Consolas" w:eastAsia="Times New Roman" w:hAnsi="Consolas" w:cs="Times New Roman"/>
+          <w:color w:val="FFFFFF"/>
+          <w:sz w:val="21"/>
+          <w:szCs w:val="21"/>
+        </w:rPr>
+      </w:pPr>
+      <w:r>
+        <w:rPr>
+          <w:rFonts w:ascii="Consolas" w:eastAsia="Times New Roman" w:hAnsi="Consolas" w:cs="Times New Roman"/>
+          <w:color w:val="FFFFFF"/>
+          <w:sz w:val="21"/>
+          <w:szCs w:val="21"/>
+        </w:rPr>
+        <w:t>        }</w:t>
+      </w:r>
+    </w:p>
+    <w:p>
+      <w:pPr>
+        <w:shd w:val="clear" w:color="auto" w:fill="00002C"/>
+        <w:spacing w:line="285" w:lineRule="atLeast"/>
+        <w:rPr>
+          <w:rFonts w:ascii="Consolas" w:eastAsia="Times New Roman" w:hAnsi="Consolas" w:cs="Times New Roman"/>
+          <w:color w:val="FFFFFF"/>
+          <w:sz w:val="21"/>
+          <w:szCs w:val="21"/>
+        </w:rPr>
+      </w:pPr>
+      <w:r>
+        <w:rPr>
+          <w:rFonts w:ascii="Consolas" w:eastAsia="Times New Roman" w:hAnsi="Consolas" w:cs="Times New Roman"/>
+          <w:color w:val="FFFFFF"/>
+          <w:sz w:val="21"/>
+          <w:szCs w:val="21"/>
+        </w:rPr>
+        <w:t>        #</w:t>
+      </w:r>
+      <w:proofErr w:type="gramStart"/>
+      <w:r>
+        <w:rPr>
+          <w:rFonts w:ascii="Consolas" w:eastAsia="Times New Roman" w:hAnsi="Consolas" w:cs="Times New Roman"/>
+          <w:color w:val="00FFF2"/>
+          <w:sz w:val="21"/>
+          <w:szCs w:val="21"/>
+        </w:rPr>
+        <w:t>green</w:t>
+      </w:r>
+      <w:r>
+        <w:rPr>
+          <w:rFonts w:ascii="Consolas" w:eastAsia="Times New Roman" w:hAnsi="Consolas" w:cs="Times New Roman"/>
+          <w:color w:val="FFFFFF"/>
+          <w:sz w:val="21"/>
+          <w:szCs w:val="21"/>
+        </w:rPr>
+        <w:t>{</w:t>
+      </w:r>
+      <w:proofErr w:type="gramEnd"/>
+    </w:p>
+    <w:p>
+      <w:pPr>
+        <w:shd w:val="clear" w:color="auto" w:fill="00002C"/>
+        <w:spacing w:line="285" w:lineRule="atLeast"/>
+        <w:rPr>
+          <w:rFonts w:ascii="Consolas" w:eastAsia="Times New Roman" w:hAnsi="Consolas" w:cs="Times New Roman"/>
+          <w:color w:val="FFFFFF"/>
+          <w:sz w:val="21"/>
+          <w:szCs w:val="21"/>
+        </w:rPr>
+      </w:pPr>
+      <w:r>
+        <w:rPr>
+          <w:rFonts w:ascii="Consolas" w:eastAsia="Times New Roman" w:hAnsi="Consolas" w:cs="Times New Roman"/>
+          <w:color w:val="FFFFFF"/>
+          <w:sz w:val="21"/>
+          <w:szCs w:val="21"/>
+        </w:rPr>
+        <w:t xml:space="preserve">            </w:t>
+      </w:r>
+      <w:proofErr w:type="gramStart"/>
+      <w:r>
+        <w:rPr>
+          <w:rFonts w:ascii="Consolas" w:eastAsia="Times New Roman" w:hAnsi="Consolas" w:cs="Times New Roman"/>
+          <w:color w:val="FFFFFF"/>
+          <w:sz w:val="21"/>
+          <w:szCs w:val="21"/>
+        </w:rPr>
+        <w:t>background-color</w:t>
+      </w:r>
+      <w:proofErr w:type="gramEnd"/>
+      <w:r>
+        <w:rPr>
+          <w:rFonts w:ascii="Consolas" w:eastAsia="Times New Roman" w:hAnsi="Consolas" w:cs="Times New Roman"/>
+          <w:color w:val="FFFFFF"/>
+          <w:sz w:val="21"/>
+          <w:szCs w:val="21"/>
+        </w:rPr>
+        <w:t xml:space="preserve">: </w:t>
+      </w:r>
+      <w:r>
+        <w:rPr>
+          <w:rFonts w:ascii="Consolas" w:eastAsia="Times New Roman" w:hAnsi="Consolas" w:cs="Times New Roman"/>
+          <w:color w:val="FF7E34"/>
+          <w:sz w:val="21"/>
+          <w:szCs w:val="21"/>
+        </w:rPr>
+        <w:t>aqua</w:t>
+      </w:r>
+      <w:r>
+        <w:rPr>
+          <w:rFonts w:ascii="Consolas" w:eastAsia="Times New Roman" w:hAnsi="Consolas" w:cs="Times New Roman"/>
+          <w:color w:val="FFFFFF"/>
+          <w:sz w:val="21"/>
+          <w:szCs w:val="21"/>
+        </w:rPr>
+        <w:t>;</w:t>
+      </w:r>
+    </w:p>
+    <w:p>
+      <w:pPr>
+        <w:shd w:val="clear" w:color="auto" w:fill="00002C"/>
+        <w:spacing w:line="285" w:lineRule="atLeast"/>
+        <w:rPr>
+          <w:rFonts w:ascii="Consolas" w:eastAsia="Times New Roman" w:hAnsi="Consolas" w:cs="Times New Roman"/>
+          <w:color w:val="FFFFFF"/>
+          <w:sz w:val="21"/>
+          <w:szCs w:val="21"/>
+        </w:rPr>
+      </w:pPr>
+      <w:r>
+        <w:rPr>
+          <w:rFonts w:ascii="Consolas" w:eastAsia="Times New Roman" w:hAnsi="Consolas" w:cs="Times New Roman"/>
+          <w:color w:val="FFFFFF"/>
+          <w:sz w:val="21"/>
+          <w:szCs w:val="21"/>
+        </w:rPr>
+        <w:t>        }</w:t>
+      </w:r>
+    </w:p>
+    <w:p>
+      <w:pPr>
+        <w:shd w:val="clear" w:color="auto" w:fill="00002C"/>
+        <w:spacing w:line="285" w:lineRule="atLeast"/>
+        <w:rPr>
+          <w:rFonts w:ascii="Consolas" w:eastAsia="Times New Roman" w:hAnsi="Consolas" w:cs="Times New Roman"/>
+          <w:color w:val="FFFFFF"/>
+          <w:sz w:val="21"/>
+          <w:szCs w:val="21"/>
+        </w:rPr>
+      </w:pPr>
+      <w:r>
+        <w:rPr>
+          <w:rFonts w:ascii="Consolas" w:eastAsia="Times New Roman" w:hAnsi="Consolas" w:cs="Times New Roman"/>
+          <w:color w:val="FFFFFF"/>
+          <w:sz w:val="21"/>
+          <w:szCs w:val="21"/>
+        </w:rPr>
+        <w:t>    &lt;/</w:t>
+      </w:r>
+      <w:r>
+        <w:rPr>
+          <w:rFonts w:ascii="Consolas" w:eastAsia="Times New Roman" w:hAnsi="Consolas" w:cs="Times New Roman"/>
+          <w:color w:val="FF0077"/>
+          <w:sz w:val="21"/>
+          <w:szCs w:val="21"/>
+        </w:rPr>
+        <w:t>style</w:t>
+      </w:r>
+      <w:r>
+        <w:rPr>
+          <w:rFonts w:ascii="Consolas" w:eastAsia="Times New Roman" w:hAnsi="Consolas" w:cs="Times New Roman"/>
+          <w:color w:val="FFFFFF"/>
+          <w:sz w:val="21"/>
+          <w:szCs w:val="21"/>
+        </w:rPr>
+        <w:t>&gt;</w:t>
+      </w:r>
+    </w:p>
+    <w:p>
+      <w:pPr>
+        <w:shd w:val="clear" w:color="auto" w:fill="00002C"/>
+        <w:spacing w:line="285" w:lineRule="atLeast"/>
+        <w:rPr>
+          <w:rFonts w:ascii="Consolas" w:eastAsia="Times New Roman" w:hAnsi="Consolas" w:cs="Times New Roman"/>
+          <w:color w:val="FFFFFF"/>
+          <w:sz w:val="21"/>
+          <w:szCs w:val="21"/>
+        </w:rPr>
+      </w:pPr>
+      <w:r>
+        <w:rPr>
+          <w:rFonts w:ascii="Consolas" w:eastAsia="Times New Roman" w:hAnsi="Consolas" w:cs="Times New Roman"/>
+          <w:color w:val="FFFFFF"/>
+          <w:sz w:val="21"/>
+          <w:szCs w:val="21"/>
+        </w:rPr>
+        <w:t>&lt;/</w:t>
+      </w:r>
+      <w:r>
+        <w:rPr>
+          <w:rFonts w:ascii="Consolas" w:eastAsia="Times New Roman" w:hAnsi="Consolas" w:cs="Times New Roman"/>
+          <w:color w:val="FF0077"/>
+          <w:sz w:val="21"/>
+          <w:szCs w:val="21"/>
+        </w:rPr>
+        <w:t>head</w:t>
+      </w:r>
+      <w:r>
+        <w:rPr>
+          <w:rFonts w:ascii="Consolas" w:eastAsia="Times New Roman" w:hAnsi="Consolas" w:cs="Times New Roman"/>
+          <w:color w:val="FFFFFF"/>
+          <w:sz w:val="21"/>
+          <w:szCs w:val="21"/>
+        </w:rPr>
+        <w:t>&gt;</w:t>
+      </w:r>
+    </w:p>
+    <w:p>
+      <w:pPr>
+        <w:shd w:val="clear" w:color="auto" w:fill="00002C"/>
+        <w:spacing w:line="285" w:lineRule="atLeast"/>
+        <w:rPr>
+          <w:rFonts w:ascii="Consolas" w:eastAsia="Times New Roman" w:hAnsi="Consolas" w:cs="Times New Roman"/>
+          <w:color w:val="FFFFFF"/>
+          <w:sz w:val="21"/>
+          <w:szCs w:val="21"/>
+        </w:rPr>
+      </w:pPr>
+      <w:r>
+        <w:rPr>
+          <w:rFonts w:ascii="Consolas" w:eastAsia="Times New Roman" w:hAnsi="Consolas" w:cs="Times New Roman"/>
+          <w:color w:val="FFFFFF"/>
+          <w:sz w:val="21"/>
+          <w:szCs w:val="21"/>
+        </w:rPr>
+        <w:t>&lt;</w:t>
+      </w:r>
+      <w:proofErr w:type="gramStart"/>
+      <w:r>
+        <w:rPr>
+          <w:rFonts w:ascii="Consolas" w:eastAsia="Times New Roman" w:hAnsi="Consolas" w:cs="Times New Roman"/>
+          <w:color w:val="FF0077"/>
+          <w:sz w:val="21"/>
+          <w:szCs w:val="21"/>
+        </w:rPr>
+        <w:t>body</w:t>
+      </w:r>
+      <w:proofErr w:type="gramEnd"/>
+      <w:r>
+        <w:rPr>
+          <w:rFonts w:ascii="Consolas" w:eastAsia="Times New Roman" w:hAnsi="Consolas" w:cs="Times New Roman"/>
+          <w:color w:val="FFFFFF"/>
+          <w:sz w:val="21"/>
+          <w:szCs w:val="21"/>
+        </w:rPr>
+        <w:t>&gt;</w:t>
+      </w:r>
+    </w:p>
+    <w:p>
+      <w:pPr>
+        <w:shd w:val="clear" w:color="auto" w:fill="00002C"/>
+        <w:spacing w:line="285" w:lineRule="atLeast"/>
+        <w:rPr>
+          <w:rFonts w:ascii="Consolas" w:eastAsia="Times New Roman" w:hAnsi="Consolas" w:cs="Times New Roman"/>
+          <w:color w:val="FFFFFF"/>
+          <w:sz w:val="21"/>
+          <w:szCs w:val="21"/>
+        </w:rPr>
+      </w:pPr>
+      <w:r>
+        <w:rPr>
+          <w:rFonts w:ascii="Consolas" w:eastAsia="Times New Roman" w:hAnsi="Consolas" w:cs="Times New Roman"/>
+          <w:color w:val="FFFFFF"/>
+          <w:sz w:val="21"/>
+          <w:szCs w:val="21"/>
+        </w:rPr>
+        <w:t>    &lt;</w:t>
+      </w:r>
+      <w:r>
+        <w:rPr>
+          <w:rFonts w:ascii="Consolas" w:eastAsia="Times New Roman" w:hAnsi="Consolas" w:cs="Times New Roman"/>
+          <w:color w:val="FF0077"/>
+          <w:sz w:val="21"/>
+          <w:szCs w:val="21"/>
+        </w:rPr>
+        <w:t>div</w:t>
+      </w:r>
+      <w:r>
+        <w:rPr>
+          <w:rFonts w:ascii="Consolas" w:eastAsia="Times New Roman" w:hAnsi="Consolas" w:cs="Times New Roman"/>
+          <w:color w:val="FFFFFF"/>
+          <w:sz w:val="21"/>
+          <w:szCs w:val="21"/>
+        </w:rPr>
+        <w:t xml:space="preserve"> </w:t>
+      </w:r>
+      <w:r>
+        <w:rPr>
+          <w:rFonts w:ascii="Consolas" w:eastAsia="Times New Roman" w:hAnsi="Consolas" w:cs="Times New Roman"/>
+          <w:color w:val="00FFF2"/>
+          <w:sz w:val="21"/>
+          <w:szCs w:val="21"/>
+        </w:rPr>
+        <w:t>class</w:t>
+      </w:r>
+      <w:r>
+        <w:rPr>
+          <w:rFonts w:ascii="Consolas" w:eastAsia="Times New Roman" w:hAnsi="Consolas" w:cs="Times New Roman"/>
+          <w:color w:val="FFFFFF"/>
+          <w:sz w:val="21"/>
+          <w:szCs w:val="21"/>
+        </w:rPr>
+        <w:t xml:space="preserve"> = "</w:t>
+      </w:r>
+      <w:r>
+        <w:rPr>
+          <w:rFonts w:ascii="Consolas" w:eastAsia="Times New Roman" w:hAnsi="Consolas" w:cs="Times New Roman"/>
+          <w:color w:val="EEFF00"/>
+          <w:sz w:val="21"/>
+          <w:szCs w:val="21"/>
+        </w:rPr>
+        <w:t>red</w:t>
+      </w:r>
+      <w:r>
+        <w:rPr>
+          <w:rFonts w:ascii="Consolas" w:eastAsia="Times New Roman" w:hAnsi="Consolas" w:cs="Times New Roman"/>
+          <w:color w:val="FFFFFF"/>
+          <w:sz w:val="21"/>
+          <w:szCs w:val="21"/>
+        </w:rPr>
+        <w:t>"&gt;</w:t>
+      </w:r>
+    </w:p>
+    <w:p>
+      <w:pPr>
+        <w:shd w:val="clear" w:color="auto" w:fill="00002C"/>
+        <w:spacing w:line="285" w:lineRule="atLeast"/>
+        <w:rPr>
+          <w:rFonts w:ascii="Consolas" w:eastAsia="Times New Roman" w:hAnsi="Consolas" w:cs="Times New Roman"/>
+          <w:color w:val="FFFFFF"/>
+          <w:sz w:val="21"/>
+          <w:szCs w:val="21"/>
+        </w:rPr>
+      </w:pPr>
+      <w:r>
+        <w:rPr>
+          <w:rFonts w:ascii="Consolas" w:eastAsia="Times New Roman" w:hAnsi="Consolas" w:cs="Times New Roman"/>
+          <w:color w:val="FFFFFF"/>
+          <w:sz w:val="21"/>
+          <w:szCs w:val="21"/>
+        </w:rPr>
+        <w:t>    I am a div &lt;/</w:t>
+      </w:r>
+      <w:r>
+        <w:rPr>
+          <w:rFonts w:ascii="Consolas" w:eastAsia="Times New Roman" w:hAnsi="Consolas" w:cs="Times New Roman"/>
+          <w:color w:val="FF0077"/>
+          <w:sz w:val="21"/>
+          <w:szCs w:val="21"/>
+        </w:rPr>
+        <w:t>div</w:t>
+      </w:r>
+      <w:r>
+        <w:rPr>
+          <w:rFonts w:ascii="Consolas" w:eastAsia="Times New Roman" w:hAnsi="Consolas" w:cs="Times New Roman"/>
+          <w:color w:val="FFFFFF"/>
+          <w:sz w:val="21"/>
+          <w:szCs w:val="21"/>
+        </w:rPr>
+        <w:t>&gt;</w:t>
+      </w:r>
+    </w:p>
+    <w:p>
+      <w:pPr>
+        <w:shd w:val="clear" w:color="auto" w:fill="00002C"/>
+        <w:spacing w:line="285" w:lineRule="atLeast"/>
+        <w:rPr>
+          <w:rFonts w:ascii="Consolas" w:eastAsia="Times New Roman" w:hAnsi="Consolas" w:cs="Times New Roman"/>
+          <w:color w:val="FFFFFF"/>
+          <w:sz w:val="21"/>
+          <w:szCs w:val="21"/>
+        </w:rPr>
+      </w:pPr>
+      <w:r>
+        <w:rPr>
+          <w:rFonts w:ascii="Consolas" w:eastAsia="Times New Roman" w:hAnsi="Consolas" w:cs="Times New Roman"/>
+          <w:color w:val="FFFFFF"/>
+          <w:sz w:val="21"/>
+          <w:szCs w:val="21"/>
+        </w:rPr>
+        <w:t>    &lt;</w:t>
+      </w:r>
+      <w:r>
+        <w:rPr>
+          <w:rFonts w:ascii="Consolas" w:eastAsia="Times New Roman" w:hAnsi="Consolas" w:cs="Times New Roman"/>
+          <w:color w:val="FF0077"/>
+          <w:sz w:val="21"/>
+          <w:szCs w:val="21"/>
+        </w:rPr>
+        <w:t>div</w:t>
+      </w:r>
+      <w:r>
+        <w:rPr>
+          <w:rFonts w:ascii="Consolas" w:eastAsia="Times New Roman" w:hAnsi="Consolas" w:cs="Times New Roman"/>
+          <w:color w:val="FFFFFF"/>
+          <w:sz w:val="21"/>
+          <w:szCs w:val="21"/>
+        </w:rPr>
+        <w:t xml:space="preserve"> </w:t>
+      </w:r>
+      <w:r>
+        <w:rPr>
+          <w:rFonts w:ascii="Consolas" w:eastAsia="Times New Roman" w:hAnsi="Consolas" w:cs="Times New Roman"/>
+          <w:color w:val="00FFF2"/>
+          <w:sz w:val="21"/>
+          <w:szCs w:val="21"/>
+        </w:rPr>
+        <w:t>id</w:t>
+      </w:r>
+      <w:r>
+        <w:rPr>
+          <w:rFonts w:ascii="Consolas" w:eastAsia="Times New Roman" w:hAnsi="Consolas" w:cs="Times New Roman"/>
+          <w:color w:val="FFFFFF"/>
+          <w:sz w:val="21"/>
+          <w:szCs w:val="21"/>
+        </w:rPr>
+        <w:t xml:space="preserve"> ="</w:t>
+      </w:r>
+      <w:r>
+        <w:rPr>
+          <w:rFonts w:ascii="Consolas" w:eastAsia="Times New Roman" w:hAnsi="Consolas" w:cs="Times New Roman"/>
+          <w:color w:val="EEFF00"/>
+          <w:sz w:val="21"/>
+          <w:szCs w:val="21"/>
+        </w:rPr>
+        <w:t>green</w:t>
+      </w:r>
+      <w:r>
+        <w:rPr>
+          <w:rFonts w:ascii="Consolas" w:eastAsia="Times New Roman" w:hAnsi="Consolas" w:cs="Times New Roman"/>
+          <w:color w:val="FFFFFF"/>
+          <w:sz w:val="21"/>
+          <w:szCs w:val="21"/>
+        </w:rPr>
+        <w:t xml:space="preserve">"&gt; </w:t>
+      </w:r>
+      <w:proofErr w:type="spellStart"/>
+      <w:r>
+        <w:rPr>
+          <w:rFonts w:ascii="Consolas" w:eastAsia="Times New Roman" w:hAnsi="Consolas" w:cs="Times New Roman"/>
+          <w:color w:val="FFFFFF"/>
+          <w:sz w:val="21"/>
+          <w:szCs w:val="21"/>
+        </w:rPr>
+        <w:t>im</w:t>
+      </w:r>
+      <w:proofErr w:type="spellEnd"/>
+      <w:r>
+        <w:rPr>
+          <w:rFonts w:ascii="Consolas" w:eastAsia="Times New Roman" w:hAnsi="Consolas" w:cs="Times New Roman"/>
+          <w:color w:val="FFFFFF"/>
+          <w:sz w:val="21"/>
+          <w:szCs w:val="21"/>
+        </w:rPr>
+        <w:t xml:space="preserve"> not a div&lt;/</w:t>
+      </w:r>
+      <w:r>
+        <w:rPr>
+          <w:rFonts w:ascii="Consolas" w:eastAsia="Times New Roman" w:hAnsi="Consolas" w:cs="Times New Roman"/>
+          <w:color w:val="FF0077"/>
+          <w:sz w:val="21"/>
+          <w:szCs w:val="21"/>
+        </w:rPr>
+        <w:t>div</w:t>
+      </w:r>
+      <w:r>
+        <w:rPr>
+          <w:rFonts w:ascii="Consolas" w:eastAsia="Times New Roman" w:hAnsi="Consolas" w:cs="Times New Roman"/>
+          <w:color w:val="FFFFFF"/>
+          <w:sz w:val="21"/>
+          <w:szCs w:val="21"/>
+        </w:rPr>
+        <w:t>&gt;</w:t>
+      </w:r>
+    </w:p>
+    <w:p>
+      <w:pPr>
+        <w:pStyle w:val="NoSpacing"/>
+      </w:pPr>
+      <w:r>
+        <w:t xml:space="preserve">Here in the last give the id green to the second div and above by using the </w:t>
+      </w:r>
+      <w:proofErr w:type="spellStart"/>
+      <w:r>
+        <w:t>css</w:t>
+      </w:r>
+      <w:proofErr w:type="spellEnd"/>
+      <w:r>
+        <w:t xml:space="preserve"> we call it by #green so its background goes green.</w:t>
+      </w:r>
+    </w:p>
+    <w:p>
+      <w:pPr>
+        <w:shd w:val="clear" w:color="auto" w:fill="00002C"/>
+        <w:spacing w:line="285" w:lineRule="atLeast"/>
+        <w:rPr>
+          <w:rFonts w:ascii="Consolas" w:eastAsia="Times New Roman" w:hAnsi="Consolas" w:cs="Times New Roman"/>
+          <w:color w:val="FFFFFF"/>
+          <w:sz w:val="21"/>
+          <w:szCs w:val="21"/>
+        </w:rPr>
+      </w:pPr>
+      <w:r>
+        <w:rPr>
+          <w:rFonts w:ascii="Consolas" w:eastAsia="Times New Roman" w:hAnsi="Consolas" w:cs="Times New Roman"/>
+          <w:i/>
+          <w:iCs/>
+          <w:color w:val="838383"/>
+          <w:sz w:val="21"/>
+          <w:szCs w:val="21"/>
+        </w:rPr>
+        <w:lastRenderedPageBreak/>
+        <w:t> </w:t>
+      </w:r>
+      <w:proofErr w:type="gramStart"/>
+      <w:r>
+        <w:rPr>
+          <w:rFonts w:ascii="Consolas" w:eastAsia="Times New Roman" w:hAnsi="Consolas" w:cs="Times New Roman"/>
+          <w:i/>
+          <w:iCs/>
+          <w:color w:val="838383"/>
+          <w:sz w:val="21"/>
+          <w:szCs w:val="21"/>
+        </w:rPr>
+        <w:t>child</w:t>
+      </w:r>
+      <w:proofErr w:type="gramEnd"/>
+      <w:r>
+        <w:rPr>
+          <w:rFonts w:ascii="Consolas" w:eastAsia="Times New Roman" w:hAnsi="Consolas" w:cs="Times New Roman"/>
+          <w:i/>
+          <w:iCs/>
+          <w:color w:val="838383"/>
+          <w:sz w:val="21"/>
+          <w:szCs w:val="21"/>
+        </w:rPr>
+        <w:t xml:space="preserve"> </w:t>
+      </w:r>
+      <w:proofErr w:type="spellStart"/>
+      <w:r>
+        <w:rPr>
+          <w:rFonts w:ascii="Consolas" w:eastAsia="Times New Roman" w:hAnsi="Consolas" w:cs="Times New Roman"/>
+          <w:i/>
+          <w:iCs/>
+          <w:color w:val="838383"/>
+          <w:sz w:val="21"/>
+          <w:szCs w:val="21"/>
+        </w:rPr>
+        <w:t>selecter</w:t>
+      </w:r>
+      <w:proofErr w:type="spellEnd"/>
+      <w:r>
+        <w:rPr>
+          <w:rFonts w:ascii="Consolas" w:eastAsia="Times New Roman" w:hAnsi="Consolas" w:cs="Times New Roman"/>
+          <w:i/>
+          <w:iCs/>
+          <w:color w:val="838383"/>
+          <w:sz w:val="21"/>
+          <w:szCs w:val="21"/>
+        </w:rPr>
+        <w:t>*/</w:t>
+      </w:r>
+    </w:p>
+    <w:p>
+      <w:pPr>
+        <w:shd w:val="clear" w:color="auto" w:fill="00002C"/>
+        <w:spacing w:line="285" w:lineRule="atLeast"/>
+        <w:rPr>
+          <w:rFonts w:ascii="Consolas" w:eastAsia="Times New Roman" w:hAnsi="Consolas" w:cs="Times New Roman"/>
+          <w:color w:val="FFFFFF"/>
+          <w:sz w:val="21"/>
+          <w:szCs w:val="21"/>
+        </w:rPr>
+      </w:pPr>
+      <w:r>
+        <w:rPr>
+          <w:rFonts w:ascii="Consolas" w:eastAsia="Times New Roman" w:hAnsi="Consolas" w:cs="Times New Roman"/>
+          <w:color w:val="FFFFFF"/>
+          <w:sz w:val="21"/>
+          <w:szCs w:val="21"/>
+        </w:rPr>
+        <w:t xml:space="preserve">        </w:t>
+      </w:r>
+      <w:proofErr w:type="gramStart"/>
+      <w:r>
+        <w:rPr>
+          <w:rFonts w:ascii="Consolas" w:eastAsia="Times New Roman" w:hAnsi="Consolas" w:cs="Times New Roman"/>
+          <w:color w:val="FF0077"/>
+          <w:sz w:val="21"/>
+          <w:szCs w:val="21"/>
+        </w:rPr>
+        <w:t>div</w:t>
+      </w:r>
+      <w:r>
+        <w:rPr>
+          <w:rFonts w:ascii="Consolas" w:eastAsia="Times New Roman" w:hAnsi="Consolas" w:cs="Times New Roman"/>
+          <w:color w:val="FF0062"/>
+          <w:sz w:val="21"/>
+          <w:szCs w:val="21"/>
+        </w:rPr>
+        <w:t>&gt;</w:t>
+      </w:r>
+      <w:proofErr w:type="gramEnd"/>
+      <w:r>
+        <w:rPr>
+          <w:rFonts w:ascii="Consolas" w:eastAsia="Times New Roman" w:hAnsi="Consolas" w:cs="Times New Roman"/>
+          <w:color w:val="FF0077"/>
+          <w:sz w:val="21"/>
+          <w:szCs w:val="21"/>
+        </w:rPr>
+        <w:t>p</w:t>
+      </w:r>
+      <w:r>
+        <w:rPr>
+          <w:rFonts w:ascii="Consolas" w:eastAsia="Times New Roman" w:hAnsi="Consolas" w:cs="Times New Roman"/>
+          <w:color w:val="FFFFFF"/>
+          <w:sz w:val="21"/>
+          <w:szCs w:val="21"/>
+        </w:rPr>
+        <w:t xml:space="preserve"> {</w:t>
+      </w:r>
+    </w:p>
+    <w:p>
+      <w:pPr>
+        <w:shd w:val="clear" w:color="auto" w:fill="00002C"/>
+        <w:spacing w:line="285" w:lineRule="atLeast"/>
+        <w:rPr>
+          <w:rFonts w:ascii="Consolas" w:eastAsia="Times New Roman" w:hAnsi="Consolas" w:cs="Times New Roman"/>
+          <w:color w:val="FFFFFF"/>
+          <w:sz w:val="21"/>
+          <w:szCs w:val="21"/>
+        </w:rPr>
+      </w:pPr>
+      <w:r>
+        <w:rPr>
+          <w:rFonts w:ascii="Consolas" w:eastAsia="Times New Roman" w:hAnsi="Consolas" w:cs="Times New Roman"/>
+          <w:color w:val="FFFFFF"/>
+          <w:sz w:val="21"/>
+          <w:szCs w:val="21"/>
+        </w:rPr>
+        <w:t xml:space="preserve">            </w:t>
+      </w:r>
+      <w:proofErr w:type="gramStart"/>
+      <w:r>
+        <w:rPr>
+          <w:rFonts w:ascii="Consolas" w:eastAsia="Times New Roman" w:hAnsi="Consolas" w:cs="Times New Roman"/>
+          <w:color w:val="FFFFFF"/>
+          <w:sz w:val="21"/>
+          <w:szCs w:val="21"/>
+        </w:rPr>
+        <w:t>background-color</w:t>
+      </w:r>
+      <w:proofErr w:type="gramEnd"/>
+      <w:r>
+        <w:rPr>
+          <w:rFonts w:ascii="Consolas" w:eastAsia="Times New Roman" w:hAnsi="Consolas" w:cs="Times New Roman"/>
+          <w:color w:val="FFFFFF"/>
+          <w:sz w:val="21"/>
+          <w:szCs w:val="21"/>
+        </w:rPr>
+        <w:t xml:space="preserve">: </w:t>
+      </w:r>
+      <w:r>
+        <w:rPr>
+          <w:rFonts w:ascii="Consolas" w:eastAsia="Times New Roman" w:hAnsi="Consolas" w:cs="Times New Roman"/>
+          <w:color w:val="FF7E34"/>
+          <w:sz w:val="21"/>
+          <w:szCs w:val="21"/>
+        </w:rPr>
+        <w:t>fuchsia</w:t>
+      </w:r>
+      <w:r>
+        <w:rPr>
+          <w:rFonts w:ascii="Consolas" w:eastAsia="Times New Roman" w:hAnsi="Consolas" w:cs="Times New Roman"/>
+          <w:color w:val="FFFFFF"/>
+          <w:sz w:val="21"/>
+          <w:szCs w:val="21"/>
+        </w:rPr>
+        <w:t>;</w:t>
+      </w:r>
+    </w:p>
+    <w:p>
+      <w:pPr>
+        <w:shd w:val="clear" w:color="auto" w:fill="00002C"/>
+        <w:spacing w:line="285" w:lineRule="atLeast"/>
+        <w:rPr>
+          <w:rFonts w:ascii="Consolas" w:eastAsia="Times New Roman" w:hAnsi="Consolas" w:cs="Times New Roman"/>
+          <w:color w:val="FFFFFF"/>
+          <w:sz w:val="21"/>
+          <w:szCs w:val="21"/>
+        </w:rPr>
+      </w:pPr>
+      <w:r>
+        <w:rPr>
+          <w:rFonts w:ascii="Consolas" w:eastAsia="Times New Roman" w:hAnsi="Consolas" w:cs="Times New Roman"/>
+          <w:color w:val="FFFFFF"/>
+          <w:sz w:val="21"/>
+          <w:szCs w:val="21"/>
+        </w:rPr>
+        <w:t xml:space="preserve">            </w:t>
+      </w:r>
+      <w:proofErr w:type="gramStart"/>
+      <w:r>
+        <w:rPr>
+          <w:rFonts w:ascii="Consolas" w:eastAsia="Times New Roman" w:hAnsi="Consolas" w:cs="Times New Roman"/>
+          <w:color w:val="FFFFFF"/>
+          <w:sz w:val="21"/>
+          <w:szCs w:val="21"/>
+        </w:rPr>
+        <w:t>color</w:t>
+      </w:r>
+      <w:proofErr w:type="gramEnd"/>
+      <w:r>
+        <w:rPr>
+          <w:rFonts w:ascii="Consolas" w:eastAsia="Times New Roman" w:hAnsi="Consolas" w:cs="Times New Roman"/>
+          <w:color w:val="FFFFFF"/>
+          <w:sz w:val="21"/>
+          <w:szCs w:val="21"/>
+        </w:rPr>
+        <w:t xml:space="preserve">: </w:t>
+      </w:r>
+      <w:r>
+        <w:rPr>
+          <w:rFonts w:ascii="Consolas" w:eastAsia="Times New Roman" w:hAnsi="Consolas" w:cs="Times New Roman"/>
+          <w:color w:val="FF7E34"/>
+          <w:sz w:val="21"/>
+          <w:szCs w:val="21"/>
+        </w:rPr>
+        <w:t>blue</w:t>
+      </w:r>
+      <w:r>
+        <w:rPr>
+          <w:rFonts w:ascii="Consolas" w:eastAsia="Times New Roman" w:hAnsi="Consolas" w:cs="Times New Roman"/>
+          <w:color w:val="FFFFFF"/>
+          <w:sz w:val="21"/>
+          <w:szCs w:val="21"/>
+        </w:rPr>
+        <w:t>;</w:t>
+      </w:r>
+    </w:p>
+    <w:p>
+      <w:pPr>
+        <w:shd w:val="clear" w:color="auto" w:fill="00002C"/>
+        <w:spacing w:line="285" w:lineRule="atLeast"/>
+        <w:rPr>
+          <w:rFonts w:ascii="Consolas" w:eastAsia="Times New Roman" w:hAnsi="Consolas" w:cs="Times New Roman"/>
+          <w:color w:val="FFFFFF"/>
+          <w:sz w:val="21"/>
+          <w:szCs w:val="21"/>
+        </w:rPr>
+      </w:pPr>
+      <w:r>
+        <w:rPr>
+          <w:rFonts w:ascii="Consolas" w:eastAsia="Times New Roman" w:hAnsi="Consolas" w:cs="Times New Roman"/>
+          <w:color w:val="FFFFFF"/>
+          <w:sz w:val="21"/>
+          <w:szCs w:val="21"/>
+        </w:rPr>
+        <w:t>        }</w:t>
+      </w:r>
+    </w:p>
+    <w:p>
+      <w:pPr>
+        <w:pStyle w:val="NoSpacing"/>
+      </w:pPr>
+      <w:r>
+        <w:t xml:space="preserve">This is the child </w:t>
+      </w:r>
+      <w:proofErr w:type="spellStart"/>
+      <w:r>
+        <w:t>selecte</w:t>
+      </w:r>
+      <w:proofErr w:type="spellEnd"/>
+      <w:r>
+        <w:t xml:space="preserve"> used for the paragraph inside the </w:t>
+      </w:r>
+      <w:proofErr w:type="gramStart"/>
+      <w:r>
+        <w:t>div .</w:t>
+      </w:r>
+      <w:proofErr w:type="gramEnd"/>
+      <w:r>
+        <w:t xml:space="preserve"> </w:t>
+      </w:r>
+      <w:proofErr w:type="gramStart"/>
+      <w:r>
+        <w:t>means</w:t>
+      </w:r>
+      <w:proofErr w:type="gramEnd"/>
+      <w:r>
+        <w:t xml:space="preserve"> if we want to give the another color to the paragraph inside the div so we use this selector. </w:t>
+      </w:r>
+      <w:proofErr w:type="spellStart"/>
+      <w:r>
+        <w:t>Other wise</w:t>
+      </w:r>
+      <w:proofErr w:type="spellEnd"/>
+      <w:r>
+        <w:t xml:space="preserve"> the thing inside the div have the same color and background that we provide.</w:t>
+      </w:r>
+    </w:p>
+    <w:p>
+      <w:pPr>
+        <w:shd w:val="clear" w:color="auto" w:fill="00002C"/>
+        <w:spacing w:line="285" w:lineRule="atLeast"/>
+        <w:rPr>
+          <w:rFonts w:ascii="Consolas" w:eastAsia="Times New Roman" w:hAnsi="Consolas" w:cs="Times New Roman"/>
+          <w:color w:val="FFFFFF"/>
+          <w:sz w:val="21"/>
+          <w:szCs w:val="21"/>
+        </w:rPr>
+      </w:pPr>
+      <w:r>
+        <w:rPr>
+          <w:rFonts w:ascii="Consolas" w:eastAsia="Times New Roman" w:hAnsi="Consolas" w:cs="Times New Roman"/>
+          <w:color w:val="FFFFFF"/>
+          <w:sz w:val="21"/>
+          <w:szCs w:val="21"/>
+        </w:rPr>
+        <w:t> &lt;</w:t>
+      </w:r>
+      <w:r>
+        <w:rPr>
+          <w:rFonts w:ascii="Consolas" w:eastAsia="Times New Roman" w:hAnsi="Consolas" w:cs="Times New Roman"/>
+          <w:color w:val="FF0077"/>
+          <w:sz w:val="21"/>
+          <w:szCs w:val="21"/>
+        </w:rPr>
+        <w:t>div</w:t>
+      </w:r>
+      <w:r>
+        <w:rPr>
+          <w:rFonts w:ascii="Consolas" w:eastAsia="Times New Roman" w:hAnsi="Consolas" w:cs="Times New Roman"/>
+          <w:color w:val="FFFFFF"/>
+          <w:sz w:val="21"/>
+          <w:szCs w:val="21"/>
+        </w:rPr>
+        <w:t xml:space="preserve"> </w:t>
+      </w:r>
+      <w:r>
+        <w:rPr>
+          <w:rFonts w:ascii="Consolas" w:eastAsia="Times New Roman" w:hAnsi="Consolas" w:cs="Times New Roman"/>
+          <w:color w:val="00FFF2"/>
+          <w:sz w:val="21"/>
+          <w:szCs w:val="21"/>
+        </w:rPr>
+        <w:t>class</w:t>
+      </w:r>
+      <w:r>
+        <w:rPr>
+          <w:rFonts w:ascii="Consolas" w:eastAsia="Times New Roman" w:hAnsi="Consolas" w:cs="Times New Roman"/>
+          <w:color w:val="FFFFFF"/>
+          <w:sz w:val="21"/>
+          <w:szCs w:val="21"/>
+        </w:rPr>
+        <w:t>="</w:t>
+      </w:r>
+      <w:r>
+        <w:rPr>
+          <w:rFonts w:ascii="Consolas" w:eastAsia="Times New Roman" w:hAnsi="Consolas" w:cs="Times New Roman"/>
+          <w:color w:val="EEFF00"/>
+          <w:sz w:val="21"/>
+          <w:szCs w:val="21"/>
+        </w:rPr>
+        <w:t>red</w:t>
+      </w:r>
+      <w:r>
+        <w:rPr>
+          <w:rFonts w:ascii="Consolas" w:eastAsia="Times New Roman" w:hAnsi="Consolas" w:cs="Times New Roman"/>
+          <w:color w:val="FFFFFF"/>
+          <w:sz w:val="21"/>
+          <w:szCs w:val="21"/>
+        </w:rPr>
+        <w:t>"&gt;</w:t>
+      </w:r>
+    </w:p>
+    <w:p>
+      <w:pPr>
+        <w:shd w:val="clear" w:color="auto" w:fill="00002C"/>
+        <w:spacing w:line="285" w:lineRule="atLeast"/>
+        <w:rPr>
+          <w:rFonts w:ascii="Consolas" w:eastAsia="Times New Roman" w:hAnsi="Consolas" w:cs="Times New Roman"/>
+          <w:color w:val="FFFFFF"/>
+          <w:sz w:val="21"/>
+          <w:szCs w:val="21"/>
+        </w:rPr>
+      </w:pPr>
+      <w:r>
+        <w:rPr>
+          <w:rFonts w:ascii="Consolas" w:eastAsia="Times New Roman" w:hAnsi="Consolas" w:cs="Times New Roman"/>
+          <w:color w:val="FFFFFF"/>
+          <w:sz w:val="21"/>
+          <w:szCs w:val="21"/>
+        </w:rPr>
+        <w:t>        I am a div</w:t>
+      </w:r>
+    </w:p>
+    <w:p>
+      <w:pPr>
+        <w:shd w:val="clear" w:color="auto" w:fill="00002C"/>
+        <w:spacing w:line="285" w:lineRule="atLeast"/>
+        <w:rPr>
+          <w:rFonts w:ascii="Consolas" w:eastAsia="Times New Roman" w:hAnsi="Consolas" w:cs="Times New Roman"/>
+          <w:color w:val="FFFFFF"/>
+          <w:sz w:val="21"/>
+          <w:szCs w:val="21"/>
+        </w:rPr>
+      </w:pPr>
+      <w:r>
+        <w:rPr>
+          <w:rFonts w:ascii="Consolas" w:eastAsia="Times New Roman" w:hAnsi="Consolas" w:cs="Times New Roman"/>
+          <w:color w:val="FFFFFF"/>
+          <w:sz w:val="21"/>
+          <w:szCs w:val="21"/>
+        </w:rPr>
+        <w:t>        &lt;</w:t>
+      </w:r>
+      <w:r>
+        <w:rPr>
+          <w:rFonts w:ascii="Consolas" w:eastAsia="Times New Roman" w:hAnsi="Consolas" w:cs="Times New Roman"/>
+          <w:color w:val="FF0077"/>
+          <w:sz w:val="21"/>
+          <w:szCs w:val="21"/>
+        </w:rPr>
+        <w:t>p</w:t>
+      </w:r>
+      <w:r>
+        <w:rPr>
+          <w:rFonts w:ascii="Consolas" w:eastAsia="Times New Roman" w:hAnsi="Consolas" w:cs="Times New Roman"/>
+          <w:color w:val="FFFFFF"/>
+          <w:sz w:val="21"/>
+          <w:szCs w:val="21"/>
+        </w:rPr>
+        <w:t xml:space="preserve">&gt; </w:t>
+      </w:r>
+      <w:proofErr w:type="spellStart"/>
+      <w:r>
+        <w:rPr>
+          <w:rFonts w:ascii="Consolas" w:eastAsia="Times New Roman" w:hAnsi="Consolas" w:cs="Times New Roman"/>
+          <w:color w:val="FFFFFF"/>
+          <w:sz w:val="21"/>
+          <w:szCs w:val="21"/>
+        </w:rPr>
+        <w:t>im</w:t>
+      </w:r>
+      <w:proofErr w:type="spellEnd"/>
+      <w:r>
+        <w:rPr>
+          <w:rFonts w:ascii="Consolas" w:eastAsia="Times New Roman" w:hAnsi="Consolas" w:cs="Times New Roman"/>
+          <w:color w:val="FFFFFF"/>
+          <w:sz w:val="21"/>
+          <w:szCs w:val="21"/>
+        </w:rPr>
+        <w:t xml:space="preserve"> a paragraph inside the dib</w:t>
+      </w:r>
+    </w:p>
+    <w:p>
+      <w:pPr>
+        <w:shd w:val="clear" w:color="auto" w:fill="00002C"/>
+        <w:spacing w:line="285" w:lineRule="atLeast"/>
+        <w:rPr>
+          <w:rFonts w:ascii="Consolas" w:eastAsia="Times New Roman" w:hAnsi="Consolas" w:cs="Times New Roman"/>
+          <w:color w:val="FFFFFF"/>
+          <w:sz w:val="21"/>
+          <w:szCs w:val="21"/>
+        </w:rPr>
+      </w:pPr>
+    </w:p>
+    <w:p>
+      <w:pPr>
+        <w:shd w:val="clear" w:color="auto" w:fill="00002C"/>
+        <w:spacing w:line="285" w:lineRule="atLeast"/>
+        <w:rPr>
+          <w:rFonts w:ascii="Consolas" w:eastAsia="Times New Roman" w:hAnsi="Consolas" w:cs="Times New Roman"/>
+          <w:color w:val="FFFFFF"/>
+          <w:sz w:val="21"/>
+          <w:szCs w:val="21"/>
+        </w:rPr>
+      </w:pPr>
+      <w:r>
+        <w:rPr>
+          <w:rFonts w:ascii="Consolas" w:eastAsia="Times New Roman" w:hAnsi="Consolas" w:cs="Times New Roman"/>
+          <w:color w:val="FFFFFF"/>
+          <w:sz w:val="21"/>
+          <w:szCs w:val="21"/>
+        </w:rPr>
+        <w:t>        &lt;/</w:t>
+      </w:r>
+      <w:r>
+        <w:rPr>
+          <w:rFonts w:ascii="Consolas" w:eastAsia="Times New Roman" w:hAnsi="Consolas" w:cs="Times New Roman"/>
+          <w:color w:val="FF0077"/>
+          <w:sz w:val="21"/>
+          <w:szCs w:val="21"/>
+        </w:rPr>
+        <w:t>p</w:t>
+      </w:r>
+      <w:r>
+        <w:rPr>
+          <w:rFonts w:ascii="Consolas" w:eastAsia="Times New Roman" w:hAnsi="Consolas" w:cs="Times New Roman"/>
+          <w:color w:val="FFFFFF"/>
+          <w:sz w:val="21"/>
+          <w:szCs w:val="21"/>
+        </w:rPr>
+        <w:t>&gt;</w:t>
+      </w:r>
+    </w:p>
+    <w:p>
+      <w:pPr>
+        <w:shd w:val="clear" w:color="auto" w:fill="00002C"/>
+        <w:spacing w:line="285" w:lineRule="atLeast"/>
+        <w:rPr>
+          <w:rFonts w:ascii="Consolas" w:eastAsia="Times New Roman" w:hAnsi="Consolas" w:cs="Times New Roman"/>
+          <w:color w:val="FFFFFF"/>
+          <w:sz w:val="21"/>
+          <w:szCs w:val="21"/>
+        </w:rPr>
+      </w:pPr>
+      <w:r>
+        <w:rPr>
+          <w:rFonts w:ascii="Consolas" w:eastAsia="Times New Roman" w:hAnsi="Consolas" w:cs="Times New Roman"/>
+          <w:color w:val="FFFFFF"/>
+          <w:sz w:val="21"/>
+          <w:szCs w:val="21"/>
+        </w:rPr>
+        <w:t>    &lt;/</w:t>
+      </w:r>
+      <w:r>
+        <w:rPr>
+          <w:rFonts w:ascii="Consolas" w:eastAsia="Times New Roman" w:hAnsi="Consolas" w:cs="Times New Roman"/>
+          <w:color w:val="FF0077"/>
+          <w:sz w:val="21"/>
+          <w:szCs w:val="21"/>
+        </w:rPr>
+        <w:t>div</w:t>
+      </w:r>
+      <w:r>
+        <w:rPr>
+          <w:rFonts w:ascii="Consolas" w:eastAsia="Times New Roman" w:hAnsi="Consolas" w:cs="Times New Roman"/>
+          <w:color w:val="FFFFFF"/>
+          <w:sz w:val="21"/>
+          <w:szCs w:val="21"/>
+        </w:rPr>
+        <w:t>&gt;</w:t>
+      </w:r>
+    </w:p>
+    <w:p>
+      <w:pPr>
+        <w:pStyle w:val="NoSpacing"/>
+      </w:pPr>
+      <w:proofErr w:type="gramStart"/>
+      <w:r>
+        <w:t>See  above</w:t>
+      </w:r>
+      <w:proofErr w:type="gramEnd"/>
+      <w:r>
+        <w:t xml:space="preserve"> that the paragraph is inside the div.</w:t>
+      </w:r>
+    </w:p>
+    <w:p>
+      <w:pPr>
+        <w:pStyle w:val="NoSpacing"/>
+      </w:pPr>
+      <w:r>
+        <w:t xml:space="preserve">But one thing that I made clear is that we use the div &gt; p means that the P inside the div if insert the another tag as like div&gt; article&gt; span then if we add paragraph so it is not </w:t>
+      </w:r>
+      <w:proofErr w:type="gramStart"/>
+      <w:r>
+        <w:t>applicable .</w:t>
+      </w:r>
+      <w:proofErr w:type="gramEnd"/>
+      <w:r>
+        <w:t xml:space="preserve"> </w:t>
+      </w:r>
+      <w:proofErr w:type="gramStart"/>
+      <w:r>
+        <w:t>means</w:t>
+      </w:r>
+      <w:proofErr w:type="gramEnd"/>
+      <w:r>
+        <w:t xml:space="preserve"> that the color not changed of the paragraph. As like this.</w:t>
+      </w:r>
+    </w:p>
+    <w:p>
+      <w:pPr>
+        <w:pStyle w:val="NoSpacing"/>
+      </w:pPr>
+    </w:p>
+    <w:p>
+      <w:pPr>
+        <w:pStyle w:val="NoSpacing"/>
+      </w:pPr>
+    </w:p>
+    <w:p>
+      <w:pPr>
+        <w:shd w:val="clear" w:color="auto" w:fill="00002C"/>
+        <w:spacing w:line="285" w:lineRule="atLeast"/>
+        <w:rPr>
+          <w:rFonts w:ascii="Consolas" w:eastAsia="Times New Roman" w:hAnsi="Consolas" w:cs="Times New Roman"/>
+          <w:color w:val="FFFFFF"/>
+          <w:sz w:val="21"/>
+          <w:szCs w:val="21"/>
+        </w:rPr>
+      </w:pPr>
+      <w:r>
+        <w:rPr>
+          <w:rFonts w:ascii="Consolas" w:eastAsia="Times New Roman" w:hAnsi="Consolas" w:cs="Times New Roman"/>
+          <w:color w:val="FFFFFF"/>
+          <w:sz w:val="21"/>
+          <w:szCs w:val="21"/>
+        </w:rPr>
+        <w:t>&lt;</w:t>
+      </w:r>
+      <w:proofErr w:type="gramStart"/>
+      <w:r>
+        <w:rPr>
+          <w:rFonts w:ascii="Consolas" w:eastAsia="Times New Roman" w:hAnsi="Consolas" w:cs="Times New Roman"/>
+          <w:color w:val="FF0077"/>
+          <w:sz w:val="21"/>
+          <w:szCs w:val="21"/>
+        </w:rPr>
+        <w:t>div</w:t>
+      </w:r>
+      <w:proofErr w:type="gramEnd"/>
+      <w:r>
+        <w:rPr>
+          <w:rFonts w:ascii="Consolas" w:eastAsia="Times New Roman" w:hAnsi="Consolas" w:cs="Times New Roman"/>
+          <w:color w:val="FFFFFF"/>
+          <w:sz w:val="21"/>
+          <w:szCs w:val="21"/>
+        </w:rPr>
+        <w:t>&gt;</w:t>
+      </w:r>
+    </w:p>
+    <w:p>
+      <w:pPr>
+        <w:shd w:val="clear" w:color="auto" w:fill="00002C"/>
+        <w:spacing w:line="285" w:lineRule="atLeast"/>
+        <w:rPr>
+          <w:rFonts w:ascii="Consolas" w:eastAsia="Times New Roman" w:hAnsi="Consolas" w:cs="Times New Roman"/>
+          <w:color w:val="FFFFFF"/>
+          <w:sz w:val="21"/>
+          <w:szCs w:val="21"/>
+        </w:rPr>
+      </w:pPr>
+      <w:r>
+        <w:rPr>
+          <w:rFonts w:ascii="Consolas" w:eastAsia="Times New Roman" w:hAnsi="Consolas" w:cs="Times New Roman"/>
+          <w:color w:val="FFFFFF"/>
+          <w:sz w:val="21"/>
+          <w:szCs w:val="21"/>
+        </w:rPr>
+        <w:t>        &lt;</w:t>
+      </w:r>
+      <w:proofErr w:type="gramStart"/>
+      <w:r>
+        <w:rPr>
+          <w:rFonts w:ascii="Consolas" w:eastAsia="Times New Roman" w:hAnsi="Consolas" w:cs="Times New Roman"/>
+          <w:color w:val="FF0077"/>
+          <w:sz w:val="21"/>
+          <w:szCs w:val="21"/>
+        </w:rPr>
+        <w:t>span</w:t>
+      </w:r>
+      <w:proofErr w:type="gramEnd"/>
+      <w:r>
+        <w:rPr>
+          <w:rFonts w:ascii="Consolas" w:eastAsia="Times New Roman" w:hAnsi="Consolas" w:cs="Times New Roman"/>
+          <w:color w:val="FFFFFF"/>
+          <w:sz w:val="21"/>
+          <w:szCs w:val="21"/>
+        </w:rPr>
+        <w:t>&gt;</w:t>
+      </w:r>
+    </w:p>
+    <w:p>
+      <w:pPr>
+        <w:shd w:val="clear" w:color="auto" w:fill="00002C"/>
+        <w:spacing w:line="285" w:lineRule="atLeast"/>
+        <w:rPr>
+          <w:rFonts w:ascii="Consolas" w:eastAsia="Times New Roman" w:hAnsi="Consolas" w:cs="Times New Roman"/>
+          <w:color w:val="FFFFFF"/>
+          <w:sz w:val="21"/>
+          <w:szCs w:val="21"/>
+        </w:rPr>
+      </w:pPr>
+      <w:r>
+        <w:rPr>
+          <w:rFonts w:ascii="Consolas" w:eastAsia="Times New Roman" w:hAnsi="Consolas" w:cs="Times New Roman"/>
+          <w:color w:val="FFFFFF"/>
+          <w:sz w:val="21"/>
+          <w:szCs w:val="21"/>
+        </w:rPr>
+        <w:t>            &lt;</w:t>
+      </w:r>
+      <w:proofErr w:type="gramStart"/>
+      <w:r>
+        <w:rPr>
+          <w:rFonts w:ascii="Consolas" w:eastAsia="Times New Roman" w:hAnsi="Consolas" w:cs="Times New Roman"/>
+          <w:color w:val="FF0077"/>
+          <w:sz w:val="21"/>
+          <w:szCs w:val="21"/>
+        </w:rPr>
+        <w:t>article</w:t>
+      </w:r>
+      <w:proofErr w:type="gramEnd"/>
+      <w:r>
+        <w:rPr>
+          <w:rFonts w:ascii="Consolas" w:eastAsia="Times New Roman" w:hAnsi="Consolas" w:cs="Times New Roman"/>
+          <w:color w:val="FFFFFF"/>
+          <w:sz w:val="21"/>
+          <w:szCs w:val="21"/>
+        </w:rPr>
+        <w:t>&gt;</w:t>
+      </w:r>
+    </w:p>
+    <w:p>
+      <w:pPr>
+        <w:shd w:val="clear" w:color="auto" w:fill="00002C"/>
+        <w:spacing w:line="285" w:lineRule="atLeast"/>
+        <w:rPr>
+          <w:rFonts w:ascii="Consolas" w:eastAsia="Times New Roman" w:hAnsi="Consolas" w:cs="Times New Roman"/>
+          <w:color w:val="FFFFFF"/>
+          <w:sz w:val="21"/>
+          <w:szCs w:val="21"/>
+        </w:rPr>
+      </w:pPr>
+      <w:r>
+        <w:rPr>
+          <w:rFonts w:ascii="Consolas" w:eastAsia="Times New Roman" w:hAnsi="Consolas" w:cs="Times New Roman"/>
+          <w:color w:val="FFFFFF"/>
+          <w:sz w:val="21"/>
+          <w:szCs w:val="21"/>
+        </w:rPr>
+        <w:t>                &lt;</w:t>
+      </w:r>
+      <w:r>
+        <w:rPr>
+          <w:rFonts w:ascii="Consolas" w:eastAsia="Times New Roman" w:hAnsi="Consolas" w:cs="Times New Roman"/>
+          <w:color w:val="FF0077"/>
+          <w:sz w:val="21"/>
+          <w:szCs w:val="21"/>
+        </w:rPr>
+        <w:t>p</w:t>
+      </w:r>
+      <w:r>
+        <w:rPr>
+          <w:rFonts w:ascii="Consolas" w:eastAsia="Times New Roman" w:hAnsi="Consolas" w:cs="Times New Roman"/>
+          <w:color w:val="FFFFFF"/>
+          <w:sz w:val="21"/>
+          <w:szCs w:val="21"/>
+        </w:rPr>
+        <w:t>&gt;</w:t>
+      </w:r>
+    </w:p>
+    <w:p>
+      <w:pPr>
+        <w:shd w:val="clear" w:color="auto" w:fill="00002C"/>
+        <w:spacing w:line="285" w:lineRule="atLeast"/>
+        <w:rPr>
+          <w:rFonts w:ascii="Consolas" w:eastAsia="Times New Roman" w:hAnsi="Consolas" w:cs="Times New Roman"/>
+          <w:color w:val="FFFFFF"/>
+          <w:sz w:val="21"/>
+          <w:szCs w:val="21"/>
+        </w:rPr>
+      </w:pPr>
+      <w:r>
+        <w:rPr>
+          <w:rFonts w:ascii="Consolas" w:eastAsia="Times New Roman" w:hAnsi="Consolas" w:cs="Times New Roman"/>
+          <w:color w:val="FFFFFF"/>
+          <w:sz w:val="21"/>
+          <w:szCs w:val="21"/>
+        </w:rPr>
+        <w:t xml:space="preserve">                    </w:t>
+      </w:r>
+      <w:proofErr w:type="gramStart"/>
+      <w:r>
+        <w:rPr>
+          <w:rFonts w:ascii="Consolas" w:eastAsia="Times New Roman" w:hAnsi="Consolas" w:cs="Times New Roman"/>
+          <w:color w:val="FFFFFF"/>
+          <w:sz w:val="21"/>
+          <w:szCs w:val="21"/>
+        </w:rPr>
+        <w:t>this</w:t>
+      </w:r>
+      <w:proofErr w:type="gramEnd"/>
+      <w:r>
+        <w:rPr>
+          <w:rFonts w:ascii="Consolas" w:eastAsia="Times New Roman" w:hAnsi="Consolas" w:cs="Times New Roman"/>
+          <w:color w:val="FFFFFF"/>
+          <w:sz w:val="21"/>
+          <w:szCs w:val="21"/>
+        </w:rPr>
+        <w:t xml:space="preserve"> is the paragraph</w:t>
+      </w:r>
+    </w:p>
+    <w:p>
+      <w:pPr>
+        <w:shd w:val="clear" w:color="auto" w:fill="00002C"/>
+        <w:spacing w:line="285" w:lineRule="atLeast"/>
+        <w:rPr>
+          <w:rFonts w:ascii="Consolas" w:eastAsia="Times New Roman" w:hAnsi="Consolas" w:cs="Times New Roman"/>
+          <w:color w:val="FFFFFF"/>
+          <w:sz w:val="21"/>
+          <w:szCs w:val="21"/>
+        </w:rPr>
+      </w:pPr>
+      <w:r>
+        <w:rPr>
+          <w:rFonts w:ascii="Consolas" w:eastAsia="Times New Roman" w:hAnsi="Consolas" w:cs="Times New Roman"/>
+          <w:color w:val="FFFFFF"/>
+          <w:sz w:val="21"/>
+          <w:szCs w:val="21"/>
+        </w:rPr>
+        <w:t>                &lt;/</w:t>
+      </w:r>
+      <w:r>
+        <w:rPr>
+          <w:rFonts w:ascii="Consolas" w:eastAsia="Times New Roman" w:hAnsi="Consolas" w:cs="Times New Roman"/>
+          <w:color w:val="FF0077"/>
+          <w:sz w:val="21"/>
+          <w:szCs w:val="21"/>
+        </w:rPr>
+        <w:t>p</w:t>
+      </w:r>
+      <w:r>
+        <w:rPr>
+          <w:rFonts w:ascii="Consolas" w:eastAsia="Times New Roman" w:hAnsi="Consolas" w:cs="Times New Roman"/>
+          <w:color w:val="FFFFFF"/>
+          <w:sz w:val="21"/>
+          <w:szCs w:val="21"/>
+        </w:rPr>
+        <w:t>&gt;</w:t>
+      </w:r>
+    </w:p>
+    <w:p>
+      <w:pPr>
+        <w:shd w:val="clear" w:color="auto" w:fill="00002C"/>
+        <w:spacing w:line="285" w:lineRule="atLeast"/>
+        <w:rPr>
+          <w:rFonts w:ascii="Consolas" w:eastAsia="Times New Roman" w:hAnsi="Consolas" w:cs="Times New Roman"/>
+          <w:color w:val="FFFFFF"/>
+          <w:sz w:val="21"/>
+          <w:szCs w:val="21"/>
+        </w:rPr>
+      </w:pPr>
+      <w:r>
+        <w:rPr>
+          <w:rFonts w:ascii="Consolas" w:eastAsia="Times New Roman" w:hAnsi="Consolas" w:cs="Times New Roman"/>
+          <w:color w:val="FFFFFF"/>
+          <w:sz w:val="21"/>
+          <w:szCs w:val="21"/>
+        </w:rPr>
+        <w:t>            &lt;/</w:t>
+      </w:r>
+      <w:r>
+        <w:rPr>
+          <w:rFonts w:ascii="Consolas" w:eastAsia="Times New Roman" w:hAnsi="Consolas" w:cs="Times New Roman"/>
+          <w:color w:val="FF0077"/>
+          <w:sz w:val="21"/>
+          <w:szCs w:val="21"/>
+        </w:rPr>
+        <w:t>article</w:t>
+      </w:r>
+      <w:r>
+        <w:rPr>
+          <w:rFonts w:ascii="Consolas" w:eastAsia="Times New Roman" w:hAnsi="Consolas" w:cs="Times New Roman"/>
+          <w:color w:val="FFFFFF"/>
+          <w:sz w:val="21"/>
+          <w:szCs w:val="21"/>
+        </w:rPr>
+        <w:t>&gt;</w:t>
+      </w:r>
+    </w:p>
+    <w:p>
+      <w:pPr>
+        <w:shd w:val="clear" w:color="auto" w:fill="00002C"/>
+        <w:spacing w:line="285" w:lineRule="atLeast"/>
+        <w:rPr>
+          <w:rFonts w:ascii="Consolas" w:eastAsia="Times New Roman" w:hAnsi="Consolas" w:cs="Times New Roman"/>
+          <w:color w:val="FFFFFF"/>
+          <w:sz w:val="21"/>
+          <w:szCs w:val="21"/>
+        </w:rPr>
+      </w:pPr>
+      <w:r>
+        <w:rPr>
+          <w:rFonts w:ascii="Consolas" w:eastAsia="Times New Roman" w:hAnsi="Consolas" w:cs="Times New Roman"/>
+          <w:color w:val="FFFFFF"/>
+          <w:sz w:val="21"/>
+          <w:szCs w:val="21"/>
+        </w:rPr>
+        <w:t>        &lt;/</w:t>
+      </w:r>
+      <w:r>
+        <w:rPr>
+          <w:rFonts w:ascii="Consolas" w:eastAsia="Times New Roman" w:hAnsi="Consolas" w:cs="Times New Roman"/>
+          <w:color w:val="FF0077"/>
+          <w:sz w:val="21"/>
+          <w:szCs w:val="21"/>
+        </w:rPr>
+        <w:t>span</w:t>
+      </w:r>
+      <w:r>
+        <w:rPr>
+          <w:rFonts w:ascii="Consolas" w:eastAsia="Times New Roman" w:hAnsi="Consolas" w:cs="Times New Roman"/>
+          <w:color w:val="FFFFFF"/>
+          <w:sz w:val="21"/>
+          <w:szCs w:val="21"/>
+        </w:rPr>
+        <w:t>&gt;</w:t>
+      </w:r>
+    </w:p>
+    <w:p>
+      <w:pPr>
+        <w:shd w:val="clear" w:color="auto" w:fill="00002C"/>
+        <w:spacing w:line="285" w:lineRule="atLeast"/>
+        <w:rPr>
+          <w:rFonts w:ascii="Consolas" w:eastAsia="Times New Roman" w:hAnsi="Consolas" w:cs="Times New Roman"/>
+          <w:color w:val="FFFFFF"/>
+          <w:sz w:val="21"/>
+          <w:szCs w:val="21"/>
+        </w:rPr>
+      </w:pPr>
+      <w:r>
+        <w:rPr>
+          <w:rFonts w:ascii="Consolas" w:eastAsia="Times New Roman" w:hAnsi="Consolas" w:cs="Times New Roman"/>
+          <w:color w:val="FFFFFF"/>
+          <w:sz w:val="21"/>
+          <w:szCs w:val="21"/>
+        </w:rPr>
+        <w:t>    &lt;/</w:t>
+      </w:r>
+      <w:r>
+        <w:rPr>
+          <w:rFonts w:ascii="Consolas" w:eastAsia="Times New Roman" w:hAnsi="Consolas" w:cs="Times New Roman"/>
+          <w:color w:val="FF0077"/>
+          <w:sz w:val="21"/>
+          <w:szCs w:val="21"/>
+        </w:rPr>
+        <w:t>div</w:t>
+      </w:r>
+      <w:r>
+        <w:rPr>
+          <w:rFonts w:ascii="Consolas" w:eastAsia="Times New Roman" w:hAnsi="Consolas" w:cs="Times New Roman"/>
+          <w:color w:val="FFFFFF"/>
+          <w:sz w:val="21"/>
+          <w:szCs w:val="21"/>
+        </w:rPr>
+        <w:t>&gt;</w:t>
+      </w:r>
+    </w:p>
+    <w:p>
+      <w:pPr>
+        <w:pStyle w:val="NoSpacing"/>
+      </w:pPr>
+      <w:r>
+        <w:t xml:space="preserve">Here paragraph is inside the article </w:t>
+      </w:r>
+      <w:proofErr w:type="gramStart"/>
+      <w:r>
+        <w:t>so  div</w:t>
+      </w:r>
+      <w:proofErr w:type="gramEnd"/>
+      <w:r>
+        <w:t xml:space="preserve"> &gt; p is not applicable here. </w:t>
+      </w:r>
+    </w:p>
+    <w:p>
+      <w:pPr>
+        <w:pStyle w:val="NoSpacing"/>
+      </w:pPr>
+      <w:r>
+        <w:t xml:space="preserve">But we can make it applicable by </w:t>
+      </w:r>
+      <w:proofErr w:type="spellStart"/>
+      <w:r>
+        <w:t>decendent</w:t>
+      </w:r>
+      <w:proofErr w:type="spellEnd"/>
+      <w:r>
+        <w:t xml:space="preserve"> </w:t>
+      </w:r>
+      <w:proofErr w:type="spellStart"/>
+      <w:proofErr w:type="gramStart"/>
+      <w:r>
+        <w:t>selecter</w:t>
+      </w:r>
+      <w:proofErr w:type="spellEnd"/>
+      <w:r>
+        <w:t xml:space="preserve"> .</w:t>
+      </w:r>
+      <w:proofErr w:type="gramEnd"/>
+      <w:r>
+        <w:t xml:space="preserve"> </w:t>
+      </w:r>
+    </w:p>
+    <w:p>
+      <w:pPr>
+        <w:pStyle w:val="NoSpacing"/>
+      </w:pPr>
+      <w:r>
+        <w:t xml:space="preserve"> When we just use        </w:t>
+      </w:r>
+      <w:proofErr w:type="gramStart"/>
+      <w:r>
+        <w:rPr>
+          <w:b/>
+        </w:rPr>
+        <w:t>div  P</w:t>
+      </w:r>
+      <w:proofErr w:type="gramEnd"/>
+      <w:r>
+        <w:rPr>
+          <w:b/>
+        </w:rPr>
+        <w:t xml:space="preserve"> </w:t>
+      </w:r>
+      <w:r>
+        <w:rPr>
+          <w:b/>
+        </w:rPr>
+        <w:t xml:space="preserve"> s</w:t>
+      </w:r>
+      <w:r>
+        <w:t>o it applicable even the paragraph is where in the div</w:t>
+      </w:r>
+      <w:r>
+        <w:t>.</w:t>
+      </w:r>
+    </w:p>
+    <w:p>
+      <w:pPr>
+        <w:pStyle w:val="NoSpacing"/>
+      </w:pPr>
+    </w:p>
+    <w:p>
+      <w:pPr>
+        <w:pStyle w:val="NoSpacing"/>
+      </w:pPr>
+    </w:p>
+    <w:p>
+      <w:pPr>
+        <w:pStyle w:val="NoSpacing"/>
+      </w:pPr>
+    </w:p>
+    <w:p>
+      <w:pPr>
+        <w:pStyle w:val="NoSpacing"/>
+      </w:pPr>
+      <w:r>
+        <w:t xml:space="preserve">Now the another </w:t>
+      </w:r>
+      <w:proofErr w:type="spellStart"/>
+      <w:r>
+        <w:t>selecter</w:t>
+      </w:r>
+      <w:proofErr w:type="spellEnd"/>
+      <w:r>
+        <w:t xml:space="preserve"> is called universal </w:t>
+      </w:r>
+      <w:proofErr w:type="spellStart"/>
+      <w:proofErr w:type="gramStart"/>
+      <w:r>
+        <w:t>selecter</w:t>
+      </w:r>
+      <w:proofErr w:type="spellEnd"/>
+      <w:r>
+        <w:t xml:space="preserve"> .</w:t>
+      </w:r>
+      <w:proofErr w:type="gramEnd"/>
+    </w:p>
+    <w:p>
+      <w:pPr>
+        <w:pStyle w:val="NoSpacing"/>
+      </w:pPr>
+      <w:r>
+        <w:t xml:space="preserve">Which is used to assign something as a whole </w:t>
+      </w:r>
+    </w:p>
+    <w:p>
+      <w:pPr>
+        <w:shd w:val="clear" w:color="auto" w:fill="00002C"/>
+        <w:spacing w:line="285" w:lineRule="atLeast"/>
+        <w:rPr>
+          <w:rFonts w:ascii="Consolas" w:eastAsia="Times New Roman" w:hAnsi="Consolas" w:cs="Times New Roman"/>
+          <w:color w:val="FFFFFF"/>
+          <w:sz w:val="21"/>
+          <w:szCs w:val="21"/>
+        </w:rPr>
+      </w:pPr>
+      <w:r>
+        <w:rPr>
+          <w:rFonts w:ascii="Consolas" w:eastAsia="Times New Roman" w:hAnsi="Consolas" w:cs="Times New Roman"/>
+          <w:color w:val="FFFFFF"/>
+          <w:sz w:val="21"/>
+          <w:szCs w:val="21"/>
+        </w:rPr>
+        <w:t>   </w:t>
+      </w:r>
+      <w:r>
+        <w:rPr>
+          <w:rFonts w:ascii="Consolas" w:eastAsia="Times New Roman" w:hAnsi="Consolas" w:cs="Times New Roman"/>
+          <w:color w:val="FF0077"/>
+          <w:sz w:val="21"/>
+          <w:szCs w:val="21"/>
+        </w:rPr>
+        <w:t>*</w:t>
+      </w:r>
+      <w:r>
+        <w:rPr>
+          <w:rFonts w:ascii="Consolas" w:eastAsia="Times New Roman" w:hAnsi="Consolas" w:cs="Times New Roman"/>
+          <w:color w:val="FFFFFF"/>
+          <w:sz w:val="21"/>
+          <w:szCs w:val="21"/>
+        </w:rPr>
+        <w:t>{</w:t>
+      </w:r>
+    </w:p>
+    <w:p>
+      <w:pPr>
+        <w:shd w:val="clear" w:color="auto" w:fill="00002C"/>
+        <w:spacing w:line="285" w:lineRule="atLeast"/>
+        <w:rPr>
+          <w:rFonts w:ascii="Consolas" w:eastAsia="Times New Roman" w:hAnsi="Consolas" w:cs="Times New Roman"/>
+          <w:color w:val="FFFFFF"/>
+          <w:sz w:val="21"/>
+          <w:szCs w:val="21"/>
+        </w:rPr>
+      </w:pPr>
+      <w:r>
+        <w:rPr>
+          <w:rFonts w:ascii="Consolas" w:eastAsia="Times New Roman" w:hAnsi="Consolas" w:cs="Times New Roman"/>
+          <w:color w:val="FFFFFF"/>
+          <w:sz w:val="21"/>
+          <w:szCs w:val="21"/>
+        </w:rPr>
+        <w:t xml:space="preserve">            </w:t>
+      </w:r>
+      <w:proofErr w:type="gramStart"/>
+      <w:r>
+        <w:rPr>
+          <w:rFonts w:ascii="Consolas" w:eastAsia="Times New Roman" w:hAnsi="Consolas" w:cs="Times New Roman"/>
+          <w:color w:val="FFFFFF"/>
+          <w:sz w:val="21"/>
+          <w:szCs w:val="21"/>
+        </w:rPr>
+        <w:t>margin</w:t>
+      </w:r>
+      <w:proofErr w:type="gramEnd"/>
+      <w:r>
+        <w:rPr>
+          <w:rFonts w:ascii="Consolas" w:eastAsia="Times New Roman" w:hAnsi="Consolas" w:cs="Times New Roman"/>
+          <w:color w:val="FFFFFF"/>
+          <w:sz w:val="21"/>
+          <w:szCs w:val="21"/>
+        </w:rPr>
+        <w:t xml:space="preserve">: </w:t>
+      </w:r>
+      <w:r>
+        <w:rPr>
+          <w:rFonts w:ascii="Consolas" w:eastAsia="Times New Roman" w:hAnsi="Consolas" w:cs="Times New Roman"/>
+          <w:color w:val="FF7E34"/>
+          <w:sz w:val="21"/>
+          <w:szCs w:val="21"/>
+        </w:rPr>
+        <w:t>0</w:t>
+      </w:r>
+      <w:r>
+        <w:rPr>
+          <w:rFonts w:ascii="Consolas" w:eastAsia="Times New Roman" w:hAnsi="Consolas" w:cs="Times New Roman"/>
+          <w:color w:val="FFFFFF"/>
+          <w:sz w:val="21"/>
+          <w:szCs w:val="21"/>
+        </w:rPr>
+        <w:t>;</w:t>
+      </w:r>
+    </w:p>
+    <w:p>
+      <w:pPr>
+        <w:shd w:val="clear" w:color="auto" w:fill="00002C"/>
+        <w:spacing w:line="285" w:lineRule="atLeast"/>
+        <w:rPr>
+          <w:rFonts w:ascii="Consolas" w:eastAsia="Times New Roman" w:hAnsi="Consolas" w:cs="Times New Roman"/>
+          <w:color w:val="FFFFFF"/>
+          <w:sz w:val="21"/>
+          <w:szCs w:val="21"/>
+        </w:rPr>
+      </w:pPr>
+      <w:r>
+        <w:rPr>
+          <w:rFonts w:ascii="Consolas" w:eastAsia="Times New Roman" w:hAnsi="Consolas" w:cs="Times New Roman"/>
+          <w:color w:val="FFFFFF"/>
+          <w:sz w:val="21"/>
+          <w:szCs w:val="21"/>
+        </w:rPr>
+        <w:t xml:space="preserve">            </w:t>
+      </w:r>
+      <w:proofErr w:type="gramStart"/>
+      <w:r>
+        <w:rPr>
+          <w:rFonts w:ascii="Consolas" w:eastAsia="Times New Roman" w:hAnsi="Consolas" w:cs="Times New Roman"/>
+          <w:color w:val="FFFFFF"/>
+          <w:sz w:val="21"/>
+          <w:szCs w:val="21"/>
+        </w:rPr>
+        <w:t>padding</w:t>
+      </w:r>
+      <w:proofErr w:type="gramEnd"/>
+      <w:r>
+        <w:rPr>
+          <w:rFonts w:ascii="Consolas" w:eastAsia="Times New Roman" w:hAnsi="Consolas" w:cs="Times New Roman"/>
+          <w:color w:val="FFFFFF"/>
+          <w:sz w:val="21"/>
+          <w:szCs w:val="21"/>
+        </w:rPr>
+        <w:t xml:space="preserve">: </w:t>
+      </w:r>
+      <w:r>
+        <w:rPr>
+          <w:rFonts w:ascii="Consolas" w:eastAsia="Times New Roman" w:hAnsi="Consolas" w:cs="Times New Roman"/>
+          <w:color w:val="FF7E34"/>
+          <w:sz w:val="21"/>
+          <w:szCs w:val="21"/>
+        </w:rPr>
+        <w:t>0</w:t>
+      </w:r>
+      <w:r>
+        <w:rPr>
+          <w:rFonts w:ascii="Consolas" w:eastAsia="Times New Roman" w:hAnsi="Consolas" w:cs="Times New Roman"/>
+          <w:color w:val="FFFFFF"/>
+          <w:sz w:val="21"/>
+          <w:szCs w:val="21"/>
+        </w:rPr>
+        <w:t>;</w:t>
+      </w:r>
+    </w:p>
+    <w:p>
+      <w:pPr>
+        <w:shd w:val="clear" w:color="auto" w:fill="00002C"/>
+        <w:spacing w:line="285" w:lineRule="atLeast"/>
+        <w:rPr>
+          <w:rFonts w:ascii="Consolas" w:eastAsia="Times New Roman" w:hAnsi="Consolas" w:cs="Times New Roman"/>
+          <w:color w:val="FFFFFF"/>
+          <w:sz w:val="21"/>
+          <w:szCs w:val="21"/>
+        </w:rPr>
+      </w:pPr>
+      <w:r>
+        <w:rPr>
+          <w:rFonts w:ascii="Consolas" w:eastAsia="Times New Roman" w:hAnsi="Consolas" w:cs="Times New Roman"/>
+          <w:color w:val="FFFFFF"/>
+          <w:sz w:val="21"/>
+          <w:szCs w:val="21"/>
+        </w:rPr>
+        <w:t>        }</w:t>
+      </w:r>
+    </w:p>
+    <w:p>
+      <w:pPr>
+        <w:pStyle w:val="NoSpacing"/>
+      </w:pPr>
+    </w:p>
+    <w:p>
+      <w:pPr>
+        <w:pStyle w:val="NoSpacing"/>
+      </w:pPr>
+      <w:r>
+        <w:t xml:space="preserve">This </w:t>
+      </w:r>
+      <w:proofErr w:type="spellStart"/>
+      <w:r>
+        <w:t>selecter</w:t>
+      </w:r>
+      <w:proofErr w:type="spellEnd"/>
+      <w:r>
+        <w:t xml:space="preserve"> is given by steric and margin and padding are the spaces btw the paragraphs and headings.</w:t>
+      </w:r>
+    </w:p>
+    <w:p>
+      <w:pPr>
+        <w:shd w:val="clear" w:color="auto" w:fill="7FFF00"/>
+        <w:spacing w:line="240" w:lineRule="auto"/>
+        <w:rPr>
+          <w:rFonts w:ascii="Times New Roman" w:eastAsia="Times New Roman" w:hAnsi="Times New Roman" w:cs="Times New Roman"/>
+          <w:color w:val="000000"/>
+          <w:sz w:val="27"/>
+          <w:szCs w:val="27"/>
+        </w:rPr>
+      </w:pPr>
+      <w:r>
+        <w:rPr>
+          <w:rFonts w:ascii="Times New Roman" w:eastAsia="Times New Roman" w:hAnsi="Times New Roman" w:cs="Times New Roman"/>
+          <w:color w:val="000000"/>
+          <w:sz w:val="27"/>
+          <w:szCs w:val="27"/>
+        </w:rPr>
+        <w:t> </w:t>
+      </w:r>
+      <w:proofErr w:type="gramStart"/>
+      <w:r>
+        <w:rPr>
+          <w:rFonts w:ascii="Times New Roman" w:eastAsia="Times New Roman" w:hAnsi="Times New Roman" w:cs="Times New Roman"/>
+          <w:color w:val="000000"/>
+          <w:sz w:val="27"/>
+          <w:szCs w:val="27"/>
+        </w:rPr>
+        <w:t>am</w:t>
+      </w:r>
+      <w:proofErr w:type="gramEnd"/>
+      <w:r>
+        <w:rPr>
+          <w:rFonts w:ascii="Times New Roman" w:eastAsia="Times New Roman" w:hAnsi="Times New Roman" w:cs="Times New Roman"/>
+          <w:color w:val="000000"/>
+          <w:sz w:val="27"/>
+          <w:szCs w:val="27"/>
+        </w:rPr>
+        <w:t xml:space="preserve"> a div</w:t>
+      </w:r>
+    </w:p>
+    <w:p>
+      <w:pPr>
+        <w:shd w:val="clear" w:color="auto" w:fill="FF00FF"/>
+        <w:spacing w:line="240" w:lineRule="auto"/>
+        <w:rPr>
+          <w:rFonts w:ascii="Times New Roman" w:eastAsia="Times New Roman" w:hAnsi="Times New Roman" w:cs="Times New Roman"/>
+          <w:color w:val="0000FF"/>
+          <w:sz w:val="27"/>
+          <w:szCs w:val="27"/>
+        </w:rPr>
+      </w:pPr>
+      <w:proofErr w:type="spellStart"/>
+      <w:proofErr w:type="gramStart"/>
+      <w:r>
+        <w:rPr>
+          <w:rFonts w:ascii="Times New Roman" w:eastAsia="Times New Roman" w:hAnsi="Times New Roman" w:cs="Times New Roman"/>
+          <w:color w:val="0000FF"/>
+          <w:sz w:val="27"/>
+          <w:szCs w:val="27"/>
+        </w:rPr>
+        <w:t>im</w:t>
+      </w:r>
+      <w:proofErr w:type="spellEnd"/>
+      <w:proofErr w:type="gramEnd"/>
+      <w:r>
+        <w:rPr>
+          <w:rFonts w:ascii="Times New Roman" w:eastAsia="Times New Roman" w:hAnsi="Times New Roman" w:cs="Times New Roman"/>
+          <w:color w:val="0000FF"/>
+          <w:sz w:val="27"/>
+          <w:szCs w:val="27"/>
+        </w:rPr>
+        <w:t xml:space="preserve"> a paragraph inside the dib</w:t>
+      </w:r>
+    </w:p>
+    <w:p>
+      <w:pPr>
+        <w:shd w:val="clear" w:color="auto" w:fill="00FFFF"/>
+        <w:spacing w:line="240" w:lineRule="auto"/>
+        <w:rPr>
+          <w:rFonts w:ascii="Times New Roman" w:eastAsia="Times New Roman" w:hAnsi="Times New Roman" w:cs="Times New Roman"/>
+          <w:color w:val="000000"/>
+          <w:sz w:val="27"/>
+          <w:szCs w:val="27"/>
+        </w:rPr>
+      </w:pPr>
+      <w:proofErr w:type="spellStart"/>
+      <w:proofErr w:type="gramStart"/>
+      <w:r>
+        <w:rPr>
+          <w:rFonts w:ascii="Times New Roman" w:eastAsia="Times New Roman" w:hAnsi="Times New Roman" w:cs="Times New Roman"/>
+          <w:color w:val="000000"/>
+          <w:sz w:val="27"/>
+          <w:szCs w:val="27"/>
+        </w:rPr>
+        <w:t>im</w:t>
+      </w:r>
+      <w:proofErr w:type="spellEnd"/>
+      <w:proofErr w:type="gramEnd"/>
+      <w:r>
+        <w:rPr>
+          <w:rFonts w:ascii="Times New Roman" w:eastAsia="Times New Roman" w:hAnsi="Times New Roman" w:cs="Times New Roman"/>
+          <w:color w:val="000000"/>
+          <w:sz w:val="27"/>
+          <w:szCs w:val="27"/>
+        </w:rPr>
+        <w:t xml:space="preserve"> not a div</w:t>
+      </w:r>
+    </w:p>
+    <w:p>
+      <w:pPr>
+        <w:pStyle w:val="NoSpacing"/>
+      </w:pPr>
+      <w:r>
+        <w:t xml:space="preserve"> </w:t>
+      </w:r>
+      <w:proofErr w:type="gramStart"/>
+      <w:r>
+        <w:t>now</w:t>
+      </w:r>
+      <w:proofErr w:type="gramEnd"/>
+      <w:r>
+        <w:t xml:space="preserve"> this is the </w:t>
+      </w:r>
+      <w:proofErr w:type="spellStart"/>
+      <w:r>
+        <w:t>out put</w:t>
+      </w:r>
+      <w:proofErr w:type="spellEnd"/>
+      <w:r>
+        <w:t xml:space="preserve"> so you can see that the space btw each line is reduced to zero and they attach with each other.</w:t>
+      </w:r>
+    </w:p>
+    <w:p>
+      <w:pPr>
+        <w:pStyle w:val="NoSpacing"/>
+      </w:pPr>
+    </w:p>
+    <w:p>
+      <w:pPr>
+        <w:pStyle w:val="NoSpacing"/>
       </w:pPr>
       <w:bookmarkStart w:id="5" w:name="_GoBack"/>
       <w:bookmarkEnd w:id="5"/>
@@ -11647,6 +14862,22 @@
       <w:iCs/>
     </w:rPr>
   </w:style>
+  <w:style w:type="paragraph" w:styleId="NormalWeb">
+    <w:name w:val="Normal (Web)"/>
+    <w:basedOn w:val="Normal"/>
+    <w:uiPriority w:val="99"/>
+    <w:semiHidden/>
+    <w:unhideWhenUsed/>
+    <w:rsid w:val="00C8774A"/>
+    <w:pPr>
+      <w:spacing w:before="100" w:beforeAutospacing="1" w:after="100" w:afterAutospacing="1" w:line="240" w:lineRule="auto"/>
+    </w:pPr>
+    <w:rPr>
+      <w:rFonts w:ascii="Times New Roman" w:eastAsia="Times New Roman" w:hAnsi="Times New Roman" w:cs="Times New Roman"/>
+      <w:sz w:val="24"/>
+      <w:szCs w:val="24"/>
+    </w:rPr>
+  </w:style>
 </w:styles>
 </file>
 
@@ -11968,4 +15199,16 @@
   </a:objectDefaults>
   <a:extraClrSchemeLst/>
 </a:theme>
+</file>
+
+<file path=customXml/item1.xml><?xml version="1.0" encoding="utf-8"?>
+<b:Sources xmlns:b="http://schemas.openxmlformats.org/officeDocument/2006/bibliography" xmlns="http://schemas.openxmlformats.org/officeDocument/2006/bibliography" SelectedStyle="\APASixthEditionOfficeOnline.xsl" StyleName="APA" Version="6"/>
+</file>
+
+<file path=customXml/itemProps1.xml><?xml version="1.0" encoding="utf-8"?>
+<ds:datastoreItem xmlns:ds="http://schemas.openxmlformats.org/officeDocument/2006/customXml" ds:itemID="{16063102-F461-4613-9EF6-F69381DE4C33}">
+  <ds:schemaRefs>
+    <ds:schemaRef ds:uri="http://schemas.openxmlformats.org/officeDocument/2006/bibliography"/>
+  </ds:schemaRefs>
+</ds:datastoreItem>
 </file>
</xml_diff>

<commit_message>
adding the css day 4 programs
</commit_message>
<xml_diff>
--- a/Web_Development Notes Scratch to pro.docx
+++ b/Web_Development Notes Scratch to pro.docx
@@ -10106,6 +10106,9 @@
     <w:p>
       <w:pPr>
         <w:shd w:val="clear" w:color="auto" w:fill="00002C"/>
+        <w:tabs>
+          <w:tab w:val="right" w:pos="8910"/>
+        </w:tabs>
         <w:spacing w:line="285" w:lineRule="atLeast"/>
         <w:rPr>
           <w:rFonts w:ascii="Consolas" w:eastAsia="Times New Roman" w:hAnsi="Consolas" w:cs="Times New Roman"/>
@@ -10181,6 +10184,73 @@
         </w:rPr>
         <w:t>&gt;</w:t>
       </w:r>
+      <w:r>
+        <w:rPr>
+          <w:rFonts w:ascii="Consolas" w:eastAsia="Times New Roman" w:hAnsi="Consolas" w:cs="Times New Roman"/>
+          <w:color w:val="FFFFFF"/>
+          <w:sz w:val="21"/>
+          <w:szCs w:val="21"/>
+        </w:rPr>
+        <w:tab/>
+      </w:r>
+    </w:p>
+    <w:p>
+      <w:pPr>
+        <w:shd w:val="clear" w:color="auto" w:fill="00002C"/>
+        <w:tabs>
+          <w:tab w:val="right" w:pos="8910"/>
+        </w:tabs>
+        <w:spacing w:line="285" w:lineRule="atLeast"/>
+        <w:rPr>
+          <w:rFonts w:ascii="Consolas" w:eastAsia="Times New Roman" w:hAnsi="Consolas" w:cs="Times New Roman"/>
+          <w:color w:val="FFFFFF"/>
+          <w:sz w:val="21"/>
+          <w:szCs w:val="21"/>
+        </w:rPr>
+      </w:pPr>
+    </w:p>
+    <w:p>
+      <w:pPr>
+        <w:pStyle w:val="NoSpacing"/>
+      </w:pPr>
+    </w:p>
+    <w:p>
+      <w:pPr>
+        <w:pStyle w:val="NoSpacing"/>
+        <w:rPr>
+          <w:b/>
+        </w:rPr>
+      </w:pPr>
+      <w:r>
+        <w:rPr>
+          <w:b/>
+        </w:rPr>
+        <w:t>Date</w:t>
+      </w:r>
+      <w:proofErr w:type="gramStart"/>
+      <w:r>
+        <w:rPr>
+          <w:b/>
+        </w:rPr>
+        <w:t>:29</w:t>
+      </w:r>
+      <w:proofErr w:type="gramEnd"/>
+      <w:r>
+        <w:rPr>
+          <w:b/>
+        </w:rPr>
+        <w:t xml:space="preserve"> sep,2026</w:t>
+      </w:r>
+    </w:p>
+    <w:p>
+      <w:pPr>
+        <w:pStyle w:val="NoSpacing"/>
+      </w:pPr>
+    </w:p>
+    <w:p>
+      <w:pPr>
+        <w:pStyle w:val="NoSpacing"/>
+      </w:pPr>
     </w:p>
     <w:p>
       <w:pPr>
@@ -10682,6 +10752,7 @@
           <w:sz w:val="21"/>
           <w:szCs w:val="21"/>
         </w:rPr>
+        <w:lastRenderedPageBreak/>
         <w:t>    &lt;</w:t>
       </w:r>
       <w:r>
@@ -10906,6 +10977,65 @@
       <w:r>
         <w:t xml:space="preserve"> we call it by #green so its background goes green.</w:t>
       </w:r>
+    </w:p>
+    <w:p>
+      <w:pPr>
+        <w:pStyle w:val="NoSpacing"/>
+      </w:pPr>
+    </w:p>
+    <w:p>
+      <w:pPr>
+        <w:pStyle w:val="NoSpacing"/>
+      </w:pPr>
+    </w:p>
+    <w:p>
+      <w:pPr>
+        <w:pStyle w:val="NoSpacing"/>
+      </w:pPr>
+    </w:p>
+    <w:p>
+      <w:pPr>
+        <w:pStyle w:val="NoSpacing"/>
+      </w:pPr>
+    </w:p>
+    <w:p>
+      <w:pPr>
+        <w:pStyle w:val="NoSpacing"/>
+        <w:rPr>
+          <w:b/>
+        </w:rPr>
+      </w:pPr>
+      <w:r>
+        <w:rPr>
+          <w:b/>
+        </w:rPr>
+        <w:t>Date</w:t>
+      </w:r>
+      <w:proofErr w:type="gramStart"/>
+      <w:r>
+        <w:rPr>
+          <w:b/>
+        </w:rPr>
+        <w:t>:30</w:t>
+      </w:r>
+      <w:proofErr w:type="gramEnd"/>
+      <w:r>
+        <w:rPr>
+          <w:b/>
+        </w:rPr>
+        <w:t xml:space="preserve"> </w:t>
+      </w:r>
+      <w:r>
+        <w:rPr>
+          <w:b/>
+        </w:rPr>
+        <w:t>sep,2026</w:t>
+      </w:r>
+    </w:p>
+    <w:p>
+      <w:pPr>
+        <w:pStyle w:val="NoSpacing"/>
+      </w:pPr>
     </w:p>
     <w:p>
       <w:pPr>
@@ -10927,7 +11057,6 @@
           <w:sz w:val="21"/>
           <w:szCs w:val="21"/>
         </w:rPr>
-        <w:lastRenderedPageBreak/>
         <w:t> </w:t>
       </w:r>
       <w:proofErr w:type="gramStart"/>
@@ -11960,6 +12089,59 @@
     <w:p>
       <w:pPr>
         <w:pStyle w:val="NoSpacing"/>
+        <w:rPr>
+          <w:b/>
+        </w:rPr>
+      </w:pPr>
+      <w:r>
+        <w:rPr>
+          <w:b/>
+        </w:rPr>
+        <w:t>Date</w:t>
+      </w:r>
+      <w:proofErr w:type="gramStart"/>
+      <w:r>
+        <w:rPr>
+          <w:b/>
+        </w:rPr>
+        <w:t>:1</w:t>
+      </w:r>
+      <w:proofErr w:type="gramEnd"/>
+      <w:r>
+        <w:rPr>
+          <w:b/>
+        </w:rPr>
+        <w:t xml:space="preserve"> </w:t>
+      </w:r>
+      <w:proofErr w:type="spellStart"/>
+      <w:r>
+        <w:rPr>
+          <w:b/>
+        </w:rPr>
+        <w:t>oct</w:t>
+      </w:r>
+      <w:proofErr w:type="spellEnd"/>
+      <w:r>
+        <w:rPr>
+          <w:b/>
+        </w:rPr>
+        <w:t xml:space="preserve"> </w:t>
+      </w:r>
+      <w:r>
+        <w:rPr>
+          <w:b/>
+        </w:rPr>
+        <w:t>,2026</w:t>
+      </w:r>
+    </w:p>
+    <w:p>
+      <w:pPr>
+        <w:pStyle w:val="NoSpacing"/>
+      </w:pPr>
+    </w:p>
+    <w:p>
+      <w:pPr>
+        <w:pStyle w:val="NoSpacing"/>
       </w:pPr>
     </w:p>
     <w:p>
@@ -12053,6 +12235,7 @@
           <w:sz w:val="21"/>
           <w:szCs w:val="21"/>
         </w:rPr>
+        <w:lastRenderedPageBreak/>
         <w:t xml:space="preserve">            </w:t>
       </w:r>
       <w:proofErr w:type="gramStart"/>
@@ -12336,6 +12519,751 @@
     <w:p>
       <w:pPr>
         <w:pStyle w:val="NoSpacing"/>
+        <w:rPr>
+          <w:b/>
+        </w:rPr>
+      </w:pPr>
+      <w:r>
+        <w:rPr>
+          <w:b/>
+        </w:rPr>
+        <w:t>Date: 4 oct</w:t>
+      </w:r>
+      <w:proofErr w:type="gramStart"/>
+      <w:r>
+        <w:rPr>
+          <w:b/>
+        </w:rPr>
+        <w:t>,2026</w:t>
+      </w:r>
+      <w:proofErr w:type="gramEnd"/>
+    </w:p>
+    <w:p>
+      <w:pPr>
+        <w:pStyle w:val="NoSpacing"/>
+        <w:rPr>
+          <w:b/>
+        </w:rPr>
+      </w:pPr>
+    </w:p>
+    <w:p>
+      <w:pPr>
+        <w:pStyle w:val="NoSpacing"/>
+      </w:pPr>
+    </w:p>
+    <w:p>
+      <w:pPr>
+        <w:pStyle w:val="NoSpacing"/>
+        <w:rPr>
+          <w:b/>
+        </w:rPr>
+      </w:pPr>
+      <w:r>
+        <w:rPr>
+          <w:b/>
+        </w:rPr>
+        <w:t xml:space="preserve">Pseudo </w:t>
+      </w:r>
+      <w:proofErr w:type="spellStart"/>
+      <w:r>
+        <w:rPr>
+          <w:b/>
+        </w:rPr>
+        <w:t>selecter</w:t>
+      </w:r>
+      <w:proofErr w:type="spellEnd"/>
+      <w:r>
+        <w:rPr>
+          <w:b/>
+        </w:rPr>
+        <w:t>:</w:t>
+      </w:r>
+    </w:p>
+    <w:p>
+      <w:pPr>
+        <w:pStyle w:val="NoSpacing"/>
+      </w:pPr>
+    </w:p>
+    <w:p>
+      <w:pPr>
+        <w:pStyle w:val="NoSpacing"/>
+      </w:pPr>
+      <w:r>
+        <w:t xml:space="preserve">This </w:t>
+      </w:r>
+      <w:proofErr w:type="spellStart"/>
+      <w:r>
+        <w:t>selecter</w:t>
+      </w:r>
+      <w:proofErr w:type="spellEnd"/>
+      <w:r>
+        <w:t xml:space="preserve"> is used to provide the color to the link means that if we add any link in our website and we want </w:t>
+      </w:r>
+      <w:proofErr w:type="gramStart"/>
+      <w:r>
+        <w:t>the that</w:t>
+      </w:r>
+      <w:proofErr w:type="gramEnd"/>
+      <w:r>
+        <w:t xml:space="preserve"> color is that </w:t>
+      </w:r>
+      <w:proofErr w:type="spellStart"/>
+      <w:r>
+        <w:t>wich</w:t>
+      </w:r>
+      <w:proofErr w:type="spellEnd"/>
+      <w:r>
+        <w:t xml:space="preserve"> we want so we can by using the pseudo </w:t>
+      </w:r>
+      <w:proofErr w:type="spellStart"/>
+      <w:r>
+        <w:t>selecter</w:t>
+      </w:r>
+      <w:proofErr w:type="spellEnd"/>
+      <w:r>
+        <w:t xml:space="preserve">. </w:t>
+      </w:r>
+    </w:p>
+    <w:p>
+      <w:pPr>
+        <w:shd w:val="clear" w:color="auto" w:fill="00002C"/>
+        <w:spacing w:line="285" w:lineRule="atLeast"/>
+        <w:rPr>
+          <w:rFonts w:ascii="Consolas" w:eastAsia="Times New Roman" w:hAnsi="Consolas" w:cs="Times New Roman"/>
+          <w:color w:val="FFFFFF"/>
+          <w:sz w:val="21"/>
+          <w:szCs w:val="21"/>
+        </w:rPr>
+      </w:pPr>
+      <w:r>
+        <w:rPr>
+          <w:rFonts w:ascii="Consolas" w:eastAsia="Times New Roman" w:hAnsi="Consolas" w:cs="Times New Roman"/>
+          <w:color w:val="FFFFFF"/>
+          <w:sz w:val="21"/>
+          <w:szCs w:val="21"/>
+        </w:rPr>
+        <w:t>   &lt;</w:t>
+      </w:r>
+      <w:r>
+        <w:rPr>
+          <w:rFonts w:ascii="Consolas" w:eastAsia="Times New Roman" w:hAnsi="Consolas" w:cs="Times New Roman"/>
+          <w:color w:val="FF0077"/>
+          <w:sz w:val="21"/>
+          <w:szCs w:val="21"/>
+        </w:rPr>
+        <w:t>a</w:t>
+      </w:r>
+      <w:r>
+        <w:rPr>
+          <w:rFonts w:ascii="Consolas" w:eastAsia="Times New Roman" w:hAnsi="Consolas" w:cs="Times New Roman"/>
+          <w:color w:val="FFFFFF"/>
+          <w:sz w:val="21"/>
+          <w:szCs w:val="21"/>
+        </w:rPr>
+        <w:t xml:space="preserve"> </w:t>
+      </w:r>
+      <w:proofErr w:type="spellStart"/>
+      <w:r>
+        <w:rPr>
+          <w:rFonts w:ascii="Consolas" w:eastAsia="Times New Roman" w:hAnsi="Consolas" w:cs="Times New Roman"/>
+          <w:color w:val="00FFF2"/>
+          <w:sz w:val="21"/>
+          <w:szCs w:val="21"/>
+        </w:rPr>
+        <w:t>href</w:t>
+      </w:r>
+      <w:proofErr w:type="spellEnd"/>
+      <w:r>
+        <w:rPr>
+          <w:rFonts w:ascii="Consolas" w:eastAsia="Times New Roman" w:hAnsi="Consolas" w:cs="Times New Roman"/>
+          <w:color w:val="FFFFFF"/>
+          <w:sz w:val="21"/>
+          <w:szCs w:val="21"/>
+        </w:rPr>
+        <w:t>="</w:t>
+      </w:r>
+      <w:r>
+        <w:rPr>
+          <w:rFonts w:ascii="Consolas" w:eastAsia="Times New Roman" w:hAnsi="Consolas" w:cs="Times New Roman"/>
+          <w:color w:val="EEFF00"/>
+          <w:sz w:val="21"/>
+          <w:szCs w:val="21"/>
+        </w:rPr>
+        <w:t>https://www.google.com</w:t>
+      </w:r>
+      <w:r>
+        <w:rPr>
+          <w:rFonts w:ascii="Consolas" w:eastAsia="Times New Roman" w:hAnsi="Consolas" w:cs="Times New Roman"/>
+          <w:color w:val="FFFFFF"/>
+          <w:sz w:val="21"/>
+          <w:szCs w:val="21"/>
+        </w:rPr>
+        <w:t>"&gt;Visit the Google &lt;/</w:t>
+      </w:r>
+      <w:r>
+        <w:rPr>
+          <w:rFonts w:ascii="Consolas" w:eastAsia="Times New Roman" w:hAnsi="Consolas" w:cs="Times New Roman"/>
+          <w:color w:val="FF0077"/>
+          <w:sz w:val="21"/>
+          <w:szCs w:val="21"/>
+        </w:rPr>
+        <w:t>a</w:t>
+      </w:r>
+      <w:r>
+        <w:rPr>
+          <w:rFonts w:ascii="Consolas" w:eastAsia="Times New Roman" w:hAnsi="Consolas" w:cs="Times New Roman"/>
+          <w:color w:val="FFFFFF"/>
+          <w:sz w:val="21"/>
+          <w:szCs w:val="21"/>
+        </w:rPr>
+        <w:t>&gt;</w:t>
+      </w:r>
+    </w:p>
+    <w:p>
+      <w:pPr>
+        <w:shd w:val="clear" w:color="auto" w:fill="00002C"/>
+        <w:spacing w:line="285" w:lineRule="atLeast"/>
+        <w:rPr>
+          <w:rFonts w:ascii="Consolas" w:eastAsia="Times New Roman" w:hAnsi="Consolas" w:cs="Times New Roman"/>
+          <w:color w:val="FFFFFF"/>
+          <w:sz w:val="21"/>
+          <w:szCs w:val="21"/>
+        </w:rPr>
+      </w:pPr>
+    </w:p>
+    <w:p>
+      <w:pPr>
+        <w:shd w:val="clear" w:color="auto" w:fill="00002C"/>
+        <w:spacing w:line="285" w:lineRule="atLeast"/>
+        <w:rPr>
+          <w:rFonts w:ascii="Consolas" w:eastAsia="Times New Roman" w:hAnsi="Consolas" w:cs="Times New Roman"/>
+          <w:color w:val="FFFFFF"/>
+          <w:sz w:val="21"/>
+          <w:szCs w:val="21"/>
+        </w:rPr>
+      </w:pPr>
+      <w:r>
+        <w:rPr>
+          <w:rFonts w:ascii="Consolas" w:eastAsia="Times New Roman" w:hAnsi="Consolas" w:cs="Times New Roman"/>
+          <w:color w:val="FFFFFF"/>
+          <w:sz w:val="21"/>
+          <w:szCs w:val="21"/>
+        </w:rPr>
+        <w:t xml:space="preserve">This is the </w:t>
+      </w:r>
+      <w:proofErr w:type="spellStart"/>
+      <w:r>
+        <w:rPr>
+          <w:rFonts w:ascii="Consolas" w:eastAsia="Times New Roman" w:hAnsi="Consolas" w:cs="Times New Roman"/>
+          <w:color w:val="FFFFFF"/>
+          <w:sz w:val="21"/>
+          <w:szCs w:val="21"/>
+        </w:rPr>
+        <w:t>psudo</w:t>
+      </w:r>
+      <w:proofErr w:type="spellEnd"/>
+      <w:r>
+        <w:rPr>
+          <w:rFonts w:ascii="Consolas" w:eastAsia="Times New Roman" w:hAnsi="Consolas" w:cs="Times New Roman"/>
+          <w:color w:val="FFFFFF"/>
+          <w:sz w:val="21"/>
+          <w:szCs w:val="21"/>
+        </w:rPr>
+        <w:t xml:space="preserve"> selector which we use to give color to the google.com</w:t>
+      </w:r>
+    </w:p>
+    <w:p>
+      <w:pPr>
+        <w:shd w:val="clear" w:color="auto" w:fill="00002C"/>
+        <w:spacing w:line="285" w:lineRule="atLeast"/>
+        <w:rPr>
+          <w:rFonts w:ascii="Consolas" w:eastAsia="Times New Roman" w:hAnsi="Consolas" w:cs="Times New Roman"/>
+          <w:color w:val="FFFFFF"/>
+          <w:sz w:val="21"/>
+          <w:szCs w:val="21"/>
+        </w:rPr>
+      </w:pPr>
+      <w:r>
+        <w:rPr>
+          <w:rFonts w:ascii="Consolas" w:eastAsia="Times New Roman" w:hAnsi="Consolas" w:cs="Times New Roman"/>
+          <w:i/>
+          <w:iCs/>
+          <w:color w:val="838383"/>
+          <w:sz w:val="21"/>
+          <w:szCs w:val="21"/>
+        </w:rPr>
+        <w:t xml:space="preserve">/* </w:t>
+      </w:r>
+      <w:proofErr w:type="spellStart"/>
+      <w:r>
+        <w:rPr>
+          <w:rFonts w:ascii="Consolas" w:eastAsia="Times New Roman" w:hAnsi="Consolas" w:cs="Times New Roman"/>
+          <w:i/>
+          <w:iCs/>
+          <w:color w:val="838383"/>
+          <w:sz w:val="21"/>
+          <w:szCs w:val="21"/>
+        </w:rPr>
+        <w:t>psuedo</w:t>
+      </w:r>
+      <w:proofErr w:type="spellEnd"/>
+      <w:r>
+        <w:rPr>
+          <w:rFonts w:ascii="Consolas" w:eastAsia="Times New Roman" w:hAnsi="Consolas" w:cs="Times New Roman"/>
+          <w:i/>
+          <w:iCs/>
+          <w:color w:val="838383"/>
+          <w:sz w:val="21"/>
+          <w:szCs w:val="21"/>
+        </w:rPr>
+        <w:t xml:space="preserve"> selector */</w:t>
+      </w:r>
+    </w:p>
+    <w:p>
+      <w:pPr>
+        <w:shd w:val="clear" w:color="auto" w:fill="00002C"/>
+        <w:spacing w:line="285" w:lineRule="atLeast"/>
+        <w:rPr>
+          <w:rFonts w:ascii="Consolas" w:eastAsia="Times New Roman" w:hAnsi="Consolas" w:cs="Times New Roman"/>
+          <w:color w:val="FFFFFF"/>
+          <w:sz w:val="21"/>
+          <w:szCs w:val="21"/>
+        </w:rPr>
+      </w:pPr>
+    </w:p>
+    <w:p>
+      <w:pPr>
+        <w:shd w:val="clear" w:color="auto" w:fill="00002C"/>
+        <w:spacing w:line="285" w:lineRule="atLeast"/>
+        <w:rPr>
+          <w:rFonts w:ascii="Consolas" w:eastAsia="Times New Roman" w:hAnsi="Consolas" w:cs="Times New Roman"/>
+          <w:color w:val="FFFFFF"/>
+          <w:sz w:val="21"/>
+          <w:szCs w:val="21"/>
+        </w:rPr>
+      </w:pPr>
+      <w:r>
+        <w:rPr>
+          <w:rFonts w:ascii="Consolas" w:eastAsia="Times New Roman" w:hAnsi="Consolas" w:cs="Times New Roman"/>
+          <w:color w:val="FFFFFF"/>
+          <w:sz w:val="21"/>
+          <w:szCs w:val="21"/>
+        </w:rPr>
+        <w:t xml:space="preserve">        </w:t>
+      </w:r>
+      <w:proofErr w:type="gramStart"/>
+      <w:r>
+        <w:rPr>
+          <w:rFonts w:ascii="Consolas" w:eastAsia="Times New Roman" w:hAnsi="Consolas" w:cs="Times New Roman"/>
+          <w:color w:val="FF0077"/>
+          <w:sz w:val="21"/>
+          <w:szCs w:val="21"/>
+        </w:rPr>
+        <w:t>a</w:t>
+      </w:r>
+      <w:r>
+        <w:rPr>
+          <w:rFonts w:ascii="Consolas" w:eastAsia="Times New Roman" w:hAnsi="Consolas" w:cs="Times New Roman"/>
+          <w:color w:val="FFFFFF"/>
+          <w:sz w:val="21"/>
+          <w:szCs w:val="21"/>
+        </w:rPr>
+        <w:t>:</w:t>
+      </w:r>
+      <w:proofErr w:type="gramEnd"/>
+      <w:r>
+        <w:rPr>
+          <w:rFonts w:ascii="Consolas" w:eastAsia="Times New Roman" w:hAnsi="Consolas" w:cs="Times New Roman"/>
+          <w:color w:val="00FFF2"/>
+          <w:sz w:val="21"/>
+          <w:szCs w:val="21"/>
+        </w:rPr>
+        <w:t>visited</w:t>
+      </w:r>
+      <w:r>
+        <w:rPr>
+          <w:rFonts w:ascii="Consolas" w:eastAsia="Times New Roman" w:hAnsi="Consolas" w:cs="Times New Roman"/>
+          <w:color w:val="FFFFFF"/>
+          <w:sz w:val="21"/>
+          <w:szCs w:val="21"/>
+        </w:rPr>
+        <w:t xml:space="preserve"> {</w:t>
+      </w:r>
+    </w:p>
+    <w:p>
+      <w:pPr>
+        <w:shd w:val="clear" w:color="auto" w:fill="00002C"/>
+        <w:spacing w:line="285" w:lineRule="atLeast"/>
+        <w:rPr>
+          <w:rFonts w:ascii="Consolas" w:eastAsia="Times New Roman" w:hAnsi="Consolas" w:cs="Times New Roman"/>
+          <w:color w:val="FFFFFF"/>
+          <w:sz w:val="21"/>
+          <w:szCs w:val="21"/>
+        </w:rPr>
+      </w:pPr>
+    </w:p>
+    <w:p>
+      <w:pPr>
+        <w:shd w:val="clear" w:color="auto" w:fill="00002C"/>
+        <w:spacing w:line="285" w:lineRule="atLeast"/>
+        <w:rPr>
+          <w:rFonts w:ascii="Consolas" w:eastAsia="Times New Roman" w:hAnsi="Consolas" w:cs="Times New Roman"/>
+          <w:color w:val="FFFFFF"/>
+          <w:sz w:val="21"/>
+          <w:szCs w:val="21"/>
+        </w:rPr>
+      </w:pPr>
+      <w:r>
+        <w:rPr>
+          <w:rFonts w:ascii="Consolas" w:eastAsia="Times New Roman" w:hAnsi="Consolas" w:cs="Times New Roman"/>
+          <w:color w:val="FFFFFF"/>
+          <w:sz w:val="21"/>
+          <w:szCs w:val="21"/>
+        </w:rPr>
+        <w:t xml:space="preserve">            </w:t>
+      </w:r>
+      <w:proofErr w:type="gramStart"/>
+      <w:r>
+        <w:rPr>
+          <w:rFonts w:ascii="Consolas" w:eastAsia="Times New Roman" w:hAnsi="Consolas" w:cs="Times New Roman"/>
+          <w:color w:val="FFFFFF"/>
+          <w:sz w:val="21"/>
+          <w:szCs w:val="21"/>
+        </w:rPr>
+        <w:t>color</w:t>
+      </w:r>
+      <w:proofErr w:type="gramEnd"/>
+      <w:r>
+        <w:rPr>
+          <w:rFonts w:ascii="Consolas" w:eastAsia="Times New Roman" w:hAnsi="Consolas" w:cs="Times New Roman"/>
+          <w:color w:val="FFFFFF"/>
+          <w:sz w:val="21"/>
+          <w:szCs w:val="21"/>
+        </w:rPr>
+        <w:t xml:space="preserve">: </w:t>
+      </w:r>
+      <w:r>
+        <w:rPr>
+          <w:rFonts w:ascii="Consolas" w:eastAsia="Times New Roman" w:hAnsi="Consolas" w:cs="Times New Roman"/>
+          <w:color w:val="FF7E34"/>
+          <w:sz w:val="21"/>
+          <w:szCs w:val="21"/>
+        </w:rPr>
+        <w:t>yellow</w:t>
+      </w:r>
+      <w:r>
+        <w:rPr>
+          <w:rFonts w:ascii="Consolas" w:eastAsia="Times New Roman" w:hAnsi="Consolas" w:cs="Times New Roman"/>
+          <w:color w:val="FFFFFF"/>
+          <w:sz w:val="21"/>
+          <w:szCs w:val="21"/>
+        </w:rPr>
+        <w:t>;</w:t>
+      </w:r>
+    </w:p>
+    <w:p>
+      <w:pPr>
+        <w:shd w:val="clear" w:color="auto" w:fill="00002C"/>
+        <w:spacing w:line="285" w:lineRule="atLeast"/>
+        <w:rPr>
+          <w:rFonts w:ascii="Consolas" w:eastAsia="Times New Roman" w:hAnsi="Consolas" w:cs="Times New Roman"/>
+          <w:color w:val="FFFFFF"/>
+          <w:sz w:val="21"/>
+          <w:szCs w:val="21"/>
+        </w:rPr>
+      </w:pPr>
+      <w:r>
+        <w:rPr>
+          <w:rFonts w:ascii="Consolas" w:eastAsia="Times New Roman" w:hAnsi="Consolas" w:cs="Times New Roman"/>
+          <w:color w:val="FFFFFF"/>
+          <w:sz w:val="21"/>
+          <w:szCs w:val="21"/>
+        </w:rPr>
+        <w:t>        }</w:t>
+      </w:r>
+    </w:p>
+    <w:p>
+      <w:pPr>
+        <w:pStyle w:val="NoSpacing"/>
+      </w:pPr>
+    </w:p>
+    <w:p>
+      <w:pPr>
+        <w:pStyle w:val="NoSpacing"/>
+      </w:pPr>
+      <w:r>
+        <w:t xml:space="preserve">If we want the background color of the link </w:t>
+      </w:r>
+      <w:r>
+        <w:t xml:space="preserve">should be red or any other we want when we move the cursor the on the </w:t>
+      </w:r>
+      <w:proofErr w:type="gramStart"/>
+      <w:r>
+        <w:t>link  and</w:t>
+      </w:r>
+      <w:proofErr w:type="gramEnd"/>
+      <w:r>
+        <w:t xml:space="preserve"> click so we use the .</w:t>
+      </w:r>
+    </w:p>
+    <w:p>
+      <w:pPr>
+        <w:shd w:val="clear" w:color="auto" w:fill="00002C"/>
+        <w:spacing w:line="285" w:lineRule="atLeast"/>
+        <w:rPr>
+          <w:rFonts w:ascii="Consolas" w:eastAsia="Times New Roman" w:hAnsi="Consolas" w:cs="Times New Roman"/>
+          <w:color w:val="FFFFFF"/>
+          <w:sz w:val="21"/>
+          <w:szCs w:val="21"/>
+        </w:rPr>
+      </w:pPr>
+      <w:r>
+        <w:rPr>
+          <w:rFonts w:ascii="Consolas" w:eastAsia="Times New Roman" w:hAnsi="Consolas" w:cs="Times New Roman"/>
+          <w:color w:val="FFFFFF"/>
+          <w:sz w:val="21"/>
+          <w:szCs w:val="21"/>
+        </w:rPr>
+        <w:t>        }</w:t>
+      </w:r>
+    </w:p>
+    <w:p>
+      <w:pPr>
+        <w:shd w:val="clear" w:color="auto" w:fill="00002C"/>
+        <w:spacing w:line="285" w:lineRule="atLeast"/>
+        <w:rPr>
+          <w:rFonts w:ascii="Consolas" w:eastAsia="Times New Roman" w:hAnsi="Consolas" w:cs="Times New Roman"/>
+          <w:color w:val="FFFFFF"/>
+          <w:sz w:val="21"/>
+          <w:szCs w:val="21"/>
+        </w:rPr>
+      </w:pPr>
+      <w:r>
+        <w:rPr>
+          <w:rFonts w:ascii="Consolas" w:eastAsia="Times New Roman" w:hAnsi="Consolas" w:cs="Times New Roman"/>
+          <w:color w:val="FFFFFF"/>
+          <w:sz w:val="21"/>
+          <w:szCs w:val="21"/>
+        </w:rPr>
+        <w:t xml:space="preserve">        </w:t>
+      </w:r>
+      <w:proofErr w:type="gramStart"/>
+      <w:r>
+        <w:rPr>
+          <w:rFonts w:ascii="Consolas" w:eastAsia="Times New Roman" w:hAnsi="Consolas" w:cs="Times New Roman"/>
+          <w:color w:val="FF0077"/>
+          <w:sz w:val="21"/>
+          <w:szCs w:val="21"/>
+        </w:rPr>
+        <w:t>a</w:t>
+      </w:r>
+      <w:r>
+        <w:rPr>
+          <w:rFonts w:ascii="Consolas" w:eastAsia="Times New Roman" w:hAnsi="Consolas" w:cs="Times New Roman"/>
+          <w:color w:val="FFFFFF"/>
+          <w:sz w:val="21"/>
+          <w:szCs w:val="21"/>
+        </w:rPr>
+        <w:t>:</w:t>
+      </w:r>
+      <w:proofErr w:type="gramEnd"/>
+      <w:r>
+        <w:rPr>
+          <w:rFonts w:ascii="Consolas" w:eastAsia="Times New Roman" w:hAnsi="Consolas" w:cs="Times New Roman"/>
+          <w:color w:val="00FFF2"/>
+          <w:sz w:val="21"/>
+          <w:szCs w:val="21"/>
+        </w:rPr>
+        <w:t>active</w:t>
+      </w:r>
+      <w:r>
+        <w:rPr>
+          <w:rFonts w:ascii="Consolas" w:eastAsia="Times New Roman" w:hAnsi="Consolas" w:cs="Times New Roman"/>
+          <w:color w:val="FFFFFF"/>
+          <w:sz w:val="21"/>
+          <w:szCs w:val="21"/>
+        </w:rPr>
+        <w:t>{</w:t>
+      </w:r>
+    </w:p>
+    <w:p>
+      <w:pPr>
+        <w:shd w:val="clear" w:color="auto" w:fill="00002C"/>
+        <w:spacing w:line="285" w:lineRule="atLeast"/>
+        <w:rPr>
+          <w:rFonts w:ascii="Consolas" w:eastAsia="Times New Roman" w:hAnsi="Consolas" w:cs="Times New Roman"/>
+          <w:color w:val="FFFFFF"/>
+          <w:sz w:val="21"/>
+          <w:szCs w:val="21"/>
+        </w:rPr>
+      </w:pPr>
+      <w:r>
+        <w:rPr>
+          <w:rFonts w:ascii="Consolas" w:eastAsia="Times New Roman" w:hAnsi="Consolas" w:cs="Times New Roman"/>
+          <w:color w:val="FFFFFF"/>
+          <w:sz w:val="21"/>
+          <w:szCs w:val="21"/>
+        </w:rPr>
+        <w:t xml:space="preserve">            </w:t>
+      </w:r>
+      <w:proofErr w:type="gramStart"/>
+      <w:r>
+        <w:rPr>
+          <w:rFonts w:ascii="Consolas" w:eastAsia="Times New Roman" w:hAnsi="Consolas" w:cs="Times New Roman"/>
+          <w:color w:val="FFFFFF"/>
+          <w:sz w:val="21"/>
+          <w:szCs w:val="21"/>
+        </w:rPr>
+        <w:t>background-color</w:t>
+      </w:r>
+      <w:proofErr w:type="gramEnd"/>
+      <w:r>
+        <w:rPr>
+          <w:rFonts w:ascii="Consolas" w:eastAsia="Times New Roman" w:hAnsi="Consolas" w:cs="Times New Roman"/>
+          <w:color w:val="FFFFFF"/>
+          <w:sz w:val="21"/>
+          <w:szCs w:val="21"/>
+        </w:rPr>
+        <w:t xml:space="preserve">: </w:t>
+      </w:r>
+      <w:r>
+        <w:rPr>
+          <w:rFonts w:ascii="Consolas" w:eastAsia="Times New Roman" w:hAnsi="Consolas" w:cs="Times New Roman"/>
+          <w:color w:val="FF7E34"/>
+          <w:sz w:val="21"/>
+          <w:szCs w:val="21"/>
+        </w:rPr>
+        <w:t>blue</w:t>
+      </w:r>
+      <w:r>
+        <w:rPr>
+          <w:rFonts w:ascii="Consolas" w:eastAsia="Times New Roman" w:hAnsi="Consolas" w:cs="Times New Roman"/>
+          <w:color w:val="FFFFFF"/>
+          <w:sz w:val="21"/>
+          <w:szCs w:val="21"/>
+        </w:rPr>
+        <w:t>;</w:t>
+      </w:r>
+    </w:p>
+    <w:p>
+      <w:pPr>
+        <w:shd w:val="clear" w:color="auto" w:fill="00002C"/>
+        <w:spacing w:line="285" w:lineRule="atLeast"/>
+        <w:rPr>
+          <w:rFonts w:ascii="Consolas" w:eastAsia="Times New Roman" w:hAnsi="Consolas" w:cs="Times New Roman"/>
+          <w:color w:val="FFFFFF"/>
+          <w:sz w:val="21"/>
+          <w:szCs w:val="21"/>
+        </w:rPr>
+      </w:pPr>
+      <w:r>
+        <w:rPr>
+          <w:rFonts w:ascii="Consolas" w:eastAsia="Times New Roman" w:hAnsi="Consolas" w:cs="Times New Roman"/>
+          <w:color w:val="FFFFFF"/>
+          <w:sz w:val="21"/>
+          <w:szCs w:val="21"/>
+        </w:rPr>
+        <w:t>        }</w:t>
+      </w:r>
+    </w:p>
+    <w:p>
+      <w:pPr>
+        <w:pStyle w:val="NoSpacing"/>
+      </w:pPr>
+      <w:r>
+        <w:t xml:space="preserve">This make the background of the google .com blue when we </w:t>
+      </w:r>
+      <w:proofErr w:type="spellStart"/>
+      <w:r>
+        <w:t>mmove</w:t>
+      </w:r>
+      <w:proofErr w:type="spellEnd"/>
+      <w:r>
+        <w:t xml:space="preserve"> the cursor on it and click</w:t>
+      </w:r>
+    </w:p>
+    <w:p>
+      <w:pPr>
+        <w:pStyle w:val="NoSpacing"/>
+      </w:pPr>
+      <w:r>
+        <w:t>If we want that when we just move the cursor on the link its color become changed so we use</w:t>
+      </w:r>
+    </w:p>
+    <w:p>
+      <w:pPr>
+        <w:pStyle w:val="NoSpacing"/>
+      </w:pPr>
+    </w:p>
+    <w:p>
+      <w:pPr>
+        <w:pStyle w:val="NoSpacing"/>
+      </w:pPr>
+    </w:p>
+    <w:p>
+      <w:pPr>
+        <w:pStyle w:val="NoSpacing"/>
+        <w:rPr>
+          <w:b/>
+          <w:sz w:val="28"/>
+          <w:szCs w:val="28"/>
+        </w:rPr>
+      </w:pPr>
+    </w:p>
+    <w:p>
+      <w:pPr>
+        <w:pStyle w:val="NoSpacing"/>
+        <w:rPr>
+          <w:b/>
+          <w:sz w:val="28"/>
+          <w:szCs w:val="28"/>
+        </w:rPr>
+      </w:pPr>
+      <w:r>
+        <w:rPr>
+          <w:b/>
+          <w:sz w:val="28"/>
+          <w:szCs w:val="28"/>
+        </w:rPr>
+        <w:t xml:space="preserve">Border Margin and </w:t>
+      </w:r>
+      <w:proofErr w:type="spellStart"/>
+      <w:r>
+        <w:rPr>
+          <w:b/>
+          <w:sz w:val="28"/>
+          <w:szCs w:val="28"/>
+        </w:rPr>
+        <w:t>Pading</w:t>
+      </w:r>
+      <w:proofErr w:type="spellEnd"/>
+      <w:r>
+        <w:rPr>
+          <w:b/>
+          <w:sz w:val="28"/>
+          <w:szCs w:val="28"/>
+        </w:rPr>
+        <w:t>:</w:t>
+      </w:r>
+    </w:p>
+    <w:p>
+      <w:pPr>
+        <w:pStyle w:val="NoSpacing"/>
+        <w:rPr>
+          <w:b/>
+          <w:sz w:val="28"/>
+          <w:szCs w:val="28"/>
+        </w:rPr>
+      </w:pPr>
+    </w:p>
+    <w:p>
+      <w:pPr>
+        <w:pStyle w:val="NoSpacing"/>
+      </w:pPr>
+    </w:p>
+    <w:p>
+      <w:pPr>
+        <w:pStyle w:val="Quote"/>
       </w:pPr>
       <w:bookmarkStart w:id="5" w:name="_GoBack"/>
       <w:bookmarkEnd w:id="5"/>
@@ -15206,7 +16134,7 @@
 </file>
 
 <file path=customXml/itemProps1.xml><?xml version="1.0" encoding="utf-8"?>
-<ds:datastoreItem xmlns:ds="http://schemas.openxmlformats.org/officeDocument/2006/customXml" ds:itemID="{16063102-F461-4613-9EF6-F69381DE4C33}">
+<ds:datastoreItem xmlns:ds="http://schemas.openxmlformats.org/officeDocument/2006/customXml" ds:itemID="{64765402-BB2C-4596-93C6-589FEC24F1AA}">
   <ds:schemaRefs>
     <ds:schemaRef ds:uri="http://schemas.openxmlformats.org/officeDocument/2006/bibliography"/>
   </ds:schemaRefs>

</xml_diff>

<commit_message>
adding the day 05 programs
</commit_message>
<xml_diff>
--- a/Web_Development Notes Scratch to pro.docx
+++ b/Web_Development Notes Scratch to pro.docx
@@ -366,7 +366,7 @@
           <w:color w:val="434343"/>
         </w:rPr>
         <w:sectPr>
-          <w:headerReference w:type="default" r:id="rId8"/>
+          <w:footerReference w:type="default" r:id="rId8"/>
           <w:pgSz w:w="11909" w:h="16834"/>
           <w:pgMar w:top="1440" w:right="1440" w:bottom="1440" w:left="1559" w:header="720" w:footer="720" w:gutter="0"/>
           <w:pgNumType w:start="1"/>
@@ -11023,13 +11023,7 @@
         <w:rPr>
           <w:b/>
         </w:rPr>
-        <w:t xml:space="preserve"> </w:t>
-      </w:r>
-      <w:r>
-        <w:rPr>
-          <w:b/>
-        </w:rPr>
-        <w:t>sep,2026</w:t>
+        <w:t xml:space="preserve"> sep,2026</w:t>
       </w:r>
     </w:p>
     <w:p>
@@ -12125,13 +12119,7 @@
         <w:rPr>
           <w:b/>
         </w:rPr>
-        <w:t xml:space="preserve"> </w:t>
-      </w:r>
-      <w:r>
-        <w:rPr>
-          <w:b/>
-        </w:rPr>
-        <w:t>,2026</w:t>
+        <w:t xml:space="preserve"> ,2026</w:t>
       </w:r>
     </w:p>
     <w:p>
@@ -13198,7 +13186,24 @@
     <w:p>
       <w:pPr>
         <w:pStyle w:val="NoSpacing"/>
-      </w:pPr>
+        <w:rPr>
+          <w:b/>
+        </w:rPr>
+      </w:pPr>
+      <w:r>
+        <w:rPr>
+          <w:b/>
+        </w:rPr>
+        <w:t>5 sep</w:t>
+      </w:r>
+      <w:proofErr w:type="gramStart"/>
+      <w:r>
+        <w:rPr>
+          <w:b/>
+        </w:rPr>
+        <w:t>,2026</w:t>
+      </w:r>
+      <w:proofErr w:type="gramEnd"/>
     </w:p>
     <w:p>
       <w:pPr>
@@ -13259,12 +13264,1526 @@
     <w:p>
       <w:pPr>
         <w:pStyle w:val="NoSpacing"/>
-      </w:pPr>
+        <w:ind w:firstLine="720"/>
+      </w:pPr>
+      <w:r>
+        <w:t xml:space="preserve">The thing we made from the </w:t>
+      </w:r>
+      <w:proofErr w:type="gramStart"/>
+      <w:r>
+        <w:t>html  are</w:t>
+      </w:r>
+      <w:proofErr w:type="gramEnd"/>
+      <w:r>
+        <w:t xml:space="preserve"> said to the box in the </w:t>
+      </w:r>
+      <w:proofErr w:type="spellStart"/>
+      <w:r>
+        <w:t>css</w:t>
+      </w:r>
+      <w:proofErr w:type="spellEnd"/>
+      <w:r>
+        <w:t xml:space="preserve"> whether in the html we made a div , span or </w:t>
+      </w:r>
+      <w:proofErr w:type="spellStart"/>
+      <w:r>
+        <w:t>any thing</w:t>
+      </w:r>
+      <w:proofErr w:type="spellEnd"/>
+      <w:r>
+        <w:t xml:space="preserve"> is taken as box in the </w:t>
+      </w:r>
+      <w:proofErr w:type="spellStart"/>
+      <w:r>
+        <w:t>css</w:t>
+      </w:r>
+      <w:proofErr w:type="spellEnd"/>
+    </w:p>
+    <w:p>
+      <w:pPr>
+        <w:pStyle w:val="NoSpacing"/>
+        <w:ind w:firstLine="720"/>
+      </w:pPr>
+    </w:p>
+    <w:p>
+      <w:pPr>
+        <w:pStyle w:val="NoSpacing"/>
+        <w:ind w:firstLine="720"/>
+      </w:pPr>
+    </w:p>
+    <w:p>
+      <w:pPr>
+        <w:pStyle w:val="NoSpacing"/>
+        <w:ind w:firstLine="720"/>
+      </w:pPr>
+      <w:r>
+        <w:t xml:space="preserve"> The general overview of the box is here below.</w:t>
+      </w:r>
     </w:p>
     <w:p>
       <w:pPr>
         <w:pStyle w:val="Quote"/>
       </w:pPr>
+      <w:r>
+        <w:lastRenderedPageBreak/>
+        <w:drawing>
+          <wp:inline distT="0" distB="0" distL="0" distR="0" wp14:anchorId="3E3122DD" wp14:editId="7E13515F">
+            <wp:extent cx="2772162" cy="1590897"/>
+            <wp:effectExtent l="0" t="0" r="9525" b="9525"/>
+            <wp:docPr id="1" name="Picture 1"/>
+            <wp:cNvGraphicFramePr>
+              <a:graphicFrameLocks xmlns:a="http://schemas.openxmlformats.org/drawingml/2006/main" noChangeAspect="1"/>
+            </wp:cNvGraphicFramePr>
+            <a:graphic xmlns:a="http://schemas.openxmlformats.org/drawingml/2006/main">
+              <a:graphicData uri="http://schemas.openxmlformats.org/drawingml/2006/picture">
+                <pic:pic xmlns:pic="http://schemas.openxmlformats.org/drawingml/2006/picture">
+                  <pic:nvPicPr>
+                    <pic:cNvPr id="1" name=""/>
+                    <pic:cNvPicPr/>
+                  </pic:nvPicPr>
+                  <pic:blipFill>
+                    <a:blip r:embed="rId20"/>
+                    <a:stretch>
+                      <a:fillRect/>
+                    </a:stretch>
+                  </pic:blipFill>
+                  <pic:spPr>
+                    <a:xfrm>
+                      <a:off x="0" y="0"/>
+                      <a:ext cx="2772162" cy="1590897"/>
+                    </a:xfrm>
+                    <a:prstGeom prst="rect">
+                      <a:avLst/>
+                    </a:prstGeom>
+                  </pic:spPr>
+                </pic:pic>
+              </a:graphicData>
+            </a:graphic>
+          </wp:inline>
+        </w:drawing>
+      </w:r>
+    </w:p>
+    <w:p/>
+    <w:p>
+      <w:pPr>
+        <w:tabs>
+          <w:tab w:val="left" w:pos="1005"/>
+        </w:tabs>
+      </w:pPr>
+      <w:r>
+        <w:tab/>
+        <w:t xml:space="preserve">As mention in the pic the first inside is the content and then padding and then </w:t>
+      </w:r>
+      <w:proofErr w:type="gramStart"/>
+      <w:r>
+        <w:t>margin .</w:t>
+      </w:r>
+      <w:proofErr w:type="gramEnd"/>
+      <w:r>
+        <w:t xml:space="preserve"> </w:t>
+      </w:r>
+      <w:proofErr w:type="gramStart"/>
+      <w:r>
+        <w:t>we</w:t>
+      </w:r>
+      <w:proofErr w:type="gramEnd"/>
+      <w:r>
+        <w:t xml:space="preserve"> can add the padding margin border by </w:t>
+      </w:r>
+      <w:proofErr w:type="spellStart"/>
+      <w:r>
+        <w:t>css</w:t>
+      </w:r>
+      <w:proofErr w:type="spellEnd"/>
+      <w:r>
+        <w:t xml:space="preserve"> selectors . </w:t>
+      </w:r>
+      <w:proofErr w:type="gramStart"/>
+      <w:r>
+        <w:t>here</w:t>
+      </w:r>
+      <w:proofErr w:type="gramEnd"/>
+      <w:r>
+        <w:t xml:space="preserve"> I display the full program and then you will understand</w:t>
+      </w:r>
+    </w:p>
+    <w:p>
+      <w:pPr>
+        <w:shd w:val="clear" w:color="auto" w:fill="00002C"/>
+        <w:spacing w:line="285" w:lineRule="atLeast"/>
+        <w:rPr>
+          <w:rFonts w:ascii="Consolas" w:eastAsia="Times New Roman" w:hAnsi="Consolas" w:cs="Times New Roman"/>
+          <w:color w:val="FFFFFF"/>
+          <w:sz w:val="21"/>
+          <w:szCs w:val="21"/>
+        </w:rPr>
+      </w:pPr>
+      <w:r>
+        <w:rPr>
+          <w:rFonts w:ascii="Consolas" w:eastAsia="Times New Roman" w:hAnsi="Consolas" w:cs="Times New Roman"/>
+          <w:color w:val="FFFFFF"/>
+          <w:sz w:val="21"/>
+          <w:szCs w:val="21"/>
+        </w:rPr>
+        <w:t>  &lt;</w:t>
+      </w:r>
+      <w:proofErr w:type="gramStart"/>
+      <w:r>
+        <w:rPr>
+          <w:rFonts w:ascii="Consolas" w:eastAsia="Times New Roman" w:hAnsi="Consolas" w:cs="Times New Roman"/>
+          <w:color w:val="FF0077"/>
+          <w:sz w:val="21"/>
+          <w:szCs w:val="21"/>
+        </w:rPr>
+        <w:t>style</w:t>
+      </w:r>
+      <w:proofErr w:type="gramEnd"/>
+      <w:r>
+        <w:rPr>
+          <w:rFonts w:ascii="Consolas" w:eastAsia="Times New Roman" w:hAnsi="Consolas" w:cs="Times New Roman"/>
+          <w:color w:val="FFFFFF"/>
+          <w:sz w:val="21"/>
+          <w:szCs w:val="21"/>
+        </w:rPr>
+        <w:t>&gt;</w:t>
+      </w:r>
+    </w:p>
+    <w:p>
+      <w:pPr>
+        <w:shd w:val="clear" w:color="auto" w:fill="00002C"/>
+        <w:spacing w:line="285" w:lineRule="atLeast"/>
+        <w:rPr>
+          <w:rFonts w:ascii="Consolas" w:eastAsia="Times New Roman" w:hAnsi="Consolas" w:cs="Times New Roman"/>
+          <w:color w:val="FFFFFF"/>
+          <w:sz w:val="21"/>
+          <w:szCs w:val="21"/>
+        </w:rPr>
+      </w:pPr>
+      <w:r>
+        <w:rPr>
+          <w:rFonts w:ascii="Consolas" w:eastAsia="Times New Roman" w:hAnsi="Consolas" w:cs="Times New Roman"/>
+          <w:color w:val="FFFFFF"/>
+          <w:sz w:val="21"/>
+          <w:szCs w:val="21"/>
+        </w:rPr>
+        <w:t>.</w:t>
+      </w:r>
+      <w:proofErr w:type="gramStart"/>
+      <w:r>
+        <w:rPr>
+          <w:rFonts w:ascii="Consolas" w:eastAsia="Times New Roman" w:hAnsi="Consolas" w:cs="Times New Roman"/>
+          <w:color w:val="FFCB6B"/>
+          <w:sz w:val="21"/>
+          <w:szCs w:val="21"/>
+        </w:rPr>
+        <w:t>box</w:t>
+      </w:r>
+      <w:r>
+        <w:rPr>
+          <w:rFonts w:ascii="Consolas" w:eastAsia="Times New Roman" w:hAnsi="Consolas" w:cs="Times New Roman"/>
+          <w:color w:val="FFFFFF"/>
+          <w:sz w:val="21"/>
+          <w:szCs w:val="21"/>
+        </w:rPr>
+        <w:t>{</w:t>
+      </w:r>
+      <w:proofErr w:type="gramEnd"/>
+    </w:p>
+    <w:p>
+      <w:pPr>
+        <w:shd w:val="clear" w:color="auto" w:fill="00002C"/>
+        <w:spacing w:line="285" w:lineRule="atLeast"/>
+        <w:rPr>
+          <w:rFonts w:ascii="Consolas" w:eastAsia="Times New Roman" w:hAnsi="Consolas" w:cs="Times New Roman"/>
+          <w:color w:val="FFFFFF"/>
+          <w:sz w:val="21"/>
+          <w:szCs w:val="21"/>
+        </w:rPr>
+      </w:pPr>
+      <w:r>
+        <w:rPr>
+          <w:rFonts w:ascii="Consolas" w:eastAsia="Times New Roman" w:hAnsi="Consolas" w:cs="Times New Roman"/>
+          <w:color w:val="FFFFFF"/>
+          <w:sz w:val="21"/>
+          <w:szCs w:val="21"/>
+        </w:rPr>
+        <w:t xml:space="preserve">    </w:t>
+      </w:r>
+      <w:proofErr w:type="gramStart"/>
+      <w:r>
+        <w:rPr>
+          <w:rFonts w:ascii="Consolas" w:eastAsia="Times New Roman" w:hAnsi="Consolas" w:cs="Times New Roman"/>
+          <w:color w:val="FFFFFF"/>
+          <w:sz w:val="21"/>
+          <w:szCs w:val="21"/>
+        </w:rPr>
+        <w:t>background-color</w:t>
+      </w:r>
+      <w:proofErr w:type="gramEnd"/>
+      <w:r>
+        <w:rPr>
+          <w:rFonts w:ascii="Consolas" w:eastAsia="Times New Roman" w:hAnsi="Consolas" w:cs="Times New Roman"/>
+          <w:color w:val="FFFFFF"/>
+          <w:sz w:val="21"/>
+          <w:szCs w:val="21"/>
+        </w:rPr>
+        <w:t xml:space="preserve">: </w:t>
+      </w:r>
+      <w:proofErr w:type="spellStart"/>
+      <w:r>
+        <w:rPr>
+          <w:rFonts w:ascii="Consolas" w:eastAsia="Times New Roman" w:hAnsi="Consolas" w:cs="Times New Roman"/>
+          <w:color w:val="00FFFF"/>
+          <w:sz w:val="21"/>
+          <w:szCs w:val="21"/>
+        </w:rPr>
+        <w:t>rgb</w:t>
+      </w:r>
+      <w:proofErr w:type="spellEnd"/>
+      <w:r>
+        <w:rPr>
+          <w:rFonts w:ascii="Consolas" w:eastAsia="Times New Roman" w:hAnsi="Consolas" w:cs="Times New Roman"/>
+          <w:color w:val="FFFFFF"/>
+          <w:sz w:val="21"/>
+          <w:szCs w:val="21"/>
+        </w:rPr>
+        <w:t>(</w:t>
+      </w:r>
+      <w:r>
+        <w:rPr>
+          <w:rFonts w:ascii="Consolas" w:eastAsia="Times New Roman" w:hAnsi="Consolas" w:cs="Times New Roman"/>
+          <w:color w:val="FF7E34"/>
+          <w:sz w:val="21"/>
+          <w:szCs w:val="21"/>
+        </w:rPr>
+        <w:t>196</w:t>
+      </w:r>
+      <w:r>
+        <w:rPr>
+          <w:rFonts w:ascii="Consolas" w:eastAsia="Times New Roman" w:hAnsi="Consolas" w:cs="Times New Roman"/>
+          <w:color w:val="FFFFFF"/>
+          <w:sz w:val="21"/>
+          <w:szCs w:val="21"/>
+        </w:rPr>
+        <w:t xml:space="preserve">, </w:t>
+      </w:r>
+      <w:r>
+        <w:rPr>
+          <w:rFonts w:ascii="Consolas" w:eastAsia="Times New Roman" w:hAnsi="Consolas" w:cs="Times New Roman"/>
+          <w:color w:val="FF7E34"/>
+          <w:sz w:val="21"/>
+          <w:szCs w:val="21"/>
+        </w:rPr>
+        <w:t>255</w:t>
+      </w:r>
+      <w:r>
+        <w:rPr>
+          <w:rFonts w:ascii="Consolas" w:eastAsia="Times New Roman" w:hAnsi="Consolas" w:cs="Times New Roman"/>
+          <w:color w:val="FFFFFF"/>
+          <w:sz w:val="21"/>
+          <w:szCs w:val="21"/>
+        </w:rPr>
+        <w:t xml:space="preserve">, </w:t>
+      </w:r>
+      <w:r>
+        <w:rPr>
+          <w:rFonts w:ascii="Consolas" w:eastAsia="Times New Roman" w:hAnsi="Consolas" w:cs="Times New Roman"/>
+          <w:color w:val="FF7E34"/>
+          <w:sz w:val="21"/>
+          <w:szCs w:val="21"/>
+        </w:rPr>
+        <w:t>204</w:t>
+      </w:r>
+      <w:r>
+        <w:rPr>
+          <w:rFonts w:ascii="Consolas" w:eastAsia="Times New Roman" w:hAnsi="Consolas" w:cs="Times New Roman"/>
+          <w:color w:val="FFFFFF"/>
+          <w:sz w:val="21"/>
+          <w:szCs w:val="21"/>
+        </w:rPr>
+        <w:t>);</w:t>
+      </w:r>
+    </w:p>
+    <w:p>
+      <w:pPr>
+        <w:shd w:val="clear" w:color="auto" w:fill="00002C"/>
+        <w:spacing w:line="285" w:lineRule="atLeast"/>
+        <w:rPr>
+          <w:rFonts w:ascii="Consolas" w:eastAsia="Times New Roman" w:hAnsi="Consolas" w:cs="Times New Roman"/>
+          <w:color w:val="FFFFFF"/>
+          <w:sz w:val="21"/>
+          <w:szCs w:val="21"/>
+        </w:rPr>
+      </w:pPr>
+      <w:r>
+        <w:rPr>
+          <w:rFonts w:ascii="Consolas" w:eastAsia="Times New Roman" w:hAnsi="Consolas" w:cs="Times New Roman"/>
+          <w:color w:val="FFFFFF"/>
+          <w:sz w:val="21"/>
+          <w:szCs w:val="21"/>
+        </w:rPr>
+        <w:t>}</w:t>
+      </w:r>
+    </w:p>
+    <w:p>
+      <w:pPr>
+        <w:shd w:val="clear" w:color="auto" w:fill="00002C"/>
+        <w:spacing w:line="285" w:lineRule="atLeast"/>
+        <w:rPr>
+          <w:rFonts w:ascii="Consolas" w:eastAsia="Times New Roman" w:hAnsi="Consolas" w:cs="Times New Roman"/>
+          <w:color w:val="FFFFFF"/>
+          <w:sz w:val="21"/>
+          <w:szCs w:val="21"/>
+        </w:rPr>
+      </w:pPr>
+      <w:r>
+        <w:rPr>
+          <w:rFonts w:ascii="Consolas" w:eastAsia="Times New Roman" w:hAnsi="Consolas" w:cs="Times New Roman"/>
+          <w:color w:val="FFFFFF"/>
+          <w:sz w:val="21"/>
+          <w:szCs w:val="21"/>
+        </w:rPr>
+        <w:t>.</w:t>
+      </w:r>
+      <w:proofErr w:type="gramStart"/>
+      <w:r>
+        <w:rPr>
+          <w:rFonts w:ascii="Consolas" w:eastAsia="Times New Roman" w:hAnsi="Consolas" w:cs="Times New Roman"/>
+          <w:color w:val="FFCB6B"/>
+          <w:sz w:val="21"/>
+          <w:szCs w:val="21"/>
+        </w:rPr>
+        <w:t>box1</w:t>
+      </w:r>
+      <w:r>
+        <w:rPr>
+          <w:rFonts w:ascii="Consolas" w:eastAsia="Times New Roman" w:hAnsi="Consolas" w:cs="Times New Roman"/>
+          <w:color w:val="FFFFFF"/>
+          <w:sz w:val="21"/>
+          <w:szCs w:val="21"/>
+        </w:rPr>
+        <w:t>{</w:t>
+      </w:r>
+      <w:proofErr w:type="gramEnd"/>
+    </w:p>
+    <w:p>
+      <w:pPr>
+        <w:shd w:val="clear" w:color="auto" w:fill="00002C"/>
+        <w:spacing w:line="285" w:lineRule="atLeast"/>
+        <w:rPr>
+          <w:rFonts w:ascii="Consolas" w:eastAsia="Times New Roman" w:hAnsi="Consolas" w:cs="Times New Roman"/>
+          <w:color w:val="FFFFFF"/>
+          <w:sz w:val="21"/>
+          <w:szCs w:val="21"/>
+        </w:rPr>
+      </w:pPr>
+      <w:r>
+        <w:rPr>
+          <w:rFonts w:ascii="Consolas" w:eastAsia="Times New Roman" w:hAnsi="Consolas" w:cs="Times New Roman"/>
+          <w:color w:val="FFFFFF"/>
+          <w:sz w:val="21"/>
+          <w:szCs w:val="21"/>
+        </w:rPr>
+        <w:t xml:space="preserve">    </w:t>
+      </w:r>
+      <w:proofErr w:type="gramStart"/>
+      <w:r>
+        <w:rPr>
+          <w:rFonts w:ascii="Consolas" w:eastAsia="Times New Roman" w:hAnsi="Consolas" w:cs="Times New Roman"/>
+          <w:color w:val="FFFFFF"/>
+          <w:sz w:val="21"/>
+          <w:szCs w:val="21"/>
+        </w:rPr>
+        <w:t>color</w:t>
+      </w:r>
+      <w:proofErr w:type="gramEnd"/>
+      <w:r>
+        <w:rPr>
+          <w:rFonts w:ascii="Consolas" w:eastAsia="Times New Roman" w:hAnsi="Consolas" w:cs="Times New Roman"/>
+          <w:color w:val="FFFFFF"/>
+          <w:sz w:val="21"/>
+          <w:szCs w:val="21"/>
+        </w:rPr>
+        <w:t xml:space="preserve">: </w:t>
+      </w:r>
+      <w:r>
+        <w:rPr>
+          <w:rFonts w:ascii="Consolas" w:eastAsia="Times New Roman" w:hAnsi="Consolas" w:cs="Times New Roman"/>
+          <w:color w:val="FF7E34"/>
+          <w:sz w:val="21"/>
+          <w:szCs w:val="21"/>
+        </w:rPr>
+        <w:t>blue</w:t>
+      </w:r>
+      <w:r>
+        <w:rPr>
+          <w:rFonts w:ascii="Consolas" w:eastAsia="Times New Roman" w:hAnsi="Consolas" w:cs="Times New Roman"/>
+          <w:color w:val="FFFFFF"/>
+          <w:sz w:val="21"/>
+          <w:szCs w:val="21"/>
+        </w:rPr>
+        <w:t>;</w:t>
+      </w:r>
+    </w:p>
+    <w:p>
+      <w:pPr>
+        <w:shd w:val="clear" w:color="auto" w:fill="00002C"/>
+        <w:spacing w:line="285" w:lineRule="atLeast"/>
+        <w:rPr>
+          <w:rFonts w:ascii="Consolas" w:eastAsia="Times New Roman" w:hAnsi="Consolas" w:cs="Times New Roman"/>
+          <w:color w:val="FFFFFF"/>
+          <w:sz w:val="21"/>
+          <w:szCs w:val="21"/>
+        </w:rPr>
+      </w:pPr>
+      <w:r>
+        <w:rPr>
+          <w:rFonts w:ascii="Consolas" w:eastAsia="Times New Roman" w:hAnsi="Consolas" w:cs="Times New Roman"/>
+          <w:color w:val="FFFFFF"/>
+          <w:sz w:val="21"/>
+          <w:szCs w:val="21"/>
+        </w:rPr>
+        <w:t xml:space="preserve">    </w:t>
+      </w:r>
+      <w:proofErr w:type="gramStart"/>
+      <w:r>
+        <w:rPr>
+          <w:rFonts w:ascii="Consolas" w:eastAsia="Times New Roman" w:hAnsi="Consolas" w:cs="Times New Roman"/>
+          <w:color w:val="FFFFFF"/>
+          <w:sz w:val="21"/>
+          <w:szCs w:val="21"/>
+        </w:rPr>
+        <w:t>padding</w:t>
+      </w:r>
+      <w:proofErr w:type="gramEnd"/>
+      <w:r>
+        <w:rPr>
+          <w:rFonts w:ascii="Consolas" w:eastAsia="Times New Roman" w:hAnsi="Consolas" w:cs="Times New Roman"/>
+          <w:color w:val="FFFFFF"/>
+          <w:sz w:val="21"/>
+          <w:szCs w:val="21"/>
+        </w:rPr>
+        <w:t xml:space="preserve">: </w:t>
+      </w:r>
+      <w:r>
+        <w:rPr>
+          <w:rFonts w:ascii="Consolas" w:eastAsia="Times New Roman" w:hAnsi="Consolas" w:cs="Times New Roman"/>
+          <w:color w:val="FF7E34"/>
+          <w:sz w:val="21"/>
+          <w:szCs w:val="21"/>
+        </w:rPr>
+        <w:t>11</w:t>
+      </w:r>
+      <w:r>
+        <w:rPr>
+          <w:rFonts w:ascii="Consolas" w:eastAsia="Times New Roman" w:hAnsi="Consolas" w:cs="Times New Roman"/>
+          <w:color w:val="82FBFF"/>
+          <w:sz w:val="21"/>
+          <w:szCs w:val="21"/>
+        </w:rPr>
+        <w:t>px</w:t>
+      </w:r>
+      <w:r>
+        <w:rPr>
+          <w:rFonts w:ascii="Consolas" w:eastAsia="Times New Roman" w:hAnsi="Consolas" w:cs="Times New Roman"/>
+          <w:color w:val="FFFFFF"/>
+          <w:sz w:val="21"/>
+          <w:szCs w:val="21"/>
+        </w:rPr>
+        <w:t>;</w:t>
+      </w:r>
+    </w:p>
+    <w:p>
+      <w:pPr>
+        <w:shd w:val="clear" w:color="auto" w:fill="00002C"/>
+        <w:spacing w:line="285" w:lineRule="atLeast"/>
+        <w:rPr>
+          <w:rFonts w:ascii="Consolas" w:eastAsia="Times New Roman" w:hAnsi="Consolas" w:cs="Times New Roman"/>
+          <w:color w:val="FFFFFF"/>
+          <w:sz w:val="21"/>
+          <w:szCs w:val="21"/>
+        </w:rPr>
+      </w:pPr>
+      <w:r>
+        <w:rPr>
+          <w:rFonts w:ascii="Consolas" w:eastAsia="Times New Roman" w:hAnsi="Consolas" w:cs="Times New Roman"/>
+          <w:color w:val="FFFFFF"/>
+          <w:sz w:val="21"/>
+          <w:szCs w:val="21"/>
+        </w:rPr>
+        <w:t xml:space="preserve">    </w:t>
+      </w:r>
+      <w:proofErr w:type="gramStart"/>
+      <w:r>
+        <w:rPr>
+          <w:rFonts w:ascii="Consolas" w:eastAsia="Times New Roman" w:hAnsi="Consolas" w:cs="Times New Roman"/>
+          <w:color w:val="FFFFFF"/>
+          <w:sz w:val="21"/>
+          <w:szCs w:val="21"/>
+        </w:rPr>
+        <w:t>margin</w:t>
+      </w:r>
+      <w:proofErr w:type="gramEnd"/>
+      <w:r>
+        <w:rPr>
+          <w:rFonts w:ascii="Consolas" w:eastAsia="Times New Roman" w:hAnsi="Consolas" w:cs="Times New Roman"/>
+          <w:color w:val="FFFFFF"/>
+          <w:sz w:val="21"/>
+          <w:szCs w:val="21"/>
+        </w:rPr>
+        <w:t xml:space="preserve">: </w:t>
+      </w:r>
+      <w:r>
+        <w:rPr>
+          <w:rFonts w:ascii="Consolas" w:eastAsia="Times New Roman" w:hAnsi="Consolas" w:cs="Times New Roman"/>
+          <w:color w:val="FF7E34"/>
+          <w:sz w:val="21"/>
+          <w:szCs w:val="21"/>
+        </w:rPr>
+        <w:t>5</w:t>
+      </w:r>
+      <w:r>
+        <w:rPr>
+          <w:rFonts w:ascii="Consolas" w:eastAsia="Times New Roman" w:hAnsi="Consolas" w:cs="Times New Roman"/>
+          <w:color w:val="82FBFF"/>
+          <w:sz w:val="21"/>
+          <w:szCs w:val="21"/>
+        </w:rPr>
+        <w:t>px</w:t>
+      </w:r>
+      <w:r>
+        <w:rPr>
+          <w:rFonts w:ascii="Consolas" w:eastAsia="Times New Roman" w:hAnsi="Consolas" w:cs="Times New Roman"/>
+          <w:color w:val="FFFFFF"/>
+          <w:sz w:val="21"/>
+          <w:szCs w:val="21"/>
+        </w:rPr>
+        <w:t>;</w:t>
+      </w:r>
+    </w:p>
+    <w:p>
+      <w:pPr>
+        <w:shd w:val="clear" w:color="auto" w:fill="00002C"/>
+        <w:spacing w:line="285" w:lineRule="atLeast"/>
+        <w:rPr>
+          <w:rFonts w:ascii="Consolas" w:eastAsia="Times New Roman" w:hAnsi="Consolas" w:cs="Times New Roman"/>
+          <w:color w:val="FFFFFF"/>
+          <w:sz w:val="21"/>
+          <w:szCs w:val="21"/>
+        </w:rPr>
+      </w:pPr>
+      <w:r>
+        <w:rPr>
+          <w:rFonts w:ascii="Consolas" w:eastAsia="Times New Roman" w:hAnsi="Consolas" w:cs="Times New Roman"/>
+          <w:color w:val="FFFFFF"/>
+          <w:sz w:val="21"/>
+          <w:szCs w:val="21"/>
+        </w:rPr>
+        <w:t xml:space="preserve">    </w:t>
+      </w:r>
+      <w:proofErr w:type="gramStart"/>
+      <w:r>
+        <w:rPr>
+          <w:rFonts w:ascii="Consolas" w:eastAsia="Times New Roman" w:hAnsi="Consolas" w:cs="Times New Roman"/>
+          <w:color w:val="FFFFFF"/>
+          <w:sz w:val="21"/>
+          <w:szCs w:val="21"/>
+        </w:rPr>
+        <w:t>border</w:t>
+      </w:r>
+      <w:proofErr w:type="gramEnd"/>
+      <w:r>
+        <w:rPr>
+          <w:rFonts w:ascii="Consolas" w:eastAsia="Times New Roman" w:hAnsi="Consolas" w:cs="Times New Roman"/>
+          <w:color w:val="FFFFFF"/>
+          <w:sz w:val="21"/>
+          <w:szCs w:val="21"/>
+        </w:rPr>
+        <w:t xml:space="preserve">: </w:t>
+      </w:r>
+      <w:r>
+        <w:rPr>
+          <w:rFonts w:ascii="Consolas" w:eastAsia="Times New Roman" w:hAnsi="Consolas" w:cs="Times New Roman"/>
+          <w:color w:val="FF7E34"/>
+          <w:sz w:val="21"/>
+          <w:szCs w:val="21"/>
+        </w:rPr>
+        <w:t>2</w:t>
+      </w:r>
+      <w:r>
+        <w:rPr>
+          <w:rFonts w:ascii="Consolas" w:eastAsia="Times New Roman" w:hAnsi="Consolas" w:cs="Times New Roman"/>
+          <w:color w:val="82FBFF"/>
+          <w:sz w:val="21"/>
+          <w:szCs w:val="21"/>
+        </w:rPr>
+        <w:t>px</w:t>
+      </w:r>
+      <w:r>
+        <w:rPr>
+          <w:rFonts w:ascii="Consolas" w:eastAsia="Times New Roman" w:hAnsi="Consolas" w:cs="Times New Roman"/>
+          <w:color w:val="FFFFFF"/>
+          <w:sz w:val="21"/>
+          <w:szCs w:val="21"/>
+        </w:rPr>
+        <w:t xml:space="preserve"> </w:t>
+      </w:r>
+      <w:r>
+        <w:rPr>
+          <w:rFonts w:ascii="Consolas" w:eastAsia="Times New Roman" w:hAnsi="Consolas" w:cs="Times New Roman"/>
+          <w:color w:val="FF7E34"/>
+          <w:sz w:val="21"/>
+          <w:szCs w:val="21"/>
+        </w:rPr>
+        <w:t>solid</w:t>
+      </w:r>
+      <w:r>
+        <w:rPr>
+          <w:rFonts w:ascii="Consolas" w:eastAsia="Times New Roman" w:hAnsi="Consolas" w:cs="Times New Roman"/>
+          <w:color w:val="FFFFFF"/>
+          <w:sz w:val="21"/>
+          <w:szCs w:val="21"/>
+        </w:rPr>
+        <w:t xml:space="preserve"> </w:t>
+      </w:r>
+      <w:r>
+        <w:rPr>
+          <w:rFonts w:ascii="Consolas" w:eastAsia="Times New Roman" w:hAnsi="Consolas" w:cs="Times New Roman"/>
+          <w:color w:val="FF7E34"/>
+          <w:sz w:val="21"/>
+          <w:szCs w:val="21"/>
+        </w:rPr>
+        <w:t>blue</w:t>
+      </w:r>
+      <w:r>
+        <w:rPr>
+          <w:rFonts w:ascii="Consolas" w:eastAsia="Times New Roman" w:hAnsi="Consolas" w:cs="Times New Roman"/>
+          <w:color w:val="FFFFFF"/>
+          <w:sz w:val="21"/>
+          <w:szCs w:val="21"/>
+        </w:rPr>
+        <w:t>;</w:t>
+      </w:r>
+    </w:p>
+    <w:p>
+      <w:pPr>
+        <w:shd w:val="clear" w:color="auto" w:fill="00002C"/>
+        <w:spacing w:line="285" w:lineRule="atLeast"/>
+        <w:rPr>
+          <w:rFonts w:ascii="Consolas" w:eastAsia="Times New Roman" w:hAnsi="Consolas" w:cs="Times New Roman"/>
+          <w:color w:val="FFFFFF"/>
+          <w:sz w:val="21"/>
+          <w:szCs w:val="21"/>
+        </w:rPr>
+      </w:pPr>
+      <w:r>
+        <w:rPr>
+          <w:rFonts w:ascii="Consolas" w:eastAsia="Times New Roman" w:hAnsi="Consolas" w:cs="Times New Roman"/>
+          <w:color w:val="FFFFFF"/>
+          <w:sz w:val="21"/>
+          <w:szCs w:val="21"/>
+        </w:rPr>
+        <w:t>}</w:t>
+      </w:r>
+    </w:p>
+    <w:p>
+      <w:pPr>
+        <w:shd w:val="clear" w:color="auto" w:fill="00002C"/>
+        <w:spacing w:line="285" w:lineRule="atLeast"/>
+        <w:rPr>
+          <w:rFonts w:ascii="Consolas" w:eastAsia="Times New Roman" w:hAnsi="Consolas" w:cs="Times New Roman"/>
+          <w:color w:val="FFFFFF"/>
+          <w:sz w:val="21"/>
+          <w:szCs w:val="21"/>
+        </w:rPr>
+      </w:pPr>
+      <w:r>
+        <w:rPr>
+          <w:rFonts w:ascii="Consolas" w:eastAsia="Times New Roman" w:hAnsi="Consolas" w:cs="Times New Roman"/>
+          <w:color w:val="FFFFFF"/>
+          <w:sz w:val="21"/>
+          <w:szCs w:val="21"/>
+        </w:rPr>
+        <w:t>.</w:t>
+      </w:r>
+      <w:proofErr w:type="gramStart"/>
+      <w:r>
+        <w:rPr>
+          <w:rFonts w:ascii="Consolas" w:eastAsia="Times New Roman" w:hAnsi="Consolas" w:cs="Times New Roman"/>
+          <w:color w:val="FFCB6B"/>
+          <w:sz w:val="21"/>
+          <w:szCs w:val="21"/>
+        </w:rPr>
+        <w:t>box2</w:t>
+      </w:r>
+      <w:r>
+        <w:rPr>
+          <w:rFonts w:ascii="Consolas" w:eastAsia="Times New Roman" w:hAnsi="Consolas" w:cs="Times New Roman"/>
+          <w:color w:val="FFFFFF"/>
+          <w:sz w:val="21"/>
+          <w:szCs w:val="21"/>
+        </w:rPr>
+        <w:t>{</w:t>
+      </w:r>
+      <w:proofErr w:type="gramEnd"/>
+    </w:p>
+    <w:p>
+      <w:pPr>
+        <w:shd w:val="clear" w:color="auto" w:fill="00002C"/>
+        <w:spacing w:line="285" w:lineRule="atLeast"/>
+        <w:rPr>
+          <w:rFonts w:ascii="Consolas" w:eastAsia="Times New Roman" w:hAnsi="Consolas" w:cs="Times New Roman"/>
+          <w:color w:val="FFFFFF"/>
+          <w:sz w:val="21"/>
+          <w:szCs w:val="21"/>
+        </w:rPr>
+      </w:pPr>
+      <w:r>
+        <w:rPr>
+          <w:rFonts w:ascii="Consolas" w:eastAsia="Times New Roman" w:hAnsi="Consolas" w:cs="Times New Roman"/>
+          <w:color w:val="FFFFFF"/>
+          <w:sz w:val="21"/>
+          <w:szCs w:val="21"/>
+        </w:rPr>
+        <w:t xml:space="preserve">    </w:t>
+      </w:r>
+      <w:proofErr w:type="gramStart"/>
+      <w:r>
+        <w:rPr>
+          <w:rFonts w:ascii="Consolas" w:eastAsia="Times New Roman" w:hAnsi="Consolas" w:cs="Times New Roman"/>
+          <w:color w:val="FFFFFF"/>
+          <w:sz w:val="21"/>
+          <w:szCs w:val="21"/>
+        </w:rPr>
+        <w:t>color</w:t>
+      </w:r>
+      <w:proofErr w:type="gramEnd"/>
+      <w:r>
+        <w:rPr>
+          <w:rFonts w:ascii="Consolas" w:eastAsia="Times New Roman" w:hAnsi="Consolas" w:cs="Times New Roman"/>
+          <w:color w:val="FFFFFF"/>
+          <w:sz w:val="21"/>
+          <w:szCs w:val="21"/>
+        </w:rPr>
+        <w:t xml:space="preserve">: </w:t>
+      </w:r>
+      <w:r>
+        <w:rPr>
+          <w:rFonts w:ascii="Consolas" w:eastAsia="Times New Roman" w:hAnsi="Consolas" w:cs="Times New Roman"/>
+          <w:color w:val="FF7E34"/>
+          <w:sz w:val="21"/>
+          <w:szCs w:val="21"/>
+        </w:rPr>
+        <w:t>brown</w:t>
+      </w:r>
+      <w:r>
+        <w:rPr>
+          <w:rFonts w:ascii="Consolas" w:eastAsia="Times New Roman" w:hAnsi="Consolas" w:cs="Times New Roman"/>
+          <w:color w:val="FFFFFF"/>
+          <w:sz w:val="21"/>
+          <w:szCs w:val="21"/>
+        </w:rPr>
+        <w:t>;</w:t>
+      </w:r>
+    </w:p>
+    <w:p>
+      <w:pPr>
+        <w:shd w:val="clear" w:color="auto" w:fill="00002C"/>
+        <w:spacing w:line="285" w:lineRule="atLeast"/>
+        <w:rPr>
+          <w:rFonts w:ascii="Consolas" w:eastAsia="Times New Roman" w:hAnsi="Consolas" w:cs="Times New Roman"/>
+          <w:color w:val="FFFFFF"/>
+          <w:sz w:val="21"/>
+          <w:szCs w:val="21"/>
+        </w:rPr>
+      </w:pPr>
+      <w:r>
+        <w:rPr>
+          <w:rFonts w:ascii="Consolas" w:eastAsia="Times New Roman" w:hAnsi="Consolas" w:cs="Times New Roman"/>
+          <w:color w:val="FFFFFF"/>
+          <w:sz w:val="21"/>
+          <w:szCs w:val="21"/>
+        </w:rPr>
+        <w:t>}</w:t>
+      </w:r>
+    </w:p>
+    <w:p>
+      <w:pPr>
+        <w:shd w:val="clear" w:color="auto" w:fill="00002C"/>
+        <w:spacing w:line="285" w:lineRule="atLeast"/>
+        <w:rPr>
+          <w:rFonts w:ascii="Consolas" w:eastAsia="Times New Roman" w:hAnsi="Consolas" w:cs="Times New Roman"/>
+          <w:color w:val="FFFFFF"/>
+          <w:sz w:val="21"/>
+          <w:szCs w:val="21"/>
+        </w:rPr>
+      </w:pPr>
+      <w:r>
+        <w:rPr>
+          <w:rFonts w:ascii="Consolas" w:eastAsia="Times New Roman" w:hAnsi="Consolas" w:cs="Times New Roman"/>
+          <w:color w:val="FF0077"/>
+          <w:sz w:val="21"/>
+          <w:szCs w:val="21"/>
+        </w:rPr>
+        <w:t>*</w:t>
+      </w:r>
+      <w:r>
+        <w:rPr>
+          <w:rFonts w:ascii="Consolas" w:eastAsia="Times New Roman" w:hAnsi="Consolas" w:cs="Times New Roman"/>
+          <w:color w:val="FFFFFF"/>
+          <w:sz w:val="21"/>
+          <w:szCs w:val="21"/>
+        </w:rPr>
+        <w:t>{</w:t>
+      </w:r>
+    </w:p>
+    <w:p>
+      <w:pPr>
+        <w:shd w:val="clear" w:color="auto" w:fill="00002C"/>
+        <w:spacing w:line="285" w:lineRule="atLeast"/>
+        <w:rPr>
+          <w:rFonts w:ascii="Consolas" w:eastAsia="Times New Roman" w:hAnsi="Consolas" w:cs="Times New Roman"/>
+          <w:color w:val="FFFFFF"/>
+          <w:sz w:val="21"/>
+          <w:szCs w:val="21"/>
+        </w:rPr>
+      </w:pPr>
+      <w:r>
+        <w:rPr>
+          <w:rFonts w:ascii="Consolas" w:eastAsia="Times New Roman" w:hAnsi="Consolas" w:cs="Times New Roman"/>
+          <w:color w:val="FFFFFF"/>
+          <w:sz w:val="21"/>
+          <w:szCs w:val="21"/>
+        </w:rPr>
+        <w:t xml:space="preserve">    </w:t>
+      </w:r>
+      <w:proofErr w:type="gramStart"/>
+      <w:r>
+        <w:rPr>
+          <w:rFonts w:ascii="Consolas" w:eastAsia="Times New Roman" w:hAnsi="Consolas" w:cs="Times New Roman"/>
+          <w:color w:val="FFFFFF"/>
+          <w:sz w:val="21"/>
+          <w:szCs w:val="21"/>
+        </w:rPr>
+        <w:t>margin</w:t>
+      </w:r>
+      <w:proofErr w:type="gramEnd"/>
+      <w:r>
+        <w:rPr>
+          <w:rFonts w:ascii="Consolas" w:eastAsia="Times New Roman" w:hAnsi="Consolas" w:cs="Times New Roman"/>
+          <w:color w:val="FFFFFF"/>
+          <w:sz w:val="21"/>
+          <w:szCs w:val="21"/>
+        </w:rPr>
+        <w:t xml:space="preserve">: </w:t>
+      </w:r>
+      <w:r>
+        <w:rPr>
+          <w:rFonts w:ascii="Consolas" w:eastAsia="Times New Roman" w:hAnsi="Consolas" w:cs="Times New Roman"/>
+          <w:color w:val="FF7E34"/>
+          <w:sz w:val="21"/>
+          <w:szCs w:val="21"/>
+        </w:rPr>
+        <w:t>0</w:t>
+      </w:r>
+      <w:r>
+        <w:rPr>
+          <w:rFonts w:ascii="Consolas" w:eastAsia="Times New Roman" w:hAnsi="Consolas" w:cs="Times New Roman"/>
+          <w:color w:val="FFFFFF"/>
+          <w:sz w:val="21"/>
+          <w:szCs w:val="21"/>
+        </w:rPr>
+        <w:t>;</w:t>
+      </w:r>
+    </w:p>
+    <w:p>
+      <w:pPr>
+        <w:shd w:val="clear" w:color="auto" w:fill="00002C"/>
+        <w:spacing w:line="285" w:lineRule="atLeast"/>
+        <w:rPr>
+          <w:rFonts w:ascii="Consolas" w:eastAsia="Times New Roman" w:hAnsi="Consolas" w:cs="Times New Roman"/>
+          <w:color w:val="FFFFFF"/>
+          <w:sz w:val="21"/>
+          <w:szCs w:val="21"/>
+        </w:rPr>
+      </w:pPr>
+      <w:r>
+        <w:rPr>
+          <w:rFonts w:ascii="Consolas" w:eastAsia="Times New Roman" w:hAnsi="Consolas" w:cs="Times New Roman"/>
+          <w:color w:val="FFFFFF"/>
+          <w:sz w:val="21"/>
+          <w:szCs w:val="21"/>
+        </w:rPr>
+        <w:t xml:space="preserve">    </w:t>
+      </w:r>
+      <w:proofErr w:type="gramStart"/>
+      <w:r>
+        <w:rPr>
+          <w:rFonts w:ascii="Consolas" w:eastAsia="Times New Roman" w:hAnsi="Consolas" w:cs="Times New Roman"/>
+          <w:color w:val="FFFFFF"/>
+          <w:sz w:val="21"/>
+          <w:szCs w:val="21"/>
+        </w:rPr>
+        <w:t>padding</w:t>
+      </w:r>
+      <w:proofErr w:type="gramEnd"/>
+      <w:r>
+        <w:rPr>
+          <w:rFonts w:ascii="Consolas" w:eastAsia="Times New Roman" w:hAnsi="Consolas" w:cs="Times New Roman"/>
+          <w:color w:val="FFFFFF"/>
+          <w:sz w:val="21"/>
+          <w:szCs w:val="21"/>
+        </w:rPr>
+        <w:t xml:space="preserve">: </w:t>
+      </w:r>
+      <w:r>
+        <w:rPr>
+          <w:rFonts w:ascii="Consolas" w:eastAsia="Times New Roman" w:hAnsi="Consolas" w:cs="Times New Roman"/>
+          <w:color w:val="FF7E34"/>
+          <w:sz w:val="21"/>
+          <w:szCs w:val="21"/>
+        </w:rPr>
+        <w:t>0</w:t>
+      </w:r>
+      <w:r>
+        <w:rPr>
+          <w:rFonts w:ascii="Consolas" w:eastAsia="Times New Roman" w:hAnsi="Consolas" w:cs="Times New Roman"/>
+          <w:color w:val="FFFFFF"/>
+          <w:sz w:val="21"/>
+          <w:szCs w:val="21"/>
+        </w:rPr>
+        <w:t>;</w:t>
+      </w:r>
+    </w:p>
+    <w:p>
+      <w:pPr>
+        <w:shd w:val="clear" w:color="auto" w:fill="00002C"/>
+        <w:spacing w:line="285" w:lineRule="atLeast"/>
+        <w:rPr>
+          <w:rFonts w:ascii="Consolas" w:eastAsia="Times New Roman" w:hAnsi="Consolas" w:cs="Times New Roman"/>
+          <w:color w:val="FFFFFF"/>
+          <w:sz w:val="21"/>
+          <w:szCs w:val="21"/>
+        </w:rPr>
+      </w:pPr>
+      <w:r>
+        <w:rPr>
+          <w:rFonts w:ascii="Consolas" w:eastAsia="Times New Roman" w:hAnsi="Consolas" w:cs="Times New Roman"/>
+          <w:color w:val="FFFFFF"/>
+          <w:sz w:val="21"/>
+          <w:szCs w:val="21"/>
+        </w:rPr>
+        <w:t>}</w:t>
+      </w:r>
+    </w:p>
+    <w:p>
+      <w:pPr>
+        <w:shd w:val="clear" w:color="auto" w:fill="00002C"/>
+        <w:spacing w:line="285" w:lineRule="atLeast"/>
+        <w:rPr>
+          <w:rFonts w:ascii="Consolas" w:eastAsia="Times New Roman" w:hAnsi="Consolas" w:cs="Times New Roman"/>
+          <w:color w:val="FFFFFF"/>
+          <w:sz w:val="21"/>
+          <w:szCs w:val="21"/>
+        </w:rPr>
+      </w:pPr>
+      <w:r>
+        <w:rPr>
+          <w:rFonts w:ascii="Consolas" w:eastAsia="Times New Roman" w:hAnsi="Consolas" w:cs="Times New Roman"/>
+          <w:color w:val="FFFFFF"/>
+          <w:sz w:val="21"/>
+          <w:szCs w:val="21"/>
+        </w:rPr>
+        <w:t>    &lt;/</w:t>
+      </w:r>
+      <w:r>
+        <w:rPr>
+          <w:rFonts w:ascii="Consolas" w:eastAsia="Times New Roman" w:hAnsi="Consolas" w:cs="Times New Roman"/>
+          <w:color w:val="FF0077"/>
+          <w:sz w:val="21"/>
+          <w:szCs w:val="21"/>
+        </w:rPr>
+        <w:t>style</w:t>
+      </w:r>
+      <w:r>
+        <w:rPr>
+          <w:rFonts w:ascii="Consolas" w:eastAsia="Times New Roman" w:hAnsi="Consolas" w:cs="Times New Roman"/>
+          <w:color w:val="FFFFFF"/>
+          <w:sz w:val="21"/>
+          <w:szCs w:val="21"/>
+        </w:rPr>
+        <w:t>&gt;</w:t>
+      </w:r>
+    </w:p>
+    <w:p>
+      <w:pPr>
+        <w:shd w:val="clear" w:color="auto" w:fill="00002C"/>
+        <w:spacing w:line="285" w:lineRule="atLeast"/>
+        <w:rPr>
+          <w:rFonts w:ascii="Consolas" w:eastAsia="Times New Roman" w:hAnsi="Consolas" w:cs="Times New Roman"/>
+          <w:color w:val="FFFFFF"/>
+          <w:sz w:val="21"/>
+          <w:szCs w:val="21"/>
+        </w:rPr>
+      </w:pPr>
+      <w:r>
+        <w:rPr>
+          <w:rFonts w:ascii="Consolas" w:eastAsia="Times New Roman" w:hAnsi="Consolas" w:cs="Times New Roman"/>
+          <w:color w:val="FFFFFF"/>
+          <w:sz w:val="21"/>
+          <w:szCs w:val="21"/>
+        </w:rPr>
+        <w:t>&lt;/</w:t>
+      </w:r>
+      <w:r>
+        <w:rPr>
+          <w:rFonts w:ascii="Consolas" w:eastAsia="Times New Roman" w:hAnsi="Consolas" w:cs="Times New Roman"/>
+          <w:color w:val="FF0077"/>
+          <w:sz w:val="21"/>
+          <w:szCs w:val="21"/>
+        </w:rPr>
+        <w:t>head</w:t>
+      </w:r>
+      <w:r>
+        <w:rPr>
+          <w:rFonts w:ascii="Consolas" w:eastAsia="Times New Roman" w:hAnsi="Consolas" w:cs="Times New Roman"/>
+          <w:color w:val="FFFFFF"/>
+          <w:sz w:val="21"/>
+          <w:szCs w:val="21"/>
+        </w:rPr>
+        <w:t>&gt;</w:t>
+      </w:r>
+    </w:p>
+    <w:p>
+      <w:pPr>
+        <w:shd w:val="clear" w:color="auto" w:fill="00002C"/>
+        <w:spacing w:line="285" w:lineRule="atLeast"/>
+        <w:rPr>
+          <w:rFonts w:ascii="Consolas" w:eastAsia="Times New Roman" w:hAnsi="Consolas" w:cs="Times New Roman"/>
+          <w:color w:val="FFFFFF"/>
+          <w:sz w:val="21"/>
+          <w:szCs w:val="21"/>
+        </w:rPr>
+      </w:pPr>
+      <w:r>
+        <w:rPr>
+          <w:rFonts w:ascii="Consolas" w:eastAsia="Times New Roman" w:hAnsi="Consolas" w:cs="Times New Roman"/>
+          <w:color w:val="FFFFFF"/>
+          <w:sz w:val="21"/>
+          <w:szCs w:val="21"/>
+        </w:rPr>
+        <w:t>&lt;</w:t>
+      </w:r>
+      <w:proofErr w:type="gramStart"/>
+      <w:r>
+        <w:rPr>
+          <w:rFonts w:ascii="Consolas" w:eastAsia="Times New Roman" w:hAnsi="Consolas" w:cs="Times New Roman"/>
+          <w:color w:val="FF0077"/>
+          <w:sz w:val="21"/>
+          <w:szCs w:val="21"/>
+        </w:rPr>
+        <w:t>body</w:t>
+      </w:r>
+      <w:proofErr w:type="gramEnd"/>
+      <w:r>
+        <w:rPr>
+          <w:rFonts w:ascii="Consolas" w:eastAsia="Times New Roman" w:hAnsi="Consolas" w:cs="Times New Roman"/>
+          <w:color w:val="FFFFFF"/>
+          <w:sz w:val="21"/>
+          <w:szCs w:val="21"/>
+        </w:rPr>
+        <w:t>&gt;</w:t>
+      </w:r>
+    </w:p>
+    <w:p>
+      <w:pPr>
+        <w:shd w:val="clear" w:color="auto" w:fill="00002C"/>
+        <w:spacing w:line="285" w:lineRule="atLeast"/>
+        <w:rPr>
+          <w:rFonts w:ascii="Consolas" w:eastAsia="Times New Roman" w:hAnsi="Consolas" w:cs="Times New Roman"/>
+          <w:color w:val="FFFFFF"/>
+          <w:sz w:val="21"/>
+          <w:szCs w:val="21"/>
+        </w:rPr>
+      </w:pPr>
+      <w:r>
+        <w:rPr>
+          <w:rFonts w:ascii="Consolas" w:eastAsia="Times New Roman" w:hAnsi="Consolas" w:cs="Times New Roman"/>
+          <w:color w:val="FFFFFF"/>
+          <w:sz w:val="21"/>
+          <w:szCs w:val="21"/>
+        </w:rPr>
+        <w:t>    &lt;</w:t>
+      </w:r>
+      <w:r>
+        <w:rPr>
+          <w:rFonts w:ascii="Consolas" w:eastAsia="Times New Roman" w:hAnsi="Consolas" w:cs="Times New Roman"/>
+          <w:color w:val="FF0077"/>
+          <w:sz w:val="21"/>
+          <w:szCs w:val="21"/>
+        </w:rPr>
+        <w:t>div</w:t>
+      </w:r>
+      <w:r>
+        <w:rPr>
+          <w:rFonts w:ascii="Consolas" w:eastAsia="Times New Roman" w:hAnsi="Consolas" w:cs="Times New Roman"/>
+          <w:color w:val="FFFFFF"/>
+          <w:sz w:val="21"/>
+          <w:szCs w:val="21"/>
+        </w:rPr>
+        <w:t xml:space="preserve"> </w:t>
+      </w:r>
+      <w:r>
+        <w:rPr>
+          <w:rFonts w:ascii="Consolas" w:eastAsia="Times New Roman" w:hAnsi="Consolas" w:cs="Times New Roman"/>
+          <w:color w:val="00FFF2"/>
+          <w:sz w:val="21"/>
+          <w:szCs w:val="21"/>
+        </w:rPr>
+        <w:t>class</w:t>
+      </w:r>
+      <w:r>
+        <w:rPr>
+          <w:rFonts w:ascii="Consolas" w:eastAsia="Times New Roman" w:hAnsi="Consolas" w:cs="Times New Roman"/>
+          <w:color w:val="FFFFFF"/>
+          <w:sz w:val="21"/>
+          <w:szCs w:val="21"/>
+        </w:rPr>
+        <w:t>="</w:t>
+      </w:r>
+      <w:r>
+        <w:rPr>
+          <w:rFonts w:ascii="Consolas" w:eastAsia="Times New Roman" w:hAnsi="Consolas" w:cs="Times New Roman"/>
+          <w:color w:val="EEFF00"/>
+          <w:sz w:val="21"/>
+          <w:szCs w:val="21"/>
+        </w:rPr>
+        <w:t>box1 box</w:t>
+      </w:r>
+      <w:r>
+        <w:rPr>
+          <w:rFonts w:ascii="Consolas" w:eastAsia="Times New Roman" w:hAnsi="Consolas" w:cs="Times New Roman"/>
+          <w:color w:val="FFFFFF"/>
+          <w:sz w:val="21"/>
+          <w:szCs w:val="21"/>
+        </w:rPr>
+        <w:t>"&gt;</w:t>
+      </w:r>
+      <w:proofErr w:type="spellStart"/>
+      <w:r>
+        <w:rPr>
+          <w:rFonts w:ascii="Consolas" w:eastAsia="Times New Roman" w:hAnsi="Consolas" w:cs="Times New Roman"/>
+          <w:color w:val="FFFFFF"/>
+          <w:sz w:val="21"/>
+          <w:szCs w:val="21"/>
+        </w:rPr>
+        <w:t>im</w:t>
+      </w:r>
+      <w:proofErr w:type="spellEnd"/>
+      <w:r>
+        <w:rPr>
+          <w:rFonts w:ascii="Consolas" w:eastAsia="Times New Roman" w:hAnsi="Consolas" w:cs="Times New Roman"/>
+          <w:color w:val="FFFFFF"/>
+          <w:sz w:val="21"/>
+          <w:szCs w:val="21"/>
+        </w:rPr>
+        <w:t xml:space="preserve"> a box&lt;/</w:t>
+      </w:r>
+      <w:r>
+        <w:rPr>
+          <w:rFonts w:ascii="Consolas" w:eastAsia="Times New Roman" w:hAnsi="Consolas" w:cs="Times New Roman"/>
+          <w:color w:val="FF0077"/>
+          <w:sz w:val="21"/>
+          <w:szCs w:val="21"/>
+        </w:rPr>
+        <w:t>div</w:t>
+      </w:r>
+      <w:r>
+        <w:rPr>
+          <w:rFonts w:ascii="Consolas" w:eastAsia="Times New Roman" w:hAnsi="Consolas" w:cs="Times New Roman"/>
+          <w:color w:val="FFFFFF"/>
+          <w:sz w:val="21"/>
+          <w:szCs w:val="21"/>
+        </w:rPr>
+        <w:t>&gt;</w:t>
+      </w:r>
+    </w:p>
+    <w:p>
+      <w:pPr>
+        <w:shd w:val="clear" w:color="auto" w:fill="00002C"/>
+        <w:spacing w:line="285" w:lineRule="atLeast"/>
+        <w:rPr>
+          <w:rFonts w:ascii="Consolas" w:eastAsia="Times New Roman" w:hAnsi="Consolas" w:cs="Times New Roman"/>
+          <w:color w:val="FFFFFF"/>
+          <w:sz w:val="21"/>
+          <w:szCs w:val="21"/>
+        </w:rPr>
+      </w:pPr>
+      <w:r>
+        <w:rPr>
+          <w:rFonts w:ascii="Consolas" w:eastAsia="Times New Roman" w:hAnsi="Consolas" w:cs="Times New Roman"/>
+          <w:color w:val="FFFFFF"/>
+          <w:sz w:val="21"/>
+          <w:szCs w:val="21"/>
+        </w:rPr>
+        <w:t>    &lt;</w:t>
+      </w:r>
+      <w:r>
+        <w:rPr>
+          <w:rFonts w:ascii="Consolas" w:eastAsia="Times New Roman" w:hAnsi="Consolas" w:cs="Times New Roman"/>
+          <w:color w:val="FF0077"/>
+          <w:sz w:val="21"/>
+          <w:szCs w:val="21"/>
+        </w:rPr>
+        <w:t>div</w:t>
+      </w:r>
+      <w:r>
+        <w:rPr>
+          <w:rFonts w:ascii="Consolas" w:eastAsia="Times New Roman" w:hAnsi="Consolas" w:cs="Times New Roman"/>
+          <w:color w:val="FFFFFF"/>
+          <w:sz w:val="21"/>
+          <w:szCs w:val="21"/>
+        </w:rPr>
+        <w:t xml:space="preserve"> </w:t>
+      </w:r>
+      <w:r>
+        <w:rPr>
+          <w:rFonts w:ascii="Consolas" w:eastAsia="Times New Roman" w:hAnsi="Consolas" w:cs="Times New Roman"/>
+          <w:color w:val="00FFF2"/>
+          <w:sz w:val="21"/>
+          <w:szCs w:val="21"/>
+        </w:rPr>
+        <w:t>class</w:t>
+      </w:r>
+      <w:r>
+        <w:rPr>
+          <w:rFonts w:ascii="Consolas" w:eastAsia="Times New Roman" w:hAnsi="Consolas" w:cs="Times New Roman"/>
+          <w:color w:val="FFFFFF"/>
+          <w:sz w:val="21"/>
+          <w:szCs w:val="21"/>
+        </w:rPr>
+        <w:t xml:space="preserve"> ="</w:t>
+      </w:r>
+      <w:r>
+        <w:rPr>
+          <w:rFonts w:ascii="Consolas" w:eastAsia="Times New Roman" w:hAnsi="Consolas" w:cs="Times New Roman"/>
+          <w:color w:val="EEFF00"/>
+          <w:sz w:val="21"/>
+          <w:szCs w:val="21"/>
+        </w:rPr>
+        <w:t>box2 box</w:t>
+      </w:r>
+      <w:r>
+        <w:rPr>
+          <w:rFonts w:ascii="Consolas" w:eastAsia="Times New Roman" w:hAnsi="Consolas" w:cs="Times New Roman"/>
+          <w:color w:val="FFFFFF"/>
+          <w:sz w:val="21"/>
+          <w:szCs w:val="21"/>
+        </w:rPr>
+        <w:t>"&gt;</w:t>
+      </w:r>
+      <w:proofErr w:type="spellStart"/>
+      <w:r>
+        <w:rPr>
+          <w:rFonts w:ascii="Consolas" w:eastAsia="Times New Roman" w:hAnsi="Consolas" w:cs="Times New Roman"/>
+          <w:color w:val="FFFFFF"/>
+          <w:sz w:val="21"/>
+          <w:szCs w:val="21"/>
+        </w:rPr>
+        <w:t>im</w:t>
+      </w:r>
+      <w:proofErr w:type="spellEnd"/>
+      <w:r>
+        <w:rPr>
+          <w:rFonts w:ascii="Consolas" w:eastAsia="Times New Roman" w:hAnsi="Consolas" w:cs="Times New Roman"/>
+          <w:color w:val="FFFFFF"/>
+          <w:sz w:val="21"/>
+          <w:szCs w:val="21"/>
+        </w:rPr>
+        <w:t xml:space="preserve"> another box&lt;/</w:t>
+      </w:r>
+      <w:r>
+        <w:rPr>
+          <w:rFonts w:ascii="Consolas" w:eastAsia="Times New Roman" w:hAnsi="Consolas" w:cs="Times New Roman"/>
+          <w:color w:val="FF0077"/>
+          <w:sz w:val="21"/>
+          <w:szCs w:val="21"/>
+        </w:rPr>
+        <w:t>div</w:t>
+      </w:r>
+      <w:r>
+        <w:rPr>
+          <w:rFonts w:ascii="Consolas" w:eastAsia="Times New Roman" w:hAnsi="Consolas" w:cs="Times New Roman"/>
+          <w:color w:val="FFFFFF"/>
+          <w:sz w:val="21"/>
+          <w:szCs w:val="21"/>
+        </w:rPr>
+        <w:t>&gt;</w:t>
+      </w:r>
+    </w:p>
+    <w:p>
+      <w:pPr>
+        <w:tabs>
+          <w:tab w:val="left" w:pos="1005"/>
+        </w:tabs>
+      </w:pPr>
+      <w:r>
+        <w:t xml:space="preserve">See in this program at the end I made the two div and give them different class and by these classes I apply the properties on them. Simply the box background color is solid </w:t>
+      </w:r>
+      <w:proofErr w:type="gramStart"/>
+      <w:r>
+        <w:t>blue  and</w:t>
+      </w:r>
+      <w:proofErr w:type="gramEnd"/>
+      <w:r>
+        <w:t xml:space="preserve"> then text color inside the box is blue and brown which is assigned by using the selectors. </w:t>
+      </w:r>
+    </w:p>
+    <w:p>
+      <w:pPr>
+        <w:tabs>
+          <w:tab w:val="left" w:pos="1005"/>
+        </w:tabs>
+      </w:pPr>
+      <w:r>
+        <w:t xml:space="preserve">And then I give the margin to the box 1 and also the padding and </w:t>
+      </w:r>
+      <w:proofErr w:type="gramStart"/>
+      <w:r>
+        <w:t xml:space="preserve">the  </w:t>
+      </w:r>
+      <w:proofErr w:type="spellStart"/>
+      <w:r>
+        <w:t>the</w:t>
+      </w:r>
+      <w:proofErr w:type="spellEnd"/>
+      <w:proofErr w:type="gramEnd"/>
+      <w:r>
+        <w:t xml:space="preserve"> border, </w:t>
+      </w:r>
+    </w:p>
+    <w:p>
+      <w:pPr>
+        <w:tabs>
+          <w:tab w:val="left" w:pos="1005"/>
+        </w:tabs>
+      </w:pPr>
+      <w:r>
+        <w:drawing>
+          <wp:inline distT="0" distB="0" distL="0" distR="0" wp14:anchorId="6883697C" wp14:editId="0CD96389">
+            <wp:extent cx="5182323" cy="819264"/>
+            <wp:effectExtent l="0" t="0" r="0" b="0"/>
+            <wp:docPr id="3" name="Picture 3"/>
+            <wp:cNvGraphicFramePr>
+              <a:graphicFrameLocks xmlns:a="http://schemas.openxmlformats.org/drawingml/2006/main" noChangeAspect="1"/>
+            </wp:cNvGraphicFramePr>
+            <a:graphic xmlns:a="http://schemas.openxmlformats.org/drawingml/2006/main">
+              <a:graphicData uri="http://schemas.openxmlformats.org/drawingml/2006/picture">
+                <pic:pic xmlns:pic="http://schemas.openxmlformats.org/drawingml/2006/picture">
+                  <pic:nvPicPr>
+                    <pic:cNvPr id="1" name=""/>
+                    <pic:cNvPicPr/>
+                  </pic:nvPicPr>
+                  <pic:blipFill>
+                    <a:blip r:embed="rId21"/>
+                    <a:stretch>
+                      <a:fillRect/>
+                    </a:stretch>
+                  </pic:blipFill>
+                  <pic:spPr>
+                    <a:xfrm>
+                      <a:off x="0" y="0"/>
+                      <a:ext cx="5182323" cy="819264"/>
+                    </a:xfrm>
+                    <a:prstGeom prst="rect">
+                      <a:avLst/>
+                    </a:prstGeom>
+                  </pic:spPr>
+                </pic:pic>
+              </a:graphicData>
+            </a:graphic>
+          </wp:inline>
+        </w:drawing>
+      </w:r>
+    </w:p>
+    <w:p>
+      <w:pPr>
+        <w:jc w:val="right"/>
+      </w:pPr>
+      <w:r>
+        <w:t xml:space="preserve">In this pic you can see the border is blue at the outside and the box inside the </w:t>
+      </w:r>
+      <w:proofErr w:type="spellStart"/>
+      <w:r>
+        <w:t>im</w:t>
+      </w:r>
+      <w:proofErr w:type="spellEnd"/>
+      <w:r>
+        <w:t xml:space="preserve"> a box color is </w:t>
+      </w:r>
+      <w:proofErr w:type="gramStart"/>
+      <w:r>
+        <w:t>blue .</w:t>
+      </w:r>
+      <w:proofErr w:type="gramEnd"/>
+      <w:r>
+        <w:t xml:space="preserve"> </w:t>
+      </w:r>
+      <w:proofErr w:type="gramStart"/>
+      <w:r>
+        <w:t>which</w:t>
+      </w:r>
+      <w:proofErr w:type="gramEnd"/>
+      <w:r>
+        <w:t xml:space="preserve"> is actually a box1 . </w:t>
+      </w:r>
+      <w:proofErr w:type="gramStart"/>
+      <w:r>
+        <w:t>and</w:t>
+      </w:r>
+      <w:proofErr w:type="gramEnd"/>
+      <w:r>
+        <w:t xml:space="preserve"> the spaces from the top left corner in the pic is the margin and padding that move the box slightly.</w:t>
+      </w:r>
+    </w:p>
+    <w:p>
+      <w:pPr>
+        <w:pStyle w:val="NoSpacing"/>
+        <w:rPr>
+          <w:b/>
+        </w:rPr>
+      </w:pPr>
+      <w:r>
+        <w:rPr>
+          <w:b/>
+        </w:rPr>
+        <w:lastRenderedPageBreak/>
+        <w:t>MARGIN COLLAPSE:</w:t>
+      </w:r>
+    </w:p>
+    <w:p>
+      <w:pPr>
+        <w:pStyle w:val="NoSpacing"/>
+        <w:rPr>
+          <w:b/>
+        </w:rPr>
+      </w:pPr>
+    </w:p>
+    <w:p>
+      <w:pPr>
+        <w:pStyle w:val="NoSpacing"/>
+        <w:rPr>
+          <w:b/>
+        </w:rPr>
+      </w:pPr>
+    </w:p>
+    <w:p>
+      <w:pPr>
+        <w:pStyle w:val="NoSpacing"/>
+      </w:pPr>
+      <w:r>
+        <w:t>This is the collapse in which if you give the different margin to the two box the margin btw these box is that which is max means if you give 35 margin to box1 and 25 to box 2 so the margin btw these box is not 25 but is the 35.</w:t>
+      </w:r>
       <w:bookmarkStart w:id="5" w:name="_GoBack"/>
       <w:bookmarkEnd w:id="5"/>
     </w:p>
@@ -13302,6 +14821,21 @@
 </w:endnotes>
 </file>
 
+<file path=word/footer1.xml><?xml version="1.0" encoding="utf-8"?>
+<w:ftr xmlns:wpc="http://schemas.microsoft.com/office/word/2010/wordprocessingCanvas" xmlns:mc="http://schemas.openxmlformats.org/markup-compatibility/2006" xmlns:o="urn:schemas-microsoft-com:office:office" xmlns:r="http://schemas.openxmlformats.org/officeDocument/2006/relationships" xmlns:m="http://schemas.openxmlformats.org/officeDocument/2006/math" xmlns:v="urn:schemas-microsoft-com:vml" xmlns:wp14="http://schemas.microsoft.com/office/word/2010/wordprocessingDrawing" xmlns:wp="http://schemas.openxmlformats.org/drawingml/2006/wordprocessingDrawing" xmlns:w10="urn:schemas-microsoft-com:office:word" xmlns:w="http://schemas.openxmlformats.org/wordprocessingml/2006/main" xmlns:w14="http://schemas.microsoft.com/office/word/2010/wordml" xmlns:w15="http://schemas.microsoft.com/office/word/2012/wordml" xmlns:wpg="http://schemas.microsoft.com/office/word/2010/wordprocessingGroup" xmlns:wpi="http://schemas.microsoft.com/office/word/2010/wordprocessingInk" xmlns:wne="http://schemas.microsoft.com/office/word/2006/wordml" xmlns:wps="http://schemas.microsoft.com/office/word/2010/wordprocessingShape" mc:Ignorable="w14 w15 wp14">
+  <w:p>
+    <w:pPr>
+      <w:pStyle w:val="Footer"/>
+    </w:pPr>
+    <w:proofErr w:type="gramStart"/>
+    <w:r>
+      <w:t>d</w:t>
+    </w:r>
+    <w:proofErr w:type="gramEnd"/>
+  </w:p>
+</w:ftr>
+</file>
+
 <file path=word/footnotes.xml><?xml version="1.0" encoding="utf-8"?>
 <w:footnotes xmlns:wpc="http://schemas.microsoft.com/office/word/2010/wordprocessingCanvas" xmlns:mc="http://schemas.openxmlformats.org/markup-compatibility/2006" xmlns:o="urn:schemas-microsoft-com:office:office" xmlns:r="http://schemas.openxmlformats.org/officeDocument/2006/relationships" xmlns:m="http://schemas.openxmlformats.org/officeDocument/2006/math" xmlns:v="urn:schemas-microsoft-com:vml" xmlns:wp14="http://schemas.microsoft.com/office/word/2010/wordprocessingDrawing" xmlns:wp="http://schemas.openxmlformats.org/drawingml/2006/wordprocessingDrawing" xmlns:w10="urn:schemas-microsoft-com:office:word" xmlns:w="http://schemas.openxmlformats.org/wordprocessingml/2006/main" xmlns:w14="http://schemas.microsoft.com/office/word/2010/wordml" xmlns:w15="http://schemas.microsoft.com/office/word/2012/wordml" xmlns:wpg="http://schemas.microsoft.com/office/word/2010/wordprocessingGroup" xmlns:wpi="http://schemas.microsoft.com/office/word/2010/wordprocessingInk" xmlns:wne="http://schemas.microsoft.com/office/word/2006/wordml" xmlns:wps="http://schemas.microsoft.com/office/word/2010/wordprocessingShape" mc:Ignorable="w14 w15 wp14">
   <w:footnote w:type="separator" w:id="-1">
@@ -13325,12 +14859,6 @@
     </w:p>
   </w:footnote>
 </w:footnotes>
-</file>
-
-<file path=word/header1.xml><?xml version="1.0" encoding="utf-8"?>
-<w:hdr xmlns:wpc="http://schemas.microsoft.com/office/word/2010/wordprocessingCanvas" xmlns:mc="http://schemas.openxmlformats.org/markup-compatibility/2006" xmlns:o="urn:schemas-microsoft-com:office:office" xmlns:r="http://schemas.openxmlformats.org/officeDocument/2006/relationships" xmlns:m="http://schemas.openxmlformats.org/officeDocument/2006/math" xmlns:v="urn:schemas-microsoft-com:vml" xmlns:wp14="http://schemas.microsoft.com/office/word/2010/wordprocessingDrawing" xmlns:wp="http://schemas.openxmlformats.org/drawingml/2006/wordprocessingDrawing" xmlns:w10="urn:schemas-microsoft-com:office:word" xmlns:w="http://schemas.openxmlformats.org/wordprocessingml/2006/main" xmlns:w14="http://schemas.microsoft.com/office/word/2010/wordml" xmlns:w15="http://schemas.microsoft.com/office/word/2012/wordml" xmlns:wpg="http://schemas.microsoft.com/office/word/2010/wordprocessingGroup" xmlns:wpi="http://schemas.microsoft.com/office/word/2010/wordprocessingInk" xmlns:wne="http://schemas.microsoft.com/office/word/2006/wordml" xmlns:wps="http://schemas.microsoft.com/office/word/2010/wordprocessingShape" mc:Ignorable="w14 w15 wp14">
-  <w:p/>
-</w:hdr>
 </file>
 
 <file path=word/numbering.xml><?xml version="1.0" encoding="utf-8"?>
@@ -15806,6 +17334,50 @@
       <w:szCs w:val="24"/>
     </w:rPr>
   </w:style>
+  <w:style w:type="paragraph" w:styleId="Header">
+    <w:name w:val="header"/>
+    <w:basedOn w:val="Normal"/>
+    <w:link w:val="HeaderChar"/>
+    <w:uiPriority w:val="99"/>
+    <w:unhideWhenUsed/>
+    <w:rsid w:val="004715BB"/>
+    <w:pPr>
+      <w:tabs>
+        <w:tab w:val="center" w:pos="4680"/>
+        <w:tab w:val="right" w:pos="9360"/>
+      </w:tabs>
+      <w:spacing w:line="240" w:lineRule="auto"/>
+    </w:pPr>
+  </w:style>
+  <w:style w:type="character" w:customStyle="1" w:styleId="HeaderChar">
+    <w:name w:val="Header Char"/>
+    <w:basedOn w:val="DefaultParagraphFont"/>
+    <w:link w:val="Header"/>
+    <w:uiPriority w:val="99"/>
+    <w:rsid w:val="004715BB"/>
+  </w:style>
+  <w:style w:type="paragraph" w:styleId="Footer">
+    <w:name w:val="footer"/>
+    <w:basedOn w:val="Normal"/>
+    <w:link w:val="FooterChar"/>
+    <w:uiPriority w:val="99"/>
+    <w:unhideWhenUsed/>
+    <w:rsid w:val="004715BB"/>
+    <w:pPr>
+      <w:tabs>
+        <w:tab w:val="center" w:pos="4680"/>
+        <w:tab w:val="right" w:pos="9360"/>
+      </w:tabs>
+      <w:spacing w:line="240" w:lineRule="auto"/>
+    </w:pPr>
+  </w:style>
+  <w:style w:type="character" w:customStyle="1" w:styleId="FooterChar">
+    <w:name w:val="Footer Char"/>
+    <w:basedOn w:val="DefaultParagraphFont"/>
+    <w:link w:val="Footer"/>
+    <w:uiPriority w:val="99"/>
+    <w:rsid w:val="004715BB"/>
+  </w:style>
 </w:styles>
 </file>
 
@@ -16134,7 +17706,7 @@
 </file>
 
 <file path=customXml/itemProps1.xml><?xml version="1.0" encoding="utf-8"?>
-<ds:datastoreItem xmlns:ds="http://schemas.openxmlformats.org/officeDocument/2006/customXml" ds:itemID="{64765402-BB2C-4596-93C6-589FEC24F1AA}">
+<ds:datastoreItem xmlns:ds="http://schemas.openxmlformats.org/officeDocument/2006/customXml" ds:itemID="{E773026D-F9A0-4E98-A562-FE5C23CD1050}">
   <ds:schemaRefs>
     <ds:schemaRef ds:uri="http://schemas.openxmlformats.org/officeDocument/2006/bibliography"/>
   </ds:schemaRefs>

</xml_diff>

<commit_message>
pushing day 6 program
</commit_message>
<xml_diff>
--- a/Web_Development Notes Scratch to pro.docx
+++ b/Web_Development Notes Scratch to pro.docx
@@ -13194,7 +13194,7 @@
         <w:rPr>
           <w:b/>
         </w:rPr>
-        <w:t>5 sep</w:t>
+        <w:t>5 oct</w:t>
       </w:r>
       <w:proofErr w:type="gramStart"/>
       <w:r>
@@ -13325,6 +13325,9 @@
         <w:pStyle w:val="Quote"/>
       </w:pPr>
       <w:r>
+        <w:rPr>
+          <w:noProof/>
+        </w:rPr>
         <w:lastRenderedPageBreak/>
         <w:drawing>
           <wp:inline distT="0" distB="0" distL="0" distR="0" wp14:anchorId="3E3122DD" wp14:editId="7E13515F">
@@ -14669,6 +14672,9 @@
         </w:tabs>
       </w:pPr>
       <w:r>
+        <w:rPr>
+          <w:noProof/>
+        </w:rPr>
         <w:drawing>
           <wp:inline distT="0" distB="0" distL="0" distR="0" wp14:anchorId="6883697C" wp14:editId="0CD96389">
             <wp:extent cx="5182323" cy="819264"/>
@@ -14783,6 +14789,976 @@
       </w:pPr>
       <w:r>
         <w:t>This is the collapse in which if you give the different margin to the two box the margin btw these box is that which is max means if you give 35 margin to box1 and 25 to box 2 so the margin btw these box is not 25 but is the 35.</w:t>
+      </w:r>
+    </w:p>
+    <w:p/>
+    <w:p/>
+    <w:p/>
+    <w:p>
+      <w:pPr>
+        <w:rPr>
+          <w:b/>
+        </w:rPr>
+      </w:pPr>
+      <w:r>
+        <w:rPr>
+          <w:b/>
+        </w:rPr>
+        <w:t>8</w:t>
+      </w:r>
+      <w:r>
+        <w:rPr>
+          <w:b/>
+        </w:rPr>
+        <w:t xml:space="preserve"> oct</w:t>
+      </w:r>
+      <w:proofErr w:type="gramStart"/>
+      <w:r>
+        <w:rPr>
+          <w:b/>
+        </w:rPr>
+        <w:t>,2026</w:t>
+      </w:r>
+      <w:proofErr w:type="gramEnd"/>
+    </w:p>
+    <w:p>
+      <w:pPr>
+        <w:rPr>
+          <w:b/>
+        </w:rPr>
+      </w:pPr>
+      <w:r>
+        <w:rPr>
+          <w:b/>
+        </w:rPr>
+        <w:t xml:space="preserve">      </w:t>
+      </w:r>
+    </w:p>
+    <w:p>
+      <w:pPr>
+        <w:rPr>
+          <w:b/>
+          <w:sz w:val="32"/>
+          <w:szCs w:val="32"/>
+        </w:rPr>
+      </w:pPr>
+      <w:r>
+        <w:rPr>
+          <w:b/>
+        </w:rPr>
+        <w:t xml:space="preserve"> </w:t>
+      </w:r>
+      <w:r>
+        <w:rPr>
+          <w:b/>
+          <w:sz w:val="32"/>
+          <w:szCs w:val="32"/>
+        </w:rPr>
+        <w:t xml:space="preserve">Fonts and colors in the </w:t>
+      </w:r>
+      <w:proofErr w:type="spellStart"/>
+      <w:r>
+        <w:rPr>
+          <w:b/>
+          <w:sz w:val="32"/>
+          <w:szCs w:val="32"/>
+        </w:rPr>
+        <w:t>css</w:t>
+      </w:r>
+      <w:proofErr w:type="spellEnd"/>
+      <w:r>
+        <w:rPr>
+          <w:b/>
+          <w:sz w:val="32"/>
+          <w:szCs w:val="32"/>
+        </w:rPr>
+        <w:t>:</w:t>
+      </w:r>
+    </w:p>
+    <w:p>
+      <w:pPr>
+        <w:pStyle w:val="NoSpacing"/>
+      </w:pPr>
+      <w:r>
+        <w:t xml:space="preserve">  We can add the </w:t>
+      </w:r>
+      <w:proofErr w:type="spellStart"/>
+      <w:r>
+        <w:t>phonts</w:t>
+      </w:r>
+      <w:proofErr w:type="spellEnd"/>
+      <w:r>
+        <w:t xml:space="preserve"> and colors in the </w:t>
+      </w:r>
+      <w:proofErr w:type="spellStart"/>
+      <w:r>
+        <w:t>css</w:t>
+      </w:r>
+      <w:proofErr w:type="spellEnd"/>
+      <w:r>
+        <w:t xml:space="preserve"> by using the special </w:t>
+      </w:r>
+      <w:proofErr w:type="spellStart"/>
+      <w:r>
+        <w:t>css</w:t>
+      </w:r>
+      <w:proofErr w:type="spellEnd"/>
+      <w:r>
+        <w:t xml:space="preserve"> tags and elements. </w:t>
+      </w:r>
+    </w:p>
+    <w:p>
+      <w:pPr>
+        <w:shd w:val="clear" w:color="auto" w:fill="00002C"/>
+        <w:spacing w:line="285" w:lineRule="atLeast"/>
+        <w:rPr>
+          <w:rFonts w:ascii="Consolas" w:eastAsia="Times New Roman" w:hAnsi="Consolas" w:cs="Times New Roman"/>
+          <w:color w:val="FFFFFF"/>
+          <w:sz w:val="21"/>
+          <w:szCs w:val="21"/>
+        </w:rPr>
+      </w:pPr>
+      <w:r>
+        <w:rPr>
+          <w:rFonts w:ascii="Consolas" w:eastAsia="Times New Roman" w:hAnsi="Consolas" w:cs="Times New Roman"/>
+          <w:color w:val="FFFFFF"/>
+          <w:sz w:val="21"/>
+          <w:szCs w:val="21"/>
+        </w:rPr>
+        <w:t xml:space="preserve">      </w:t>
+      </w:r>
+      <w:proofErr w:type="gramStart"/>
+      <w:r>
+        <w:rPr>
+          <w:rFonts w:ascii="Consolas" w:eastAsia="Times New Roman" w:hAnsi="Consolas" w:cs="Times New Roman"/>
+          <w:color w:val="FF0077"/>
+          <w:sz w:val="21"/>
+          <w:szCs w:val="21"/>
+        </w:rPr>
+        <w:t>p</w:t>
+      </w:r>
+      <w:r>
+        <w:rPr>
+          <w:rFonts w:ascii="Consolas" w:eastAsia="Times New Roman" w:hAnsi="Consolas" w:cs="Times New Roman"/>
+          <w:color w:val="FFFFFF"/>
+          <w:sz w:val="21"/>
+          <w:szCs w:val="21"/>
+        </w:rPr>
+        <w:t>{</w:t>
+      </w:r>
+      <w:proofErr w:type="gramEnd"/>
+    </w:p>
+    <w:p>
+      <w:pPr>
+        <w:shd w:val="clear" w:color="auto" w:fill="00002C"/>
+        <w:spacing w:line="285" w:lineRule="atLeast"/>
+        <w:rPr>
+          <w:rFonts w:ascii="Consolas" w:eastAsia="Times New Roman" w:hAnsi="Consolas" w:cs="Times New Roman"/>
+          <w:color w:val="FFFFFF"/>
+          <w:sz w:val="21"/>
+          <w:szCs w:val="21"/>
+        </w:rPr>
+      </w:pPr>
+      <w:proofErr w:type="gramStart"/>
+      <w:r>
+        <w:rPr>
+          <w:rFonts w:ascii="Consolas" w:eastAsia="Times New Roman" w:hAnsi="Consolas" w:cs="Times New Roman"/>
+          <w:color w:val="FFFFFF"/>
+          <w:sz w:val="21"/>
+          <w:szCs w:val="21"/>
+        </w:rPr>
+        <w:t>font-family</w:t>
+      </w:r>
+      <w:proofErr w:type="gramEnd"/>
+      <w:r>
+        <w:rPr>
+          <w:rFonts w:ascii="Consolas" w:eastAsia="Times New Roman" w:hAnsi="Consolas" w:cs="Times New Roman"/>
+          <w:color w:val="FFFFFF"/>
+          <w:sz w:val="21"/>
+          <w:szCs w:val="21"/>
+        </w:rPr>
+        <w:t>: '</w:t>
+      </w:r>
+      <w:r>
+        <w:rPr>
+          <w:rFonts w:ascii="Consolas" w:eastAsia="Times New Roman" w:hAnsi="Consolas" w:cs="Times New Roman"/>
+          <w:color w:val="EEFF00"/>
+          <w:sz w:val="21"/>
+          <w:szCs w:val="21"/>
+        </w:rPr>
+        <w:t>Courier New</w:t>
+      </w:r>
+      <w:r>
+        <w:rPr>
+          <w:rFonts w:ascii="Consolas" w:eastAsia="Times New Roman" w:hAnsi="Consolas" w:cs="Times New Roman"/>
+          <w:color w:val="FFFFFF"/>
+          <w:sz w:val="21"/>
+          <w:szCs w:val="21"/>
+        </w:rPr>
+        <w:t xml:space="preserve">', </w:t>
+      </w:r>
+      <w:r>
+        <w:rPr>
+          <w:rFonts w:ascii="Consolas" w:eastAsia="Times New Roman" w:hAnsi="Consolas" w:cs="Times New Roman"/>
+          <w:color w:val="FF7E34"/>
+          <w:sz w:val="21"/>
+          <w:szCs w:val="21"/>
+        </w:rPr>
+        <w:t>Courier</w:t>
+      </w:r>
+      <w:r>
+        <w:rPr>
+          <w:rFonts w:ascii="Consolas" w:eastAsia="Times New Roman" w:hAnsi="Consolas" w:cs="Times New Roman"/>
+          <w:color w:val="FFFFFF"/>
+          <w:sz w:val="21"/>
+          <w:szCs w:val="21"/>
+        </w:rPr>
+        <w:t xml:space="preserve">, </w:t>
+      </w:r>
+      <w:proofErr w:type="spellStart"/>
+      <w:r>
+        <w:rPr>
+          <w:rFonts w:ascii="Consolas" w:eastAsia="Times New Roman" w:hAnsi="Consolas" w:cs="Times New Roman"/>
+          <w:color w:val="FF7E34"/>
+          <w:sz w:val="21"/>
+          <w:szCs w:val="21"/>
+        </w:rPr>
+        <w:t>monospace</w:t>
+      </w:r>
+      <w:proofErr w:type="spellEnd"/>
+      <w:r>
+        <w:rPr>
+          <w:rFonts w:ascii="Consolas" w:eastAsia="Times New Roman" w:hAnsi="Consolas" w:cs="Times New Roman"/>
+          <w:color w:val="FFFFFF"/>
+          <w:sz w:val="21"/>
+          <w:szCs w:val="21"/>
+        </w:rPr>
+        <w:t>;</w:t>
+      </w:r>
+    </w:p>
+    <w:p>
+      <w:pPr>
+        <w:shd w:val="clear" w:color="auto" w:fill="00002C"/>
+        <w:spacing w:line="285" w:lineRule="atLeast"/>
+        <w:rPr>
+          <w:rFonts w:ascii="Consolas" w:eastAsia="Times New Roman" w:hAnsi="Consolas" w:cs="Times New Roman"/>
+          <w:color w:val="FFFFFF"/>
+          <w:sz w:val="21"/>
+          <w:szCs w:val="21"/>
+        </w:rPr>
+      </w:pPr>
+      <w:r>
+        <w:rPr>
+          <w:rFonts w:ascii="Consolas" w:eastAsia="Times New Roman" w:hAnsi="Consolas" w:cs="Times New Roman"/>
+          <w:color w:val="FFFFFF"/>
+          <w:sz w:val="21"/>
+          <w:szCs w:val="21"/>
+        </w:rPr>
+        <w:t>      }</w:t>
+      </w:r>
+    </w:p>
+    <w:p>
+      <w:pPr>
+        <w:shd w:val="clear" w:color="auto" w:fill="00002C"/>
+        <w:spacing w:line="285" w:lineRule="atLeast"/>
+        <w:rPr>
+          <w:rFonts w:ascii="Consolas" w:eastAsia="Times New Roman" w:hAnsi="Consolas" w:cs="Times New Roman"/>
+          <w:color w:val="FFFFFF"/>
+          <w:sz w:val="21"/>
+          <w:szCs w:val="21"/>
+        </w:rPr>
+      </w:pPr>
+      <w:r>
+        <w:rPr>
+          <w:rFonts w:ascii="Consolas" w:eastAsia="Times New Roman" w:hAnsi="Consolas" w:cs="Times New Roman"/>
+          <w:color w:val="FFFFFF"/>
+          <w:sz w:val="21"/>
+          <w:szCs w:val="21"/>
+        </w:rPr>
+        <w:t xml:space="preserve">      </w:t>
+      </w:r>
+    </w:p>
+    <w:p>
+      <w:pPr>
+        <w:pStyle w:val="NoSpacing"/>
+      </w:pPr>
+      <w:r>
+        <w:t xml:space="preserve">In this above example you can see that I apply the font on the text by the font family tag. Then the courier New………….. </w:t>
+      </w:r>
+      <w:proofErr w:type="gramStart"/>
+      <w:r>
+        <w:t>is</w:t>
+      </w:r>
+      <w:proofErr w:type="gramEnd"/>
+      <w:r>
+        <w:t xml:space="preserve"> the font type which we apply . </w:t>
+      </w:r>
+      <w:proofErr w:type="gramStart"/>
+      <w:r>
+        <w:t>so</w:t>
+      </w:r>
+      <w:proofErr w:type="gramEnd"/>
+      <w:r>
+        <w:t xml:space="preserve"> you can see the results </w:t>
+      </w:r>
+      <w:proofErr w:type="spellStart"/>
+      <w:r>
+        <w:t>here.below</w:t>
+      </w:r>
+      <w:proofErr w:type="spellEnd"/>
+    </w:p>
+    <w:p>
+      <w:pPr>
+        <w:pStyle w:val="NoSpacing"/>
+        <w:rPr>
+          <w:rFonts w:ascii="Courier New" w:hAnsi="Courier New" w:cs="Courier New"/>
+          <w:color w:val="000000"/>
+          <w:sz w:val="27"/>
+          <w:szCs w:val="27"/>
+        </w:rPr>
+      </w:pPr>
+      <w:r>
+        <w:rPr>
+          <w:rFonts w:ascii="Courier New" w:hAnsi="Courier New" w:cs="Courier New"/>
+          <w:color w:val="000000"/>
+          <w:sz w:val="27"/>
+          <w:szCs w:val="27"/>
+        </w:rPr>
+        <w:t xml:space="preserve">This is the </w:t>
+      </w:r>
+      <w:proofErr w:type="spellStart"/>
+      <w:r>
+        <w:rPr>
+          <w:rFonts w:ascii="Courier New" w:hAnsi="Courier New" w:cs="Courier New"/>
+          <w:color w:val="000000"/>
+          <w:sz w:val="27"/>
+          <w:szCs w:val="27"/>
+        </w:rPr>
+        <w:t>praragraph</w:t>
+      </w:r>
+      <w:proofErr w:type="spellEnd"/>
+      <w:r>
+        <w:rPr>
+          <w:rFonts w:ascii="Courier New" w:hAnsi="Courier New" w:cs="Courier New"/>
+          <w:color w:val="000000"/>
+          <w:sz w:val="27"/>
+          <w:szCs w:val="27"/>
+        </w:rPr>
+        <w:t xml:space="preserve"> and the video on the fonts and colors in the </w:t>
+      </w:r>
+      <w:proofErr w:type="spellStart"/>
+      <w:r>
+        <w:rPr>
+          <w:rFonts w:ascii="Courier New" w:hAnsi="Courier New" w:cs="Courier New"/>
+          <w:color w:val="000000"/>
+          <w:sz w:val="27"/>
+          <w:szCs w:val="27"/>
+        </w:rPr>
+        <w:t>css</w:t>
+      </w:r>
+      <w:proofErr w:type="spellEnd"/>
+    </w:p>
+    <w:p>
+      <w:pPr>
+        <w:pStyle w:val="NoSpacing"/>
+        <w:rPr>
+          <w:rFonts w:ascii="Courier New" w:hAnsi="Courier New" w:cs="Courier New"/>
+          <w:color w:val="000000"/>
+          <w:sz w:val="27"/>
+          <w:szCs w:val="27"/>
+        </w:rPr>
+      </w:pPr>
+    </w:p>
+    <w:p>
+      <w:pPr>
+        <w:pStyle w:val="NoSpacing"/>
+      </w:pPr>
+      <w:r>
+        <w:t>These are result of the paragraph on which I apply the fonts tag.</w:t>
+      </w:r>
+    </w:p>
+    <w:p>
+      <w:pPr>
+        <w:pStyle w:val="NoSpacing"/>
+      </w:pPr>
+      <w:r>
+        <w:t xml:space="preserve">We can also change the style of the font by using the font style tag. Means </w:t>
+      </w:r>
+      <w:proofErr w:type="spellStart"/>
+      <w:r>
+        <w:t>italic</w:t>
+      </w:r>
+      <w:proofErr w:type="gramStart"/>
+      <w:r>
+        <w:t>,etc</w:t>
+      </w:r>
+      <w:proofErr w:type="spellEnd"/>
+      <w:proofErr w:type="gramEnd"/>
+      <w:r>
+        <w:t>.</w:t>
+      </w:r>
+    </w:p>
+    <w:p>
+      <w:pPr>
+        <w:pStyle w:val="NoSpacing"/>
+      </w:pPr>
+      <w:r>
+        <w:t>For the bold the text we use font weight tag to bold the text</w:t>
+      </w:r>
+    </w:p>
+    <w:p>
+      <w:pPr>
+        <w:shd w:val="clear" w:color="auto" w:fill="00002C"/>
+        <w:spacing w:line="285" w:lineRule="atLeast"/>
+        <w:rPr>
+          <w:rFonts w:ascii="Consolas" w:eastAsia="Times New Roman" w:hAnsi="Consolas" w:cs="Times New Roman"/>
+          <w:color w:val="FFFFFF"/>
+          <w:sz w:val="21"/>
+          <w:szCs w:val="21"/>
+        </w:rPr>
+      </w:pPr>
+      <w:r>
+        <w:rPr>
+          <w:rFonts w:ascii="Consolas" w:eastAsia="Times New Roman" w:hAnsi="Consolas" w:cs="Times New Roman"/>
+          <w:color w:val="FFFFFF"/>
+          <w:sz w:val="21"/>
+          <w:szCs w:val="21"/>
+        </w:rPr>
+        <w:t xml:space="preserve">      </w:t>
+      </w:r>
+      <w:proofErr w:type="gramStart"/>
+      <w:r>
+        <w:rPr>
+          <w:rFonts w:ascii="Consolas" w:eastAsia="Times New Roman" w:hAnsi="Consolas" w:cs="Times New Roman"/>
+          <w:color w:val="FF0077"/>
+          <w:sz w:val="21"/>
+          <w:szCs w:val="21"/>
+        </w:rPr>
+        <w:t>p</w:t>
+      </w:r>
+      <w:r>
+        <w:rPr>
+          <w:rFonts w:ascii="Consolas" w:eastAsia="Times New Roman" w:hAnsi="Consolas" w:cs="Times New Roman"/>
+          <w:color w:val="FFFFFF"/>
+          <w:sz w:val="21"/>
+          <w:szCs w:val="21"/>
+        </w:rPr>
+        <w:t>{</w:t>
+      </w:r>
+      <w:proofErr w:type="gramEnd"/>
+    </w:p>
+    <w:p>
+      <w:pPr>
+        <w:shd w:val="clear" w:color="auto" w:fill="00002C"/>
+        <w:spacing w:line="285" w:lineRule="atLeast"/>
+        <w:rPr>
+          <w:rFonts w:ascii="Consolas" w:eastAsia="Times New Roman" w:hAnsi="Consolas" w:cs="Times New Roman"/>
+          <w:color w:val="FFFFFF"/>
+          <w:sz w:val="21"/>
+          <w:szCs w:val="21"/>
+        </w:rPr>
+      </w:pPr>
+      <w:proofErr w:type="gramStart"/>
+      <w:r>
+        <w:rPr>
+          <w:rFonts w:ascii="Consolas" w:eastAsia="Times New Roman" w:hAnsi="Consolas" w:cs="Times New Roman"/>
+          <w:color w:val="FFFFFF"/>
+          <w:sz w:val="21"/>
+          <w:szCs w:val="21"/>
+        </w:rPr>
+        <w:t>font-family</w:t>
+      </w:r>
+      <w:proofErr w:type="gramEnd"/>
+      <w:r>
+        <w:rPr>
+          <w:rFonts w:ascii="Consolas" w:eastAsia="Times New Roman" w:hAnsi="Consolas" w:cs="Times New Roman"/>
+          <w:color w:val="FFFFFF"/>
+          <w:sz w:val="21"/>
+          <w:szCs w:val="21"/>
+        </w:rPr>
+        <w:t>: '</w:t>
+      </w:r>
+      <w:r>
+        <w:rPr>
+          <w:rFonts w:ascii="Consolas" w:eastAsia="Times New Roman" w:hAnsi="Consolas" w:cs="Times New Roman"/>
+          <w:color w:val="EEFF00"/>
+          <w:sz w:val="21"/>
+          <w:szCs w:val="21"/>
+        </w:rPr>
+        <w:t>Courier New</w:t>
+      </w:r>
+      <w:r>
+        <w:rPr>
+          <w:rFonts w:ascii="Consolas" w:eastAsia="Times New Roman" w:hAnsi="Consolas" w:cs="Times New Roman"/>
+          <w:color w:val="FFFFFF"/>
+          <w:sz w:val="21"/>
+          <w:szCs w:val="21"/>
+        </w:rPr>
+        <w:t xml:space="preserve">', </w:t>
+      </w:r>
+      <w:r>
+        <w:rPr>
+          <w:rFonts w:ascii="Consolas" w:eastAsia="Times New Roman" w:hAnsi="Consolas" w:cs="Times New Roman"/>
+          <w:color w:val="FF7E34"/>
+          <w:sz w:val="21"/>
+          <w:szCs w:val="21"/>
+        </w:rPr>
+        <w:t>Courier</w:t>
+      </w:r>
+      <w:r>
+        <w:rPr>
+          <w:rFonts w:ascii="Consolas" w:eastAsia="Times New Roman" w:hAnsi="Consolas" w:cs="Times New Roman"/>
+          <w:color w:val="FFFFFF"/>
+          <w:sz w:val="21"/>
+          <w:szCs w:val="21"/>
+        </w:rPr>
+        <w:t xml:space="preserve">, </w:t>
+      </w:r>
+      <w:proofErr w:type="spellStart"/>
+      <w:r>
+        <w:rPr>
+          <w:rFonts w:ascii="Consolas" w:eastAsia="Times New Roman" w:hAnsi="Consolas" w:cs="Times New Roman"/>
+          <w:color w:val="FF7E34"/>
+          <w:sz w:val="21"/>
+          <w:szCs w:val="21"/>
+        </w:rPr>
+        <w:t>monospace</w:t>
+      </w:r>
+      <w:proofErr w:type="spellEnd"/>
+      <w:r>
+        <w:rPr>
+          <w:rFonts w:ascii="Consolas" w:eastAsia="Times New Roman" w:hAnsi="Consolas" w:cs="Times New Roman"/>
+          <w:color w:val="FFFFFF"/>
+          <w:sz w:val="21"/>
+          <w:szCs w:val="21"/>
+        </w:rPr>
+        <w:t>;</w:t>
+      </w:r>
+    </w:p>
+    <w:p>
+      <w:pPr>
+        <w:shd w:val="clear" w:color="auto" w:fill="00002C"/>
+        <w:spacing w:line="285" w:lineRule="atLeast"/>
+        <w:rPr>
+          <w:rFonts w:ascii="Consolas" w:eastAsia="Times New Roman" w:hAnsi="Consolas" w:cs="Times New Roman"/>
+          <w:color w:val="FFFFFF"/>
+          <w:sz w:val="21"/>
+          <w:szCs w:val="21"/>
+        </w:rPr>
+      </w:pPr>
+      <w:r>
+        <w:rPr>
+          <w:rFonts w:ascii="Consolas" w:eastAsia="Times New Roman" w:hAnsi="Consolas" w:cs="Times New Roman"/>
+          <w:color w:val="FFFFFF"/>
+          <w:sz w:val="21"/>
+          <w:szCs w:val="21"/>
+        </w:rPr>
+        <w:t>       </w:t>
+      </w:r>
+      <w:proofErr w:type="spellStart"/>
+      <w:proofErr w:type="gramStart"/>
+      <w:r>
+        <w:rPr>
+          <w:rFonts w:ascii="Consolas" w:eastAsia="Times New Roman" w:hAnsi="Consolas" w:cs="Times New Roman"/>
+          <w:color w:val="FFFFFF"/>
+          <w:sz w:val="21"/>
+          <w:szCs w:val="21"/>
+        </w:rPr>
+        <w:t>font-style:</w:t>
+      </w:r>
+      <w:proofErr w:type="gramEnd"/>
+      <w:r>
+        <w:rPr>
+          <w:rFonts w:ascii="Consolas" w:eastAsia="Times New Roman" w:hAnsi="Consolas" w:cs="Times New Roman"/>
+          <w:color w:val="FF7E34"/>
+          <w:sz w:val="21"/>
+          <w:szCs w:val="21"/>
+        </w:rPr>
+        <w:t>italic</w:t>
+      </w:r>
+      <w:proofErr w:type="spellEnd"/>
+      <w:r>
+        <w:rPr>
+          <w:rFonts w:ascii="Consolas" w:eastAsia="Times New Roman" w:hAnsi="Consolas" w:cs="Times New Roman"/>
+          <w:color w:val="FFFFFF"/>
+          <w:sz w:val="21"/>
+          <w:szCs w:val="21"/>
+        </w:rPr>
+        <w:t xml:space="preserve"> ;</w:t>
+      </w:r>
+    </w:p>
+    <w:p>
+      <w:pPr>
+        <w:shd w:val="clear" w:color="auto" w:fill="00002C"/>
+        <w:spacing w:line="285" w:lineRule="atLeast"/>
+        <w:rPr>
+          <w:rFonts w:ascii="Consolas" w:eastAsia="Times New Roman" w:hAnsi="Consolas" w:cs="Times New Roman"/>
+          <w:color w:val="FFFFFF"/>
+          <w:sz w:val="21"/>
+          <w:szCs w:val="21"/>
+        </w:rPr>
+      </w:pPr>
+      <w:r>
+        <w:rPr>
+          <w:rFonts w:ascii="Consolas" w:eastAsia="Times New Roman" w:hAnsi="Consolas" w:cs="Times New Roman"/>
+          <w:color w:val="FFFFFF"/>
+          <w:sz w:val="21"/>
+          <w:szCs w:val="21"/>
+        </w:rPr>
+        <w:t>       </w:t>
+      </w:r>
+      <w:proofErr w:type="gramStart"/>
+      <w:r>
+        <w:rPr>
+          <w:rFonts w:ascii="Consolas" w:eastAsia="Times New Roman" w:hAnsi="Consolas" w:cs="Times New Roman"/>
+          <w:color w:val="FFFFFF"/>
+          <w:sz w:val="21"/>
+          <w:szCs w:val="21"/>
+        </w:rPr>
+        <w:t>font-weight</w:t>
+      </w:r>
+      <w:proofErr w:type="gramEnd"/>
+      <w:r>
+        <w:rPr>
+          <w:rFonts w:ascii="Consolas" w:eastAsia="Times New Roman" w:hAnsi="Consolas" w:cs="Times New Roman"/>
+          <w:color w:val="FFFFFF"/>
+          <w:sz w:val="21"/>
+          <w:szCs w:val="21"/>
+        </w:rPr>
+        <w:t xml:space="preserve">: </w:t>
+      </w:r>
+      <w:r>
+        <w:rPr>
+          <w:rFonts w:ascii="Consolas" w:eastAsia="Times New Roman" w:hAnsi="Consolas" w:cs="Times New Roman"/>
+          <w:color w:val="FF7E34"/>
+          <w:sz w:val="21"/>
+          <w:szCs w:val="21"/>
+        </w:rPr>
+        <w:t>bold</w:t>
+      </w:r>
+      <w:r>
+        <w:rPr>
+          <w:rFonts w:ascii="Consolas" w:eastAsia="Times New Roman" w:hAnsi="Consolas" w:cs="Times New Roman"/>
+          <w:color w:val="FFFFFF"/>
+          <w:sz w:val="21"/>
+          <w:szCs w:val="21"/>
+        </w:rPr>
+        <w:t>;</w:t>
+      </w:r>
+    </w:p>
+    <w:p>
+      <w:pPr>
+        <w:shd w:val="clear" w:color="auto" w:fill="00002C"/>
+        <w:spacing w:line="285" w:lineRule="atLeast"/>
+        <w:rPr>
+          <w:rFonts w:ascii="Consolas" w:eastAsia="Times New Roman" w:hAnsi="Consolas" w:cs="Times New Roman"/>
+          <w:color w:val="FFFFFF"/>
+          <w:sz w:val="21"/>
+          <w:szCs w:val="21"/>
+        </w:rPr>
+      </w:pPr>
+      <w:r>
+        <w:rPr>
+          <w:rFonts w:ascii="Consolas" w:eastAsia="Times New Roman" w:hAnsi="Consolas" w:cs="Times New Roman"/>
+          <w:color w:val="FFFFFF"/>
+          <w:sz w:val="21"/>
+          <w:szCs w:val="21"/>
+        </w:rPr>
+        <w:t>      }</w:t>
+      </w:r>
+    </w:p>
+    <w:p>
+      <w:pPr>
+        <w:shd w:val="clear" w:color="auto" w:fill="00002C"/>
+        <w:spacing w:line="285" w:lineRule="atLeast"/>
+        <w:rPr>
+          <w:rFonts w:ascii="Consolas" w:eastAsia="Times New Roman" w:hAnsi="Consolas" w:cs="Times New Roman"/>
+          <w:color w:val="FFFFFF"/>
+          <w:sz w:val="21"/>
+          <w:szCs w:val="21"/>
+        </w:rPr>
+      </w:pPr>
+      <w:r>
+        <w:rPr>
+          <w:rFonts w:ascii="Consolas" w:eastAsia="Times New Roman" w:hAnsi="Consolas" w:cs="Times New Roman"/>
+          <w:color w:val="FFFFFF"/>
+          <w:sz w:val="21"/>
+          <w:szCs w:val="21"/>
+        </w:rPr>
+        <w:t xml:space="preserve">      </w:t>
+      </w:r>
+    </w:p>
+    <w:p>
+      <w:pPr>
+        <w:pStyle w:val="NoSpacing"/>
+        <w:rPr>
+          <w:rFonts w:ascii="Courier New" w:hAnsi="Courier New" w:cs="Courier New"/>
+          <w:b/>
+          <w:bCs/>
+          <w:i/>
+          <w:iCs/>
+          <w:color w:val="000000"/>
+          <w:sz w:val="27"/>
+          <w:szCs w:val="27"/>
+        </w:rPr>
+      </w:pPr>
+      <w:r>
+        <w:rPr>
+          <w:rFonts w:ascii="Courier New" w:hAnsi="Courier New" w:cs="Courier New"/>
+          <w:b/>
+          <w:bCs/>
+          <w:i/>
+          <w:iCs/>
+          <w:color w:val="000000"/>
+          <w:sz w:val="27"/>
+          <w:szCs w:val="27"/>
+        </w:rPr>
+        <w:t xml:space="preserve">This is the </w:t>
+      </w:r>
+      <w:proofErr w:type="spellStart"/>
+      <w:r>
+        <w:rPr>
+          <w:rFonts w:ascii="Courier New" w:hAnsi="Courier New" w:cs="Courier New"/>
+          <w:b/>
+          <w:bCs/>
+          <w:i/>
+          <w:iCs/>
+          <w:color w:val="000000"/>
+          <w:sz w:val="27"/>
+          <w:szCs w:val="27"/>
+        </w:rPr>
+        <w:t>praragraph</w:t>
+      </w:r>
+      <w:proofErr w:type="spellEnd"/>
+      <w:r>
+        <w:rPr>
+          <w:rFonts w:ascii="Courier New" w:hAnsi="Courier New" w:cs="Courier New"/>
+          <w:b/>
+          <w:bCs/>
+          <w:i/>
+          <w:iCs/>
+          <w:color w:val="000000"/>
+          <w:sz w:val="27"/>
+          <w:szCs w:val="27"/>
+        </w:rPr>
+        <w:t xml:space="preserve"> and the video on the fonts and colors in the </w:t>
+      </w:r>
+      <w:proofErr w:type="spellStart"/>
+      <w:r>
+        <w:rPr>
+          <w:rFonts w:ascii="Courier New" w:hAnsi="Courier New" w:cs="Courier New"/>
+          <w:b/>
+          <w:bCs/>
+          <w:i/>
+          <w:iCs/>
+          <w:color w:val="000000"/>
+          <w:sz w:val="27"/>
+          <w:szCs w:val="27"/>
+        </w:rPr>
+        <w:t>css</w:t>
+      </w:r>
+      <w:proofErr w:type="spellEnd"/>
+    </w:p>
+    <w:p>
+      <w:pPr>
+        <w:pStyle w:val="NoSpacing"/>
+        <w:rPr>
+          <w:rFonts w:ascii="Courier New" w:hAnsi="Courier New" w:cs="Courier New"/>
+          <w:b/>
+          <w:bCs/>
+          <w:i/>
+          <w:iCs/>
+          <w:color w:val="000000"/>
+          <w:sz w:val="27"/>
+          <w:szCs w:val="27"/>
+        </w:rPr>
+      </w:pPr>
+    </w:p>
+    <w:p>
+      <w:pPr>
+        <w:pStyle w:val="NoSpacing"/>
+        <w:rPr>
+          <w:rFonts w:ascii="Courier New" w:hAnsi="Courier New" w:cs="Courier New"/>
+          <w:b/>
+          <w:bCs/>
+          <w:i/>
+          <w:iCs/>
+          <w:color w:val="000000"/>
+          <w:sz w:val="27"/>
+          <w:szCs w:val="27"/>
+        </w:rPr>
+      </w:pPr>
+    </w:p>
+    <w:p>
+      <w:pPr>
+        <w:pStyle w:val="NoSpacing"/>
+      </w:pPr>
+      <w:r>
+        <w:t>See above the result of the italic and then bold.</w:t>
+      </w:r>
+    </w:p>
+    <w:p>
+      <w:pPr>
+        <w:pStyle w:val="NoSpacing"/>
+      </w:pPr>
+      <w:r>
+        <w:t xml:space="preserve">For to underline the text we use text decoration tag. </w:t>
+      </w:r>
+    </w:p>
+    <w:p>
+      <w:pPr>
+        <w:shd w:val="clear" w:color="auto" w:fill="00002C"/>
+        <w:spacing w:line="285" w:lineRule="atLeast"/>
+        <w:rPr>
+          <w:rFonts w:ascii="Consolas" w:eastAsia="Times New Roman" w:hAnsi="Consolas" w:cs="Times New Roman"/>
+          <w:color w:val="FFFFFF"/>
+          <w:sz w:val="21"/>
+          <w:szCs w:val="21"/>
+        </w:rPr>
+      </w:pPr>
+      <w:r>
+        <w:rPr>
+          <w:rFonts w:ascii="Consolas" w:eastAsia="Times New Roman" w:hAnsi="Consolas" w:cs="Times New Roman"/>
+          <w:color w:val="FFFFFF"/>
+          <w:sz w:val="21"/>
+          <w:szCs w:val="21"/>
+        </w:rPr>
+        <w:t xml:space="preserve">  </w:t>
+      </w:r>
+      <w:proofErr w:type="gramStart"/>
+      <w:r>
+        <w:rPr>
+          <w:rFonts w:ascii="Consolas" w:eastAsia="Times New Roman" w:hAnsi="Consolas" w:cs="Times New Roman"/>
+          <w:color w:val="FF0077"/>
+          <w:sz w:val="21"/>
+          <w:szCs w:val="21"/>
+        </w:rPr>
+        <w:t>h1</w:t>
+      </w:r>
+      <w:r>
+        <w:rPr>
+          <w:rFonts w:ascii="Consolas" w:eastAsia="Times New Roman" w:hAnsi="Consolas" w:cs="Times New Roman"/>
+          <w:color w:val="FFFFFF"/>
+          <w:sz w:val="21"/>
+          <w:szCs w:val="21"/>
+        </w:rPr>
+        <w:t>{</w:t>
+      </w:r>
+      <w:proofErr w:type="gramEnd"/>
+    </w:p>
+    <w:p>
+      <w:pPr>
+        <w:shd w:val="clear" w:color="auto" w:fill="00002C"/>
+        <w:spacing w:line="285" w:lineRule="atLeast"/>
+        <w:rPr>
+          <w:rFonts w:ascii="Consolas" w:eastAsia="Times New Roman" w:hAnsi="Consolas" w:cs="Times New Roman"/>
+          <w:color w:val="FFFFFF"/>
+          <w:sz w:val="21"/>
+          <w:szCs w:val="21"/>
+        </w:rPr>
+      </w:pPr>
+      <w:r>
+        <w:rPr>
+          <w:rFonts w:ascii="Consolas" w:eastAsia="Times New Roman" w:hAnsi="Consolas" w:cs="Times New Roman"/>
+          <w:color w:val="FFFFFF"/>
+          <w:sz w:val="21"/>
+          <w:szCs w:val="21"/>
+        </w:rPr>
+        <w:t xml:space="preserve">        </w:t>
+      </w:r>
+      <w:proofErr w:type="spellStart"/>
+      <w:proofErr w:type="gramStart"/>
+      <w:r>
+        <w:rPr>
+          <w:rFonts w:ascii="Consolas" w:eastAsia="Times New Roman" w:hAnsi="Consolas" w:cs="Times New Roman"/>
+          <w:color w:val="FFFFFF"/>
+          <w:sz w:val="21"/>
+          <w:szCs w:val="21"/>
+        </w:rPr>
+        <w:t>text-decoration:</w:t>
+      </w:r>
+      <w:proofErr w:type="gramEnd"/>
+      <w:r>
+        <w:rPr>
+          <w:rFonts w:ascii="Consolas" w:eastAsia="Times New Roman" w:hAnsi="Consolas" w:cs="Times New Roman"/>
+          <w:color w:val="FF7E34"/>
+          <w:sz w:val="21"/>
+          <w:szCs w:val="21"/>
+        </w:rPr>
+        <w:t>underline</w:t>
+      </w:r>
+      <w:proofErr w:type="spellEnd"/>
+      <w:r>
+        <w:rPr>
+          <w:rFonts w:ascii="Consolas" w:eastAsia="Times New Roman" w:hAnsi="Consolas" w:cs="Times New Roman"/>
+          <w:color w:val="FFFFFF"/>
+          <w:sz w:val="21"/>
+          <w:szCs w:val="21"/>
+        </w:rPr>
+        <w:t>;</w:t>
+      </w:r>
+    </w:p>
+    <w:p>
+      <w:pPr>
+        <w:shd w:val="clear" w:color="auto" w:fill="00002C"/>
+        <w:spacing w:line="285" w:lineRule="atLeast"/>
+        <w:rPr>
+          <w:rFonts w:ascii="Consolas" w:eastAsia="Times New Roman" w:hAnsi="Consolas" w:cs="Times New Roman"/>
+          <w:color w:val="FFFFFF"/>
+          <w:sz w:val="21"/>
+          <w:szCs w:val="21"/>
+        </w:rPr>
+      </w:pPr>
+      <w:r>
+        <w:rPr>
+          <w:rFonts w:ascii="Consolas" w:eastAsia="Times New Roman" w:hAnsi="Consolas" w:cs="Times New Roman"/>
+          <w:color w:val="FFFFFF"/>
+          <w:sz w:val="21"/>
+          <w:szCs w:val="21"/>
+        </w:rPr>
+        <w:t xml:space="preserve">      </w:t>
+      </w:r>
+      <w:proofErr w:type="gramStart"/>
+      <w:r>
+        <w:rPr>
+          <w:rFonts w:ascii="Consolas" w:eastAsia="Times New Roman" w:hAnsi="Consolas" w:cs="Times New Roman"/>
+          <w:color w:val="FFFFFF"/>
+          <w:sz w:val="21"/>
+          <w:szCs w:val="21"/>
+        </w:rPr>
+        <w:t>}</w:t>
+      </w:r>
+      <w:r>
+        <w:rPr>
+          <w:color w:val="000000"/>
+          <w:u w:val="single"/>
+        </w:rPr>
+        <w:t>Fonts</w:t>
+      </w:r>
+      <w:proofErr w:type="gramEnd"/>
+    </w:p>
+    <w:p>
+      <w:pPr>
+        <w:pStyle w:val="Heading1"/>
+        <w:rPr>
+          <w:color w:val="000000"/>
+          <w:u w:val="single"/>
+        </w:rPr>
+      </w:pPr>
+      <w:r>
+        <w:rPr>
+          <w:color w:val="000000"/>
+          <w:u w:val="single"/>
+        </w:rPr>
+        <w:t>Fonts</w:t>
+      </w:r>
+    </w:p>
+    <w:p>
+      <w:pPr>
+        <w:pStyle w:val="NoSpacing"/>
+      </w:pPr>
+      <w:r>
+        <w:t>See here above this is underline text.</w:t>
       </w:r>
       <w:bookmarkStart w:id="5" w:name="_GoBack"/>
       <w:bookmarkEnd w:id="5"/>
@@ -17706,7 +18682,7 @@
 </file>
 
 <file path=customXml/itemProps1.xml><?xml version="1.0" encoding="utf-8"?>
-<ds:datastoreItem xmlns:ds="http://schemas.openxmlformats.org/officeDocument/2006/customXml" ds:itemID="{E773026D-F9A0-4E98-A562-FE5C23CD1050}">
+<ds:datastoreItem xmlns:ds="http://schemas.openxmlformats.org/officeDocument/2006/customXml" ds:itemID="{32279C25-DEA9-4285-B925-0DB41FBCAAC6}">
   <ds:schemaRefs>
     <ds:schemaRef ds:uri="http://schemas.openxmlformats.org/officeDocument/2006/bibliography"/>
   </ds:schemaRefs>

</xml_diff>

<commit_message>
pushing day 8 programs
</commit_message>
<xml_diff>
--- a/Web_Development Notes Scratch to pro.docx
+++ b/Web_Development Notes Scratch to pro.docx
@@ -15760,6 +15760,362 @@
       <w:r>
         <w:t>See here above this is underline text.</w:t>
       </w:r>
+    </w:p>
+    <w:p>
+      <w:pPr>
+        <w:pStyle w:val="NoSpacing"/>
+      </w:pPr>
+    </w:p>
+    <w:p>
+      <w:pPr>
+        <w:rPr>
+          <w:b/>
+          <w:u w:val="single"/>
+        </w:rPr>
+      </w:pPr>
+      <w:r>
+        <w:rPr>
+          <w:b/>
+          <w:u w:val="single"/>
+        </w:rPr>
+        <w:t>9</w:t>
+      </w:r>
+      <w:r>
+        <w:rPr>
+          <w:b/>
+          <w:u w:val="single"/>
+        </w:rPr>
+        <w:t xml:space="preserve"> oct</w:t>
+      </w:r>
+      <w:proofErr w:type="gramStart"/>
+      <w:r>
+        <w:rPr>
+          <w:b/>
+          <w:u w:val="single"/>
+        </w:rPr>
+        <w:t>,2026</w:t>
+      </w:r>
+      <w:proofErr w:type="gramEnd"/>
+    </w:p>
+    <w:p>
+      <w:pPr>
+        <w:pStyle w:val="NoSpacing"/>
+      </w:pPr>
+    </w:p>
+    <w:p>
+      <w:pPr>
+        <w:pStyle w:val="NoSpacing"/>
+      </w:pPr>
+      <w:r>
+        <w:t xml:space="preserve">We can capitalize the text by using the </w:t>
+      </w:r>
+      <w:proofErr w:type="spellStart"/>
+      <w:r>
+        <w:t>css</w:t>
+      </w:r>
+      <w:proofErr w:type="spellEnd"/>
+      <w:r>
+        <w:t xml:space="preserve"> tags and also uppercase lower case etc.</w:t>
+      </w:r>
+    </w:p>
+    <w:p>
+      <w:pPr>
+        <w:shd w:val="clear" w:color="auto" w:fill="00002C"/>
+        <w:spacing w:line="285" w:lineRule="atLeast"/>
+        <w:rPr>
+          <w:rFonts w:ascii="Consolas" w:eastAsia="Times New Roman" w:hAnsi="Consolas" w:cs="Times New Roman"/>
+          <w:color w:val="FFFFFF"/>
+          <w:sz w:val="21"/>
+          <w:szCs w:val="21"/>
+        </w:rPr>
+      </w:pPr>
+      <w:r>
+        <w:rPr>
+          <w:rFonts w:ascii="Consolas" w:eastAsia="Times New Roman" w:hAnsi="Consolas" w:cs="Times New Roman"/>
+          <w:color w:val="FFFFFF"/>
+          <w:sz w:val="21"/>
+          <w:szCs w:val="21"/>
+        </w:rPr>
+        <w:lastRenderedPageBreak/>
+        <w:t> </w:t>
+      </w:r>
+      <w:proofErr w:type="gramStart"/>
+      <w:r>
+        <w:rPr>
+          <w:rFonts w:ascii="Consolas" w:eastAsia="Times New Roman" w:hAnsi="Consolas" w:cs="Times New Roman"/>
+          <w:color w:val="FF0077"/>
+          <w:sz w:val="21"/>
+          <w:szCs w:val="21"/>
+        </w:rPr>
+        <w:t>h2</w:t>
+      </w:r>
+      <w:r>
+        <w:rPr>
+          <w:rFonts w:ascii="Consolas" w:eastAsia="Times New Roman" w:hAnsi="Consolas" w:cs="Times New Roman"/>
+          <w:color w:val="FFFFFF"/>
+          <w:sz w:val="21"/>
+          <w:szCs w:val="21"/>
+        </w:rPr>
+        <w:t>{</w:t>
+      </w:r>
+      <w:proofErr w:type="gramEnd"/>
+    </w:p>
+    <w:p>
+      <w:pPr>
+        <w:shd w:val="clear" w:color="auto" w:fill="00002C"/>
+        <w:spacing w:line="285" w:lineRule="atLeast"/>
+        <w:rPr>
+          <w:rFonts w:ascii="Consolas" w:eastAsia="Times New Roman" w:hAnsi="Consolas" w:cs="Times New Roman"/>
+          <w:color w:val="FFFFFF"/>
+          <w:sz w:val="21"/>
+          <w:szCs w:val="21"/>
+        </w:rPr>
+      </w:pPr>
+      <w:r>
+        <w:rPr>
+          <w:rFonts w:ascii="Consolas" w:eastAsia="Times New Roman" w:hAnsi="Consolas" w:cs="Times New Roman"/>
+          <w:color w:val="FFFFFF"/>
+          <w:sz w:val="21"/>
+          <w:szCs w:val="21"/>
+        </w:rPr>
+        <w:t xml:space="preserve">            </w:t>
+      </w:r>
+      <w:proofErr w:type="spellStart"/>
+      <w:proofErr w:type="gramStart"/>
+      <w:r>
+        <w:rPr>
+          <w:rFonts w:ascii="Consolas" w:eastAsia="Times New Roman" w:hAnsi="Consolas" w:cs="Times New Roman"/>
+          <w:color w:val="FFFFFF"/>
+          <w:sz w:val="21"/>
+          <w:szCs w:val="21"/>
+        </w:rPr>
+        <w:t>text-transform:</w:t>
+      </w:r>
+      <w:proofErr w:type="gramEnd"/>
+      <w:r>
+        <w:rPr>
+          <w:rFonts w:ascii="Consolas" w:eastAsia="Times New Roman" w:hAnsi="Consolas" w:cs="Times New Roman"/>
+          <w:color w:val="FF7E34"/>
+          <w:sz w:val="21"/>
+          <w:szCs w:val="21"/>
+        </w:rPr>
+        <w:t>capitalize</w:t>
+      </w:r>
+      <w:proofErr w:type="spellEnd"/>
+      <w:r>
+        <w:rPr>
+          <w:rFonts w:ascii="Consolas" w:eastAsia="Times New Roman" w:hAnsi="Consolas" w:cs="Times New Roman"/>
+          <w:color w:val="FFFFFF"/>
+          <w:sz w:val="21"/>
+          <w:szCs w:val="21"/>
+        </w:rPr>
+        <w:t>;</w:t>
+      </w:r>
+    </w:p>
+    <w:p>
+      <w:pPr>
+        <w:shd w:val="clear" w:color="auto" w:fill="00002C"/>
+        <w:spacing w:line="285" w:lineRule="atLeast"/>
+        <w:rPr>
+          <w:rFonts w:ascii="Consolas" w:eastAsia="Times New Roman" w:hAnsi="Consolas" w:cs="Times New Roman"/>
+          <w:color w:val="FFFFFF"/>
+          <w:sz w:val="21"/>
+          <w:szCs w:val="21"/>
+        </w:rPr>
+      </w:pPr>
+      <w:r>
+        <w:rPr>
+          <w:rFonts w:ascii="Consolas" w:eastAsia="Times New Roman" w:hAnsi="Consolas" w:cs="Times New Roman"/>
+          <w:color w:val="FFFFFF"/>
+          <w:sz w:val="21"/>
+          <w:szCs w:val="21"/>
+        </w:rPr>
+        <w:t>        }</w:t>
+      </w:r>
+    </w:p>
+    <w:p>
+      <w:pPr>
+        <w:shd w:val="clear" w:color="auto" w:fill="00002C"/>
+        <w:spacing w:line="285" w:lineRule="atLeast"/>
+        <w:rPr>
+          <w:rFonts w:ascii="Consolas" w:eastAsia="Times New Roman" w:hAnsi="Consolas" w:cs="Times New Roman"/>
+          <w:color w:val="FFFFFF"/>
+          <w:sz w:val="21"/>
+          <w:szCs w:val="21"/>
+        </w:rPr>
+      </w:pPr>
+      <w:r>
+        <w:rPr>
+          <w:rFonts w:ascii="Consolas" w:eastAsia="Times New Roman" w:hAnsi="Consolas" w:cs="Times New Roman"/>
+          <w:color w:val="FFFFFF"/>
+          <w:sz w:val="21"/>
+          <w:szCs w:val="21"/>
+        </w:rPr>
+        <w:t>    &lt;/</w:t>
+      </w:r>
+      <w:r>
+        <w:rPr>
+          <w:rFonts w:ascii="Consolas" w:eastAsia="Times New Roman" w:hAnsi="Consolas" w:cs="Times New Roman"/>
+          <w:color w:val="FF0077"/>
+          <w:sz w:val="21"/>
+          <w:szCs w:val="21"/>
+        </w:rPr>
+        <w:t>style</w:t>
+      </w:r>
+      <w:r>
+        <w:rPr>
+          <w:rFonts w:ascii="Consolas" w:eastAsia="Times New Roman" w:hAnsi="Consolas" w:cs="Times New Roman"/>
+          <w:color w:val="FFFFFF"/>
+          <w:sz w:val="21"/>
+          <w:szCs w:val="21"/>
+        </w:rPr>
+        <w:t>&gt;</w:t>
+      </w:r>
+    </w:p>
+    <w:p>
+      <w:pPr>
+        <w:shd w:val="clear" w:color="auto" w:fill="00002C"/>
+        <w:spacing w:line="285" w:lineRule="atLeast"/>
+        <w:rPr>
+          <w:rFonts w:ascii="Consolas" w:eastAsia="Times New Roman" w:hAnsi="Consolas" w:cs="Times New Roman"/>
+          <w:color w:val="FFFFFF"/>
+          <w:sz w:val="21"/>
+          <w:szCs w:val="21"/>
+        </w:rPr>
+      </w:pPr>
+      <w:r>
+        <w:rPr>
+          <w:rFonts w:ascii="Consolas" w:eastAsia="Times New Roman" w:hAnsi="Consolas" w:cs="Times New Roman"/>
+          <w:color w:val="FFFFFF"/>
+          <w:sz w:val="21"/>
+          <w:szCs w:val="21"/>
+        </w:rPr>
+        <w:t>&lt;/</w:t>
+      </w:r>
+      <w:r>
+        <w:rPr>
+          <w:rFonts w:ascii="Consolas" w:eastAsia="Times New Roman" w:hAnsi="Consolas" w:cs="Times New Roman"/>
+          <w:color w:val="FF0077"/>
+          <w:sz w:val="21"/>
+          <w:szCs w:val="21"/>
+        </w:rPr>
+        <w:t>head</w:t>
+      </w:r>
+      <w:r>
+        <w:rPr>
+          <w:rFonts w:ascii="Consolas" w:eastAsia="Times New Roman" w:hAnsi="Consolas" w:cs="Times New Roman"/>
+          <w:color w:val="FFFFFF"/>
+          <w:sz w:val="21"/>
+          <w:szCs w:val="21"/>
+        </w:rPr>
+        <w:t>&gt;</w:t>
+      </w:r>
+    </w:p>
+    <w:p>
+      <w:pPr>
+        <w:shd w:val="clear" w:color="auto" w:fill="00002C"/>
+        <w:spacing w:line="285" w:lineRule="atLeast"/>
+        <w:rPr>
+          <w:rFonts w:ascii="Consolas" w:eastAsia="Times New Roman" w:hAnsi="Consolas" w:cs="Times New Roman"/>
+          <w:color w:val="FFFFFF"/>
+          <w:sz w:val="21"/>
+          <w:szCs w:val="21"/>
+        </w:rPr>
+      </w:pPr>
+      <w:r>
+        <w:rPr>
+          <w:rFonts w:ascii="Consolas" w:eastAsia="Times New Roman" w:hAnsi="Consolas" w:cs="Times New Roman"/>
+          <w:color w:val="FFFFFF"/>
+          <w:sz w:val="21"/>
+          <w:szCs w:val="21"/>
+        </w:rPr>
+        <w:t>&lt;</w:t>
+      </w:r>
+      <w:proofErr w:type="gramStart"/>
+      <w:r>
+        <w:rPr>
+          <w:rFonts w:ascii="Consolas" w:eastAsia="Times New Roman" w:hAnsi="Consolas" w:cs="Times New Roman"/>
+          <w:color w:val="FF0077"/>
+          <w:sz w:val="21"/>
+          <w:szCs w:val="21"/>
+        </w:rPr>
+        <w:t>body</w:t>
+      </w:r>
+      <w:proofErr w:type="gramEnd"/>
+      <w:r>
+        <w:rPr>
+          <w:rFonts w:ascii="Consolas" w:eastAsia="Times New Roman" w:hAnsi="Consolas" w:cs="Times New Roman"/>
+          <w:color w:val="FFFFFF"/>
+          <w:sz w:val="21"/>
+          <w:szCs w:val="21"/>
+        </w:rPr>
+        <w:t>&gt;</w:t>
+      </w:r>
+    </w:p>
+    <w:p>
+      <w:pPr>
+        <w:shd w:val="clear" w:color="auto" w:fill="00002C"/>
+        <w:spacing w:line="285" w:lineRule="atLeast"/>
+        <w:rPr>
+          <w:rFonts w:ascii="Consolas" w:eastAsia="Times New Roman" w:hAnsi="Consolas" w:cs="Times New Roman"/>
+          <w:color w:val="FFFFFF"/>
+          <w:sz w:val="21"/>
+          <w:szCs w:val="21"/>
+        </w:rPr>
+      </w:pPr>
+      <w:r>
+        <w:rPr>
+          <w:rFonts w:ascii="Consolas" w:eastAsia="Times New Roman" w:hAnsi="Consolas" w:cs="Times New Roman"/>
+          <w:color w:val="FFFFFF"/>
+          <w:sz w:val="21"/>
+          <w:szCs w:val="21"/>
+        </w:rPr>
+        <w:t>    &lt;</w:t>
+      </w:r>
+      <w:r>
+        <w:rPr>
+          <w:rFonts w:ascii="Consolas" w:eastAsia="Times New Roman" w:hAnsi="Consolas" w:cs="Times New Roman"/>
+          <w:color w:val="FF0077"/>
+          <w:sz w:val="21"/>
+          <w:szCs w:val="21"/>
+        </w:rPr>
+        <w:t>h2</w:t>
+      </w:r>
+      <w:r>
+        <w:rPr>
+          <w:rFonts w:ascii="Consolas" w:eastAsia="Times New Roman" w:hAnsi="Consolas" w:cs="Times New Roman"/>
+          <w:color w:val="FFFFFF"/>
+          <w:sz w:val="21"/>
+          <w:szCs w:val="21"/>
+        </w:rPr>
+        <w:t>&gt;about&lt;/</w:t>
+      </w:r>
+      <w:r>
+        <w:rPr>
+          <w:rFonts w:ascii="Consolas" w:eastAsia="Times New Roman" w:hAnsi="Consolas" w:cs="Times New Roman"/>
+          <w:color w:val="FF0077"/>
+          <w:sz w:val="21"/>
+          <w:szCs w:val="21"/>
+        </w:rPr>
+        <w:t>h2</w:t>
+      </w:r>
+      <w:r>
+        <w:rPr>
+          <w:rFonts w:ascii="Consolas" w:eastAsia="Times New Roman" w:hAnsi="Consolas" w:cs="Times New Roman"/>
+          <w:color w:val="FFFFFF"/>
+          <w:sz w:val="21"/>
+          <w:szCs w:val="21"/>
+        </w:rPr>
+        <w:t>&gt;</w:t>
+      </w:r>
+    </w:p>
+    <w:p>
+      <w:pPr>
+        <w:pStyle w:val="NoSpacing"/>
+      </w:pPr>
+      <w:r>
+        <w:t xml:space="preserve">See here in the text </w:t>
+      </w:r>
       <w:bookmarkStart w:id="5" w:name="_GoBack"/>
       <w:bookmarkEnd w:id="5"/>
     </w:p>
@@ -17975,7 +18331,7 @@
   </w:latentStyles>
   <w:style w:type="paragraph" w:default="1" w:styleId="Normal">
     <w:name w:val="Normal"/>
-    <w:rsid w:val="006B3D6D"/>
+    <w:rsid w:val="00464352"/>
   </w:style>
   <w:style w:type="paragraph" w:styleId="Heading1">
     <w:name w:val="heading 1"/>
@@ -18682,7 +19038,7 @@
 </file>
 
 <file path=customXml/itemProps1.xml><?xml version="1.0" encoding="utf-8"?>
-<ds:datastoreItem xmlns:ds="http://schemas.openxmlformats.org/officeDocument/2006/customXml" ds:itemID="{32279C25-DEA9-4285-B925-0DB41FBCAAC6}">
+<ds:datastoreItem xmlns:ds="http://schemas.openxmlformats.org/officeDocument/2006/customXml" ds:itemID="{D2C9A4A6-EAFE-4A16-A8D3-DB2A0351F56A}">
   <ds:schemaRefs>
     <ds:schemaRef ds:uri="http://schemas.openxmlformats.org/officeDocument/2006/bibliography"/>
   </ds:schemaRefs>

</xml_diff>

<commit_message>
adding the day 10 programs
</commit_message>
<xml_diff>
--- a/Web_Development Notes Scratch to pro.docx
+++ b/Web_Development Notes Scratch to pro.docx
@@ -19374,6 +19374,3933 @@
       <w:r>
         <w:t xml:space="preserve"> and the use the values and made changes according to you in the values</w:t>
       </w:r>
+    </w:p>
+    <w:p>
+      <w:pPr>
+        <w:pStyle w:val="NoSpacing"/>
+      </w:pPr>
+    </w:p>
+    <w:p>
+      <w:pPr>
+        <w:pStyle w:val="NoSpacing"/>
+        <w:rPr>
+          <w:b/>
+        </w:rPr>
+      </w:pPr>
+    </w:p>
+    <w:p>
+      <w:pPr>
+        <w:pStyle w:val="NoSpacing"/>
+        <w:rPr>
+          <w:b/>
+        </w:rPr>
+      </w:pPr>
+      <w:proofErr w:type="spellStart"/>
+      <w:r>
+        <w:rPr>
+          <w:b/>
+        </w:rPr>
+        <w:t>Css</w:t>
+      </w:r>
+      <w:proofErr w:type="spellEnd"/>
+      <w:r>
+        <w:rPr>
+          <w:b/>
+        </w:rPr>
+        <w:t xml:space="preserve"> specificity and cascade:</w:t>
+      </w:r>
+    </w:p>
+    <w:p>
+      <w:pPr>
+        <w:pStyle w:val="NoSpacing"/>
+        <w:tabs>
+          <w:tab w:val="left" w:pos="1230"/>
+        </w:tabs>
+      </w:pPr>
+      <w:r>
+        <w:tab/>
+      </w:r>
+      <w:proofErr w:type="spellStart"/>
+      <w:r>
+        <w:t>Css</w:t>
+      </w:r>
+      <w:proofErr w:type="spellEnd"/>
+      <w:r>
+        <w:t xml:space="preserve"> specificity means that when we apply the </w:t>
+      </w:r>
+      <w:proofErr w:type="spellStart"/>
+      <w:r>
+        <w:t>css</w:t>
+      </w:r>
+      <w:proofErr w:type="spellEnd"/>
+      <w:r>
+        <w:t xml:space="preserve"> by using the </w:t>
+      </w:r>
+      <w:proofErr w:type="gramStart"/>
+      <w:r>
+        <w:t>selector .</w:t>
+      </w:r>
+      <w:proofErr w:type="gramEnd"/>
+      <w:r>
+        <w:t xml:space="preserve"> </w:t>
+      </w:r>
+      <w:proofErr w:type="spellStart"/>
+      <w:proofErr w:type="gramStart"/>
+      <w:r>
+        <w:t>e.g</w:t>
+      </w:r>
+      <w:proofErr w:type="spellEnd"/>
+      <w:proofErr w:type="gramEnd"/>
+      <w:r>
+        <w:t xml:space="preserve"> one </w:t>
+      </w:r>
+      <w:proofErr w:type="spellStart"/>
+      <w:r>
+        <w:t>selecter</w:t>
+      </w:r>
+      <w:proofErr w:type="spellEnd"/>
+      <w:r>
+        <w:t xml:space="preserve"> says that turn the color of the paragraph to the green and another selector says to blue but know confusion is that which one is apply which we describe by the specificity</w:t>
+      </w:r>
+    </w:p>
+    <w:p>
+      <w:pPr>
+        <w:shd w:val="clear" w:color="auto" w:fill="00002C"/>
+        <w:spacing w:line="285" w:lineRule="atLeast"/>
+        <w:rPr>
+          <w:rFonts w:ascii="Consolas" w:eastAsia="Times New Roman" w:hAnsi="Consolas" w:cs="Times New Roman"/>
+          <w:color w:val="FFFFFF"/>
+          <w:sz w:val="21"/>
+          <w:szCs w:val="21"/>
+        </w:rPr>
+      </w:pPr>
+      <w:r>
+        <w:t xml:space="preserve"> </w:t>
+      </w:r>
+      <w:r>
+        <w:rPr>
+          <w:rFonts w:ascii="Consolas" w:eastAsia="Times New Roman" w:hAnsi="Consolas" w:cs="Times New Roman"/>
+          <w:color w:val="FFFFFF"/>
+          <w:sz w:val="21"/>
+          <w:szCs w:val="21"/>
+        </w:rPr>
+        <w:t>&lt;</w:t>
+      </w:r>
+      <w:proofErr w:type="gramStart"/>
+      <w:r>
+        <w:rPr>
+          <w:rFonts w:ascii="Consolas" w:eastAsia="Times New Roman" w:hAnsi="Consolas" w:cs="Times New Roman"/>
+          <w:color w:val="FF0077"/>
+          <w:sz w:val="21"/>
+          <w:szCs w:val="21"/>
+        </w:rPr>
+        <w:t>style</w:t>
+      </w:r>
+      <w:proofErr w:type="gramEnd"/>
+      <w:r>
+        <w:rPr>
+          <w:rFonts w:ascii="Consolas" w:eastAsia="Times New Roman" w:hAnsi="Consolas" w:cs="Times New Roman"/>
+          <w:color w:val="FFFFFF"/>
+          <w:sz w:val="21"/>
+          <w:szCs w:val="21"/>
+        </w:rPr>
+        <w:t>&gt;</w:t>
+      </w:r>
+    </w:p>
+    <w:p>
+      <w:pPr>
+        <w:shd w:val="clear" w:color="auto" w:fill="00002C"/>
+        <w:spacing w:line="285" w:lineRule="atLeast"/>
+        <w:rPr>
+          <w:rFonts w:ascii="Consolas" w:eastAsia="Times New Roman" w:hAnsi="Consolas" w:cs="Times New Roman"/>
+          <w:color w:val="FFFFFF"/>
+          <w:sz w:val="21"/>
+          <w:szCs w:val="21"/>
+        </w:rPr>
+      </w:pPr>
+      <w:r>
+        <w:rPr>
+          <w:rFonts w:ascii="Consolas" w:eastAsia="Times New Roman" w:hAnsi="Consolas" w:cs="Times New Roman"/>
+          <w:color w:val="FFFFFF"/>
+          <w:sz w:val="21"/>
+          <w:szCs w:val="21"/>
+        </w:rPr>
+        <w:t xml:space="preserve">        </w:t>
+      </w:r>
+      <w:proofErr w:type="gramStart"/>
+      <w:r>
+        <w:rPr>
+          <w:rFonts w:ascii="Consolas" w:eastAsia="Times New Roman" w:hAnsi="Consolas" w:cs="Times New Roman"/>
+          <w:color w:val="FF0077"/>
+          <w:sz w:val="21"/>
+          <w:szCs w:val="21"/>
+        </w:rPr>
+        <w:t>h1</w:t>
+      </w:r>
+      <w:r>
+        <w:rPr>
+          <w:rFonts w:ascii="Consolas" w:eastAsia="Times New Roman" w:hAnsi="Consolas" w:cs="Times New Roman"/>
+          <w:color w:val="FFFFFF"/>
+          <w:sz w:val="21"/>
+          <w:szCs w:val="21"/>
+        </w:rPr>
+        <w:t>{</w:t>
+      </w:r>
+      <w:proofErr w:type="gramEnd"/>
+    </w:p>
+    <w:p>
+      <w:pPr>
+        <w:shd w:val="clear" w:color="auto" w:fill="00002C"/>
+        <w:spacing w:line="285" w:lineRule="atLeast"/>
+        <w:rPr>
+          <w:rFonts w:ascii="Consolas" w:eastAsia="Times New Roman" w:hAnsi="Consolas" w:cs="Times New Roman"/>
+          <w:color w:val="FFFFFF"/>
+          <w:sz w:val="21"/>
+          <w:szCs w:val="21"/>
+        </w:rPr>
+      </w:pPr>
+      <w:r>
+        <w:rPr>
+          <w:rFonts w:ascii="Consolas" w:eastAsia="Times New Roman" w:hAnsi="Consolas" w:cs="Times New Roman"/>
+          <w:color w:val="FFFFFF"/>
+          <w:sz w:val="21"/>
+          <w:szCs w:val="21"/>
+        </w:rPr>
+        <w:t xml:space="preserve">            </w:t>
+      </w:r>
+      <w:proofErr w:type="gramStart"/>
+      <w:r>
+        <w:rPr>
+          <w:rFonts w:ascii="Consolas" w:eastAsia="Times New Roman" w:hAnsi="Consolas" w:cs="Times New Roman"/>
+          <w:color w:val="FFFFFF"/>
+          <w:sz w:val="21"/>
+          <w:szCs w:val="21"/>
+        </w:rPr>
+        <w:t>color</w:t>
+      </w:r>
+      <w:proofErr w:type="gramEnd"/>
+      <w:r>
+        <w:rPr>
+          <w:rFonts w:ascii="Consolas" w:eastAsia="Times New Roman" w:hAnsi="Consolas" w:cs="Times New Roman"/>
+          <w:color w:val="FFFFFF"/>
+          <w:sz w:val="21"/>
+          <w:szCs w:val="21"/>
+        </w:rPr>
+        <w:t xml:space="preserve">: </w:t>
+      </w:r>
+      <w:proofErr w:type="spellStart"/>
+      <w:r>
+        <w:rPr>
+          <w:rFonts w:ascii="Consolas" w:eastAsia="Times New Roman" w:hAnsi="Consolas" w:cs="Times New Roman"/>
+          <w:color w:val="00FFFF"/>
+          <w:sz w:val="21"/>
+          <w:szCs w:val="21"/>
+        </w:rPr>
+        <w:t>rgb</w:t>
+      </w:r>
+      <w:proofErr w:type="spellEnd"/>
+      <w:r>
+        <w:rPr>
+          <w:rFonts w:ascii="Consolas" w:eastAsia="Times New Roman" w:hAnsi="Consolas" w:cs="Times New Roman"/>
+          <w:color w:val="FFFFFF"/>
+          <w:sz w:val="21"/>
+          <w:szCs w:val="21"/>
+        </w:rPr>
+        <w:t>(</w:t>
+      </w:r>
+      <w:r>
+        <w:rPr>
+          <w:rFonts w:ascii="Consolas" w:eastAsia="Times New Roman" w:hAnsi="Consolas" w:cs="Times New Roman"/>
+          <w:color w:val="FF7E34"/>
+          <w:sz w:val="21"/>
+          <w:szCs w:val="21"/>
+        </w:rPr>
+        <w:t>0</w:t>
+      </w:r>
+      <w:r>
+        <w:rPr>
+          <w:rFonts w:ascii="Consolas" w:eastAsia="Times New Roman" w:hAnsi="Consolas" w:cs="Times New Roman"/>
+          <w:color w:val="FFFFFF"/>
+          <w:sz w:val="21"/>
+          <w:szCs w:val="21"/>
+        </w:rPr>
+        <w:t xml:space="preserve">, </w:t>
+      </w:r>
+      <w:r>
+        <w:rPr>
+          <w:rFonts w:ascii="Consolas" w:eastAsia="Times New Roman" w:hAnsi="Consolas" w:cs="Times New Roman"/>
+          <w:color w:val="FF7E34"/>
+          <w:sz w:val="21"/>
+          <w:szCs w:val="21"/>
+        </w:rPr>
+        <w:t>255</w:t>
+      </w:r>
+      <w:r>
+        <w:rPr>
+          <w:rFonts w:ascii="Consolas" w:eastAsia="Times New Roman" w:hAnsi="Consolas" w:cs="Times New Roman"/>
+          <w:color w:val="FFFFFF"/>
+          <w:sz w:val="21"/>
+          <w:szCs w:val="21"/>
+        </w:rPr>
+        <w:t xml:space="preserve">, </w:t>
+      </w:r>
+      <w:r>
+        <w:rPr>
+          <w:rFonts w:ascii="Consolas" w:eastAsia="Times New Roman" w:hAnsi="Consolas" w:cs="Times New Roman"/>
+          <w:color w:val="FF7E34"/>
+          <w:sz w:val="21"/>
+          <w:szCs w:val="21"/>
+        </w:rPr>
+        <w:t>98</w:t>
+      </w:r>
+      <w:r>
+        <w:rPr>
+          <w:rFonts w:ascii="Consolas" w:eastAsia="Times New Roman" w:hAnsi="Consolas" w:cs="Times New Roman"/>
+          <w:color w:val="FFFFFF"/>
+          <w:sz w:val="21"/>
+          <w:szCs w:val="21"/>
+        </w:rPr>
+        <w:t>);</w:t>
+      </w:r>
+    </w:p>
+    <w:p>
+      <w:pPr>
+        <w:shd w:val="clear" w:color="auto" w:fill="00002C"/>
+        <w:spacing w:line="285" w:lineRule="atLeast"/>
+        <w:rPr>
+          <w:rFonts w:ascii="Consolas" w:eastAsia="Times New Roman" w:hAnsi="Consolas" w:cs="Times New Roman"/>
+          <w:color w:val="FFFFFF"/>
+          <w:sz w:val="21"/>
+          <w:szCs w:val="21"/>
+        </w:rPr>
+      </w:pPr>
+      <w:r>
+        <w:rPr>
+          <w:rFonts w:ascii="Consolas" w:eastAsia="Times New Roman" w:hAnsi="Consolas" w:cs="Times New Roman"/>
+          <w:color w:val="FFFFFF"/>
+          <w:sz w:val="21"/>
+          <w:szCs w:val="21"/>
+        </w:rPr>
+        <w:t>            .</w:t>
+      </w:r>
+      <w:proofErr w:type="spellStart"/>
+      <w:proofErr w:type="gramStart"/>
+      <w:r>
+        <w:rPr>
+          <w:rFonts w:ascii="Consolas" w:eastAsia="Times New Roman" w:hAnsi="Consolas" w:cs="Times New Roman"/>
+          <w:color w:val="FFCB6B"/>
+          <w:sz w:val="21"/>
+          <w:szCs w:val="21"/>
+        </w:rPr>
+        <w:t>vblue</w:t>
+      </w:r>
+      <w:proofErr w:type="spellEnd"/>
+      <w:r>
+        <w:rPr>
+          <w:rFonts w:ascii="Consolas" w:eastAsia="Times New Roman" w:hAnsi="Consolas" w:cs="Times New Roman"/>
+          <w:color w:val="FFFFFF"/>
+          <w:sz w:val="21"/>
+          <w:szCs w:val="21"/>
+        </w:rPr>
+        <w:t>{</w:t>
+      </w:r>
+      <w:proofErr w:type="gramEnd"/>
+    </w:p>
+    <w:p>
+      <w:pPr>
+        <w:shd w:val="clear" w:color="auto" w:fill="00002C"/>
+        <w:spacing w:line="285" w:lineRule="atLeast"/>
+        <w:rPr>
+          <w:rFonts w:ascii="Consolas" w:eastAsia="Times New Roman" w:hAnsi="Consolas" w:cs="Times New Roman"/>
+          <w:color w:val="FFFFFF"/>
+          <w:sz w:val="21"/>
+          <w:szCs w:val="21"/>
+        </w:rPr>
+      </w:pPr>
+      <w:r>
+        <w:rPr>
+          <w:rFonts w:ascii="Consolas" w:eastAsia="Times New Roman" w:hAnsi="Consolas" w:cs="Times New Roman"/>
+          <w:color w:val="FFFFFF"/>
+          <w:sz w:val="21"/>
+          <w:szCs w:val="21"/>
+        </w:rPr>
+        <w:t xml:space="preserve">                </w:t>
+      </w:r>
+      <w:proofErr w:type="gramStart"/>
+      <w:r>
+        <w:rPr>
+          <w:rFonts w:ascii="Consolas" w:eastAsia="Times New Roman" w:hAnsi="Consolas" w:cs="Times New Roman"/>
+          <w:color w:val="FFFFFF"/>
+          <w:sz w:val="21"/>
+          <w:szCs w:val="21"/>
+        </w:rPr>
+        <w:t>color</w:t>
+      </w:r>
+      <w:proofErr w:type="gramEnd"/>
+      <w:r>
+        <w:rPr>
+          <w:rFonts w:ascii="Consolas" w:eastAsia="Times New Roman" w:hAnsi="Consolas" w:cs="Times New Roman"/>
+          <w:color w:val="FFFFFF"/>
+          <w:sz w:val="21"/>
+          <w:szCs w:val="21"/>
+        </w:rPr>
+        <w:t xml:space="preserve">: </w:t>
+      </w:r>
+      <w:r>
+        <w:rPr>
+          <w:rFonts w:ascii="Consolas" w:eastAsia="Times New Roman" w:hAnsi="Consolas" w:cs="Times New Roman"/>
+          <w:color w:val="FF7E34"/>
+          <w:sz w:val="21"/>
+          <w:szCs w:val="21"/>
+        </w:rPr>
+        <w:t>blue</w:t>
+      </w:r>
+      <w:r>
+        <w:rPr>
+          <w:rFonts w:ascii="Consolas" w:eastAsia="Times New Roman" w:hAnsi="Consolas" w:cs="Times New Roman"/>
+          <w:color w:val="FFFFFF"/>
+          <w:sz w:val="21"/>
+          <w:szCs w:val="21"/>
+        </w:rPr>
+        <w:t>;}</w:t>
+      </w:r>
+    </w:p>
+    <w:p>
+      <w:pPr>
+        <w:shd w:val="clear" w:color="auto" w:fill="00002C"/>
+        <w:spacing w:line="285" w:lineRule="atLeast"/>
+        <w:rPr>
+          <w:rFonts w:ascii="Consolas" w:eastAsia="Times New Roman" w:hAnsi="Consolas" w:cs="Times New Roman"/>
+          <w:color w:val="FFFFFF"/>
+          <w:sz w:val="21"/>
+          <w:szCs w:val="21"/>
+        </w:rPr>
+      </w:pPr>
+      <w:r>
+        <w:rPr>
+          <w:rFonts w:ascii="Consolas" w:eastAsia="Times New Roman" w:hAnsi="Consolas" w:cs="Times New Roman"/>
+          <w:color w:val="FFFFFF"/>
+          <w:sz w:val="21"/>
+          <w:szCs w:val="21"/>
+        </w:rPr>
+        <w:t>            .</w:t>
+      </w:r>
+      <w:proofErr w:type="spellStart"/>
+      <w:proofErr w:type="gramStart"/>
+      <w:r>
+        <w:rPr>
+          <w:rFonts w:ascii="Consolas" w:eastAsia="Times New Roman" w:hAnsi="Consolas" w:cs="Times New Roman"/>
+          <w:color w:val="FFCB6B"/>
+          <w:sz w:val="21"/>
+          <w:szCs w:val="21"/>
+        </w:rPr>
+        <w:t>tpurple</w:t>
+      </w:r>
+      <w:proofErr w:type="spellEnd"/>
+      <w:r>
+        <w:rPr>
+          <w:rFonts w:ascii="Consolas" w:eastAsia="Times New Roman" w:hAnsi="Consolas" w:cs="Times New Roman"/>
+          <w:color w:val="FFFFFF"/>
+          <w:sz w:val="21"/>
+          <w:szCs w:val="21"/>
+        </w:rPr>
+        <w:t>{</w:t>
+      </w:r>
+      <w:proofErr w:type="gramEnd"/>
+    </w:p>
+    <w:p>
+      <w:pPr>
+        <w:shd w:val="clear" w:color="auto" w:fill="00002C"/>
+        <w:spacing w:line="285" w:lineRule="atLeast"/>
+        <w:rPr>
+          <w:rFonts w:ascii="Consolas" w:eastAsia="Times New Roman" w:hAnsi="Consolas" w:cs="Times New Roman"/>
+          <w:color w:val="FFFFFF"/>
+          <w:sz w:val="21"/>
+          <w:szCs w:val="21"/>
+        </w:rPr>
+      </w:pPr>
+      <w:r>
+        <w:rPr>
+          <w:rFonts w:ascii="Consolas" w:eastAsia="Times New Roman" w:hAnsi="Consolas" w:cs="Times New Roman"/>
+          <w:color w:val="FFFFFF"/>
+          <w:sz w:val="21"/>
+          <w:szCs w:val="21"/>
+        </w:rPr>
+        <w:t xml:space="preserve">                </w:t>
+      </w:r>
+      <w:proofErr w:type="gramStart"/>
+      <w:r>
+        <w:rPr>
+          <w:rFonts w:ascii="Consolas" w:eastAsia="Times New Roman" w:hAnsi="Consolas" w:cs="Times New Roman"/>
+          <w:color w:val="FFFFFF"/>
+          <w:sz w:val="21"/>
+          <w:szCs w:val="21"/>
+        </w:rPr>
+        <w:t>color</w:t>
+      </w:r>
+      <w:proofErr w:type="gramEnd"/>
+      <w:r>
+        <w:rPr>
+          <w:rFonts w:ascii="Consolas" w:eastAsia="Times New Roman" w:hAnsi="Consolas" w:cs="Times New Roman"/>
+          <w:color w:val="FFFFFF"/>
+          <w:sz w:val="21"/>
+          <w:szCs w:val="21"/>
+        </w:rPr>
+        <w:t xml:space="preserve">: </w:t>
+      </w:r>
+      <w:r>
+        <w:rPr>
+          <w:rFonts w:ascii="Consolas" w:eastAsia="Times New Roman" w:hAnsi="Consolas" w:cs="Times New Roman"/>
+          <w:color w:val="FF7E34"/>
+          <w:sz w:val="21"/>
+          <w:szCs w:val="21"/>
+        </w:rPr>
+        <w:t>firebrick</w:t>
+      </w:r>
+      <w:r>
+        <w:rPr>
+          <w:rFonts w:ascii="Consolas" w:eastAsia="Times New Roman" w:hAnsi="Consolas" w:cs="Times New Roman"/>
+          <w:color w:val="FFFFFF"/>
+          <w:sz w:val="21"/>
+          <w:szCs w:val="21"/>
+        </w:rPr>
+        <w:t>;</w:t>
+      </w:r>
+    </w:p>
+    <w:p>
+      <w:pPr>
+        <w:shd w:val="clear" w:color="auto" w:fill="00002C"/>
+        <w:spacing w:line="285" w:lineRule="atLeast"/>
+        <w:rPr>
+          <w:rFonts w:ascii="Consolas" w:eastAsia="Times New Roman" w:hAnsi="Consolas" w:cs="Times New Roman"/>
+          <w:color w:val="FFFFFF"/>
+          <w:sz w:val="21"/>
+          <w:szCs w:val="21"/>
+        </w:rPr>
+      </w:pPr>
+      <w:r>
+        <w:rPr>
+          <w:rFonts w:ascii="Consolas" w:eastAsia="Times New Roman" w:hAnsi="Consolas" w:cs="Times New Roman"/>
+          <w:color w:val="FFFFFF"/>
+          <w:sz w:val="21"/>
+          <w:szCs w:val="21"/>
+        </w:rPr>
+        <w:t>            }</w:t>
+      </w:r>
+    </w:p>
+    <w:p>
+      <w:pPr>
+        <w:shd w:val="clear" w:color="auto" w:fill="00002C"/>
+        <w:spacing w:line="285" w:lineRule="atLeast"/>
+        <w:rPr>
+          <w:rFonts w:ascii="Consolas" w:eastAsia="Times New Roman" w:hAnsi="Consolas" w:cs="Times New Roman"/>
+          <w:color w:val="FFFFFF"/>
+          <w:sz w:val="21"/>
+          <w:szCs w:val="21"/>
+        </w:rPr>
+      </w:pPr>
+      <w:r>
+        <w:rPr>
+          <w:rFonts w:ascii="Consolas" w:eastAsia="Times New Roman" w:hAnsi="Consolas" w:cs="Times New Roman"/>
+          <w:color w:val="FFFFFF"/>
+          <w:sz w:val="21"/>
+          <w:szCs w:val="21"/>
+        </w:rPr>
+        <w:t>            .</w:t>
+      </w:r>
+      <w:proofErr w:type="spellStart"/>
+      <w:proofErr w:type="gramStart"/>
+      <w:r>
+        <w:rPr>
+          <w:rFonts w:ascii="Consolas" w:eastAsia="Times New Roman" w:hAnsi="Consolas" w:cs="Times New Roman"/>
+          <w:color w:val="FFCB6B"/>
+          <w:sz w:val="21"/>
+          <w:szCs w:val="21"/>
+        </w:rPr>
+        <w:t>mgrey</w:t>
+      </w:r>
+      <w:proofErr w:type="spellEnd"/>
+      <w:r>
+        <w:rPr>
+          <w:rFonts w:ascii="Consolas" w:eastAsia="Times New Roman" w:hAnsi="Consolas" w:cs="Times New Roman"/>
+          <w:color w:val="FFFFFF"/>
+          <w:sz w:val="21"/>
+          <w:szCs w:val="21"/>
+        </w:rPr>
+        <w:t>{</w:t>
+      </w:r>
+      <w:proofErr w:type="gramEnd"/>
+    </w:p>
+    <w:p>
+      <w:pPr>
+        <w:shd w:val="clear" w:color="auto" w:fill="00002C"/>
+        <w:spacing w:line="285" w:lineRule="atLeast"/>
+        <w:rPr>
+          <w:rFonts w:ascii="Consolas" w:eastAsia="Times New Roman" w:hAnsi="Consolas" w:cs="Times New Roman"/>
+          <w:color w:val="FFFFFF"/>
+          <w:sz w:val="21"/>
+          <w:szCs w:val="21"/>
+        </w:rPr>
+      </w:pPr>
+      <w:r>
+        <w:rPr>
+          <w:rFonts w:ascii="Consolas" w:eastAsia="Times New Roman" w:hAnsi="Consolas" w:cs="Times New Roman"/>
+          <w:color w:val="FFFFFF"/>
+          <w:sz w:val="21"/>
+          <w:szCs w:val="21"/>
+        </w:rPr>
+        <w:t xml:space="preserve">                </w:t>
+      </w:r>
+      <w:proofErr w:type="gramStart"/>
+      <w:r>
+        <w:rPr>
+          <w:rFonts w:ascii="Consolas" w:eastAsia="Times New Roman" w:hAnsi="Consolas" w:cs="Times New Roman"/>
+          <w:color w:val="FFFFFF"/>
+          <w:sz w:val="21"/>
+          <w:szCs w:val="21"/>
+        </w:rPr>
+        <w:t>color</w:t>
+      </w:r>
+      <w:proofErr w:type="gramEnd"/>
+      <w:r>
+        <w:rPr>
+          <w:rFonts w:ascii="Consolas" w:eastAsia="Times New Roman" w:hAnsi="Consolas" w:cs="Times New Roman"/>
+          <w:color w:val="FFFFFF"/>
+          <w:sz w:val="21"/>
+          <w:szCs w:val="21"/>
+        </w:rPr>
+        <w:t xml:space="preserve">: </w:t>
+      </w:r>
+      <w:r>
+        <w:rPr>
+          <w:rFonts w:ascii="Consolas" w:eastAsia="Times New Roman" w:hAnsi="Consolas" w:cs="Times New Roman"/>
+          <w:color w:val="FF7E34"/>
+          <w:sz w:val="21"/>
+          <w:szCs w:val="21"/>
+        </w:rPr>
+        <w:t>green</w:t>
+      </w:r>
+      <w:r>
+        <w:rPr>
+          <w:rFonts w:ascii="Consolas" w:eastAsia="Times New Roman" w:hAnsi="Consolas" w:cs="Times New Roman"/>
+          <w:color w:val="FFFFFF"/>
+          <w:sz w:val="21"/>
+          <w:szCs w:val="21"/>
+        </w:rPr>
+        <w:t>;</w:t>
+      </w:r>
+    </w:p>
+    <w:p>
+      <w:pPr>
+        <w:shd w:val="clear" w:color="auto" w:fill="00002C"/>
+        <w:spacing w:line="285" w:lineRule="atLeast"/>
+        <w:rPr>
+          <w:rFonts w:ascii="Consolas" w:eastAsia="Times New Roman" w:hAnsi="Consolas" w:cs="Times New Roman"/>
+          <w:color w:val="FFFFFF"/>
+          <w:sz w:val="21"/>
+          <w:szCs w:val="21"/>
+        </w:rPr>
+      </w:pPr>
+      <w:r>
+        <w:rPr>
+          <w:rFonts w:ascii="Consolas" w:eastAsia="Times New Roman" w:hAnsi="Consolas" w:cs="Times New Roman"/>
+          <w:color w:val="FFFFFF"/>
+          <w:sz w:val="21"/>
+          <w:szCs w:val="21"/>
+        </w:rPr>
+        <w:t>            }</w:t>
+      </w:r>
+    </w:p>
+    <w:p>
+      <w:pPr>
+        <w:shd w:val="clear" w:color="auto" w:fill="00002C"/>
+        <w:spacing w:line="285" w:lineRule="atLeast"/>
+        <w:rPr>
+          <w:rFonts w:ascii="Consolas" w:eastAsia="Times New Roman" w:hAnsi="Consolas" w:cs="Times New Roman"/>
+          <w:color w:val="FFFFFF"/>
+          <w:sz w:val="21"/>
+          <w:szCs w:val="21"/>
+        </w:rPr>
+      </w:pPr>
+      <w:r>
+        <w:rPr>
+          <w:rFonts w:ascii="Consolas" w:eastAsia="Times New Roman" w:hAnsi="Consolas" w:cs="Times New Roman"/>
+          <w:color w:val="FFFFFF"/>
+          <w:sz w:val="21"/>
+          <w:szCs w:val="21"/>
+        </w:rPr>
+        <w:t>        }</w:t>
+      </w:r>
+    </w:p>
+    <w:p>
+      <w:pPr>
+        <w:shd w:val="clear" w:color="auto" w:fill="00002C"/>
+        <w:spacing w:line="285" w:lineRule="atLeast"/>
+        <w:rPr>
+          <w:rFonts w:ascii="Consolas" w:eastAsia="Times New Roman" w:hAnsi="Consolas" w:cs="Times New Roman"/>
+          <w:color w:val="FFFFFF"/>
+          <w:sz w:val="21"/>
+          <w:szCs w:val="21"/>
+        </w:rPr>
+      </w:pPr>
+      <w:r>
+        <w:rPr>
+          <w:rFonts w:ascii="Consolas" w:eastAsia="Times New Roman" w:hAnsi="Consolas" w:cs="Times New Roman"/>
+          <w:color w:val="FFFFFF"/>
+          <w:sz w:val="21"/>
+          <w:szCs w:val="21"/>
+        </w:rPr>
+        <w:t>    &lt;/</w:t>
+      </w:r>
+      <w:r>
+        <w:rPr>
+          <w:rFonts w:ascii="Consolas" w:eastAsia="Times New Roman" w:hAnsi="Consolas" w:cs="Times New Roman"/>
+          <w:color w:val="FF0077"/>
+          <w:sz w:val="21"/>
+          <w:szCs w:val="21"/>
+        </w:rPr>
+        <w:t>style</w:t>
+      </w:r>
+      <w:r>
+        <w:rPr>
+          <w:rFonts w:ascii="Consolas" w:eastAsia="Times New Roman" w:hAnsi="Consolas" w:cs="Times New Roman"/>
+          <w:color w:val="FFFFFF"/>
+          <w:sz w:val="21"/>
+          <w:szCs w:val="21"/>
+        </w:rPr>
+        <w:t>&gt;</w:t>
+      </w:r>
+    </w:p>
+    <w:p>
+      <w:pPr>
+        <w:shd w:val="clear" w:color="auto" w:fill="00002C"/>
+        <w:spacing w:line="285" w:lineRule="atLeast"/>
+        <w:rPr>
+          <w:rFonts w:ascii="Consolas" w:eastAsia="Times New Roman" w:hAnsi="Consolas" w:cs="Times New Roman"/>
+          <w:color w:val="FFFFFF"/>
+          <w:sz w:val="21"/>
+          <w:szCs w:val="21"/>
+        </w:rPr>
+      </w:pPr>
+      <w:r>
+        <w:rPr>
+          <w:rFonts w:ascii="Consolas" w:eastAsia="Times New Roman" w:hAnsi="Consolas" w:cs="Times New Roman"/>
+          <w:color w:val="FFFFFF"/>
+          <w:sz w:val="21"/>
+          <w:szCs w:val="21"/>
+        </w:rPr>
+        <w:t>&lt;/</w:t>
+      </w:r>
+      <w:r>
+        <w:rPr>
+          <w:rFonts w:ascii="Consolas" w:eastAsia="Times New Roman" w:hAnsi="Consolas" w:cs="Times New Roman"/>
+          <w:color w:val="FF0077"/>
+          <w:sz w:val="21"/>
+          <w:szCs w:val="21"/>
+        </w:rPr>
+        <w:t>head</w:t>
+      </w:r>
+      <w:r>
+        <w:rPr>
+          <w:rFonts w:ascii="Consolas" w:eastAsia="Times New Roman" w:hAnsi="Consolas" w:cs="Times New Roman"/>
+          <w:color w:val="FFFFFF"/>
+          <w:sz w:val="21"/>
+          <w:szCs w:val="21"/>
+        </w:rPr>
+        <w:t>&gt;</w:t>
+      </w:r>
+    </w:p>
+    <w:p>
+      <w:pPr>
+        <w:shd w:val="clear" w:color="auto" w:fill="00002C"/>
+        <w:spacing w:line="285" w:lineRule="atLeast"/>
+        <w:rPr>
+          <w:rFonts w:ascii="Consolas" w:eastAsia="Times New Roman" w:hAnsi="Consolas" w:cs="Times New Roman"/>
+          <w:color w:val="FFFFFF"/>
+          <w:sz w:val="21"/>
+          <w:szCs w:val="21"/>
+        </w:rPr>
+      </w:pPr>
+      <w:r>
+        <w:rPr>
+          <w:rFonts w:ascii="Consolas" w:eastAsia="Times New Roman" w:hAnsi="Consolas" w:cs="Times New Roman"/>
+          <w:color w:val="FFFFFF"/>
+          <w:sz w:val="21"/>
+          <w:szCs w:val="21"/>
+        </w:rPr>
+        <w:t>&lt;</w:t>
+      </w:r>
+      <w:proofErr w:type="gramStart"/>
+      <w:r>
+        <w:rPr>
+          <w:rFonts w:ascii="Consolas" w:eastAsia="Times New Roman" w:hAnsi="Consolas" w:cs="Times New Roman"/>
+          <w:color w:val="FF0077"/>
+          <w:sz w:val="21"/>
+          <w:szCs w:val="21"/>
+        </w:rPr>
+        <w:t>body</w:t>
+      </w:r>
+      <w:proofErr w:type="gramEnd"/>
+      <w:r>
+        <w:rPr>
+          <w:rFonts w:ascii="Consolas" w:eastAsia="Times New Roman" w:hAnsi="Consolas" w:cs="Times New Roman"/>
+          <w:color w:val="FFFFFF"/>
+          <w:sz w:val="21"/>
+          <w:szCs w:val="21"/>
+        </w:rPr>
+        <w:t>&gt;</w:t>
+      </w:r>
+    </w:p>
+    <w:p>
+      <w:pPr>
+        <w:shd w:val="clear" w:color="auto" w:fill="00002C"/>
+        <w:spacing w:line="285" w:lineRule="atLeast"/>
+        <w:rPr>
+          <w:rFonts w:ascii="Consolas" w:eastAsia="Times New Roman" w:hAnsi="Consolas" w:cs="Times New Roman"/>
+          <w:color w:val="FFFFFF"/>
+          <w:sz w:val="21"/>
+          <w:szCs w:val="21"/>
+        </w:rPr>
+      </w:pPr>
+      <w:r>
+        <w:rPr>
+          <w:rFonts w:ascii="Consolas" w:eastAsia="Times New Roman" w:hAnsi="Consolas" w:cs="Times New Roman"/>
+          <w:color w:val="FFFFFF"/>
+          <w:sz w:val="21"/>
+          <w:szCs w:val="21"/>
+        </w:rPr>
+        <w:t>    &lt;</w:t>
+      </w:r>
+      <w:r>
+        <w:rPr>
+          <w:rFonts w:ascii="Consolas" w:eastAsia="Times New Roman" w:hAnsi="Consolas" w:cs="Times New Roman"/>
+          <w:color w:val="FF0077"/>
+          <w:sz w:val="21"/>
+          <w:szCs w:val="21"/>
+        </w:rPr>
+        <w:t>h1</w:t>
+      </w:r>
+      <w:r>
+        <w:rPr>
+          <w:rFonts w:ascii="Consolas" w:eastAsia="Times New Roman" w:hAnsi="Consolas" w:cs="Times New Roman"/>
+          <w:color w:val="FFFFFF"/>
+          <w:sz w:val="21"/>
+          <w:szCs w:val="21"/>
+        </w:rPr>
+        <w:t xml:space="preserve"> </w:t>
+      </w:r>
+      <w:r>
+        <w:rPr>
+          <w:rFonts w:ascii="Consolas" w:eastAsia="Times New Roman" w:hAnsi="Consolas" w:cs="Times New Roman"/>
+          <w:color w:val="00FFF2"/>
+          <w:sz w:val="21"/>
+          <w:szCs w:val="21"/>
+        </w:rPr>
+        <w:t>class</w:t>
+      </w:r>
+      <w:r>
+        <w:rPr>
+          <w:rFonts w:ascii="Consolas" w:eastAsia="Times New Roman" w:hAnsi="Consolas" w:cs="Times New Roman"/>
+          <w:color w:val="FFFFFF"/>
+          <w:sz w:val="21"/>
+          <w:szCs w:val="21"/>
+        </w:rPr>
+        <w:t>="</w:t>
+      </w:r>
+      <w:proofErr w:type="gramStart"/>
+      <w:r>
+        <w:rPr>
+          <w:rFonts w:ascii="Consolas" w:eastAsia="Times New Roman" w:hAnsi="Consolas" w:cs="Times New Roman"/>
+          <w:color w:val="EEFF00"/>
+          <w:sz w:val="21"/>
+          <w:szCs w:val="21"/>
+        </w:rPr>
+        <w:t>red  </w:t>
+      </w:r>
+      <w:proofErr w:type="spellStart"/>
+      <w:r>
+        <w:rPr>
+          <w:rFonts w:ascii="Consolas" w:eastAsia="Times New Roman" w:hAnsi="Consolas" w:cs="Times New Roman"/>
+          <w:color w:val="EEFF00"/>
+          <w:sz w:val="21"/>
+          <w:szCs w:val="21"/>
+        </w:rPr>
+        <w:t>vblue</w:t>
+      </w:r>
+      <w:proofErr w:type="spellEnd"/>
+      <w:proofErr w:type="gramEnd"/>
+      <w:r>
+        <w:rPr>
+          <w:rFonts w:ascii="Consolas" w:eastAsia="Times New Roman" w:hAnsi="Consolas" w:cs="Times New Roman"/>
+          <w:color w:val="EEFF00"/>
+          <w:sz w:val="21"/>
+          <w:szCs w:val="21"/>
+        </w:rPr>
+        <w:t xml:space="preserve"> </w:t>
+      </w:r>
+      <w:proofErr w:type="spellStart"/>
+      <w:r>
+        <w:rPr>
+          <w:rFonts w:ascii="Consolas" w:eastAsia="Times New Roman" w:hAnsi="Consolas" w:cs="Times New Roman"/>
+          <w:color w:val="EEFF00"/>
+          <w:sz w:val="21"/>
+          <w:szCs w:val="21"/>
+        </w:rPr>
+        <w:t>tpurple</w:t>
+      </w:r>
+      <w:proofErr w:type="spellEnd"/>
+      <w:r>
+        <w:rPr>
+          <w:rFonts w:ascii="Consolas" w:eastAsia="Times New Roman" w:hAnsi="Consolas" w:cs="Times New Roman"/>
+          <w:color w:val="EEFF00"/>
+          <w:sz w:val="21"/>
+          <w:szCs w:val="21"/>
+        </w:rPr>
+        <w:t xml:space="preserve"> </w:t>
+      </w:r>
+      <w:proofErr w:type="spellStart"/>
+      <w:r>
+        <w:rPr>
+          <w:rFonts w:ascii="Consolas" w:eastAsia="Times New Roman" w:hAnsi="Consolas" w:cs="Times New Roman"/>
+          <w:color w:val="EEFF00"/>
+          <w:sz w:val="21"/>
+          <w:szCs w:val="21"/>
+        </w:rPr>
+        <w:t>mgrey</w:t>
+      </w:r>
+      <w:proofErr w:type="spellEnd"/>
+      <w:r>
+        <w:rPr>
+          <w:rFonts w:ascii="Consolas" w:eastAsia="Times New Roman" w:hAnsi="Consolas" w:cs="Times New Roman"/>
+          <w:color w:val="EEFF00"/>
+          <w:sz w:val="21"/>
+          <w:szCs w:val="21"/>
+        </w:rPr>
+        <w:t xml:space="preserve"> </w:t>
+      </w:r>
+      <w:r>
+        <w:rPr>
+          <w:rFonts w:ascii="Consolas" w:eastAsia="Times New Roman" w:hAnsi="Consolas" w:cs="Times New Roman"/>
+          <w:color w:val="FFFFFF"/>
+          <w:sz w:val="21"/>
+          <w:szCs w:val="21"/>
+        </w:rPr>
+        <w:t>"&gt;</w:t>
+      </w:r>
+      <w:proofErr w:type="spellStart"/>
+      <w:r>
+        <w:rPr>
+          <w:rFonts w:ascii="Consolas" w:eastAsia="Times New Roman" w:hAnsi="Consolas" w:cs="Times New Roman"/>
+          <w:color w:val="FFFFFF"/>
+          <w:sz w:val="21"/>
+          <w:szCs w:val="21"/>
+        </w:rPr>
+        <w:t>css</w:t>
+      </w:r>
+      <w:proofErr w:type="spellEnd"/>
+      <w:r>
+        <w:rPr>
+          <w:rFonts w:ascii="Consolas" w:eastAsia="Times New Roman" w:hAnsi="Consolas" w:cs="Times New Roman"/>
+          <w:color w:val="FFFFFF"/>
+          <w:sz w:val="21"/>
+          <w:szCs w:val="21"/>
+        </w:rPr>
+        <w:t xml:space="preserve"> Specificity and Cascade&lt;/</w:t>
+      </w:r>
+      <w:r>
+        <w:rPr>
+          <w:rFonts w:ascii="Consolas" w:eastAsia="Times New Roman" w:hAnsi="Consolas" w:cs="Times New Roman"/>
+          <w:color w:val="FF0077"/>
+          <w:sz w:val="21"/>
+          <w:szCs w:val="21"/>
+        </w:rPr>
+        <w:t>h1</w:t>
+      </w:r>
+      <w:r>
+        <w:rPr>
+          <w:rFonts w:ascii="Consolas" w:eastAsia="Times New Roman" w:hAnsi="Consolas" w:cs="Times New Roman"/>
+          <w:color w:val="FFFFFF"/>
+          <w:sz w:val="21"/>
+          <w:szCs w:val="21"/>
+        </w:rPr>
+        <w:t>&gt;</w:t>
+      </w:r>
+    </w:p>
+    <w:p>
+      <w:pPr>
+        <w:pStyle w:val="NoSpacing"/>
+        <w:tabs>
+          <w:tab w:val="left" w:pos="1230"/>
+        </w:tabs>
+      </w:pPr>
+      <w:r>
+        <w:t xml:space="preserve">See here we apply the three different names of the class on the h1 and then by using the </w:t>
+      </w:r>
+      <w:proofErr w:type="spellStart"/>
+      <w:r>
+        <w:t>css</w:t>
+      </w:r>
+      <w:proofErr w:type="spellEnd"/>
+      <w:r>
+        <w:t xml:space="preserve"> we give them different color but in the output only of the one color green which is in the </w:t>
+      </w:r>
+      <w:proofErr w:type="gramStart"/>
+      <w:r>
+        <w:t>last .</w:t>
+      </w:r>
+      <w:proofErr w:type="gramEnd"/>
+      <w:r>
+        <w:t xml:space="preserve"> Why other not </w:t>
+      </w:r>
+      <w:proofErr w:type="gramStart"/>
+      <w:r>
+        <w:t>apply ?</w:t>
+      </w:r>
+      <w:proofErr w:type="gramEnd"/>
+    </w:p>
+    <w:p>
+      <w:pPr>
+        <w:pStyle w:val="NoSpacing"/>
+        <w:tabs>
+          <w:tab w:val="left" w:pos="1230"/>
+        </w:tabs>
+      </w:pPr>
+      <w:r>
+        <w:t>This process is called the cascading</w:t>
+      </w:r>
+    </w:p>
+    <w:p>
+      <w:pPr>
+        <w:pStyle w:val="NoSpacing"/>
+        <w:tabs>
+          <w:tab w:val="left" w:pos="1230"/>
+        </w:tabs>
+      </w:pPr>
+      <w:r>
+        <w:t xml:space="preserve">The cascading means that solving of the problem </w:t>
+      </w:r>
+      <w:proofErr w:type="gramStart"/>
+      <w:r>
+        <w:t>In</w:t>
+      </w:r>
+      <w:proofErr w:type="gramEnd"/>
+      <w:r>
+        <w:t xml:space="preserve"> which you use the multiple number of the </w:t>
+      </w:r>
+      <w:proofErr w:type="spellStart"/>
+      <w:r>
+        <w:t>properperties</w:t>
+      </w:r>
+      <w:proofErr w:type="spellEnd"/>
+      <w:r>
+        <w:t xml:space="preserve"> on the single html element and cascading is use to </w:t>
+      </w:r>
+      <w:proofErr w:type="spellStart"/>
+      <w:r>
+        <w:t>chose</w:t>
+      </w:r>
+      <w:proofErr w:type="spellEnd"/>
+      <w:r>
+        <w:t xml:space="preserve"> that one or to solve that problem.  </w:t>
+      </w:r>
+      <w:proofErr w:type="gramStart"/>
+      <w:r>
+        <w:t>and</w:t>
+      </w:r>
+      <w:proofErr w:type="gramEnd"/>
+      <w:r>
+        <w:t xml:space="preserve"> there are four rules of the cascading .</w:t>
+      </w:r>
+    </w:p>
+    <w:p>
+      <w:pPr>
+        <w:pStyle w:val="NoSpacing"/>
+        <w:tabs>
+          <w:tab w:val="left" w:pos="1230"/>
+        </w:tabs>
+      </w:pPr>
+    </w:p>
+    <w:p>
+      <w:pPr>
+        <w:pStyle w:val="NoSpacing"/>
+        <w:tabs>
+          <w:tab w:val="left" w:pos="1230"/>
+        </w:tabs>
+      </w:pPr>
+      <w:proofErr w:type="gramStart"/>
+      <w:r>
+        <w:t>1.Positon</w:t>
+      </w:r>
+      <w:proofErr w:type="gramEnd"/>
+      <w:r>
+        <w:t xml:space="preserve"> and order of the appearance:</w:t>
+      </w:r>
+    </w:p>
+    <w:p>
+      <w:pPr>
+        <w:pStyle w:val="NoSpacing"/>
+        <w:tabs>
+          <w:tab w:val="left" w:pos="1230"/>
+        </w:tabs>
+      </w:pPr>
+    </w:p>
+    <w:p>
+      <w:pPr>
+        <w:pStyle w:val="NoSpacing"/>
+        <w:tabs>
+          <w:tab w:val="left" w:pos="1230"/>
+        </w:tabs>
+      </w:pPr>
+      <w:r>
+        <w:t xml:space="preserve">Means that which is after </w:t>
+      </w:r>
+      <w:proofErr w:type="gramStart"/>
+      <w:r>
+        <w:t>the another</w:t>
+      </w:r>
+      <w:proofErr w:type="gramEnd"/>
+      <w:r>
+        <w:t xml:space="preserve"> one means to say which is at last so that property is </w:t>
+      </w:r>
+      <w:proofErr w:type="spellStart"/>
+      <w:r>
+        <w:t>applied.when</w:t>
+      </w:r>
+      <w:proofErr w:type="spellEnd"/>
+      <w:r>
+        <w:t xml:space="preserve"> we use the same type of the selector</w:t>
+      </w:r>
+    </w:p>
+    <w:p>
+      <w:pPr>
+        <w:pStyle w:val="NoSpacing"/>
+        <w:tabs>
+          <w:tab w:val="left" w:pos="1230"/>
+        </w:tabs>
+      </w:pPr>
+    </w:p>
+    <w:p>
+      <w:pPr>
+        <w:pStyle w:val="NoSpacing"/>
+        <w:tabs>
+          <w:tab w:val="left" w:pos="1230"/>
+        </w:tabs>
+      </w:pPr>
+      <w:proofErr w:type="gramStart"/>
+      <w:r>
+        <w:t>2.specificity</w:t>
+      </w:r>
+      <w:proofErr w:type="gramEnd"/>
+      <w:r>
+        <w:t xml:space="preserve"> :</w:t>
+      </w:r>
+    </w:p>
+    <w:p>
+      <w:pPr>
+        <w:pStyle w:val="NoSpacing"/>
+        <w:tabs>
+          <w:tab w:val="left" w:pos="1230"/>
+        </w:tabs>
+      </w:pPr>
+      <w:r>
+        <w:t xml:space="preserve">This means there some selector that give </w:t>
+      </w:r>
+      <w:proofErr w:type="gramStart"/>
+      <w:r>
+        <w:t>priority .</w:t>
+      </w:r>
+      <w:proofErr w:type="gramEnd"/>
+    </w:p>
+    <w:p>
+      <w:pPr>
+        <w:pStyle w:val="NoSpacing"/>
+        <w:tabs>
+          <w:tab w:val="left" w:pos="1230"/>
+        </w:tabs>
+      </w:pPr>
+      <w:r>
+        <w:rPr>
+          <w:noProof/>
+        </w:rPr>
+        <w:drawing>
+          <wp:inline distT="0" distB="0" distL="0" distR="0" wp14:anchorId="72D82419" wp14:editId="1944FBE7">
+            <wp:extent cx="6238875" cy="276225"/>
+            <wp:effectExtent l="0" t="0" r="9525" b="9525"/>
+            <wp:docPr id="2" name="Picture 2"/>
+            <wp:cNvGraphicFramePr>
+              <a:graphicFrameLocks xmlns:a="http://schemas.openxmlformats.org/drawingml/2006/main" noChangeAspect="1"/>
+            </wp:cNvGraphicFramePr>
+            <a:graphic xmlns:a="http://schemas.openxmlformats.org/drawingml/2006/main">
+              <a:graphicData uri="http://schemas.openxmlformats.org/drawingml/2006/picture">
+                <pic:pic xmlns:pic="http://schemas.openxmlformats.org/drawingml/2006/picture">
+                  <pic:nvPicPr>
+                    <pic:cNvPr id="1" name=""/>
+                    <pic:cNvPicPr/>
+                  </pic:nvPicPr>
+                  <pic:blipFill>
+                    <a:blip r:embed="rId26"/>
+                    <a:stretch>
+                      <a:fillRect/>
+                    </a:stretch>
+                  </pic:blipFill>
+                  <pic:spPr>
+                    <a:xfrm>
+                      <a:off x="0" y="0"/>
+                      <a:ext cx="6239846" cy="276268"/>
+                    </a:xfrm>
+                    <a:prstGeom prst="rect">
+                      <a:avLst/>
+                    </a:prstGeom>
+                  </pic:spPr>
+                </pic:pic>
+              </a:graphicData>
+            </a:graphic>
+          </wp:inline>
+        </w:drawing>
+      </w:r>
+    </w:p>
+    <w:p/>
+    <w:p>
+      <w:pPr>
+        <w:tabs>
+          <w:tab w:val="left" w:pos="1920"/>
+        </w:tabs>
+      </w:pPr>
+      <w:r>
+        <w:tab/>
+        <w:t>The order of them is above.</w:t>
+      </w:r>
+    </w:p>
+    <w:p>
+      <w:pPr>
+        <w:tabs>
+          <w:tab w:val="left" w:pos="1920"/>
+        </w:tabs>
+      </w:pPr>
+    </w:p>
+    <w:p>
+      <w:pPr>
+        <w:tabs>
+          <w:tab w:val="left" w:pos="1920"/>
+        </w:tabs>
+      </w:pPr>
+    </w:p>
+    <w:p>
+      <w:pPr>
+        <w:tabs>
+          <w:tab w:val="left" w:pos="1920"/>
+        </w:tabs>
+      </w:pPr>
+    </w:p>
+    <w:p>
+      <w:pPr>
+        <w:shd w:val="clear" w:color="auto" w:fill="00002C"/>
+        <w:spacing w:line="285" w:lineRule="atLeast"/>
+        <w:rPr>
+          <w:rFonts w:ascii="Consolas" w:eastAsia="Times New Roman" w:hAnsi="Consolas" w:cs="Times New Roman"/>
+          <w:color w:val="FFFFFF"/>
+          <w:sz w:val="21"/>
+          <w:szCs w:val="21"/>
+        </w:rPr>
+      </w:pPr>
+      <w:r>
+        <w:rPr>
+          <w:rFonts w:ascii="Consolas" w:eastAsia="Times New Roman" w:hAnsi="Consolas" w:cs="Times New Roman"/>
+          <w:color w:val="FFFFFF"/>
+          <w:sz w:val="21"/>
+          <w:szCs w:val="21"/>
+        </w:rPr>
+        <w:lastRenderedPageBreak/>
+        <w:t>&lt;/</w:t>
+      </w:r>
+      <w:r>
+        <w:rPr>
+          <w:rFonts w:ascii="Consolas" w:eastAsia="Times New Roman" w:hAnsi="Consolas" w:cs="Times New Roman"/>
+          <w:color w:val="FF0077"/>
+          <w:sz w:val="21"/>
+          <w:szCs w:val="21"/>
+        </w:rPr>
+        <w:t>head</w:t>
+      </w:r>
+      <w:r>
+        <w:rPr>
+          <w:rFonts w:ascii="Consolas" w:eastAsia="Times New Roman" w:hAnsi="Consolas" w:cs="Times New Roman"/>
+          <w:color w:val="FFFFFF"/>
+          <w:sz w:val="21"/>
+          <w:szCs w:val="21"/>
+        </w:rPr>
+        <w:t>&gt;</w:t>
+      </w:r>
+    </w:p>
+    <w:p>
+      <w:pPr>
+        <w:shd w:val="clear" w:color="auto" w:fill="00002C"/>
+        <w:spacing w:line="285" w:lineRule="atLeast"/>
+        <w:rPr>
+          <w:rFonts w:ascii="Consolas" w:eastAsia="Times New Roman" w:hAnsi="Consolas" w:cs="Times New Roman"/>
+          <w:color w:val="FFFFFF"/>
+          <w:sz w:val="21"/>
+          <w:szCs w:val="21"/>
+        </w:rPr>
+      </w:pPr>
+      <w:r>
+        <w:rPr>
+          <w:rFonts w:ascii="Consolas" w:eastAsia="Times New Roman" w:hAnsi="Consolas" w:cs="Times New Roman"/>
+          <w:color w:val="FFFFFF"/>
+          <w:sz w:val="21"/>
+          <w:szCs w:val="21"/>
+        </w:rPr>
+        <w:t>&lt;</w:t>
+      </w:r>
+      <w:proofErr w:type="gramStart"/>
+      <w:r>
+        <w:rPr>
+          <w:rFonts w:ascii="Consolas" w:eastAsia="Times New Roman" w:hAnsi="Consolas" w:cs="Times New Roman"/>
+          <w:color w:val="FF0077"/>
+          <w:sz w:val="21"/>
+          <w:szCs w:val="21"/>
+        </w:rPr>
+        <w:t>body</w:t>
+      </w:r>
+      <w:proofErr w:type="gramEnd"/>
+      <w:r>
+        <w:rPr>
+          <w:rFonts w:ascii="Consolas" w:eastAsia="Times New Roman" w:hAnsi="Consolas" w:cs="Times New Roman"/>
+          <w:color w:val="FFFFFF"/>
+          <w:sz w:val="21"/>
+          <w:szCs w:val="21"/>
+        </w:rPr>
+        <w:t>&gt;</w:t>
+      </w:r>
+    </w:p>
+    <w:p>
+      <w:pPr>
+        <w:shd w:val="clear" w:color="auto" w:fill="00002C"/>
+        <w:spacing w:line="285" w:lineRule="atLeast"/>
+        <w:rPr>
+          <w:rFonts w:ascii="Consolas" w:eastAsia="Times New Roman" w:hAnsi="Consolas" w:cs="Times New Roman"/>
+          <w:color w:val="FFFFFF"/>
+          <w:sz w:val="21"/>
+          <w:szCs w:val="21"/>
+        </w:rPr>
+      </w:pPr>
+      <w:r>
+        <w:rPr>
+          <w:rFonts w:ascii="Consolas" w:eastAsia="Times New Roman" w:hAnsi="Consolas" w:cs="Times New Roman"/>
+          <w:color w:val="FFFFFF"/>
+          <w:sz w:val="21"/>
+          <w:szCs w:val="21"/>
+        </w:rPr>
+        <w:t>    &lt;</w:t>
+      </w:r>
+      <w:r>
+        <w:rPr>
+          <w:rFonts w:ascii="Consolas" w:eastAsia="Times New Roman" w:hAnsi="Consolas" w:cs="Times New Roman"/>
+          <w:color w:val="FF0077"/>
+          <w:sz w:val="21"/>
+          <w:szCs w:val="21"/>
+        </w:rPr>
+        <w:t>h1</w:t>
+      </w:r>
+      <w:r>
+        <w:rPr>
+          <w:rFonts w:ascii="Consolas" w:eastAsia="Times New Roman" w:hAnsi="Consolas" w:cs="Times New Roman"/>
+          <w:color w:val="FFFFFF"/>
+          <w:sz w:val="21"/>
+          <w:szCs w:val="21"/>
+        </w:rPr>
+        <w:t xml:space="preserve"> </w:t>
+      </w:r>
+      <w:r>
+        <w:rPr>
+          <w:rFonts w:ascii="Consolas" w:eastAsia="Times New Roman" w:hAnsi="Consolas" w:cs="Times New Roman"/>
+          <w:color w:val="00FFF2"/>
+          <w:sz w:val="21"/>
+          <w:szCs w:val="21"/>
+        </w:rPr>
+        <w:t>style</w:t>
+      </w:r>
+      <w:r>
+        <w:rPr>
+          <w:rFonts w:ascii="Consolas" w:eastAsia="Times New Roman" w:hAnsi="Consolas" w:cs="Times New Roman"/>
+          <w:color w:val="FFFFFF"/>
+          <w:sz w:val="21"/>
+          <w:szCs w:val="21"/>
+        </w:rPr>
+        <w:t>="</w:t>
+      </w:r>
+      <w:r>
+        <w:rPr>
+          <w:rFonts w:ascii="Consolas" w:eastAsia="Times New Roman" w:hAnsi="Consolas" w:cs="Times New Roman"/>
+          <w:color w:val="EEFF00"/>
+          <w:sz w:val="21"/>
+          <w:szCs w:val="21"/>
+        </w:rPr>
+        <w:t>color: purple;</w:t>
+      </w:r>
+      <w:r>
+        <w:rPr>
+          <w:rFonts w:ascii="Consolas" w:eastAsia="Times New Roman" w:hAnsi="Consolas" w:cs="Times New Roman"/>
+          <w:color w:val="FFFFFF"/>
+          <w:sz w:val="21"/>
+          <w:szCs w:val="21"/>
+        </w:rPr>
+        <w:t xml:space="preserve">" </w:t>
+      </w:r>
+      <w:r>
+        <w:rPr>
+          <w:rFonts w:ascii="Consolas" w:eastAsia="Times New Roman" w:hAnsi="Consolas" w:cs="Times New Roman"/>
+          <w:color w:val="00FFF2"/>
+          <w:sz w:val="21"/>
+          <w:szCs w:val="21"/>
+        </w:rPr>
+        <w:t>class</w:t>
+      </w:r>
+      <w:r>
+        <w:rPr>
+          <w:rFonts w:ascii="Consolas" w:eastAsia="Times New Roman" w:hAnsi="Consolas" w:cs="Times New Roman"/>
+          <w:color w:val="FFFFFF"/>
+          <w:sz w:val="21"/>
+          <w:szCs w:val="21"/>
+        </w:rPr>
+        <w:t>="</w:t>
+      </w:r>
+      <w:proofErr w:type="gramStart"/>
+      <w:r>
+        <w:rPr>
+          <w:rFonts w:ascii="Consolas" w:eastAsia="Times New Roman" w:hAnsi="Consolas" w:cs="Times New Roman"/>
+          <w:color w:val="EEFF00"/>
+          <w:sz w:val="21"/>
+          <w:szCs w:val="21"/>
+        </w:rPr>
+        <w:t>red  </w:t>
+      </w:r>
+      <w:proofErr w:type="spellStart"/>
+      <w:r>
+        <w:rPr>
+          <w:rFonts w:ascii="Consolas" w:eastAsia="Times New Roman" w:hAnsi="Consolas" w:cs="Times New Roman"/>
+          <w:color w:val="EEFF00"/>
+          <w:sz w:val="21"/>
+          <w:szCs w:val="21"/>
+        </w:rPr>
+        <w:t>vblue</w:t>
+      </w:r>
+      <w:proofErr w:type="spellEnd"/>
+      <w:proofErr w:type="gramEnd"/>
+      <w:r>
+        <w:rPr>
+          <w:rFonts w:ascii="Consolas" w:eastAsia="Times New Roman" w:hAnsi="Consolas" w:cs="Times New Roman"/>
+          <w:color w:val="EEFF00"/>
+          <w:sz w:val="21"/>
+          <w:szCs w:val="21"/>
+        </w:rPr>
+        <w:t xml:space="preserve"> </w:t>
+      </w:r>
+      <w:proofErr w:type="spellStart"/>
+      <w:r>
+        <w:rPr>
+          <w:rFonts w:ascii="Consolas" w:eastAsia="Times New Roman" w:hAnsi="Consolas" w:cs="Times New Roman"/>
+          <w:color w:val="EEFF00"/>
+          <w:sz w:val="21"/>
+          <w:szCs w:val="21"/>
+        </w:rPr>
+        <w:t>tpurple</w:t>
+      </w:r>
+      <w:proofErr w:type="spellEnd"/>
+      <w:r>
+        <w:rPr>
+          <w:rFonts w:ascii="Consolas" w:eastAsia="Times New Roman" w:hAnsi="Consolas" w:cs="Times New Roman"/>
+          <w:color w:val="EEFF00"/>
+          <w:sz w:val="21"/>
+          <w:szCs w:val="21"/>
+        </w:rPr>
+        <w:t xml:space="preserve"> </w:t>
+      </w:r>
+      <w:proofErr w:type="spellStart"/>
+      <w:r>
+        <w:rPr>
+          <w:rFonts w:ascii="Consolas" w:eastAsia="Times New Roman" w:hAnsi="Consolas" w:cs="Times New Roman"/>
+          <w:color w:val="EEFF00"/>
+          <w:sz w:val="21"/>
+          <w:szCs w:val="21"/>
+        </w:rPr>
+        <w:t>mgrey</w:t>
+      </w:r>
+      <w:proofErr w:type="spellEnd"/>
+      <w:r>
+        <w:rPr>
+          <w:rFonts w:ascii="Consolas" w:eastAsia="Times New Roman" w:hAnsi="Consolas" w:cs="Times New Roman"/>
+          <w:color w:val="EEFF00"/>
+          <w:sz w:val="21"/>
+          <w:szCs w:val="21"/>
+        </w:rPr>
+        <w:t xml:space="preserve"> </w:t>
+      </w:r>
+      <w:r>
+        <w:rPr>
+          <w:rFonts w:ascii="Consolas" w:eastAsia="Times New Roman" w:hAnsi="Consolas" w:cs="Times New Roman"/>
+          <w:color w:val="FFFFFF"/>
+          <w:sz w:val="21"/>
+          <w:szCs w:val="21"/>
+        </w:rPr>
+        <w:t>"&gt;</w:t>
+      </w:r>
+      <w:proofErr w:type="spellStart"/>
+      <w:r>
+        <w:rPr>
+          <w:rFonts w:ascii="Consolas" w:eastAsia="Times New Roman" w:hAnsi="Consolas" w:cs="Times New Roman"/>
+          <w:color w:val="FFFFFF"/>
+          <w:sz w:val="21"/>
+          <w:szCs w:val="21"/>
+        </w:rPr>
+        <w:t>css</w:t>
+      </w:r>
+      <w:proofErr w:type="spellEnd"/>
+      <w:r>
+        <w:rPr>
+          <w:rFonts w:ascii="Consolas" w:eastAsia="Times New Roman" w:hAnsi="Consolas" w:cs="Times New Roman"/>
+          <w:color w:val="FFFFFF"/>
+          <w:sz w:val="21"/>
+          <w:szCs w:val="21"/>
+        </w:rPr>
+        <w:t xml:space="preserve"> Specificity and Cascade&lt;/</w:t>
+      </w:r>
+      <w:r>
+        <w:rPr>
+          <w:rFonts w:ascii="Consolas" w:eastAsia="Times New Roman" w:hAnsi="Consolas" w:cs="Times New Roman"/>
+          <w:color w:val="FF0077"/>
+          <w:sz w:val="21"/>
+          <w:szCs w:val="21"/>
+        </w:rPr>
+        <w:t>h1</w:t>
+      </w:r>
+      <w:r>
+        <w:rPr>
+          <w:rFonts w:ascii="Consolas" w:eastAsia="Times New Roman" w:hAnsi="Consolas" w:cs="Times New Roman"/>
+          <w:color w:val="FFFFFF"/>
+          <w:sz w:val="21"/>
+          <w:szCs w:val="21"/>
+        </w:rPr>
+        <w:t>&gt;</w:t>
+      </w:r>
+    </w:p>
+    <w:p>
+      <w:pPr>
+        <w:shd w:val="clear" w:color="auto" w:fill="00002C"/>
+        <w:spacing w:line="285" w:lineRule="atLeast"/>
+        <w:rPr>
+          <w:rFonts w:ascii="Consolas" w:eastAsia="Times New Roman" w:hAnsi="Consolas" w:cs="Times New Roman"/>
+          <w:color w:val="FFFFFF"/>
+          <w:sz w:val="21"/>
+          <w:szCs w:val="21"/>
+        </w:rPr>
+      </w:pPr>
+      <w:r>
+        <w:rPr>
+          <w:rFonts w:ascii="Consolas" w:eastAsia="Times New Roman" w:hAnsi="Consolas" w:cs="Times New Roman"/>
+          <w:color w:val="FFFFFF"/>
+          <w:sz w:val="21"/>
+          <w:szCs w:val="21"/>
+        </w:rPr>
+        <w:t>&lt;/</w:t>
+      </w:r>
+      <w:r>
+        <w:rPr>
+          <w:rFonts w:ascii="Consolas" w:eastAsia="Times New Roman" w:hAnsi="Consolas" w:cs="Times New Roman"/>
+          <w:color w:val="FF0077"/>
+          <w:sz w:val="21"/>
+          <w:szCs w:val="21"/>
+        </w:rPr>
+        <w:t>body</w:t>
+      </w:r>
+      <w:r>
+        <w:rPr>
+          <w:rFonts w:ascii="Consolas" w:eastAsia="Times New Roman" w:hAnsi="Consolas" w:cs="Times New Roman"/>
+          <w:color w:val="FFFFFF"/>
+          <w:sz w:val="21"/>
+          <w:szCs w:val="21"/>
+        </w:rPr>
+        <w:t>&gt;</w:t>
+      </w:r>
+    </w:p>
+    <w:p>
+      <w:pPr>
+        <w:shd w:val="clear" w:color="auto" w:fill="00002C"/>
+        <w:spacing w:line="285" w:lineRule="atLeast"/>
+        <w:rPr>
+          <w:rFonts w:ascii="Consolas" w:eastAsia="Times New Roman" w:hAnsi="Consolas" w:cs="Times New Roman"/>
+          <w:color w:val="FFFFFF"/>
+          <w:sz w:val="21"/>
+          <w:szCs w:val="21"/>
+        </w:rPr>
+      </w:pPr>
+      <w:r>
+        <w:rPr>
+          <w:rFonts w:ascii="Consolas" w:eastAsia="Times New Roman" w:hAnsi="Consolas" w:cs="Times New Roman"/>
+          <w:color w:val="FFFFFF"/>
+          <w:sz w:val="21"/>
+          <w:szCs w:val="21"/>
+        </w:rPr>
+        <w:t>&lt;/</w:t>
+      </w:r>
+      <w:r>
+        <w:rPr>
+          <w:rFonts w:ascii="Consolas" w:eastAsia="Times New Roman" w:hAnsi="Consolas" w:cs="Times New Roman"/>
+          <w:color w:val="FF0077"/>
+          <w:sz w:val="21"/>
+          <w:szCs w:val="21"/>
+        </w:rPr>
+        <w:t>html</w:t>
+      </w:r>
+      <w:r>
+        <w:rPr>
+          <w:rFonts w:ascii="Consolas" w:eastAsia="Times New Roman" w:hAnsi="Consolas" w:cs="Times New Roman"/>
+          <w:color w:val="FFFFFF"/>
+          <w:sz w:val="21"/>
+          <w:szCs w:val="21"/>
+        </w:rPr>
+        <w:t>&gt;</w:t>
+      </w:r>
+    </w:p>
+    <w:p>
+      <w:pPr>
+        <w:tabs>
+          <w:tab w:val="left" w:pos="1920"/>
+        </w:tabs>
+      </w:pPr>
+      <w:r>
+        <w:t xml:space="preserve">The best example of the specificity is above here I apply the style in the h1 and give purple color by ignoring </w:t>
+      </w:r>
+      <w:proofErr w:type="spellStart"/>
+      <w:r>
+        <w:t>whatelse</w:t>
+      </w:r>
+      <w:proofErr w:type="spellEnd"/>
+      <w:r>
+        <w:t xml:space="preserve"> I write in the </w:t>
+      </w:r>
+      <w:proofErr w:type="spellStart"/>
+      <w:proofErr w:type="gramStart"/>
+      <w:r>
+        <w:t>css</w:t>
+      </w:r>
+      <w:proofErr w:type="spellEnd"/>
+      <w:r>
+        <w:t xml:space="preserve"> .</w:t>
+      </w:r>
+      <w:proofErr w:type="gramEnd"/>
+      <w:r>
+        <w:t xml:space="preserve"> </w:t>
+      </w:r>
+      <w:proofErr w:type="gramStart"/>
+      <w:r>
+        <w:t>means</w:t>
+      </w:r>
+      <w:proofErr w:type="gramEnd"/>
+      <w:r>
+        <w:t xml:space="preserve"> to say some are </w:t>
+      </w:r>
+      <w:proofErr w:type="spellStart"/>
+      <w:r>
+        <w:t>specificied</w:t>
+      </w:r>
+      <w:proofErr w:type="spellEnd"/>
+      <w:r>
+        <w:t xml:space="preserve"> to provide them priority.</w:t>
+      </w:r>
+    </w:p>
+    <w:p>
+      <w:pPr>
+        <w:tabs>
+          <w:tab w:val="left" w:pos="1920"/>
+        </w:tabs>
+      </w:pPr>
+    </w:p>
+    <w:p>
+      <w:pPr>
+        <w:tabs>
+          <w:tab w:val="left" w:pos="1920"/>
+        </w:tabs>
+      </w:pPr>
+      <w:proofErr w:type="gramStart"/>
+      <w:r>
+        <w:t>3.origin</w:t>
+      </w:r>
+      <w:proofErr w:type="gramEnd"/>
+      <w:r>
+        <w:t xml:space="preserve"> is the order in which </w:t>
+      </w:r>
+      <w:proofErr w:type="spellStart"/>
+      <w:r>
+        <w:t>css</w:t>
+      </w:r>
+      <w:proofErr w:type="spellEnd"/>
+      <w:r>
+        <w:t xml:space="preserve"> appear and where it comes </w:t>
+      </w:r>
+      <w:proofErr w:type="spellStart"/>
+      <w:r>
+        <w:t>from,wheather</w:t>
+      </w:r>
+      <w:proofErr w:type="spellEnd"/>
+      <w:r>
+        <w:t xml:space="preserve"> that it is a browser style ,</w:t>
+      </w:r>
+      <w:proofErr w:type="spellStart"/>
+      <w:r>
+        <w:t>css</w:t>
+      </w:r>
+      <w:proofErr w:type="spellEnd"/>
+      <w:r>
+        <w:t xml:space="preserve"> form from browser </w:t>
+      </w:r>
+      <w:proofErr w:type="spellStart"/>
+      <w:r>
+        <w:t>extention</w:t>
+      </w:r>
+      <w:proofErr w:type="spellEnd"/>
+      <w:r>
+        <w:t xml:space="preserve"> or your </w:t>
+      </w:r>
+      <w:proofErr w:type="spellStart"/>
+      <w:r>
+        <w:t>authoured</w:t>
+      </w:r>
+      <w:proofErr w:type="spellEnd"/>
+      <w:r>
+        <w:t xml:space="preserve"> </w:t>
+      </w:r>
+      <w:proofErr w:type="spellStart"/>
+      <w:r>
+        <w:t>css</w:t>
+      </w:r>
+      <w:proofErr w:type="spellEnd"/>
+      <w:r>
+        <w:t>.</w:t>
+      </w:r>
+    </w:p>
+    <w:p>
+      <w:pPr>
+        <w:tabs>
+          <w:tab w:val="left" w:pos="1920"/>
+        </w:tabs>
+      </w:pPr>
+      <w:proofErr w:type="gramStart"/>
+      <w:r>
+        <w:t>4.important</w:t>
+      </w:r>
+      <w:proofErr w:type="gramEnd"/>
+      <w:r>
+        <w:t xml:space="preserve"> is the another tag if we use it anywhere so that place would be much important even </w:t>
+      </w:r>
+      <w:proofErr w:type="spellStart"/>
+      <w:r>
+        <w:t>overwriter</w:t>
+      </w:r>
+      <w:proofErr w:type="spellEnd"/>
+      <w:r>
+        <w:t xml:space="preserve"> the inline </w:t>
+      </w:r>
+      <w:proofErr w:type="spellStart"/>
+      <w:r>
+        <w:t>css</w:t>
+      </w:r>
+      <w:proofErr w:type="spellEnd"/>
+      <w:r>
+        <w:t>.</w:t>
+      </w:r>
+    </w:p>
+    <w:p>
+      <w:pPr>
+        <w:shd w:val="clear" w:color="auto" w:fill="00002C"/>
+        <w:spacing w:line="285" w:lineRule="atLeast"/>
+        <w:rPr>
+          <w:rFonts w:ascii="Consolas" w:eastAsia="Times New Roman" w:hAnsi="Consolas" w:cs="Times New Roman"/>
+          <w:color w:val="FFFFFF"/>
+          <w:sz w:val="21"/>
+          <w:szCs w:val="21"/>
+        </w:rPr>
+      </w:pPr>
+      <w:r>
+        <w:rPr>
+          <w:rFonts w:ascii="Consolas" w:eastAsia="Times New Roman" w:hAnsi="Consolas" w:cs="Times New Roman"/>
+          <w:color w:val="FFFFFF"/>
+          <w:sz w:val="21"/>
+          <w:szCs w:val="21"/>
+        </w:rPr>
+        <w:t>   &lt;</w:t>
+      </w:r>
+      <w:proofErr w:type="gramStart"/>
+      <w:r>
+        <w:rPr>
+          <w:rFonts w:ascii="Consolas" w:eastAsia="Times New Roman" w:hAnsi="Consolas" w:cs="Times New Roman"/>
+          <w:color w:val="FF0077"/>
+          <w:sz w:val="21"/>
+          <w:szCs w:val="21"/>
+        </w:rPr>
+        <w:t>style</w:t>
+      </w:r>
+      <w:proofErr w:type="gramEnd"/>
+      <w:r>
+        <w:rPr>
+          <w:rFonts w:ascii="Consolas" w:eastAsia="Times New Roman" w:hAnsi="Consolas" w:cs="Times New Roman"/>
+          <w:color w:val="FFFFFF"/>
+          <w:sz w:val="21"/>
+          <w:szCs w:val="21"/>
+        </w:rPr>
+        <w:t>&gt;</w:t>
+      </w:r>
+    </w:p>
+    <w:p>
+      <w:pPr>
+        <w:shd w:val="clear" w:color="auto" w:fill="00002C"/>
+        <w:spacing w:line="285" w:lineRule="atLeast"/>
+        <w:rPr>
+          <w:rFonts w:ascii="Consolas" w:eastAsia="Times New Roman" w:hAnsi="Consolas" w:cs="Times New Roman"/>
+          <w:color w:val="FFFFFF"/>
+          <w:sz w:val="21"/>
+          <w:szCs w:val="21"/>
+        </w:rPr>
+      </w:pPr>
+      <w:r>
+        <w:rPr>
+          <w:rFonts w:ascii="Consolas" w:eastAsia="Times New Roman" w:hAnsi="Consolas" w:cs="Times New Roman"/>
+          <w:color w:val="FFFFFF"/>
+          <w:sz w:val="21"/>
+          <w:szCs w:val="21"/>
+        </w:rPr>
+        <w:t xml:space="preserve">        </w:t>
+      </w:r>
+      <w:proofErr w:type="gramStart"/>
+      <w:r>
+        <w:rPr>
+          <w:rFonts w:ascii="Consolas" w:eastAsia="Times New Roman" w:hAnsi="Consolas" w:cs="Times New Roman"/>
+          <w:color w:val="FF0077"/>
+          <w:sz w:val="21"/>
+          <w:szCs w:val="21"/>
+        </w:rPr>
+        <w:t>h1</w:t>
+      </w:r>
+      <w:r>
+        <w:rPr>
+          <w:rFonts w:ascii="Consolas" w:eastAsia="Times New Roman" w:hAnsi="Consolas" w:cs="Times New Roman"/>
+          <w:color w:val="FFFFFF"/>
+          <w:sz w:val="21"/>
+          <w:szCs w:val="21"/>
+        </w:rPr>
+        <w:t>{</w:t>
+      </w:r>
+      <w:proofErr w:type="gramEnd"/>
+    </w:p>
+    <w:p>
+      <w:pPr>
+        <w:shd w:val="clear" w:color="auto" w:fill="00002C"/>
+        <w:spacing w:line="285" w:lineRule="atLeast"/>
+        <w:rPr>
+          <w:rFonts w:ascii="Consolas" w:eastAsia="Times New Roman" w:hAnsi="Consolas" w:cs="Times New Roman"/>
+          <w:color w:val="FFFFFF"/>
+          <w:sz w:val="21"/>
+          <w:szCs w:val="21"/>
+        </w:rPr>
+      </w:pPr>
+      <w:r>
+        <w:rPr>
+          <w:rFonts w:ascii="Consolas" w:eastAsia="Times New Roman" w:hAnsi="Consolas" w:cs="Times New Roman"/>
+          <w:color w:val="FFFFFF"/>
+          <w:sz w:val="21"/>
+          <w:szCs w:val="21"/>
+        </w:rPr>
+        <w:t xml:space="preserve">            </w:t>
+      </w:r>
+      <w:proofErr w:type="gramStart"/>
+      <w:r>
+        <w:rPr>
+          <w:rFonts w:ascii="Consolas" w:eastAsia="Times New Roman" w:hAnsi="Consolas" w:cs="Times New Roman"/>
+          <w:color w:val="FFFFFF"/>
+          <w:sz w:val="21"/>
+          <w:szCs w:val="21"/>
+        </w:rPr>
+        <w:t>color</w:t>
+      </w:r>
+      <w:proofErr w:type="gramEnd"/>
+      <w:r>
+        <w:rPr>
+          <w:rFonts w:ascii="Consolas" w:eastAsia="Times New Roman" w:hAnsi="Consolas" w:cs="Times New Roman"/>
+          <w:color w:val="FFFFFF"/>
+          <w:sz w:val="21"/>
+          <w:szCs w:val="21"/>
+        </w:rPr>
+        <w:t xml:space="preserve">: </w:t>
+      </w:r>
+      <w:proofErr w:type="spellStart"/>
+      <w:r>
+        <w:rPr>
+          <w:rFonts w:ascii="Consolas" w:eastAsia="Times New Roman" w:hAnsi="Consolas" w:cs="Times New Roman"/>
+          <w:color w:val="00FFFF"/>
+          <w:sz w:val="21"/>
+          <w:szCs w:val="21"/>
+        </w:rPr>
+        <w:t>rgb</w:t>
+      </w:r>
+      <w:proofErr w:type="spellEnd"/>
+      <w:r>
+        <w:rPr>
+          <w:rFonts w:ascii="Consolas" w:eastAsia="Times New Roman" w:hAnsi="Consolas" w:cs="Times New Roman"/>
+          <w:color w:val="FFFFFF"/>
+          <w:sz w:val="21"/>
+          <w:szCs w:val="21"/>
+        </w:rPr>
+        <w:t>(</w:t>
+      </w:r>
+      <w:r>
+        <w:rPr>
+          <w:rFonts w:ascii="Consolas" w:eastAsia="Times New Roman" w:hAnsi="Consolas" w:cs="Times New Roman"/>
+          <w:color w:val="FF7E34"/>
+          <w:sz w:val="21"/>
+          <w:szCs w:val="21"/>
+        </w:rPr>
+        <w:t>0</w:t>
+      </w:r>
+      <w:r>
+        <w:rPr>
+          <w:rFonts w:ascii="Consolas" w:eastAsia="Times New Roman" w:hAnsi="Consolas" w:cs="Times New Roman"/>
+          <w:color w:val="FFFFFF"/>
+          <w:sz w:val="21"/>
+          <w:szCs w:val="21"/>
+        </w:rPr>
+        <w:t xml:space="preserve">, </w:t>
+      </w:r>
+      <w:r>
+        <w:rPr>
+          <w:rFonts w:ascii="Consolas" w:eastAsia="Times New Roman" w:hAnsi="Consolas" w:cs="Times New Roman"/>
+          <w:color w:val="FF7E34"/>
+          <w:sz w:val="21"/>
+          <w:szCs w:val="21"/>
+        </w:rPr>
+        <w:t>255</w:t>
+      </w:r>
+      <w:r>
+        <w:rPr>
+          <w:rFonts w:ascii="Consolas" w:eastAsia="Times New Roman" w:hAnsi="Consolas" w:cs="Times New Roman"/>
+          <w:color w:val="FFFFFF"/>
+          <w:sz w:val="21"/>
+          <w:szCs w:val="21"/>
+        </w:rPr>
+        <w:t xml:space="preserve">, </w:t>
+      </w:r>
+      <w:r>
+        <w:rPr>
+          <w:rFonts w:ascii="Consolas" w:eastAsia="Times New Roman" w:hAnsi="Consolas" w:cs="Times New Roman"/>
+          <w:color w:val="FF7E34"/>
+          <w:sz w:val="21"/>
+          <w:szCs w:val="21"/>
+        </w:rPr>
+        <w:t>98</w:t>
+      </w:r>
+      <w:r>
+        <w:rPr>
+          <w:rFonts w:ascii="Consolas" w:eastAsia="Times New Roman" w:hAnsi="Consolas" w:cs="Times New Roman"/>
+          <w:color w:val="FFFFFF"/>
+          <w:sz w:val="21"/>
+          <w:szCs w:val="21"/>
+        </w:rPr>
+        <w:t>);}</w:t>
+      </w:r>
+    </w:p>
+    <w:p>
+      <w:pPr>
+        <w:shd w:val="clear" w:color="auto" w:fill="00002C"/>
+        <w:spacing w:line="285" w:lineRule="atLeast"/>
+        <w:rPr>
+          <w:rFonts w:ascii="Consolas" w:eastAsia="Times New Roman" w:hAnsi="Consolas" w:cs="Times New Roman"/>
+          <w:color w:val="FFFFFF"/>
+          <w:sz w:val="21"/>
+          <w:szCs w:val="21"/>
+        </w:rPr>
+      </w:pPr>
+      <w:r>
+        <w:rPr>
+          <w:rFonts w:ascii="Consolas" w:eastAsia="Times New Roman" w:hAnsi="Consolas" w:cs="Times New Roman"/>
+          <w:color w:val="FFFFFF"/>
+          <w:sz w:val="21"/>
+          <w:szCs w:val="21"/>
+        </w:rPr>
+        <w:t>            .</w:t>
+      </w:r>
+      <w:proofErr w:type="spellStart"/>
+      <w:proofErr w:type="gramStart"/>
+      <w:r>
+        <w:rPr>
+          <w:rFonts w:ascii="Consolas" w:eastAsia="Times New Roman" w:hAnsi="Consolas" w:cs="Times New Roman"/>
+          <w:color w:val="FFCB6B"/>
+          <w:sz w:val="21"/>
+          <w:szCs w:val="21"/>
+        </w:rPr>
+        <w:t>vblue</w:t>
+      </w:r>
+      <w:proofErr w:type="spellEnd"/>
+      <w:r>
+        <w:rPr>
+          <w:rFonts w:ascii="Consolas" w:eastAsia="Times New Roman" w:hAnsi="Consolas" w:cs="Times New Roman"/>
+          <w:color w:val="FFFFFF"/>
+          <w:sz w:val="21"/>
+          <w:szCs w:val="21"/>
+        </w:rPr>
+        <w:t>{</w:t>
+      </w:r>
+      <w:proofErr w:type="gramEnd"/>
+    </w:p>
+    <w:p>
+      <w:pPr>
+        <w:shd w:val="clear" w:color="auto" w:fill="00002C"/>
+        <w:spacing w:line="285" w:lineRule="atLeast"/>
+        <w:rPr>
+          <w:rFonts w:ascii="Consolas" w:eastAsia="Times New Roman" w:hAnsi="Consolas" w:cs="Times New Roman"/>
+          <w:color w:val="FFFFFF"/>
+          <w:sz w:val="21"/>
+          <w:szCs w:val="21"/>
+        </w:rPr>
+      </w:pPr>
+      <w:r>
+        <w:rPr>
+          <w:rFonts w:ascii="Consolas" w:eastAsia="Times New Roman" w:hAnsi="Consolas" w:cs="Times New Roman"/>
+          <w:color w:val="FFFFFF"/>
+          <w:sz w:val="21"/>
+          <w:szCs w:val="21"/>
+        </w:rPr>
+        <w:t xml:space="preserve">                </w:t>
+      </w:r>
+      <w:proofErr w:type="gramStart"/>
+      <w:r>
+        <w:rPr>
+          <w:rFonts w:ascii="Consolas" w:eastAsia="Times New Roman" w:hAnsi="Consolas" w:cs="Times New Roman"/>
+          <w:color w:val="FFFFFF"/>
+          <w:sz w:val="21"/>
+          <w:szCs w:val="21"/>
+        </w:rPr>
+        <w:t>color</w:t>
+      </w:r>
+      <w:proofErr w:type="gramEnd"/>
+      <w:r>
+        <w:rPr>
+          <w:rFonts w:ascii="Consolas" w:eastAsia="Times New Roman" w:hAnsi="Consolas" w:cs="Times New Roman"/>
+          <w:color w:val="FFFFFF"/>
+          <w:sz w:val="21"/>
+          <w:szCs w:val="21"/>
+        </w:rPr>
+        <w:t xml:space="preserve">: </w:t>
+      </w:r>
+      <w:r>
+        <w:rPr>
+          <w:rFonts w:ascii="Consolas" w:eastAsia="Times New Roman" w:hAnsi="Consolas" w:cs="Times New Roman"/>
+          <w:color w:val="FF7E34"/>
+          <w:sz w:val="21"/>
+          <w:szCs w:val="21"/>
+        </w:rPr>
+        <w:t>blue</w:t>
+      </w:r>
+      <w:r>
+        <w:rPr>
+          <w:rFonts w:ascii="Consolas" w:eastAsia="Times New Roman" w:hAnsi="Consolas" w:cs="Times New Roman"/>
+          <w:color w:val="FFFFFF"/>
+          <w:sz w:val="21"/>
+          <w:szCs w:val="21"/>
+        </w:rPr>
+        <w:t>;}</w:t>
+      </w:r>
+    </w:p>
+    <w:p>
+      <w:pPr>
+        <w:shd w:val="clear" w:color="auto" w:fill="00002C"/>
+        <w:spacing w:line="285" w:lineRule="atLeast"/>
+        <w:rPr>
+          <w:rFonts w:ascii="Consolas" w:eastAsia="Times New Roman" w:hAnsi="Consolas" w:cs="Times New Roman"/>
+          <w:color w:val="FFFFFF"/>
+          <w:sz w:val="21"/>
+          <w:szCs w:val="21"/>
+        </w:rPr>
+      </w:pPr>
+      <w:r>
+        <w:rPr>
+          <w:rFonts w:ascii="Consolas" w:eastAsia="Times New Roman" w:hAnsi="Consolas" w:cs="Times New Roman"/>
+          <w:color w:val="FFFFFF"/>
+          <w:sz w:val="21"/>
+          <w:szCs w:val="21"/>
+        </w:rPr>
+        <w:t>            .</w:t>
+      </w:r>
+      <w:proofErr w:type="spellStart"/>
+      <w:proofErr w:type="gramStart"/>
+      <w:r>
+        <w:rPr>
+          <w:rFonts w:ascii="Consolas" w:eastAsia="Times New Roman" w:hAnsi="Consolas" w:cs="Times New Roman"/>
+          <w:color w:val="FFCB6B"/>
+          <w:sz w:val="21"/>
+          <w:szCs w:val="21"/>
+        </w:rPr>
+        <w:t>tpurple</w:t>
+      </w:r>
+      <w:proofErr w:type="spellEnd"/>
+      <w:r>
+        <w:rPr>
+          <w:rFonts w:ascii="Consolas" w:eastAsia="Times New Roman" w:hAnsi="Consolas" w:cs="Times New Roman"/>
+          <w:color w:val="FFFFFF"/>
+          <w:sz w:val="21"/>
+          <w:szCs w:val="21"/>
+        </w:rPr>
+        <w:t>{</w:t>
+      </w:r>
+      <w:proofErr w:type="gramEnd"/>
+    </w:p>
+    <w:p>
+      <w:pPr>
+        <w:shd w:val="clear" w:color="auto" w:fill="00002C"/>
+        <w:spacing w:line="285" w:lineRule="atLeast"/>
+        <w:rPr>
+          <w:rFonts w:ascii="Consolas" w:eastAsia="Times New Roman" w:hAnsi="Consolas" w:cs="Times New Roman"/>
+          <w:color w:val="FFFFFF"/>
+          <w:sz w:val="21"/>
+          <w:szCs w:val="21"/>
+        </w:rPr>
+      </w:pPr>
+      <w:r>
+        <w:rPr>
+          <w:rFonts w:ascii="Consolas" w:eastAsia="Times New Roman" w:hAnsi="Consolas" w:cs="Times New Roman"/>
+          <w:color w:val="FFFFFF"/>
+          <w:sz w:val="21"/>
+          <w:szCs w:val="21"/>
+        </w:rPr>
+        <w:t xml:space="preserve">                </w:t>
+      </w:r>
+      <w:proofErr w:type="gramStart"/>
+      <w:r>
+        <w:rPr>
+          <w:rFonts w:ascii="Consolas" w:eastAsia="Times New Roman" w:hAnsi="Consolas" w:cs="Times New Roman"/>
+          <w:color w:val="FFFFFF"/>
+          <w:sz w:val="21"/>
+          <w:szCs w:val="21"/>
+        </w:rPr>
+        <w:t>color</w:t>
+      </w:r>
+      <w:proofErr w:type="gramEnd"/>
+      <w:r>
+        <w:rPr>
+          <w:rFonts w:ascii="Consolas" w:eastAsia="Times New Roman" w:hAnsi="Consolas" w:cs="Times New Roman"/>
+          <w:color w:val="FFFFFF"/>
+          <w:sz w:val="21"/>
+          <w:szCs w:val="21"/>
+        </w:rPr>
+        <w:t xml:space="preserve">: </w:t>
+      </w:r>
+      <w:r>
+        <w:rPr>
+          <w:rFonts w:ascii="Consolas" w:eastAsia="Times New Roman" w:hAnsi="Consolas" w:cs="Times New Roman"/>
+          <w:color w:val="FF7E34"/>
+          <w:sz w:val="21"/>
+          <w:szCs w:val="21"/>
+        </w:rPr>
+        <w:t>firebrick</w:t>
+      </w:r>
+      <w:r>
+        <w:rPr>
+          <w:rFonts w:ascii="Consolas" w:eastAsia="Times New Roman" w:hAnsi="Consolas" w:cs="Times New Roman"/>
+          <w:color w:val="FFFFFF"/>
+          <w:sz w:val="21"/>
+          <w:szCs w:val="21"/>
+        </w:rPr>
+        <w:t xml:space="preserve"> </w:t>
+      </w:r>
+      <w:r>
+        <w:rPr>
+          <w:rFonts w:ascii="Consolas" w:eastAsia="Times New Roman" w:hAnsi="Consolas" w:cs="Times New Roman"/>
+          <w:color w:val="82FBFF"/>
+          <w:sz w:val="21"/>
+          <w:szCs w:val="21"/>
+        </w:rPr>
+        <w:t>!important</w:t>
+      </w:r>
+      <w:r>
+        <w:rPr>
+          <w:rFonts w:ascii="Consolas" w:eastAsia="Times New Roman" w:hAnsi="Consolas" w:cs="Times New Roman"/>
+          <w:color w:val="FFFFFF"/>
+          <w:sz w:val="21"/>
+          <w:szCs w:val="21"/>
+        </w:rPr>
+        <w:t>;</w:t>
+      </w:r>
+    </w:p>
+    <w:p>
+      <w:pPr>
+        <w:shd w:val="clear" w:color="auto" w:fill="00002C"/>
+        <w:spacing w:line="285" w:lineRule="atLeast"/>
+        <w:rPr>
+          <w:rFonts w:ascii="Consolas" w:eastAsia="Times New Roman" w:hAnsi="Consolas" w:cs="Times New Roman"/>
+          <w:color w:val="FFFFFF"/>
+          <w:sz w:val="21"/>
+          <w:szCs w:val="21"/>
+        </w:rPr>
+      </w:pPr>
+      <w:r>
+        <w:rPr>
+          <w:rFonts w:ascii="Consolas" w:eastAsia="Times New Roman" w:hAnsi="Consolas" w:cs="Times New Roman"/>
+          <w:color w:val="FFFFFF"/>
+          <w:sz w:val="21"/>
+          <w:szCs w:val="21"/>
+        </w:rPr>
+        <w:t>            }</w:t>
+      </w:r>
+    </w:p>
+    <w:p>
+      <w:pPr>
+        <w:shd w:val="clear" w:color="auto" w:fill="00002C"/>
+        <w:spacing w:line="285" w:lineRule="atLeast"/>
+        <w:rPr>
+          <w:rFonts w:ascii="Consolas" w:eastAsia="Times New Roman" w:hAnsi="Consolas" w:cs="Times New Roman"/>
+          <w:color w:val="FFFFFF"/>
+          <w:sz w:val="21"/>
+          <w:szCs w:val="21"/>
+        </w:rPr>
+      </w:pPr>
+      <w:r>
+        <w:rPr>
+          <w:rFonts w:ascii="Consolas" w:eastAsia="Times New Roman" w:hAnsi="Consolas" w:cs="Times New Roman"/>
+          <w:color w:val="FFFFFF"/>
+          <w:sz w:val="21"/>
+          <w:szCs w:val="21"/>
+        </w:rPr>
+        <w:t>            .</w:t>
+      </w:r>
+      <w:proofErr w:type="spellStart"/>
+      <w:proofErr w:type="gramStart"/>
+      <w:r>
+        <w:rPr>
+          <w:rFonts w:ascii="Consolas" w:eastAsia="Times New Roman" w:hAnsi="Consolas" w:cs="Times New Roman"/>
+          <w:color w:val="FFCB6B"/>
+          <w:sz w:val="21"/>
+          <w:szCs w:val="21"/>
+        </w:rPr>
+        <w:t>mgrey</w:t>
+      </w:r>
+      <w:proofErr w:type="spellEnd"/>
+      <w:r>
+        <w:rPr>
+          <w:rFonts w:ascii="Consolas" w:eastAsia="Times New Roman" w:hAnsi="Consolas" w:cs="Times New Roman"/>
+          <w:color w:val="FFFFFF"/>
+          <w:sz w:val="21"/>
+          <w:szCs w:val="21"/>
+        </w:rPr>
+        <w:t>{</w:t>
+      </w:r>
+      <w:proofErr w:type="gramEnd"/>
+    </w:p>
+    <w:p>
+      <w:pPr>
+        <w:shd w:val="clear" w:color="auto" w:fill="00002C"/>
+        <w:spacing w:line="285" w:lineRule="atLeast"/>
+        <w:rPr>
+          <w:rFonts w:ascii="Consolas" w:eastAsia="Times New Roman" w:hAnsi="Consolas" w:cs="Times New Roman"/>
+          <w:color w:val="FFFFFF"/>
+          <w:sz w:val="21"/>
+          <w:szCs w:val="21"/>
+        </w:rPr>
+      </w:pPr>
+      <w:r>
+        <w:rPr>
+          <w:rFonts w:ascii="Consolas" w:eastAsia="Times New Roman" w:hAnsi="Consolas" w:cs="Times New Roman"/>
+          <w:color w:val="FFFFFF"/>
+          <w:sz w:val="21"/>
+          <w:szCs w:val="21"/>
+        </w:rPr>
+        <w:t xml:space="preserve">                </w:t>
+      </w:r>
+      <w:proofErr w:type="gramStart"/>
+      <w:r>
+        <w:rPr>
+          <w:rFonts w:ascii="Consolas" w:eastAsia="Times New Roman" w:hAnsi="Consolas" w:cs="Times New Roman"/>
+          <w:color w:val="FFFFFF"/>
+          <w:sz w:val="21"/>
+          <w:szCs w:val="21"/>
+        </w:rPr>
+        <w:t>color</w:t>
+      </w:r>
+      <w:proofErr w:type="gramEnd"/>
+      <w:r>
+        <w:rPr>
+          <w:rFonts w:ascii="Consolas" w:eastAsia="Times New Roman" w:hAnsi="Consolas" w:cs="Times New Roman"/>
+          <w:color w:val="FFFFFF"/>
+          <w:sz w:val="21"/>
+          <w:szCs w:val="21"/>
+        </w:rPr>
+        <w:t xml:space="preserve">: </w:t>
+      </w:r>
+      <w:r>
+        <w:rPr>
+          <w:rFonts w:ascii="Consolas" w:eastAsia="Times New Roman" w:hAnsi="Consolas" w:cs="Times New Roman"/>
+          <w:color w:val="FF7E34"/>
+          <w:sz w:val="21"/>
+          <w:szCs w:val="21"/>
+        </w:rPr>
+        <w:t>green</w:t>
+      </w:r>
+      <w:r>
+        <w:rPr>
+          <w:rFonts w:ascii="Consolas" w:eastAsia="Times New Roman" w:hAnsi="Consolas" w:cs="Times New Roman"/>
+          <w:color w:val="FFFFFF"/>
+          <w:sz w:val="21"/>
+          <w:szCs w:val="21"/>
+        </w:rPr>
+        <w:t>;</w:t>
+      </w:r>
+    </w:p>
+    <w:p>
+      <w:pPr>
+        <w:shd w:val="clear" w:color="auto" w:fill="00002C"/>
+        <w:spacing w:line="285" w:lineRule="atLeast"/>
+        <w:rPr>
+          <w:rFonts w:ascii="Consolas" w:eastAsia="Times New Roman" w:hAnsi="Consolas" w:cs="Times New Roman"/>
+          <w:color w:val="FFFFFF"/>
+          <w:sz w:val="21"/>
+          <w:szCs w:val="21"/>
+        </w:rPr>
+      </w:pPr>
+      <w:r>
+        <w:rPr>
+          <w:rFonts w:ascii="Consolas" w:eastAsia="Times New Roman" w:hAnsi="Consolas" w:cs="Times New Roman"/>
+          <w:color w:val="FFFFFF"/>
+          <w:sz w:val="21"/>
+          <w:szCs w:val="21"/>
+        </w:rPr>
+        <w:t>            }</w:t>
+      </w:r>
+    </w:p>
+    <w:p>
+      <w:pPr>
+        <w:shd w:val="clear" w:color="auto" w:fill="00002C"/>
+        <w:spacing w:line="285" w:lineRule="atLeast"/>
+        <w:rPr>
+          <w:rFonts w:ascii="Consolas" w:eastAsia="Times New Roman" w:hAnsi="Consolas" w:cs="Times New Roman"/>
+          <w:color w:val="FFFFFF"/>
+          <w:sz w:val="21"/>
+          <w:szCs w:val="21"/>
+        </w:rPr>
+      </w:pPr>
+      <w:r>
+        <w:rPr>
+          <w:rFonts w:ascii="Consolas" w:eastAsia="Times New Roman" w:hAnsi="Consolas" w:cs="Times New Roman"/>
+          <w:color w:val="FFFFFF"/>
+          <w:sz w:val="21"/>
+          <w:szCs w:val="21"/>
+        </w:rPr>
+        <w:t xml:space="preserve">        </w:t>
+      </w:r>
+    </w:p>
+    <w:p>
+      <w:pPr>
+        <w:shd w:val="clear" w:color="auto" w:fill="00002C"/>
+        <w:spacing w:line="285" w:lineRule="atLeast"/>
+        <w:rPr>
+          <w:rFonts w:ascii="Consolas" w:eastAsia="Times New Roman" w:hAnsi="Consolas" w:cs="Times New Roman"/>
+          <w:color w:val="FFFFFF"/>
+          <w:sz w:val="21"/>
+          <w:szCs w:val="21"/>
+        </w:rPr>
+      </w:pPr>
+      <w:r>
+        <w:rPr>
+          <w:rFonts w:ascii="Consolas" w:eastAsia="Times New Roman" w:hAnsi="Consolas" w:cs="Times New Roman"/>
+          <w:color w:val="FFFFFF"/>
+          <w:sz w:val="21"/>
+          <w:szCs w:val="21"/>
+        </w:rPr>
+        <w:t>    &lt;/</w:t>
+      </w:r>
+      <w:r>
+        <w:rPr>
+          <w:rFonts w:ascii="Consolas" w:eastAsia="Times New Roman" w:hAnsi="Consolas" w:cs="Times New Roman"/>
+          <w:color w:val="FF0077"/>
+          <w:sz w:val="21"/>
+          <w:szCs w:val="21"/>
+        </w:rPr>
+        <w:t>style</w:t>
+      </w:r>
+      <w:r>
+        <w:rPr>
+          <w:rFonts w:ascii="Consolas" w:eastAsia="Times New Roman" w:hAnsi="Consolas" w:cs="Times New Roman"/>
+          <w:color w:val="FFFFFF"/>
+          <w:sz w:val="21"/>
+          <w:szCs w:val="21"/>
+        </w:rPr>
+        <w:t>&gt;</w:t>
+      </w:r>
+    </w:p>
+    <w:p>
+      <w:pPr>
+        <w:tabs>
+          <w:tab w:val="left" w:pos="1920"/>
+        </w:tabs>
+      </w:pPr>
+      <w:r>
+        <w:t xml:space="preserve">As here in the above </w:t>
+      </w:r>
+      <w:proofErr w:type="spellStart"/>
+      <w:r>
+        <w:t>ss</w:t>
+      </w:r>
+      <w:proofErr w:type="spellEnd"/>
+      <w:r>
+        <w:t xml:space="preserve"> I use the </w:t>
+      </w:r>
+      <w:proofErr w:type="spellStart"/>
+      <w:r>
+        <w:t>importatant</w:t>
+      </w:r>
+      <w:proofErr w:type="spellEnd"/>
+      <w:r>
+        <w:t xml:space="preserve"> with the firebrick color so it give the firebrick color means that          </w:t>
+      </w:r>
+    </w:p>
+    <w:p>
+      <w:pPr>
+        <w:tabs>
+          <w:tab w:val="left" w:pos="1920"/>
+        </w:tabs>
+      </w:pPr>
+      <w:proofErr w:type="gramStart"/>
+      <w:r>
+        <w:t>important&gt;</w:t>
+      </w:r>
+      <w:proofErr w:type="gramEnd"/>
+      <w:r>
+        <w:t xml:space="preserve">inline </w:t>
+      </w:r>
+      <w:proofErr w:type="spellStart"/>
+      <w:r>
+        <w:t>css</w:t>
+      </w:r>
+      <w:proofErr w:type="spellEnd"/>
+      <w:r>
+        <w:t>&gt;then other specificity element</w:t>
+      </w:r>
+    </w:p>
+    <w:p>
+      <w:pPr>
+        <w:tabs>
+          <w:tab w:val="left" w:pos="1920"/>
+        </w:tabs>
+      </w:pPr>
+    </w:p>
+    <w:p>
+      <w:pPr>
+        <w:tabs>
+          <w:tab w:val="left" w:pos="1920"/>
+        </w:tabs>
+      </w:pPr>
+    </w:p>
+    <w:p>
+      <w:pPr>
+        <w:tabs>
+          <w:tab w:val="left" w:pos="1920"/>
+        </w:tabs>
+        <w:rPr>
+          <w:b/>
+        </w:rPr>
+      </w:pPr>
+      <w:r>
+        <w:rPr>
+          <w:b/>
+        </w:rPr>
+        <w:t xml:space="preserve">How to calculate </w:t>
+      </w:r>
+      <w:proofErr w:type="gramStart"/>
+      <w:r>
+        <w:rPr>
+          <w:b/>
+        </w:rPr>
+        <w:t xml:space="preserve">any </w:t>
+      </w:r>
+      <w:r>
+        <w:rPr>
+          <w:b/>
+        </w:rPr>
+        <w:t xml:space="preserve"> particular</w:t>
+      </w:r>
+      <w:proofErr w:type="gramEnd"/>
+      <w:r>
+        <w:rPr>
+          <w:b/>
+        </w:rPr>
+        <w:t xml:space="preserve"> </w:t>
+      </w:r>
+      <w:r>
+        <w:rPr>
+          <w:b/>
+        </w:rPr>
+        <w:t>element specificity calculation?</w:t>
+      </w:r>
+    </w:p>
+    <w:p>
+      <w:pPr>
+        <w:tabs>
+          <w:tab w:val="left" w:pos="1920"/>
+        </w:tabs>
+        <w:rPr>
+          <w:b/>
+        </w:rPr>
+      </w:pPr>
+    </w:p>
+    <w:p>
+      <w:pPr>
+        <w:tabs>
+          <w:tab w:val="left" w:pos="1920"/>
+        </w:tabs>
+      </w:pPr>
+      <w:r>
+        <w:t xml:space="preserve">Means that the element we use for </w:t>
+      </w:r>
+      <w:proofErr w:type="spellStart"/>
+      <w:r>
+        <w:t>anypurpose</w:t>
+      </w:r>
+      <w:proofErr w:type="spellEnd"/>
+      <w:r>
+        <w:t xml:space="preserve"> suppose we use the </w:t>
+      </w:r>
+      <w:proofErr w:type="spellStart"/>
+      <w:r>
+        <w:t>anyof</w:t>
+      </w:r>
+      <w:proofErr w:type="spellEnd"/>
+      <w:r>
+        <w:t xml:space="preserve"> the element for the color providence and also use many other element to give the </w:t>
+      </w:r>
+      <w:proofErr w:type="gramStart"/>
+      <w:r>
+        <w:t>color .</w:t>
+      </w:r>
+      <w:proofErr w:type="gramEnd"/>
+      <w:r>
+        <w:t xml:space="preserve"> </w:t>
+      </w:r>
+      <w:proofErr w:type="gramStart"/>
+      <w:r>
+        <w:t>but</w:t>
+      </w:r>
+      <w:proofErr w:type="gramEnd"/>
+      <w:r>
+        <w:t xml:space="preserve"> any one of the element property is </w:t>
+      </w:r>
+      <w:proofErr w:type="spellStart"/>
+      <w:r>
+        <w:t>appliead</w:t>
+      </w:r>
+      <w:proofErr w:type="spellEnd"/>
+      <w:r>
+        <w:t xml:space="preserve"> so its depend upon the specificity of that element so here we </w:t>
+      </w:r>
+      <w:proofErr w:type="spellStart"/>
+      <w:r>
+        <w:t>disscuss</w:t>
+      </w:r>
+      <w:proofErr w:type="spellEnd"/>
+      <w:r>
+        <w:t xml:space="preserve"> the specificity of the elements</w:t>
+      </w:r>
+    </w:p>
+    <w:p>
+      <w:pPr>
+        <w:shd w:val="clear" w:color="auto" w:fill="00002C"/>
+        <w:spacing w:line="285" w:lineRule="atLeast"/>
+        <w:rPr>
+          <w:rFonts w:ascii="Consolas" w:eastAsia="Times New Roman" w:hAnsi="Consolas" w:cs="Times New Roman"/>
+          <w:color w:val="FFFFFF"/>
+          <w:sz w:val="21"/>
+          <w:szCs w:val="21"/>
+        </w:rPr>
+      </w:pPr>
+      <w:r>
+        <w:rPr>
+          <w:rFonts w:ascii="Consolas" w:eastAsia="Times New Roman" w:hAnsi="Consolas" w:cs="Times New Roman"/>
+          <w:color w:val="FFFFFF"/>
+          <w:sz w:val="21"/>
+          <w:szCs w:val="21"/>
+        </w:rPr>
+        <w:t>&lt;</w:t>
+      </w:r>
+      <w:proofErr w:type="gramStart"/>
+      <w:r>
+        <w:rPr>
+          <w:rFonts w:ascii="Consolas" w:eastAsia="Times New Roman" w:hAnsi="Consolas" w:cs="Times New Roman"/>
+          <w:color w:val="FF0077"/>
+          <w:sz w:val="21"/>
+          <w:szCs w:val="21"/>
+        </w:rPr>
+        <w:t>html</w:t>
+      </w:r>
+      <w:proofErr w:type="gramEnd"/>
+      <w:r>
+        <w:rPr>
+          <w:rFonts w:ascii="Consolas" w:eastAsia="Times New Roman" w:hAnsi="Consolas" w:cs="Times New Roman"/>
+          <w:color w:val="FFFFFF"/>
+          <w:sz w:val="21"/>
+          <w:szCs w:val="21"/>
+        </w:rPr>
+        <w:t>&gt;</w:t>
+      </w:r>
+    </w:p>
+    <w:p>
+      <w:pPr>
+        <w:shd w:val="clear" w:color="auto" w:fill="00002C"/>
+        <w:spacing w:line="285" w:lineRule="atLeast"/>
+        <w:rPr>
+          <w:rFonts w:ascii="Consolas" w:eastAsia="Times New Roman" w:hAnsi="Consolas" w:cs="Times New Roman"/>
+          <w:color w:val="FFFFFF"/>
+          <w:sz w:val="21"/>
+          <w:szCs w:val="21"/>
+        </w:rPr>
+      </w:pPr>
+      <w:r>
+        <w:rPr>
+          <w:rFonts w:ascii="Consolas" w:eastAsia="Times New Roman" w:hAnsi="Consolas" w:cs="Times New Roman"/>
+          <w:color w:val="FFFFFF"/>
+          <w:sz w:val="21"/>
+          <w:szCs w:val="21"/>
+        </w:rPr>
+        <w:t>&lt;</w:t>
+      </w:r>
+      <w:proofErr w:type="gramStart"/>
+      <w:r>
+        <w:rPr>
+          <w:rFonts w:ascii="Consolas" w:eastAsia="Times New Roman" w:hAnsi="Consolas" w:cs="Times New Roman"/>
+          <w:color w:val="FF0077"/>
+          <w:sz w:val="21"/>
+          <w:szCs w:val="21"/>
+        </w:rPr>
+        <w:t>head</w:t>
+      </w:r>
+      <w:proofErr w:type="gramEnd"/>
+      <w:r>
+        <w:rPr>
+          <w:rFonts w:ascii="Consolas" w:eastAsia="Times New Roman" w:hAnsi="Consolas" w:cs="Times New Roman"/>
+          <w:color w:val="FFFFFF"/>
+          <w:sz w:val="21"/>
+          <w:szCs w:val="21"/>
+        </w:rPr>
+        <w:t>&gt;</w:t>
+      </w:r>
+    </w:p>
+    <w:p>
+      <w:pPr>
+        <w:shd w:val="clear" w:color="auto" w:fill="00002C"/>
+        <w:spacing w:line="285" w:lineRule="atLeast"/>
+        <w:rPr>
+          <w:rFonts w:ascii="Consolas" w:eastAsia="Times New Roman" w:hAnsi="Consolas" w:cs="Times New Roman"/>
+          <w:color w:val="FFFFFF"/>
+          <w:sz w:val="21"/>
+          <w:szCs w:val="21"/>
+        </w:rPr>
+      </w:pPr>
+      <w:r>
+        <w:rPr>
+          <w:rFonts w:ascii="Consolas" w:eastAsia="Times New Roman" w:hAnsi="Consolas" w:cs="Times New Roman"/>
+          <w:color w:val="FFFFFF"/>
+          <w:sz w:val="21"/>
+          <w:szCs w:val="21"/>
+        </w:rPr>
+        <w:t>    &lt;</w:t>
+      </w:r>
+      <w:proofErr w:type="gramStart"/>
+      <w:r>
+        <w:rPr>
+          <w:rFonts w:ascii="Consolas" w:eastAsia="Times New Roman" w:hAnsi="Consolas" w:cs="Times New Roman"/>
+          <w:color w:val="FF0077"/>
+          <w:sz w:val="21"/>
+          <w:szCs w:val="21"/>
+        </w:rPr>
+        <w:t>style</w:t>
+      </w:r>
+      <w:proofErr w:type="gramEnd"/>
+      <w:r>
+        <w:rPr>
+          <w:rFonts w:ascii="Consolas" w:eastAsia="Times New Roman" w:hAnsi="Consolas" w:cs="Times New Roman"/>
+          <w:color w:val="FFFFFF"/>
+          <w:sz w:val="21"/>
+          <w:szCs w:val="21"/>
+        </w:rPr>
+        <w:t>&gt;</w:t>
+      </w:r>
+    </w:p>
+    <w:p>
+      <w:pPr>
+        <w:shd w:val="clear" w:color="auto" w:fill="00002C"/>
+        <w:spacing w:line="285" w:lineRule="atLeast"/>
+        <w:rPr>
+          <w:rFonts w:ascii="Consolas" w:eastAsia="Times New Roman" w:hAnsi="Consolas" w:cs="Times New Roman"/>
+          <w:color w:val="FFFFFF"/>
+          <w:sz w:val="21"/>
+          <w:szCs w:val="21"/>
+        </w:rPr>
+      </w:pPr>
+      <w:r>
+        <w:rPr>
+          <w:rFonts w:ascii="Consolas" w:eastAsia="Times New Roman" w:hAnsi="Consolas" w:cs="Times New Roman"/>
+          <w:color w:val="FFFFFF"/>
+          <w:sz w:val="21"/>
+          <w:szCs w:val="21"/>
+        </w:rPr>
+        <w:t xml:space="preserve">        </w:t>
+      </w:r>
+      <w:r>
+        <w:rPr>
+          <w:rFonts w:ascii="Consolas" w:eastAsia="Times New Roman" w:hAnsi="Consolas" w:cs="Times New Roman"/>
+          <w:color w:val="FF0077"/>
+          <w:sz w:val="21"/>
+          <w:szCs w:val="21"/>
+        </w:rPr>
+        <w:t>*</w:t>
+      </w:r>
+      <w:r>
+        <w:rPr>
+          <w:rFonts w:ascii="Consolas" w:eastAsia="Times New Roman" w:hAnsi="Consolas" w:cs="Times New Roman"/>
+          <w:color w:val="FFFFFF"/>
+          <w:sz w:val="21"/>
+          <w:szCs w:val="21"/>
+        </w:rPr>
+        <w:t>{</w:t>
+      </w:r>
+    </w:p>
+    <w:p>
+      <w:pPr>
+        <w:shd w:val="clear" w:color="auto" w:fill="00002C"/>
+        <w:spacing w:line="285" w:lineRule="atLeast"/>
+        <w:rPr>
+          <w:rFonts w:ascii="Consolas" w:eastAsia="Times New Roman" w:hAnsi="Consolas" w:cs="Times New Roman"/>
+          <w:color w:val="FFFFFF"/>
+          <w:sz w:val="21"/>
+          <w:szCs w:val="21"/>
+        </w:rPr>
+      </w:pPr>
+      <w:r>
+        <w:rPr>
+          <w:rFonts w:ascii="Consolas" w:eastAsia="Times New Roman" w:hAnsi="Consolas" w:cs="Times New Roman"/>
+          <w:color w:val="FFFFFF"/>
+          <w:sz w:val="21"/>
+          <w:szCs w:val="21"/>
+        </w:rPr>
+        <w:t xml:space="preserve">            </w:t>
+      </w:r>
+      <w:proofErr w:type="gramStart"/>
+      <w:r>
+        <w:rPr>
+          <w:rFonts w:ascii="Consolas" w:eastAsia="Times New Roman" w:hAnsi="Consolas" w:cs="Times New Roman"/>
+          <w:color w:val="FFFFFF"/>
+          <w:sz w:val="21"/>
+          <w:szCs w:val="21"/>
+        </w:rPr>
+        <w:t>color</w:t>
+      </w:r>
+      <w:proofErr w:type="gramEnd"/>
+      <w:r>
+        <w:rPr>
+          <w:rFonts w:ascii="Consolas" w:eastAsia="Times New Roman" w:hAnsi="Consolas" w:cs="Times New Roman"/>
+          <w:color w:val="FFFFFF"/>
+          <w:sz w:val="21"/>
+          <w:szCs w:val="21"/>
+        </w:rPr>
+        <w:t xml:space="preserve">: </w:t>
+      </w:r>
+      <w:r>
+        <w:rPr>
+          <w:rFonts w:ascii="Consolas" w:eastAsia="Times New Roman" w:hAnsi="Consolas" w:cs="Times New Roman"/>
+          <w:color w:val="FF7E34"/>
+          <w:sz w:val="21"/>
+          <w:szCs w:val="21"/>
+        </w:rPr>
+        <w:t>gray</w:t>
+      </w:r>
+      <w:r>
+        <w:rPr>
+          <w:rFonts w:ascii="Consolas" w:eastAsia="Times New Roman" w:hAnsi="Consolas" w:cs="Times New Roman"/>
+          <w:color w:val="FFFFFF"/>
+          <w:sz w:val="21"/>
+          <w:szCs w:val="21"/>
+        </w:rPr>
+        <w:t>;</w:t>
+      </w:r>
+    </w:p>
+    <w:p>
+      <w:pPr>
+        <w:shd w:val="clear" w:color="auto" w:fill="00002C"/>
+        <w:spacing w:line="285" w:lineRule="atLeast"/>
+        <w:rPr>
+          <w:rFonts w:ascii="Consolas" w:eastAsia="Times New Roman" w:hAnsi="Consolas" w:cs="Times New Roman"/>
+          <w:color w:val="FFFFFF"/>
+          <w:sz w:val="21"/>
+          <w:szCs w:val="21"/>
+        </w:rPr>
+      </w:pPr>
+      <w:r>
+        <w:rPr>
+          <w:rFonts w:ascii="Consolas" w:eastAsia="Times New Roman" w:hAnsi="Consolas" w:cs="Times New Roman"/>
+          <w:color w:val="FFFFFF"/>
+          <w:sz w:val="21"/>
+          <w:szCs w:val="21"/>
+        </w:rPr>
+        <w:t>        }</w:t>
+      </w:r>
+    </w:p>
+    <w:p>
+      <w:pPr>
+        <w:shd w:val="clear" w:color="auto" w:fill="00002C"/>
+        <w:spacing w:line="285" w:lineRule="atLeast"/>
+        <w:rPr>
+          <w:rFonts w:ascii="Consolas" w:eastAsia="Times New Roman" w:hAnsi="Consolas" w:cs="Times New Roman"/>
+          <w:color w:val="FFFFFF"/>
+          <w:sz w:val="21"/>
+          <w:szCs w:val="21"/>
+        </w:rPr>
+      </w:pPr>
+      <w:r>
+        <w:rPr>
+          <w:rFonts w:ascii="Consolas" w:eastAsia="Times New Roman" w:hAnsi="Consolas" w:cs="Times New Roman"/>
+          <w:color w:val="FFFFFF"/>
+          <w:sz w:val="21"/>
+          <w:szCs w:val="21"/>
+        </w:rPr>
+        <w:t>        #</w:t>
+      </w:r>
+      <w:proofErr w:type="gramStart"/>
+      <w:r>
+        <w:rPr>
+          <w:rFonts w:ascii="Consolas" w:eastAsia="Times New Roman" w:hAnsi="Consolas" w:cs="Times New Roman"/>
+          <w:color w:val="00FFF2"/>
+          <w:sz w:val="21"/>
+          <w:szCs w:val="21"/>
+        </w:rPr>
+        <w:t>title</w:t>
+      </w:r>
+      <w:r>
+        <w:rPr>
+          <w:rFonts w:ascii="Consolas" w:eastAsia="Times New Roman" w:hAnsi="Consolas" w:cs="Times New Roman"/>
+          <w:color w:val="FFFFFF"/>
+          <w:sz w:val="21"/>
+          <w:szCs w:val="21"/>
+        </w:rPr>
+        <w:t>{</w:t>
+      </w:r>
+      <w:proofErr w:type="gramEnd"/>
+    </w:p>
+    <w:p>
+      <w:pPr>
+        <w:shd w:val="clear" w:color="auto" w:fill="00002C"/>
+        <w:spacing w:line="285" w:lineRule="atLeast"/>
+        <w:rPr>
+          <w:rFonts w:ascii="Consolas" w:eastAsia="Times New Roman" w:hAnsi="Consolas" w:cs="Times New Roman"/>
+          <w:color w:val="FFFFFF"/>
+          <w:sz w:val="21"/>
+          <w:szCs w:val="21"/>
+        </w:rPr>
+      </w:pPr>
+      <w:r>
+        <w:rPr>
+          <w:rFonts w:ascii="Consolas" w:eastAsia="Times New Roman" w:hAnsi="Consolas" w:cs="Times New Roman"/>
+          <w:color w:val="FFFFFF"/>
+          <w:sz w:val="21"/>
+          <w:szCs w:val="21"/>
+        </w:rPr>
+        <w:t xml:space="preserve">            </w:t>
+      </w:r>
+      <w:proofErr w:type="gramStart"/>
+      <w:r>
+        <w:rPr>
+          <w:rFonts w:ascii="Consolas" w:eastAsia="Times New Roman" w:hAnsi="Consolas" w:cs="Times New Roman"/>
+          <w:color w:val="FFFFFF"/>
+          <w:sz w:val="21"/>
+          <w:szCs w:val="21"/>
+        </w:rPr>
+        <w:t>color</w:t>
+      </w:r>
+      <w:proofErr w:type="gramEnd"/>
+      <w:r>
+        <w:rPr>
+          <w:rFonts w:ascii="Consolas" w:eastAsia="Times New Roman" w:hAnsi="Consolas" w:cs="Times New Roman"/>
+          <w:color w:val="FFFFFF"/>
+          <w:sz w:val="21"/>
+          <w:szCs w:val="21"/>
+        </w:rPr>
+        <w:t xml:space="preserve">: </w:t>
+      </w:r>
+      <w:r>
+        <w:rPr>
+          <w:rFonts w:ascii="Consolas" w:eastAsia="Times New Roman" w:hAnsi="Consolas" w:cs="Times New Roman"/>
+          <w:color w:val="FF7E34"/>
+          <w:sz w:val="21"/>
+          <w:szCs w:val="21"/>
+        </w:rPr>
+        <w:t>red</w:t>
+      </w:r>
+      <w:r>
+        <w:rPr>
+          <w:rFonts w:ascii="Consolas" w:eastAsia="Times New Roman" w:hAnsi="Consolas" w:cs="Times New Roman"/>
+          <w:color w:val="FFFFFF"/>
+          <w:sz w:val="21"/>
+          <w:szCs w:val="21"/>
+        </w:rPr>
+        <w:t>;</w:t>
+      </w:r>
+    </w:p>
+    <w:p>
+      <w:pPr>
+        <w:shd w:val="clear" w:color="auto" w:fill="00002C"/>
+        <w:spacing w:line="285" w:lineRule="atLeast"/>
+        <w:rPr>
+          <w:rFonts w:ascii="Consolas" w:eastAsia="Times New Roman" w:hAnsi="Consolas" w:cs="Times New Roman"/>
+          <w:color w:val="FFFFFF"/>
+          <w:sz w:val="21"/>
+          <w:szCs w:val="21"/>
+        </w:rPr>
+      </w:pPr>
+      <w:r>
+        <w:rPr>
+          <w:rFonts w:ascii="Consolas" w:eastAsia="Times New Roman" w:hAnsi="Consolas" w:cs="Times New Roman"/>
+          <w:color w:val="FFFFFF"/>
+          <w:sz w:val="21"/>
+          <w:szCs w:val="21"/>
+        </w:rPr>
+        <w:t>        }</w:t>
+      </w:r>
+    </w:p>
+    <w:p>
+      <w:pPr>
+        <w:shd w:val="clear" w:color="auto" w:fill="00002C"/>
+        <w:spacing w:line="285" w:lineRule="atLeast"/>
+        <w:rPr>
+          <w:rFonts w:ascii="Consolas" w:eastAsia="Times New Roman" w:hAnsi="Consolas" w:cs="Times New Roman"/>
+          <w:color w:val="FFFFFF"/>
+          <w:sz w:val="21"/>
+          <w:szCs w:val="21"/>
+        </w:rPr>
+      </w:pPr>
+      <w:r>
+        <w:rPr>
+          <w:rFonts w:ascii="Consolas" w:eastAsia="Times New Roman" w:hAnsi="Consolas" w:cs="Times New Roman"/>
+          <w:color w:val="FFFFFF"/>
+          <w:sz w:val="21"/>
+          <w:szCs w:val="21"/>
+        </w:rPr>
+        <w:t>        .</w:t>
+      </w:r>
+      <w:proofErr w:type="gramStart"/>
+      <w:r>
+        <w:rPr>
+          <w:rFonts w:ascii="Consolas" w:eastAsia="Times New Roman" w:hAnsi="Consolas" w:cs="Times New Roman"/>
+          <w:color w:val="FFCB6B"/>
+          <w:sz w:val="21"/>
+          <w:szCs w:val="21"/>
+        </w:rPr>
+        <w:t>h1</w:t>
+      </w:r>
+      <w:r>
+        <w:rPr>
+          <w:rFonts w:ascii="Consolas" w:eastAsia="Times New Roman" w:hAnsi="Consolas" w:cs="Times New Roman"/>
+          <w:color w:val="FFFFFF"/>
+          <w:sz w:val="21"/>
+          <w:szCs w:val="21"/>
+        </w:rPr>
+        <w:t>{</w:t>
+      </w:r>
+      <w:proofErr w:type="gramEnd"/>
+    </w:p>
+    <w:p>
+      <w:pPr>
+        <w:shd w:val="clear" w:color="auto" w:fill="00002C"/>
+        <w:spacing w:line="285" w:lineRule="atLeast"/>
+        <w:rPr>
+          <w:rFonts w:ascii="Consolas" w:eastAsia="Times New Roman" w:hAnsi="Consolas" w:cs="Times New Roman"/>
+          <w:color w:val="FFFFFF"/>
+          <w:sz w:val="21"/>
+          <w:szCs w:val="21"/>
+        </w:rPr>
+      </w:pPr>
+      <w:r>
+        <w:rPr>
+          <w:rFonts w:ascii="Consolas" w:eastAsia="Times New Roman" w:hAnsi="Consolas" w:cs="Times New Roman"/>
+          <w:color w:val="FFFFFF"/>
+          <w:sz w:val="21"/>
+          <w:szCs w:val="21"/>
+        </w:rPr>
+        <w:lastRenderedPageBreak/>
+        <w:t xml:space="preserve">            </w:t>
+      </w:r>
+      <w:proofErr w:type="gramStart"/>
+      <w:r>
+        <w:rPr>
+          <w:rFonts w:ascii="Consolas" w:eastAsia="Times New Roman" w:hAnsi="Consolas" w:cs="Times New Roman"/>
+          <w:color w:val="FFFFFF"/>
+          <w:sz w:val="21"/>
+          <w:szCs w:val="21"/>
+        </w:rPr>
+        <w:t>color</w:t>
+      </w:r>
+      <w:proofErr w:type="gramEnd"/>
+      <w:r>
+        <w:rPr>
+          <w:rFonts w:ascii="Consolas" w:eastAsia="Times New Roman" w:hAnsi="Consolas" w:cs="Times New Roman"/>
+          <w:color w:val="FFFFFF"/>
+          <w:sz w:val="21"/>
+          <w:szCs w:val="21"/>
+        </w:rPr>
+        <w:t xml:space="preserve">: </w:t>
+      </w:r>
+      <w:r>
+        <w:rPr>
+          <w:rFonts w:ascii="Consolas" w:eastAsia="Times New Roman" w:hAnsi="Consolas" w:cs="Times New Roman"/>
+          <w:color w:val="FF7E34"/>
+          <w:sz w:val="21"/>
+          <w:szCs w:val="21"/>
+        </w:rPr>
+        <w:t>blue</w:t>
+      </w:r>
+      <w:r>
+        <w:rPr>
+          <w:rFonts w:ascii="Consolas" w:eastAsia="Times New Roman" w:hAnsi="Consolas" w:cs="Times New Roman"/>
+          <w:color w:val="FFFFFF"/>
+          <w:sz w:val="21"/>
+          <w:szCs w:val="21"/>
+        </w:rPr>
+        <w:t>;</w:t>
+      </w:r>
+    </w:p>
+    <w:p>
+      <w:pPr>
+        <w:shd w:val="clear" w:color="auto" w:fill="00002C"/>
+        <w:spacing w:line="285" w:lineRule="atLeast"/>
+        <w:rPr>
+          <w:rFonts w:ascii="Consolas" w:eastAsia="Times New Roman" w:hAnsi="Consolas" w:cs="Times New Roman"/>
+          <w:color w:val="FFFFFF"/>
+          <w:sz w:val="21"/>
+          <w:szCs w:val="21"/>
+        </w:rPr>
+      </w:pPr>
+      <w:r>
+        <w:rPr>
+          <w:rFonts w:ascii="Consolas" w:eastAsia="Times New Roman" w:hAnsi="Consolas" w:cs="Times New Roman"/>
+          <w:color w:val="FFFFFF"/>
+          <w:sz w:val="21"/>
+          <w:szCs w:val="21"/>
+        </w:rPr>
+        <w:t>        }</w:t>
+      </w:r>
+    </w:p>
+    <w:p>
+      <w:pPr>
+        <w:shd w:val="clear" w:color="auto" w:fill="00002C"/>
+        <w:spacing w:line="285" w:lineRule="atLeast"/>
+        <w:rPr>
+          <w:rFonts w:ascii="Consolas" w:eastAsia="Times New Roman" w:hAnsi="Consolas" w:cs="Times New Roman"/>
+          <w:color w:val="FFFFFF"/>
+          <w:sz w:val="21"/>
+          <w:szCs w:val="21"/>
+        </w:rPr>
+      </w:pPr>
+      <w:r>
+        <w:rPr>
+          <w:rFonts w:ascii="Consolas" w:eastAsia="Times New Roman" w:hAnsi="Consolas" w:cs="Times New Roman"/>
+          <w:color w:val="FFFFFF"/>
+          <w:sz w:val="21"/>
+          <w:szCs w:val="21"/>
+        </w:rPr>
+        <w:t xml:space="preserve">        </w:t>
+      </w:r>
+      <w:proofErr w:type="gramStart"/>
+      <w:r>
+        <w:rPr>
+          <w:rFonts w:ascii="Consolas" w:eastAsia="Times New Roman" w:hAnsi="Consolas" w:cs="Times New Roman"/>
+          <w:color w:val="FF0077"/>
+          <w:sz w:val="21"/>
+          <w:szCs w:val="21"/>
+        </w:rPr>
+        <w:t>h1</w:t>
+      </w:r>
+      <w:r>
+        <w:rPr>
+          <w:rFonts w:ascii="Consolas" w:eastAsia="Times New Roman" w:hAnsi="Consolas" w:cs="Times New Roman"/>
+          <w:color w:val="FFFFFF"/>
+          <w:sz w:val="21"/>
+          <w:szCs w:val="21"/>
+        </w:rPr>
+        <w:t>{</w:t>
+      </w:r>
+      <w:proofErr w:type="gramEnd"/>
+    </w:p>
+    <w:p>
+      <w:pPr>
+        <w:shd w:val="clear" w:color="auto" w:fill="00002C"/>
+        <w:spacing w:line="285" w:lineRule="atLeast"/>
+        <w:rPr>
+          <w:rFonts w:ascii="Consolas" w:eastAsia="Times New Roman" w:hAnsi="Consolas" w:cs="Times New Roman"/>
+          <w:color w:val="FFFFFF"/>
+          <w:sz w:val="21"/>
+          <w:szCs w:val="21"/>
+        </w:rPr>
+      </w:pPr>
+      <w:r>
+        <w:rPr>
+          <w:rFonts w:ascii="Consolas" w:eastAsia="Times New Roman" w:hAnsi="Consolas" w:cs="Times New Roman"/>
+          <w:color w:val="FFFFFF"/>
+          <w:sz w:val="21"/>
+          <w:szCs w:val="21"/>
+        </w:rPr>
+        <w:t xml:space="preserve">            </w:t>
+      </w:r>
+      <w:proofErr w:type="gramStart"/>
+      <w:r>
+        <w:rPr>
+          <w:rFonts w:ascii="Consolas" w:eastAsia="Times New Roman" w:hAnsi="Consolas" w:cs="Times New Roman"/>
+          <w:color w:val="FFFFFF"/>
+          <w:sz w:val="21"/>
+          <w:szCs w:val="21"/>
+        </w:rPr>
+        <w:t>color</w:t>
+      </w:r>
+      <w:proofErr w:type="gramEnd"/>
+      <w:r>
+        <w:rPr>
+          <w:rFonts w:ascii="Consolas" w:eastAsia="Times New Roman" w:hAnsi="Consolas" w:cs="Times New Roman"/>
+          <w:color w:val="FFFFFF"/>
+          <w:sz w:val="21"/>
+          <w:szCs w:val="21"/>
+        </w:rPr>
+        <w:t xml:space="preserve">: </w:t>
+      </w:r>
+      <w:r>
+        <w:rPr>
+          <w:rFonts w:ascii="Consolas" w:eastAsia="Times New Roman" w:hAnsi="Consolas" w:cs="Times New Roman"/>
+          <w:color w:val="FF7E34"/>
+          <w:sz w:val="21"/>
+          <w:szCs w:val="21"/>
+        </w:rPr>
+        <w:t>pink</w:t>
+      </w:r>
+      <w:r>
+        <w:rPr>
+          <w:rFonts w:ascii="Consolas" w:eastAsia="Times New Roman" w:hAnsi="Consolas" w:cs="Times New Roman"/>
+          <w:color w:val="FFFFFF"/>
+          <w:sz w:val="21"/>
+          <w:szCs w:val="21"/>
+        </w:rPr>
+        <w:t>;</w:t>
+      </w:r>
+    </w:p>
+    <w:p>
+      <w:pPr>
+        <w:shd w:val="clear" w:color="auto" w:fill="00002C"/>
+        <w:spacing w:line="285" w:lineRule="atLeast"/>
+        <w:rPr>
+          <w:rFonts w:ascii="Consolas" w:eastAsia="Times New Roman" w:hAnsi="Consolas" w:cs="Times New Roman"/>
+          <w:color w:val="FFFFFF"/>
+          <w:sz w:val="21"/>
+          <w:szCs w:val="21"/>
+        </w:rPr>
+      </w:pPr>
+      <w:r>
+        <w:rPr>
+          <w:rFonts w:ascii="Consolas" w:eastAsia="Times New Roman" w:hAnsi="Consolas" w:cs="Times New Roman"/>
+          <w:color w:val="FFFFFF"/>
+          <w:sz w:val="21"/>
+          <w:szCs w:val="21"/>
+        </w:rPr>
+        <w:t>        }</w:t>
+      </w:r>
+    </w:p>
+    <w:p>
+      <w:pPr>
+        <w:shd w:val="clear" w:color="auto" w:fill="00002C"/>
+        <w:spacing w:line="285" w:lineRule="atLeast"/>
+        <w:rPr>
+          <w:rFonts w:ascii="Consolas" w:eastAsia="Times New Roman" w:hAnsi="Consolas" w:cs="Times New Roman"/>
+          <w:color w:val="FFFFFF"/>
+          <w:sz w:val="21"/>
+          <w:szCs w:val="21"/>
+        </w:rPr>
+      </w:pPr>
+      <w:r>
+        <w:rPr>
+          <w:rFonts w:ascii="Consolas" w:eastAsia="Times New Roman" w:hAnsi="Consolas" w:cs="Times New Roman"/>
+          <w:color w:val="FFFFFF"/>
+          <w:sz w:val="21"/>
+          <w:szCs w:val="21"/>
+        </w:rPr>
+        <w:t>    &lt;/</w:t>
+      </w:r>
+      <w:r>
+        <w:rPr>
+          <w:rFonts w:ascii="Consolas" w:eastAsia="Times New Roman" w:hAnsi="Consolas" w:cs="Times New Roman"/>
+          <w:color w:val="FF0077"/>
+          <w:sz w:val="21"/>
+          <w:szCs w:val="21"/>
+        </w:rPr>
+        <w:t>style</w:t>
+      </w:r>
+      <w:r>
+        <w:rPr>
+          <w:rFonts w:ascii="Consolas" w:eastAsia="Times New Roman" w:hAnsi="Consolas" w:cs="Times New Roman"/>
+          <w:color w:val="FFFFFF"/>
+          <w:sz w:val="21"/>
+          <w:szCs w:val="21"/>
+        </w:rPr>
+        <w:t>&gt;</w:t>
+      </w:r>
+    </w:p>
+    <w:p>
+      <w:pPr>
+        <w:shd w:val="clear" w:color="auto" w:fill="00002C"/>
+        <w:spacing w:line="285" w:lineRule="atLeast"/>
+        <w:rPr>
+          <w:rFonts w:ascii="Consolas" w:eastAsia="Times New Roman" w:hAnsi="Consolas" w:cs="Times New Roman"/>
+          <w:color w:val="FFFFFF"/>
+          <w:sz w:val="21"/>
+          <w:szCs w:val="21"/>
+        </w:rPr>
+      </w:pPr>
+      <w:r>
+        <w:rPr>
+          <w:rFonts w:ascii="Consolas" w:eastAsia="Times New Roman" w:hAnsi="Consolas" w:cs="Times New Roman"/>
+          <w:color w:val="FFFFFF"/>
+          <w:sz w:val="21"/>
+          <w:szCs w:val="21"/>
+        </w:rPr>
+        <w:t>&lt;/</w:t>
+      </w:r>
+      <w:r>
+        <w:rPr>
+          <w:rFonts w:ascii="Consolas" w:eastAsia="Times New Roman" w:hAnsi="Consolas" w:cs="Times New Roman"/>
+          <w:color w:val="FF0077"/>
+          <w:sz w:val="21"/>
+          <w:szCs w:val="21"/>
+        </w:rPr>
+        <w:t>head</w:t>
+      </w:r>
+      <w:r>
+        <w:rPr>
+          <w:rFonts w:ascii="Consolas" w:eastAsia="Times New Roman" w:hAnsi="Consolas" w:cs="Times New Roman"/>
+          <w:color w:val="FFFFFF"/>
+          <w:sz w:val="21"/>
+          <w:szCs w:val="21"/>
+        </w:rPr>
+        <w:t>&gt;</w:t>
+      </w:r>
+    </w:p>
+    <w:p>
+      <w:pPr>
+        <w:shd w:val="clear" w:color="auto" w:fill="00002C"/>
+        <w:spacing w:line="285" w:lineRule="atLeast"/>
+        <w:rPr>
+          <w:rFonts w:ascii="Consolas" w:eastAsia="Times New Roman" w:hAnsi="Consolas" w:cs="Times New Roman"/>
+          <w:color w:val="FFFFFF"/>
+          <w:sz w:val="21"/>
+          <w:szCs w:val="21"/>
+        </w:rPr>
+      </w:pPr>
+      <w:r>
+        <w:rPr>
+          <w:rFonts w:ascii="Consolas" w:eastAsia="Times New Roman" w:hAnsi="Consolas" w:cs="Times New Roman"/>
+          <w:color w:val="FFFFFF"/>
+          <w:sz w:val="21"/>
+          <w:szCs w:val="21"/>
+        </w:rPr>
+        <w:t>&lt;</w:t>
+      </w:r>
+      <w:proofErr w:type="gramStart"/>
+      <w:r>
+        <w:rPr>
+          <w:rFonts w:ascii="Consolas" w:eastAsia="Times New Roman" w:hAnsi="Consolas" w:cs="Times New Roman"/>
+          <w:color w:val="FF0077"/>
+          <w:sz w:val="21"/>
+          <w:szCs w:val="21"/>
+        </w:rPr>
+        <w:t>body</w:t>
+      </w:r>
+      <w:proofErr w:type="gramEnd"/>
+      <w:r>
+        <w:rPr>
+          <w:rFonts w:ascii="Consolas" w:eastAsia="Times New Roman" w:hAnsi="Consolas" w:cs="Times New Roman"/>
+          <w:color w:val="FFFFFF"/>
+          <w:sz w:val="21"/>
+          <w:szCs w:val="21"/>
+        </w:rPr>
+        <w:t>&gt;</w:t>
+      </w:r>
+    </w:p>
+    <w:p>
+      <w:pPr>
+        <w:shd w:val="clear" w:color="auto" w:fill="00002C"/>
+        <w:spacing w:line="285" w:lineRule="atLeast"/>
+        <w:rPr>
+          <w:rFonts w:ascii="Consolas" w:eastAsia="Times New Roman" w:hAnsi="Consolas" w:cs="Times New Roman"/>
+          <w:color w:val="FFFFFF"/>
+          <w:sz w:val="21"/>
+          <w:szCs w:val="21"/>
+        </w:rPr>
+      </w:pPr>
+      <w:r>
+        <w:rPr>
+          <w:rFonts w:ascii="Consolas" w:eastAsia="Times New Roman" w:hAnsi="Consolas" w:cs="Times New Roman"/>
+          <w:color w:val="FFFFFF"/>
+          <w:sz w:val="21"/>
+          <w:szCs w:val="21"/>
+        </w:rPr>
+        <w:t>    &lt;</w:t>
+      </w:r>
+      <w:r>
+        <w:rPr>
+          <w:rFonts w:ascii="Consolas" w:eastAsia="Times New Roman" w:hAnsi="Consolas" w:cs="Times New Roman"/>
+          <w:color w:val="FF0077"/>
+          <w:sz w:val="21"/>
+          <w:szCs w:val="21"/>
+        </w:rPr>
+        <w:t>h1</w:t>
+      </w:r>
+      <w:r>
+        <w:rPr>
+          <w:rFonts w:ascii="Consolas" w:eastAsia="Times New Roman" w:hAnsi="Consolas" w:cs="Times New Roman"/>
+          <w:color w:val="FFFFFF"/>
+          <w:sz w:val="21"/>
+          <w:szCs w:val="21"/>
+        </w:rPr>
+        <w:t xml:space="preserve"> </w:t>
+      </w:r>
+      <w:r>
+        <w:rPr>
+          <w:rFonts w:ascii="Consolas" w:eastAsia="Times New Roman" w:hAnsi="Consolas" w:cs="Times New Roman"/>
+          <w:color w:val="00FFF2"/>
+          <w:sz w:val="21"/>
+          <w:szCs w:val="21"/>
+        </w:rPr>
+        <w:t>id</w:t>
+      </w:r>
+      <w:r>
+        <w:rPr>
+          <w:rFonts w:ascii="Consolas" w:eastAsia="Times New Roman" w:hAnsi="Consolas" w:cs="Times New Roman"/>
+          <w:color w:val="FFFFFF"/>
+          <w:sz w:val="21"/>
+          <w:szCs w:val="21"/>
+        </w:rPr>
+        <w:t>="</w:t>
+      </w:r>
+      <w:r>
+        <w:rPr>
+          <w:rFonts w:ascii="Consolas" w:eastAsia="Times New Roman" w:hAnsi="Consolas" w:cs="Times New Roman"/>
+          <w:color w:val="EEFF00"/>
+          <w:sz w:val="21"/>
+          <w:szCs w:val="21"/>
+        </w:rPr>
+        <w:t>title</w:t>
+      </w:r>
+      <w:r>
+        <w:rPr>
+          <w:rFonts w:ascii="Consolas" w:eastAsia="Times New Roman" w:hAnsi="Consolas" w:cs="Times New Roman"/>
+          <w:color w:val="FFFFFF"/>
+          <w:sz w:val="21"/>
+          <w:szCs w:val="21"/>
+        </w:rPr>
+        <w:t xml:space="preserve">" </w:t>
+      </w:r>
+      <w:r>
+        <w:rPr>
+          <w:rFonts w:ascii="Consolas" w:eastAsia="Times New Roman" w:hAnsi="Consolas" w:cs="Times New Roman"/>
+          <w:color w:val="00FFF2"/>
+          <w:sz w:val="21"/>
+          <w:szCs w:val="21"/>
+        </w:rPr>
+        <w:t>class</w:t>
+      </w:r>
+      <w:r>
+        <w:rPr>
+          <w:rFonts w:ascii="Consolas" w:eastAsia="Times New Roman" w:hAnsi="Consolas" w:cs="Times New Roman"/>
+          <w:color w:val="FFFFFF"/>
+          <w:sz w:val="21"/>
+          <w:szCs w:val="21"/>
+        </w:rPr>
+        <w:t>="</w:t>
+      </w:r>
+      <w:r>
+        <w:rPr>
+          <w:rFonts w:ascii="Consolas" w:eastAsia="Times New Roman" w:hAnsi="Consolas" w:cs="Times New Roman"/>
+          <w:color w:val="EEFF00"/>
+          <w:sz w:val="21"/>
+          <w:szCs w:val="21"/>
+        </w:rPr>
+        <w:t>h1</w:t>
+      </w:r>
+      <w:r>
+        <w:rPr>
+          <w:rFonts w:ascii="Consolas" w:eastAsia="Times New Roman" w:hAnsi="Consolas" w:cs="Times New Roman"/>
+          <w:color w:val="FFFFFF"/>
+          <w:sz w:val="21"/>
+          <w:szCs w:val="21"/>
+        </w:rPr>
+        <w:t xml:space="preserve">" </w:t>
+      </w:r>
+      <w:r>
+        <w:rPr>
+          <w:rFonts w:ascii="Consolas" w:eastAsia="Times New Roman" w:hAnsi="Consolas" w:cs="Times New Roman"/>
+          <w:color w:val="00FFF2"/>
+          <w:sz w:val="21"/>
+          <w:szCs w:val="21"/>
+        </w:rPr>
+        <w:t>style</w:t>
+      </w:r>
+      <w:r>
+        <w:rPr>
+          <w:rFonts w:ascii="Consolas" w:eastAsia="Times New Roman" w:hAnsi="Consolas" w:cs="Times New Roman"/>
+          <w:color w:val="FFFFFF"/>
+          <w:sz w:val="21"/>
+          <w:szCs w:val="21"/>
+        </w:rPr>
+        <w:t>="</w:t>
+      </w:r>
+      <w:proofErr w:type="spellStart"/>
+      <w:r>
+        <w:rPr>
+          <w:rFonts w:ascii="Consolas" w:eastAsia="Times New Roman" w:hAnsi="Consolas" w:cs="Times New Roman"/>
+          <w:color w:val="EEFF00"/>
+          <w:sz w:val="21"/>
+          <w:szCs w:val="21"/>
+        </w:rPr>
+        <w:t>color</w:t>
+      </w:r>
+      <w:proofErr w:type="gramStart"/>
+      <w:r>
+        <w:rPr>
+          <w:rFonts w:ascii="Consolas" w:eastAsia="Times New Roman" w:hAnsi="Consolas" w:cs="Times New Roman"/>
+          <w:color w:val="EEFF00"/>
+          <w:sz w:val="21"/>
+          <w:szCs w:val="21"/>
+        </w:rPr>
+        <w:t>:purple</w:t>
+      </w:r>
+      <w:proofErr w:type="spellEnd"/>
+      <w:proofErr w:type="gramEnd"/>
+      <w:r>
+        <w:rPr>
+          <w:rFonts w:ascii="Consolas" w:eastAsia="Times New Roman" w:hAnsi="Consolas" w:cs="Times New Roman"/>
+          <w:color w:val="FFFFFF"/>
+          <w:sz w:val="21"/>
+          <w:szCs w:val="21"/>
+        </w:rPr>
+        <w:t>"&gt;</w:t>
+      </w:r>
+      <w:proofErr w:type="spellStart"/>
+      <w:r>
+        <w:rPr>
+          <w:rFonts w:ascii="Consolas" w:eastAsia="Times New Roman" w:hAnsi="Consolas" w:cs="Times New Roman"/>
+          <w:color w:val="FFFFFF"/>
+          <w:sz w:val="21"/>
+          <w:szCs w:val="21"/>
+        </w:rPr>
+        <w:t>CodeWithHarry</w:t>
+      </w:r>
+      <w:proofErr w:type="spellEnd"/>
+      <w:r>
+        <w:rPr>
+          <w:rFonts w:ascii="Consolas" w:eastAsia="Times New Roman" w:hAnsi="Consolas" w:cs="Times New Roman"/>
+          <w:color w:val="FFFFFF"/>
+          <w:sz w:val="21"/>
+          <w:szCs w:val="21"/>
+        </w:rPr>
+        <w:t>&lt;/</w:t>
+      </w:r>
+      <w:r>
+        <w:rPr>
+          <w:rFonts w:ascii="Consolas" w:eastAsia="Times New Roman" w:hAnsi="Consolas" w:cs="Times New Roman"/>
+          <w:color w:val="FF0077"/>
+          <w:sz w:val="21"/>
+          <w:szCs w:val="21"/>
+        </w:rPr>
+        <w:t>h1</w:t>
+      </w:r>
+      <w:r>
+        <w:rPr>
+          <w:rFonts w:ascii="Consolas" w:eastAsia="Times New Roman" w:hAnsi="Consolas" w:cs="Times New Roman"/>
+          <w:color w:val="FFFFFF"/>
+          <w:sz w:val="21"/>
+          <w:szCs w:val="21"/>
+        </w:rPr>
+        <w:t>&gt;</w:t>
+      </w:r>
+    </w:p>
+    <w:p>
+      <w:pPr>
+        <w:shd w:val="clear" w:color="auto" w:fill="00002C"/>
+        <w:spacing w:line="285" w:lineRule="atLeast"/>
+        <w:rPr>
+          <w:rFonts w:ascii="Consolas" w:eastAsia="Times New Roman" w:hAnsi="Consolas" w:cs="Times New Roman"/>
+          <w:color w:val="FFFFFF"/>
+          <w:sz w:val="21"/>
+          <w:szCs w:val="21"/>
+        </w:rPr>
+      </w:pPr>
+      <w:r>
+        <w:rPr>
+          <w:rFonts w:ascii="Consolas" w:eastAsia="Times New Roman" w:hAnsi="Consolas" w:cs="Times New Roman"/>
+          <w:color w:val="FFFFFF"/>
+          <w:sz w:val="21"/>
+          <w:szCs w:val="21"/>
+        </w:rPr>
+        <w:t>&lt;/</w:t>
+      </w:r>
+      <w:r>
+        <w:rPr>
+          <w:rFonts w:ascii="Consolas" w:eastAsia="Times New Roman" w:hAnsi="Consolas" w:cs="Times New Roman"/>
+          <w:color w:val="FF0077"/>
+          <w:sz w:val="21"/>
+          <w:szCs w:val="21"/>
+        </w:rPr>
+        <w:t>body</w:t>
+      </w:r>
+      <w:r>
+        <w:rPr>
+          <w:rFonts w:ascii="Consolas" w:eastAsia="Times New Roman" w:hAnsi="Consolas" w:cs="Times New Roman"/>
+          <w:color w:val="FFFFFF"/>
+          <w:sz w:val="21"/>
+          <w:szCs w:val="21"/>
+        </w:rPr>
+        <w:t>&gt;</w:t>
+      </w:r>
+    </w:p>
+    <w:p>
+      <w:pPr>
+        <w:shd w:val="clear" w:color="auto" w:fill="00002C"/>
+        <w:tabs>
+          <w:tab w:val="right" w:pos="8910"/>
+        </w:tabs>
+        <w:spacing w:line="285" w:lineRule="atLeast"/>
+        <w:rPr>
+          <w:rFonts w:ascii="Consolas" w:eastAsia="Times New Roman" w:hAnsi="Consolas" w:cs="Times New Roman"/>
+          <w:color w:val="FFFFFF"/>
+          <w:sz w:val="21"/>
+          <w:szCs w:val="21"/>
+        </w:rPr>
+      </w:pPr>
+      <w:r>
+        <w:rPr>
+          <w:rFonts w:ascii="Consolas" w:eastAsia="Times New Roman" w:hAnsi="Consolas" w:cs="Times New Roman"/>
+          <w:color w:val="FFFFFF"/>
+          <w:sz w:val="21"/>
+          <w:szCs w:val="21"/>
+        </w:rPr>
+        <w:t>&lt;/</w:t>
+      </w:r>
+      <w:r>
+        <w:rPr>
+          <w:rFonts w:ascii="Consolas" w:eastAsia="Times New Roman" w:hAnsi="Consolas" w:cs="Times New Roman"/>
+          <w:color w:val="FF0077"/>
+          <w:sz w:val="21"/>
+          <w:szCs w:val="21"/>
+        </w:rPr>
+        <w:t>html</w:t>
+      </w:r>
+      <w:r>
+        <w:rPr>
+          <w:rFonts w:ascii="Consolas" w:eastAsia="Times New Roman" w:hAnsi="Consolas" w:cs="Times New Roman"/>
+          <w:color w:val="FFFFFF"/>
+          <w:sz w:val="21"/>
+          <w:szCs w:val="21"/>
+        </w:rPr>
+        <w:t>&gt;</w:t>
+      </w:r>
+      <w:r>
+        <w:rPr>
+          <w:rFonts w:ascii="Consolas" w:eastAsia="Times New Roman" w:hAnsi="Consolas" w:cs="Times New Roman"/>
+          <w:color w:val="FFFFFF"/>
+          <w:sz w:val="21"/>
+          <w:szCs w:val="21"/>
+        </w:rPr>
+        <w:tab/>
+      </w:r>
+    </w:p>
+    <w:p>
+      <w:pPr>
+        <w:shd w:val="clear" w:color="auto" w:fill="00002C"/>
+        <w:tabs>
+          <w:tab w:val="right" w:pos="8910"/>
+        </w:tabs>
+        <w:spacing w:line="285" w:lineRule="atLeast"/>
+        <w:rPr>
+          <w:rFonts w:ascii="Consolas" w:eastAsia="Times New Roman" w:hAnsi="Consolas" w:cs="Times New Roman"/>
+          <w:color w:val="FFFFFF"/>
+          <w:sz w:val="21"/>
+          <w:szCs w:val="21"/>
+        </w:rPr>
+      </w:pPr>
+    </w:p>
+    <w:p>
+      <w:pPr>
+        <w:tabs>
+          <w:tab w:val="left" w:pos="1920"/>
+        </w:tabs>
+      </w:pPr>
+      <w:r>
+        <w:rPr>
+          <w:color w:val="B6BCC9"/>
+          <w:sz w:val="27"/>
+          <w:szCs w:val="27"/>
+          <w:shd w:val="clear" w:color="auto" w:fill="0E121B"/>
+        </w:rPr>
+        <w:t>Here the question is, what color will h1 be assigned to? This is calculated based on the selector's components which we will discuss in this tutorial.</w:t>
+      </w:r>
+    </w:p>
+    <w:p>
+      <w:pPr>
+        <w:tabs>
+          <w:tab w:val="left" w:pos="1920"/>
+        </w:tabs>
+      </w:pPr>
+    </w:p>
+    <w:p>
+      <w:pPr>
+        <w:pStyle w:val="Heading4"/>
+        <w:pBdr>
+          <w:top w:val="single" w:sz="2" w:space="0" w:color="222A39"/>
+          <w:left w:val="single" w:sz="2" w:space="0" w:color="222A39"/>
+          <w:bottom w:val="single" w:sz="2" w:space="0" w:color="222A39"/>
+          <w:right w:val="single" w:sz="2" w:space="0" w:color="222A39"/>
+        </w:pBdr>
+        <w:shd w:val="clear" w:color="auto" w:fill="0E121B"/>
+        <w:spacing w:before="426" w:after="107"/>
+        <w:rPr>
+          <w:color w:val="F9FAFB"/>
+          <w:sz w:val="27"/>
+          <w:szCs w:val="27"/>
+        </w:rPr>
+      </w:pPr>
+      <w:r>
+        <w:rPr>
+          <w:color w:val="F9FAFB"/>
+          <w:sz w:val="27"/>
+          <w:szCs w:val="27"/>
+        </w:rPr>
+        <w:t>Specificity Calculation</w:t>
+      </w:r>
+    </w:p>
+    <w:p>
+      <w:pPr>
+        <w:pStyle w:val="NormalWeb"/>
+        <w:pBdr>
+          <w:top w:val="single" w:sz="2" w:space="0" w:color="222A39"/>
+          <w:left w:val="single" w:sz="2" w:space="0" w:color="222A39"/>
+          <w:bottom w:val="single" w:sz="2" w:space="0" w:color="222A39"/>
+          <w:right w:val="single" w:sz="2" w:space="0" w:color="222A39"/>
+        </w:pBdr>
+        <w:shd w:val="clear" w:color="auto" w:fill="0E121B"/>
+        <w:spacing w:before="0" w:beforeAutospacing="0" w:after="320" w:afterAutospacing="0"/>
+        <w:rPr>
+          <w:rFonts w:ascii="Arial" w:hAnsi="Arial" w:cs="Arial"/>
+          <w:color w:val="B6BCC9"/>
+          <w:sz w:val="27"/>
+          <w:szCs w:val="27"/>
+        </w:rPr>
+      </w:pPr>
+      <w:r>
+        <w:rPr>
+          <w:rFonts w:ascii="Arial" w:hAnsi="Arial" w:cs="Arial"/>
+          <w:color w:val="B6BCC9"/>
+          <w:sz w:val="27"/>
+          <w:szCs w:val="27"/>
+        </w:rPr>
+        <w:t>To calculate specificity, assign a value to each part of the selector:</w:t>
+      </w:r>
+    </w:p>
+    <w:p>
+      <w:pPr>
+        <w:numPr>
+          <w:ilvl w:val="0"/>
+          <w:numId w:val="17"/>
+        </w:numPr>
+        <w:pBdr>
+          <w:top w:val="single" w:sz="2" w:space="0" w:color="222A39"/>
+          <w:left w:val="single" w:sz="2" w:space="0" w:color="222A39"/>
+          <w:bottom w:val="single" w:sz="2" w:space="0" w:color="222A39"/>
+          <w:right w:val="single" w:sz="2" w:space="0" w:color="222A39"/>
+        </w:pBdr>
+        <w:shd w:val="clear" w:color="auto" w:fill="0E121B"/>
+        <w:spacing w:before="160" w:after="160" w:line="240" w:lineRule="auto"/>
+        <w:ind w:left="0"/>
+        <w:rPr>
+          <w:color w:val="D1D5DB"/>
+          <w:sz w:val="27"/>
+          <w:szCs w:val="27"/>
+        </w:rPr>
+      </w:pPr>
+      <w:r>
+        <w:rPr>
+          <w:color w:val="D1D5DB"/>
+          <w:sz w:val="27"/>
+          <w:szCs w:val="27"/>
+        </w:rPr>
+        <w:t>Universal Selector: 0</w:t>
+      </w:r>
+    </w:p>
+    <w:p>
+      <w:pPr>
+        <w:numPr>
+          <w:ilvl w:val="0"/>
+          <w:numId w:val="17"/>
+        </w:numPr>
+        <w:pBdr>
+          <w:top w:val="single" w:sz="2" w:space="0" w:color="222A39"/>
+          <w:left w:val="single" w:sz="2" w:space="0" w:color="222A39"/>
+          <w:bottom w:val="single" w:sz="2" w:space="0" w:color="222A39"/>
+          <w:right w:val="single" w:sz="2" w:space="0" w:color="222A39"/>
+        </w:pBdr>
+        <w:shd w:val="clear" w:color="auto" w:fill="0E121B"/>
+        <w:spacing w:before="160" w:after="160" w:line="240" w:lineRule="auto"/>
+        <w:ind w:left="0"/>
+        <w:rPr>
+          <w:color w:val="D1D5DB"/>
+          <w:sz w:val="27"/>
+          <w:szCs w:val="27"/>
+        </w:rPr>
+      </w:pPr>
+      <w:r>
+        <w:rPr>
+          <w:color w:val="D1D5DB"/>
+          <w:sz w:val="27"/>
+          <w:szCs w:val="27"/>
+        </w:rPr>
+        <w:t>Element selectors and pseudo-elements: 1</w:t>
+      </w:r>
+    </w:p>
+    <w:p>
+      <w:pPr>
+        <w:numPr>
+          <w:ilvl w:val="0"/>
+          <w:numId w:val="17"/>
+        </w:numPr>
+        <w:pBdr>
+          <w:top w:val="single" w:sz="2" w:space="0" w:color="222A39"/>
+          <w:left w:val="single" w:sz="2" w:space="0" w:color="222A39"/>
+          <w:bottom w:val="single" w:sz="2" w:space="0" w:color="222A39"/>
+          <w:right w:val="single" w:sz="2" w:space="0" w:color="222A39"/>
+        </w:pBdr>
+        <w:shd w:val="clear" w:color="auto" w:fill="0E121B"/>
+        <w:spacing w:before="160" w:after="160" w:line="240" w:lineRule="auto"/>
+        <w:ind w:left="0"/>
+        <w:rPr>
+          <w:color w:val="D1D5DB"/>
+          <w:sz w:val="27"/>
+          <w:szCs w:val="27"/>
+        </w:rPr>
+      </w:pPr>
+      <w:r>
+        <w:rPr>
+          <w:color w:val="D1D5DB"/>
+          <w:sz w:val="27"/>
+          <w:szCs w:val="27"/>
+        </w:rPr>
+        <w:t>Class selectors, attribute selectors, and pseudo-classes: 10</w:t>
+      </w:r>
+    </w:p>
+    <w:p>
+      <w:pPr>
+        <w:numPr>
+          <w:ilvl w:val="0"/>
+          <w:numId w:val="17"/>
+        </w:numPr>
+        <w:pBdr>
+          <w:top w:val="single" w:sz="2" w:space="0" w:color="222A39"/>
+          <w:left w:val="single" w:sz="2" w:space="0" w:color="222A39"/>
+          <w:bottom w:val="single" w:sz="2" w:space="0" w:color="222A39"/>
+          <w:right w:val="single" w:sz="2" w:space="0" w:color="222A39"/>
+        </w:pBdr>
+        <w:shd w:val="clear" w:color="auto" w:fill="0E121B"/>
+        <w:spacing w:before="160" w:after="160" w:line="240" w:lineRule="auto"/>
+        <w:ind w:left="0"/>
+        <w:rPr>
+          <w:color w:val="D1D5DB"/>
+          <w:sz w:val="27"/>
+          <w:szCs w:val="27"/>
+        </w:rPr>
+      </w:pPr>
+      <w:r>
+        <w:rPr>
+          <w:color w:val="D1D5DB"/>
+          <w:sz w:val="27"/>
+          <w:szCs w:val="27"/>
+        </w:rPr>
+        <w:t>ID selectors: 100</w:t>
+      </w:r>
+    </w:p>
+    <w:p>
+      <w:pPr>
+        <w:numPr>
+          <w:ilvl w:val="0"/>
+          <w:numId w:val="17"/>
+        </w:numPr>
+        <w:pBdr>
+          <w:top w:val="single" w:sz="2" w:space="0" w:color="222A39"/>
+          <w:left w:val="single" w:sz="2" w:space="0" w:color="222A39"/>
+          <w:bottom w:val="single" w:sz="2" w:space="0" w:color="222A39"/>
+          <w:right w:val="single" w:sz="2" w:space="0" w:color="222A39"/>
+        </w:pBdr>
+        <w:shd w:val="clear" w:color="auto" w:fill="0E121B"/>
+        <w:spacing w:before="160" w:after="160" w:line="240" w:lineRule="auto"/>
+        <w:ind w:left="0"/>
+        <w:rPr>
+          <w:color w:val="D1D5DB"/>
+          <w:sz w:val="27"/>
+          <w:szCs w:val="27"/>
+        </w:rPr>
+      </w:pPr>
+      <w:r>
+        <w:rPr>
+          <w:color w:val="D1D5DB"/>
+          <w:sz w:val="27"/>
+          <w:szCs w:val="27"/>
+        </w:rPr>
+        <w:t>Inline styles: 1000</w:t>
+      </w:r>
+    </w:p>
+    <w:p>
+      <w:pPr>
+        <w:pStyle w:val="NormalWeb"/>
+        <w:pBdr>
+          <w:top w:val="single" w:sz="2" w:space="0" w:color="222A39"/>
+          <w:left w:val="single" w:sz="2" w:space="0" w:color="222A39"/>
+          <w:bottom w:val="single" w:sz="2" w:space="0" w:color="222A39"/>
+          <w:right w:val="single" w:sz="2" w:space="0" w:color="222A39"/>
+        </w:pBdr>
+        <w:shd w:val="clear" w:color="auto" w:fill="0E121B"/>
+        <w:spacing w:before="320" w:beforeAutospacing="0" w:after="320" w:afterAutospacing="0"/>
+        <w:rPr>
+          <w:rFonts w:ascii="Arial" w:hAnsi="Arial" w:cs="Arial"/>
+          <w:color w:val="B6BCC9"/>
+          <w:sz w:val="27"/>
+          <w:szCs w:val="27"/>
+        </w:rPr>
+      </w:pPr>
+      <w:r>
+        <w:rPr>
+          <w:rFonts w:ascii="Arial" w:hAnsi="Arial" w:cs="Arial"/>
+          <w:color w:val="B6BCC9"/>
+          <w:sz w:val="27"/>
+          <w:szCs w:val="27"/>
+        </w:rPr>
+        <w:t>Then, add up the values of all the parts in the selector.</w:t>
+      </w:r>
+    </w:p>
+    <w:p>
+      <w:pPr>
+        <w:tabs>
+          <w:tab w:val="left" w:pos="1920"/>
+        </w:tabs>
+      </w:pPr>
+      <w:r>
+        <w:t>For example</w:t>
+      </w:r>
+    </w:p>
+    <w:p>
+      <w:pPr>
+        <w:tabs>
+          <w:tab w:val="left" w:pos="1920"/>
+        </w:tabs>
+      </w:pPr>
+      <w:r>
+        <w:t>&lt;h1 id="title" class="h1"&gt;</w:t>
+      </w:r>
+      <w:proofErr w:type="spellStart"/>
+      <w:r>
+        <w:t>CodeWithHarry</w:t>
+      </w:r>
+      <w:proofErr w:type="spellEnd"/>
+      <w:r>
+        <w:t>&lt;/h1&gt;</w:t>
+      </w:r>
+      <w:r>
+        <w:t>b</w:t>
+      </w:r>
+    </w:p>
+    <w:p>
+      <w:pPr>
+        <w:pBdr>
+          <w:top w:val="single" w:sz="2" w:space="0" w:color="222A39"/>
+          <w:left w:val="single" w:sz="2" w:space="0" w:color="222A39"/>
+          <w:bottom w:val="single" w:sz="2" w:space="0" w:color="222A39"/>
+          <w:right w:val="single" w:sz="2" w:space="0" w:color="222A39"/>
+        </w:pBdr>
+        <w:shd w:val="clear" w:color="auto" w:fill="0E121B"/>
+        <w:spacing w:before="320" w:after="320" w:line="240" w:lineRule="auto"/>
+        <w:rPr>
+          <w:rFonts w:eastAsia="Times New Roman"/>
+          <w:color w:val="B6BCC9"/>
+          <w:sz w:val="27"/>
+          <w:szCs w:val="27"/>
+        </w:rPr>
+      </w:pPr>
+      <w:r>
+        <w:rPr>
+          <w:rFonts w:eastAsia="Times New Roman"/>
+          <w:color w:val="B6BCC9"/>
+          <w:sz w:val="27"/>
+          <w:szCs w:val="27"/>
+        </w:rPr>
+        <w:t xml:space="preserve">Here, the specificity value will be </w:t>
+      </w:r>
+      <w:r>
+        <w:rPr>
+          <w:rFonts w:eastAsia="Times New Roman"/>
+          <w:b/>
+          <w:bCs/>
+          <w:color w:val="FFFFFF"/>
+          <w:sz w:val="27"/>
+          <w:szCs w:val="27"/>
+          <w:bdr w:val="single" w:sz="2" w:space="0" w:color="222A39" w:frame="1"/>
+        </w:rPr>
+        <w:t>111</w:t>
+      </w:r>
+      <w:r>
+        <w:rPr>
+          <w:rFonts w:eastAsia="Times New Roman"/>
+          <w:color w:val="B6BCC9"/>
+          <w:sz w:val="27"/>
+          <w:szCs w:val="27"/>
+        </w:rPr>
+        <w:t xml:space="preserve"> because ID has a specificity of 100, the class has a specificity of 10, and the h1 element has a specificity of 1.</w:t>
+      </w:r>
+    </w:p>
+    <w:p>
+      <w:pPr>
+        <w:pBdr>
+          <w:top w:val="single" w:sz="2" w:space="0" w:color="222A39"/>
+          <w:left w:val="single" w:sz="2" w:space="0" w:color="222A39"/>
+          <w:bottom w:val="single" w:sz="2" w:space="0" w:color="222A39"/>
+          <w:right w:val="single" w:sz="2" w:space="0" w:color="222A39"/>
+        </w:pBdr>
+        <w:shd w:val="clear" w:color="auto" w:fill="0E121B"/>
+        <w:spacing w:before="320" w:after="320" w:line="240" w:lineRule="auto"/>
+        <w:rPr>
+          <w:rFonts w:eastAsia="Times New Roman"/>
+          <w:color w:val="B6BCC9"/>
+          <w:sz w:val="27"/>
+          <w:szCs w:val="27"/>
+        </w:rPr>
+      </w:pPr>
+      <w:r>
+        <w:rPr>
+          <w:rFonts w:eastAsia="Times New Roman"/>
+          <w:color w:val="B6BCC9"/>
+          <w:sz w:val="27"/>
+          <w:szCs w:val="27"/>
+        </w:rPr>
+        <w:t>In the case of a specificity tie, the rule that appears last in the CSS is applied.</w:t>
+      </w:r>
+    </w:p>
+    <w:p>
+      <w:pPr>
+        <w:tabs>
+          <w:tab w:val="left" w:pos="1920"/>
+        </w:tabs>
+      </w:pPr>
       <w:bookmarkStart w:id="5" w:name="_GoBack"/>
       <w:bookmarkEnd w:id="5"/>
     </w:p>
@@ -19567,6 +23494,155 @@
     </w:lvl>
   </w:abstractNum>
   <w:abstractNum w:abstractNumId="1">
+    <w:nsid w:val="09930D68"/>
+    <w:multiLevelType w:val="multilevel"/>
+    <w:tmpl w:val="17740200"/>
+    <w:lvl w:ilvl="0">
+      <w:start w:val="1"/>
+      <w:numFmt w:val="bullet"/>
+      <w:lvlText w:val=""/>
+      <w:lvlJc w:val="left"/>
+      <w:pPr>
+        <w:tabs>
+          <w:tab w:val="num" w:pos="720"/>
+        </w:tabs>
+        <w:ind w:left="720" w:hanging="360"/>
+      </w:pPr>
+      <w:rPr>
+        <w:rFonts w:ascii="Symbol" w:hAnsi="Symbol" w:hint="default"/>
+        <w:sz w:val="20"/>
+      </w:rPr>
+    </w:lvl>
+    <w:lvl w:ilvl="1" w:tentative="1">
+      <w:start w:val="1"/>
+      <w:numFmt w:val="bullet"/>
+      <w:lvlText w:val=""/>
+      <w:lvlJc w:val="left"/>
+      <w:pPr>
+        <w:tabs>
+          <w:tab w:val="num" w:pos="1440"/>
+        </w:tabs>
+        <w:ind w:left="1440" w:hanging="360"/>
+      </w:pPr>
+      <w:rPr>
+        <w:rFonts w:ascii="Symbol" w:hAnsi="Symbol" w:hint="default"/>
+        <w:sz w:val="20"/>
+      </w:rPr>
+    </w:lvl>
+    <w:lvl w:ilvl="2" w:tentative="1">
+      <w:start w:val="1"/>
+      <w:numFmt w:val="bullet"/>
+      <w:lvlText w:val=""/>
+      <w:lvlJc w:val="left"/>
+      <w:pPr>
+        <w:tabs>
+          <w:tab w:val="num" w:pos="2160"/>
+        </w:tabs>
+        <w:ind w:left="2160" w:hanging="360"/>
+      </w:pPr>
+      <w:rPr>
+        <w:rFonts w:ascii="Symbol" w:hAnsi="Symbol" w:hint="default"/>
+        <w:sz w:val="20"/>
+      </w:rPr>
+    </w:lvl>
+    <w:lvl w:ilvl="3" w:tentative="1">
+      <w:start w:val="1"/>
+      <w:numFmt w:val="bullet"/>
+      <w:lvlText w:val=""/>
+      <w:lvlJc w:val="left"/>
+      <w:pPr>
+        <w:tabs>
+          <w:tab w:val="num" w:pos="2880"/>
+        </w:tabs>
+        <w:ind w:left="2880" w:hanging="360"/>
+      </w:pPr>
+      <w:rPr>
+        <w:rFonts w:ascii="Symbol" w:hAnsi="Symbol" w:hint="default"/>
+        <w:sz w:val="20"/>
+      </w:rPr>
+    </w:lvl>
+    <w:lvl w:ilvl="4" w:tentative="1">
+      <w:start w:val="1"/>
+      <w:numFmt w:val="bullet"/>
+      <w:lvlText w:val=""/>
+      <w:lvlJc w:val="left"/>
+      <w:pPr>
+        <w:tabs>
+          <w:tab w:val="num" w:pos="3600"/>
+        </w:tabs>
+        <w:ind w:left="3600" w:hanging="360"/>
+      </w:pPr>
+      <w:rPr>
+        <w:rFonts w:ascii="Symbol" w:hAnsi="Symbol" w:hint="default"/>
+        <w:sz w:val="20"/>
+      </w:rPr>
+    </w:lvl>
+    <w:lvl w:ilvl="5" w:tentative="1">
+      <w:start w:val="1"/>
+      <w:numFmt w:val="bullet"/>
+      <w:lvlText w:val=""/>
+      <w:lvlJc w:val="left"/>
+      <w:pPr>
+        <w:tabs>
+          <w:tab w:val="num" w:pos="4320"/>
+        </w:tabs>
+        <w:ind w:left="4320" w:hanging="360"/>
+      </w:pPr>
+      <w:rPr>
+        <w:rFonts w:ascii="Symbol" w:hAnsi="Symbol" w:hint="default"/>
+        <w:sz w:val="20"/>
+      </w:rPr>
+    </w:lvl>
+    <w:lvl w:ilvl="6" w:tentative="1">
+      <w:start w:val="1"/>
+      <w:numFmt w:val="bullet"/>
+      <w:lvlText w:val=""/>
+      <w:lvlJc w:val="left"/>
+      <w:pPr>
+        <w:tabs>
+          <w:tab w:val="num" w:pos="5040"/>
+        </w:tabs>
+        <w:ind w:left="5040" w:hanging="360"/>
+      </w:pPr>
+      <w:rPr>
+        <w:rFonts w:ascii="Symbol" w:hAnsi="Symbol" w:hint="default"/>
+        <w:sz w:val="20"/>
+      </w:rPr>
+    </w:lvl>
+    <w:lvl w:ilvl="7" w:tentative="1">
+      <w:start w:val="1"/>
+      <w:numFmt w:val="bullet"/>
+      <w:lvlText w:val=""/>
+      <w:lvlJc w:val="left"/>
+      <w:pPr>
+        <w:tabs>
+          <w:tab w:val="num" w:pos="5760"/>
+        </w:tabs>
+        <w:ind w:left="5760" w:hanging="360"/>
+      </w:pPr>
+      <w:rPr>
+        <w:rFonts w:ascii="Symbol" w:hAnsi="Symbol" w:hint="default"/>
+        <w:sz w:val="20"/>
+      </w:rPr>
+    </w:lvl>
+    <w:lvl w:ilvl="8" w:tentative="1">
+      <w:start w:val="1"/>
+      <w:numFmt w:val="bullet"/>
+      <w:lvlText w:val=""/>
+      <w:lvlJc w:val="left"/>
+      <w:pPr>
+        <w:tabs>
+          <w:tab w:val="num" w:pos="6480"/>
+        </w:tabs>
+        <w:ind w:left="6480" w:hanging="360"/>
+      </w:pPr>
+      <w:rPr>
+        <w:rFonts w:ascii="Symbol" w:hAnsi="Symbol" w:hint="default"/>
+        <w:sz w:val="20"/>
+      </w:rPr>
+    </w:lvl>
+  </w:abstractNum>
+  <w:abstractNum w:abstractNumId="2">
     <w:nsid w:val="12BF663A"/>
     <w:multiLevelType w:val="hybridMultilevel"/>
     <w:tmpl w:val="1E40D938"/>
@@ -19679,7 +23755,7 @@
       </w:rPr>
     </w:lvl>
   </w:abstractNum>
-  <w:abstractNum w:abstractNumId="2">
+  <w:abstractNum w:abstractNumId="3">
     <w:nsid w:val="15144208"/>
     <w:multiLevelType w:val="multilevel"/>
     <w:tmpl w:val="DB6C3B8C"/>
@@ -19792,7 +23868,7 @@
       </w:rPr>
     </w:lvl>
   </w:abstractNum>
-  <w:abstractNum w:abstractNumId="3">
+  <w:abstractNum w:abstractNumId="4">
     <w:nsid w:val="1A282A27"/>
     <w:multiLevelType w:val="multilevel"/>
     <w:tmpl w:val="CE58B6E4"/>
@@ -19906,7 +23982,7 @@
       </w:rPr>
     </w:lvl>
   </w:abstractNum>
-  <w:abstractNum w:abstractNumId="4">
+  <w:abstractNum w:abstractNumId="5">
     <w:nsid w:val="1A782602"/>
     <w:multiLevelType w:val="multilevel"/>
     <w:tmpl w:val="C14E637C"/>
@@ -20019,7 +24095,7 @@
       </w:rPr>
     </w:lvl>
   </w:abstractNum>
-  <w:abstractNum w:abstractNumId="5">
+  <w:abstractNum w:abstractNumId="6">
     <w:nsid w:val="26072703"/>
     <w:multiLevelType w:val="multilevel"/>
     <w:tmpl w:val="9BE0886C"/>
@@ -20132,7 +24208,7 @@
       </w:rPr>
     </w:lvl>
   </w:abstractNum>
-  <w:abstractNum w:abstractNumId="6">
+  <w:abstractNum w:abstractNumId="7">
     <w:nsid w:val="3E447CA3"/>
     <w:multiLevelType w:val="hybridMultilevel"/>
     <w:tmpl w:val="EE7EF708"/>
@@ -20245,7 +24321,7 @@
       </w:rPr>
     </w:lvl>
   </w:abstractNum>
-  <w:abstractNum w:abstractNumId="7">
+  <w:abstractNum w:abstractNumId="8">
     <w:nsid w:val="3EE0655E"/>
     <w:multiLevelType w:val="hybridMultilevel"/>
     <w:tmpl w:val="32AC3DC6"/>
@@ -20358,7 +24434,7 @@
       </w:rPr>
     </w:lvl>
   </w:abstractNum>
-  <w:abstractNum w:abstractNumId="8">
+  <w:abstractNum w:abstractNumId="9">
     <w:nsid w:val="4CDB3C01"/>
     <w:multiLevelType w:val="multilevel"/>
     <w:tmpl w:val="51A45056"/>
@@ -20471,7 +24547,7 @@
       </w:rPr>
     </w:lvl>
   </w:abstractNum>
-  <w:abstractNum w:abstractNumId="9">
+  <w:abstractNum w:abstractNumId="10">
     <w:nsid w:val="5C986B95"/>
     <w:multiLevelType w:val="hybridMultilevel"/>
     <w:tmpl w:val="2864D4CE"/>
@@ -20584,7 +24660,7 @@
       </w:rPr>
     </w:lvl>
   </w:abstractNum>
-  <w:abstractNum w:abstractNumId="10">
+  <w:abstractNum w:abstractNumId="11">
     <w:nsid w:val="5EFC3C1D"/>
     <w:multiLevelType w:val="multilevel"/>
     <w:tmpl w:val="BD3AC96E"/>
@@ -20697,7 +24773,7 @@
       </w:rPr>
     </w:lvl>
   </w:abstractNum>
-  <w:abstractNum w:abstractNumId="11">
+  <w:abstractNum w:abstractNumId="12">
     <w:nsid w:val="60420524"/>
     <w:multiLevelType w:val="multilevel"/>
     <w:tmpl w:val="EBAA55D6"/>
@@ -20846,7 +24922,7 @@
       </w:rPr>
     </w:lvl>
   </w:abstractNum>
-  <w:abstractNum w:abstractNumId="12">
+  <w:abstractNum w:abstractNumId="13">
     <w:nsid w:val="619C6B19"/>
     <w:multiLevelType w:val="multilevel"/>
     <w:tmpl w:val="F006DA10"/>
@@ -20959,7 +25035,7 @@
       </w:rPr>
     </w:lvl>
   </w:abstractNum>
-  <w:abstractNum w:abstractNumId="13">
+  <w:abstractNum w:abstractNumId="14">
     <w:nsid w:val="645F5E6A"/>
     <w:multiLevelType w:val="multilevel"/>
     <w:tmpl w:val="A832295A"/>
@@ -21072,7 +25148,7 @@
       </w:rPr>
     </w:lvl>
   </w:abstractNum>
-  <w:abstractNum w:abstractNumId="14">
+  <w:abstractNum w:abstractNumId="15">
     <w:nsid w:val="72295ECD"/>
     <w:multiLevelType w:val="multilevel"/>
     <w:tmpl w:val="41BE6136"/>
@@ -21185,7 +25261,7 @@
       </w:rPr>
     </w:lvl>
   </w:abstractNum>
-  <w:abstractNum w:abstractNumId="15">
+  <w:abstractNum w:abstractNumId="16">
     <w:nsid w:val="72E931F1"/>
     <w:multiLevelType w:val="multilevel"/>
     <w:tmpl w:val="3578B664"/>
@@ -21299,52 +25375,55 @@
     </w:lvl>
   </w:abstractNum>
   <w:num w:numId="1">
+    <w:abstractNumId w:val="14"/>
+  </w:num>
+  <w:num w:numId="2">
     <w:abstractNumId w:val="13"/>
   </w:num>
-  <w:num w:numId="2">
-    <w:abstractNumId w:val="12"/>
-  </w:num>
   <w:num w:numId="3">
-    <w:abstractNumId w:val="2"/>
+    <w:abstractNumId w:val="3"/>
   </w:num>
   <w:num w:numId="4">
-    <w:abstractNumId w:val="14"/>
+    <w:abstractNumId w:val="15"/>
   </w:num>
   <w:num w:numId="5">
-    <w:abstractNumId w:val="15"/>
+    <w:abstractNumId w:val="16"/>
   </w:num>
   <w:num w:numId="6">
-    <w:abstractNumId w:val="8"/>
+    <w:abstractNumId w:val="9"/>
   </w:num>
   <w:num w:numId="7">
-    <w:abstractNumId w:val="5"/>
+    <w:abstractNumId w:val="6"/>
   </w:num>
   <w:num w:numId="8">
-    <w:abstractNumId w:val="4"/>
+    <w:abstractNumId w:val="5"/>
   </w:num>
   <w:num w:numId="9">
     <w:abstractNumId w:val="0"/>
   </w:num>
   <w:num w:numId="10">
-    <w:abstractNumId w:val="3"/>
+    <w:abstractNumId w:val="4"/>
   </w:num>
   <w:num w:numId="11">
+    <w:abstractNumId w:val="11"/>
+  </w:num>
+  <w:num w:numId="12">
+    <w:abstractNumId w:val="2"/>
+  </w:num>
+  <w:num w:numId="13">
+    <w:abstractNumId w:val="7"/>
+  </w:num>
+  <w:num w:numId="14">
     <w:abstractNumId w:val="10"/>
   </w:num>
-  <w:num w:numId="12">
-    <w:abstractNumId w:val="1"/>
-  </w:num>
-  <w:num w:numId="13">
-    <w:abstractNumId w:val="6"/>
-  </w:num>
-  <w:num w:numId="14">
-    <w:abstractNumId w:val="9"/>
-  </w:num>
   <w:num w:numId="15">
-    <w:abstractNumId w:val="7"/>
+    <w:abstractNumId w:val="8"/>
   </w:num>
   <w:num w:numId="16">
-    <w:abstractNumId w:val="11"/>
+    <w:abstractNumId w:val="12"/>
+  </w:num>
+  <w:num w:numId="17">
+    <w:abstractNumId w:val="1"/>
   </w:num>
 </w:numbering>
 </file>
@@ -22453,7 +26532,7 @@
 </file>
 
 <file path=customXml/itemProps1.xml><?xml version="1.0" encoding="utf-8"?>
-<ds:datastoreItem xmlns:ds="http://schemas.openxmlformats.org/officeDocument/2006/customXml" ds:itemID="{14B45C6D-102C-48CF-BDF6-88F09E52D1A7}">
+<ds:datastoreItem xmlns:ds="http://schemas.openxmlformats.org/officeDocument/2006/customXml" ds:itemID="{7F9E17B2-45BF-4455-8390-0966A73113F3}">
   <ds:schemaRefs>
     <ds:schemaRef ds:uri="http://schemas.openxmlformats.org/officeDocument/2006/bibliography"/>
   </ds:schemaRefs>

</xml_diff>

<commit_message>
adding the day 17
</commit_message>
<xml_diff>
--- a/Web_Development Notes Scratch to pro.docx
+++ b/Web_Development Notes Scratch to pro.docx
@@ -24198,6 +24198,9 @@
         <w:pStyle w:val="NoSpacing"/>
       </w:pPr>
       <w:r>
+        <w:rPr>
+          <w:noProof/>
+        </w:rPr>
         <w:drawing>
           <wp:inline distT="0" distB="0" distL="0" distR="0" wp14:anchorId="370E81B7" wp14:editId="69975CB6">
             <wp:extent cx="4601217" cy="3057952"/>
@@ -24442,6 +24445,9 @@
         </w:tabs>
       </w:pPr>
       <w:r>
+        <w:rPr>
+          <w:noProof/>
+        </w:rPr>
         <w:drawing>
           <wp:inline distT="0" distB="0" distL="0" distR="0" wp14:anchorId="28D300ED" wp14:editId="7B27F54B">
             <wp:extent cx="4229690" cy="2305372"/>
@@ -24722,16 +24728,232 @@
         <w:tabs>
           <w:tab w:val="left" w:pos="2760"/>
         </w:tabs>
+      </w:pPr>
+      <w:r>
         <w:rPr>
           <w:b/>
         </w:rPr>
-      </w:pPr>
+        <w:t xml:space="preserve"> </w:t>
+      </w:r>
       <w:r>
         <w:rPr>
           <w:b/>
         </w:rPr>
-        <w:t xml:space="preserve"> </w:t>
-      </w:r>
+        <w:t xml:space="preserve">Css </w:t>
+      </w:r>
+      <w:r>
+        <w:t xml:space="preserve">position property is used for the giving the positon to any of the element any picture or any of the thing for its movement . </w:t>
+      </w:r>
+    </w:p>
+    <w:p>
+      <w:pPr>
+        <w:tabs>
+          <w:tab w:val="left" w:pos="2760"/>
+        </w:tabs>
+      </w:pPr>
+      <w:r>
+        <w:t>Means to say to move it from one place to the other.</w:t>
+      </w:r>
+    </w:p>
+    <w:p>
+      <w:pPr>
+        <w:shd w:val="clear" w:color="auto" w:fill="00002C"/>
+        <w:spacing w:line="300" w:lineRule="atLeast"/>
+      </w:pPr>
+      <w:r>
+        <w:t>In the css position property we give the position to the any box or thing with help of the   positon relative property</w:t>
+      </w:r>
+    </w:p>
+    <w:p>
+      <w:pPr>
+        <w:shd w:val="clear" w:color="auto" w:fill="00002C"/>
+        <w:spacing w:line="300" w:lineRule="atLeast"/>
+        <w:rPr>
+          <w:rFonts w:ascii="Consolas" w:eastAsia="Times New Roman" w:hAnsi="Consolas" w:cs="Times New Roman"/>
+          <w:color w:val="FFFFFF"/>
+          <w:sz w:val="23"/>
+          <w:szCs w:val="23"/>
+        </w:rPr>
+      </w:pPr>
+      <w:r>
+        <w:rPr>
+          <w:rFonts w:ascii="Consolas" w:eastAsia="Times New Roman" w:hAnsi="Consolas" w:cs="Times New Roman"/>
+          <w:color w:val="FFFFFF"/>
+          <w:sz w:val="23"/>
+          <w:szCs w:val="23"/>
+        </w:rPr>
+        <w:t xml:space="preserve">background-color: </w:t>
+      </w:r>
+      <w:r>
+        <w:rPr>
+          <w:rFonts w:ascii="Consolas" w:eastAsia="Times New Roman" w:hAnsi="Consolas" w:cs="Times New Roman"/>
+          <w:color w:val="FF7E34"/>
+          <w:sz w:val="23"/>
+          <w:szCs w:val="23"/>
+        </w:rPr>
+        <w:t>blueviolet</w:t>
+      </w:r>
+      <w:r>
+        <w:rPr>
+          <w:rFonts w:ascii="Consolas" w:eastAsia="Times New Roman" w:hAnsi="Consolas" w:cs="Times New Roman"/>
+          <w:color w:val="FFFFFF"/>
+          <w:sz w:val="23"/>
+          <w:szCs w:val="23"/>
+        </w:rPr>
+        <w:t>;</w:t>
+      </w:r>
+    </w:p>
+    <w:p>
+      <w:pPr>
+        <w:shd w:val="clear" w:color="auto" w:fill="00002C"/>
+        <w:spacing w:line="300" w:lineRule="atLeast"/>
+        <w:rPr>
+          <w:rFonts w:ascii="Consolas" w:eastAsia="Times New Roman" w:hAnsi="Consolas" w:cs="Times New Roman"/>
+          <w:color w:val="FFFFFF"/>
+          <w:sz w:val="23"/>
+          <w:szCs w:val="23"/>
+        </w:rPr>
+      </w:pPr>
+      <w:r>
+        <w:rPr>
+          <w:rFonts w:ascii="Consolas" w:eastAsia="Times New Roman" w:hAnsi="Consolas" w:cs="Times New Roman"/>
+          <w:color w:val="FFFFFF"/>
+          <w:sz w:val="23"/>
+          <w:szCs w:val="23"/>
+        </w:rPr>
+        <w:t xml:space="preserve">    position: </w:t>
+      </w:r>
+      <w:r>
+        <w:rPr>
+          <w:rFonts w:ascii="Consolas" w:eastAsia="Times New Roman" w:hAnsi="Consolas" w:cs="Times New Roman"/>
+          <w:color w:val="FF7E34"/>
+          <w:sz w:val="23"/>
+          <w:szCs w:val="23"/>
+        </w:rPr>
+        <w:t>relative</w:t>
+      </w:r>
+      <w:r>
+        <w:rPr>
+          <w:rFonts w:ascii="Consolas" w:eastAsia="Times New Roman" w:hAnsi="Consolas" w:cs="Times New Roman"/>
+          <w:color w:val="FFFFFF"/>
+          <w:sz w:val="23"/>
+          <w:szCs w:val="23"/>
+        </w:rPr>
+        <w:t>;</w:t>
+      </w:r>
+    </w:p>
+    <w:p>
+      <w:pPr>
+        <w:shd w:val="clear" w:color="auto" w:fill="00002C"/>
+        <w:spacing w:line="300" w:lineRule="atLeast"/>
+        <w:rPr>
+          <w:rFonts w:ascii="Consolas" w:eastAsia="Times New Roman" w:hAnsi="Consolas" w:cs="Times New Roman"/>
+          <w:color w:val="FFFFFF"/>
+          <w:sz w:val="23"/>
+          <w:szCs w:val="23"/>
+        </w:rPr>
+      </w:pPr>
+      <w:r>
+        <w:rPr>
+          <w:rFonts w:ascii="Consolas" w:eastAsia="Times New Roman" w:hAnsi="Consolas" w:cs="Times New Roman"/>
+          <w:color w:val="FFFFFF"/>
+          <w:sz w:val="23"/>
+          <w:szCs w:val="23"/>
+        </w:rPr>
+        <w:t xml:space="preserve">    top: </w:t>
+      </w:r>
+      <w:r>
+        <w:rPr>
+          <w:rFonts w:ascii="Consolas" w:eastAsia="Times New Roman" w:hAnsi="Consolas" w:cs="Times New Roman"/>
+          <w:color w:val="FF7E34"/>
+          <w:sz w:val="23"/>
+          <w:szCs w:val="23"/>
+        </w:rPr>
+        <w:t>34</w:t>
+      </w:r>
+      <w:r>
+        <w:rPr>
+          <w:rFonts w:ascii="Consolas" w:eastAsia="Times New Roman" w:hAnsi="Consolas" w:cs="Times New Roman"/>
+          <w:color w:val="82FBFF"/>
+          <w:sz w:val="23"/>
+          <w:szCs w:val="23"/>
+        </w:rPr>
+        <w:t>px</w:t>
+      </w:r>
+      <w:r>
+        <w:rPr>
+          <w:rFonts w:ascii="Consolas" w:eastAsia="Times New Roman" w:hAnsi="Consolas" w:cs="Times New Roman"/>
+          <w:color w:val="FFFFFF"/>
+          <w:sz w:val="23"/>
+          <w:szCs w:val="23"/>
+        </w:rPr>
+        <w:t>;</w:t>
+      </w:r>
+    </w:p>
+    <w:p>
+      <w:pPr>
+        <w:shd w:val="clear" w:color="auto" w:fill="00002C"/>
+        <w:spacing w:line="300" w:lineRule="atLeast"/>
+        <w:rPr>
+          <w:rFonts w:ascii="Consolas" w:eastAsia="Times New Roman" w:hAnsi="Consolas" w:cs="Times New Roman"/>
+          <w:color w:val="FFFFFF"/>
+          <w:sz w:val="23"/>
+          <w:szCs w:val="23"/>
+        </w:rPr>
+      </w:pPr>
+      <w:r>
+        <w:rPr>
+          <w:rFonts w:ascii="Consolas" w:eastAsia="Times New Roman" w:hAnsi="Consolas" w:cs="Times New Roman"/>
+          <w:color w:val="FFFFFF"/>
+          <w:sz w:val="23"/>
+          <w:szCs w:val="23"/>
+        </w:rPr>
+        <w:t xml:space="preserve">    left: </w:t>
+      </w:r>
+      <w:r>
+        <w:rPr>
+          <w:rFonts w:ascii="Consolas" w:eastAsia="Times New Roman" w:hAnsi="Consolas" w:cs="Times New Roman"/>
+          <w:color w:val="FF7E34"/>
+          <w:sz w:val="23"/>
+          <w:szCs w:val="23"/>
+        </w:rPr>
+        <w:t>56</w:t>
+      </w:r>
+      <w:r>
+        <w:rPr>
+          <w:rFonts w:ascii="Consolas" w:eastAsia="Times New Roman" w:hAnsi="Consolas" w:cs="Times New Roman"/>
+          <w:color w:val="82FBFF"/>
+          <w:sz w:val="23"/>
+          <w:szCs w:val="23"/>
+        </w:rPr>
+        <w:t>px</w:t>
+      </w:r>
+      <w:r>
+        <w:rPr>
+          <w:rFonts w:ascii="Consolas" w:eastAsia="Times New Roman" w:hAnsi="Consolas" w:cs="Times New Roman"/>
+          <w:color w:val="FFFFFF"/>
+          <w:sz w:val="23"/>
+          <w:szCs w:val="23"/>
+        </w:rPr>
+        <w:t>;</w:t>
+      </w:r>
+    </w:p>
+    <w:p>
+      <w:pPr>
+        <w:tabs>
+          <w:tab w:val="left" w:pos="2760"/>
+        </w:tabs>
+      </w:pPr>
+      <w:r>
+        <w:t xml:space="preserve">we use this for the giving the size from top bottom left right </w:t>
+      </w:r>
+    </w:p>
+    <w:p>
+      <w:pPr>
+        <w:tabs>
+          <w:tab w:val="left" w:pos="2760"/>
+        </w:tabs>
+      </w:pPr>
       <w:bookmarkStart w:id="5" w:name="_GoBack"/>
       <w:bookmarkEnd w:id="5"/>
     </w:p>
@@ -28452,7 +28674,7 @@
 </file>
 
 <file path=customXml/itemProps1.xml><?xml version="1.0" encoding="utf-8"?>
-<ds:datastoreItem xmlns:ds="http://schemas.openxmlformats.org/officeDocument/2006/customXml" ds:itemID="{D077788D-4A66-4726-8C86-6CC324E011AE}">
+<ds:datastoreItem xmlns:ds="http://schemas.openxmlformats.org/officeDocument/2006/customXml" ds:itemID="{DEF10A85-5E20-4AAF-833A-A1B83F8F3199}">
   <ds:schemaRefs>
     <ds:schemaRef ds:uri="http://schemas.openxmlformats.org/officeDocument/2006/bibliography"/>
   </ds:schemaRefs>

</xml_diff>

<commit_message>
adding the css variables program in the day 18
</commit_message>
<xml_diff>
--- a/Web_Development Notes Scratch to pro.docx
+++ b/Web_Development Notes Scratch to pro.docx
@@ -50,6 +50,9 @@
       <w:r>
         <w:t xml:space="preserve"> </w:t>
       </w:r>
+      <w:r>
+        <w:t xml:space="preserve"> One thing that in the start I want to made clear that the css and html are the not a programming languages bcz the programming languages are set of the instruction that perform some task . but the css and html are makeup languages means to say are use to design and color the webpages.</w:t>
+      </w:r>
     </w:p>
     <w:p/>
     <w:p>
@@ -97,7 +100,12 @@
         <w:ind w:left="-141"/>
       </w:pPr>
       <w:r>
-        <w:t>And the components that are used to design the structure of  website are called the HTML tags</w:t>
+        <w:t>And the components that are used to design the structure of  website are cal</w:t>
+      </w:r>
+      <w:bookmarkStart w:id="0" w:name="_GoBack"/>
+      <w:bookmarkEnd w:id="0"/>
+      <w:r>
+        <w:t>led the HTML tags</w:t>
       </w:r>
     </w:p>
     <w:p>
@@ -422,8 +430,8 @@
           <w:szCs w:val="34"/>
         </w:rPr>
       </w:pPr>
-      <w:bookmarkStart w:id="0" w:name="_y9mzdsyfcrwc" w:colFirst="0" w:colLast="0"/>
-      <w:bookmarkEnd w:id="0"/>
+      <w:bookmarkStart w:id="1" w:name="_y9mzdsyfcrwc" w:colFirst="0" w:colLast="0"/>
+      <w:bookmarkEnd w:id="1"/>
       <w:r>
         <w:rPr>
           <w:rFonts w:ascii="Times New Roman" w:eastAsia="Times New Roman" w:hAnsi="Times New Roman" w:cs="Times New Roman"/>
@@ -456,8 +464,8 @@
           <w:szCs w:val="26"/>
         </w:rPr>
       </w:pPr>
-      <w:bookmarkStart w:id="1" w:name="_sve1thniop04" w:colFirst="0" w:colLast="0"/>
-      <w:bookmarkEnd w:id="1"/>
+      <w:bookmarkStart w:id="2" w:name="_sve1thniop04" w:colFirst="0" w:colLast="0"/>
+      <w:bookmarkEnd w:id="2"/>
       <w:r>
         <w:rPr>
           <w:rFonts w:ascii="Times New Roman" w:eastAsia="Times New Roman" w:hAnsi="Times New Roman" w:cs="Times New Roman"/>
@@ -490,8 +498,8 @@
           <w:color w:val="000000"/>
         </w:rPr>
       </w:pPr>
-      <w:bookmarkStart w:id="2" w:name="_2pyo9tb4dpfu" w:colFirst="0" w:colLast="0"/>
-      <w:bookmarkEnd w:id="2"/>
+      <w:bookmarkStart w:id="3" w:name="_2pyo9tb4dpfu" w:colFirst="0" w:colLast="0"/>
+      <w:bookmarkEnd w:id="3"/>
       <w:r>
         <w:rPr>
           <w:rFonts w:ascii="Times New Roman" w:eastAsia="Times New Roman" w:hAnsi="Times New Roman" w:cs="Times New Roman"/>
@@ -522,8 +530,8 @@
           <w:szCs w:val="20"/>
         </w:rPr>
       </w:pPr>
-      <w:bookmarkStart w:id="3" w:name="_3jfjscjec8qj" w:colFirst="0" w:colLast="0"/>
-      <w:bookmarkEnd w:id="3"/>
+      <w:bookmarkStart w:id="4" w:name="_3jfjscjec8qj" w:colFirst="0" w:colLast="0"/>
+      <w:bookmarkEnd w:id="4"/>
       <w:r>
         <w:rPr>
           <w:rFonts w:ascii="Times New Roman" w:eastAsia="Times New Roman" w:hAnsi="Times New Roman" w:cs="Times New Roman"/>
@@ -560,8 +568,8 @@
           <w:szCs w:val="18"/>
         </w:rPr>
       </w:pPr>
-      <w:bookmarkStart w:id="4" w:name="_b3bvm94c9aer" w:colFirst="0" w:colLast="0"/>
-      <w:bookmarkEnd w:id="4"/>
+      <w:bookmarkStart w:id="5" w:name="_b3bvm94c9aer" w:colFirst="0" w:colLast="0"/>
+      <w:bookmarkEnd w:id="5"/>
       <w:r>
         <w:rPr>
           <w:rFonts w:ascii="Times New Roman" w:eastAsia="Times New Roman" w:hAnsi="Times New Roman" w:cs="Times New Roman"/>
@@ -24954,8 +24962,211 @@
           <w:tab w:val="left" w:pos="2760"/>
         </w:tabs>
       </w:pPr>
-      <w:bookmarkStart w:id="5" w:name="_GoBack"/>
-      <w:bookmarkEnd w:id="5"/>
+    </w:p>
+    <w:p>
+      <w:pPr>
+        <w:shd w:val="clear" w:color="auto" w:fill="00002C"/>
+        <w:spacing w:line="285" w:lineRule="atLeast"/>
+        <w:rPr>
+          <w:rFonts w:ascii="Consolas" w:eastAsia="Times New Roman" w:hAnsi="Consolas" w:cs="Times New Roman"/>
+          <w:color w:val="FFFFFF"/>
+          <w:sz w:val="21"/>
+          <w:szCs w:val="21"/>
+        </w:rPr>
+      </w:pPr>
+      <w:r>
+        <w:rPr>
+          <w:rFonts w:ascii="Consolas" w:eastAsia="Times New Roman" w:hAnsi="Consolas" w:cs="Times New Roman"/>
+          <w:color w:val="FFFFFF"/>
+          <w:sz w:val="21"/>
+          <w:szCs w:val="21"/>
+        </w:rPr>
+        <w:t xml:space="preserve">  position: </w:t>
+      </w:r>
+      <w:r>
+        <w:rPr>
+          <w:rFonts w:ascii="Consolas" w:eastAsia="Times New Roman" w:hAnsi="Consolas" w:cs="Times New Roman"/>
+          <w:color w:val="FF7E34"/>
+          <w:sz w:val="21"/>
+          <w:szCs w:val="21"/>
+        </w:rPr>
+        <w:t>absolute</w:t>
+      </w:r>
+      <w:r>
+        <w:rPr>
+          <w:rFonts w:ascii="Consolas" w:eastAsia="Times New Roman" w:hAnsi="Consolas" w:cs="Times New Roman"/>
+          <w:color w:val="FFFFFF"/>
+          <w:sz w:val="21"/>
+          <w:szCs w:val="21"/>
+        </w:rPr>
+        <w:t>;</w:t>
+      </w:r>
+    </w:p>
+    <w:p>
+      <w:pPr>
+        <w:tabs>
+          <w:tab w:val="left" w:pos="2760"/>
+        </w:tabs>
+      </w:pPr>
+      <w:r>
+        <w:t>position absolute is the tag which is used to set the position . position absolute take the instruction from the nearest ancestor.</w:t>
+      </w:r>
+    </w:p>
+    <w:p>
+      <w:pPr>
+        <w:shd w:val="clear" w:color="auto" w:fill="00002C"/>
+        <w:spacing w:line="285" w:lineRule="atLeast"/>
+        <w:rPr>
+          <w:rFonts w:ascii="Consolas" w:eastAsia="Times New Roman" w:hAnsi="Consolas" w:cs="Times New Roman"/>
+          <w:color w:val="FFFFFF"/>
+          <w:sz w:val="21"/>
+          <w:szCs w:val="21"/>
+        </w:rPr>
+      </w:pPr>
+      <w:r>
+        <w:rPr>
+          <w:rFonts w:ascii="Consolas" w:eastAsia="Times New Roman" w:hAnsi="Consolas" w:cs="Times New Roman"/>
+          <w:color w:val="FFFFFF"/>
+          <w:sz w:val="21"/>
+          <w:szCs w:val="21"/>
+        </w:rPr>
+        <w:lastRenderedPageBreak/>
+        <w:t>p</w:t>
+      </w:r>
+      <w:r>
+        <w:rPr>
+          <w:rFonts w:ascii="Consolas" w:eastAsia="Times New Roman" w:hAnsi="Consolas" w:cs="Times New Roman"/>
+          <w:color w:val="FFFFFF"/>
+          <w:sz w:val="21"/>
+          <w:szCs w:val="21"/>
+        </w:rPr>
+        <w:t xml:space="preserve">osition: </w:t>
+      </w:r>
+      <w:r>
+        <w:rPr>
+          <w:rFonts w:ascii="Consolas" w:eastAsia="Times New Roman" w:hAnsi="Consolas" w:cs="Times New Roman"/>
+          <w:color w:val="FF7E34"/>
+          <w:sz w:val="21"/>
+          <w:szCs w:val="21"/>
+        </w:rPr>
+        <w:t>fixed</w:t>
+      </w:r>
+      <w:r>
+        <w:rPr>
+          <w:rFonts w:ascii="Consolas" w:eastAsia="Times New Roman" w:hAnsi="Consolas" w:cs="Times New Roman"/>
+          <w:color w:val="FFFFFF"/>
+          <w:sz w:val="21"/>
+          <w:szCs w:val="21"/>
+        </w:rPr>
+        <w:t>;</w:t>
+      </w:r>
+    </w:p>
+    <w:p>
+      <w:pPr>
+        <w:tabs>
+          <w:tab w:val="left" w:pos="2760"/>
+        </w:tabs>
+      </w:pPr>
+      <w:r>
+        <w:t>this is also a type of the tag that we use to fixed the any box or the any thing. E</w:t>
+      </w:r>
+      <w:r>
+        <w:t>,g  the three boxes I fixed the box 1 and scroll the other boxes to see them full but the other boxes scrolled and this one cannot be scrolled.</w:t>
+      </w:r>
+    </w:p>
+    <w:p>
+      <w:pPr>
+        <w:shd w:val="clear" w:color="auto" w:fill="00002C"/>
+        <w:spacing w:line="285" w:lineRule="atLeast"/>
+        <w:rPr>
+          <w:rFonts w:ascii="Consolas" w:eastAsia="Times New Roman" w:hAnsi="Consolas" w:cs="Times New Roman"/>
+          <w:color w:val="FFFFFF"/>
+          <w:sz w:val="21"/>
+          <w:szCs w:val="21"/>
+        </w:rPr>
+      </w:pPr>
+      <w:r>
+        <w:rPr>
+          <w:rFonts w:ascii="Consolas" w:eastAsia="Times New Roman" w:hAnsi="Consolas" w:cs="Times New Roman"/>
+          <w:color w:val="FFFFFF"/>
+          <w:sz w:val="21"/>
+          <w:szCs w:val="21"/>
+        </w:rPr>
+        <w:t xml:space="preserve"> position: </w:t>
+      </w:r>
+      <w:r>
+        <w:rPr>
+          <w:rFonts w:ascii="Consolas" w:eastAsia="Times New Roman" w:hAnsi="Consolas" w:cs="Times New Roman"/>
+          <w:color w:val="FF7E34"/>
+          <w:sz w:val="21"/>
+          <w:szCs w:val="21"/>
+        </w:rPr>
+        <w:t>sticky</w:t>
+      </w:r>
+      <w:r>
+        <w:rPr>
+          <w:rFonts w:ascii="Consolas" w:eastAsia="Times New Roman" w:hAnsi="Consolas" w:cs="Times New Roman"/>
+          <w:color w:val="FFFFFF"/>
+          <w:sz w:val="21"/>
+          <w:szCs w:val="21"/>
+        </w:rPr>
+        <w:t>;</w:t>
+      </w:r>
+    </w:p>
+    <w:p>
+      <w:pPr>
+        <w:tabs>
+          <w:tab w:val="left" w:pos="2760"/>
+        </w:tabs>
+      </w:pPr>
+      <w:r>
+        <w:t>this is the another type of the tag that is used to fixed same means like to stick on the place but the fixed some other type but have the some similarity.</w:t>
+      </w:r>
+    </w:p>
+    <w:p>
+      <w:pPr>
+        <w:tabs>
+          <w:tab w:val="left" w:pos="2760"/>
+        </w:tabs>
+      </w:pPr>
+      <w:r>
+        <w:t>But the difference is that without scrolling is in the normal position but when we scroll then it stick at the place but in the fixed tag it in start appear as frontward like to fixed.</w:t>
+      </w:r>
+    </w:p>
+    <w:p>
+      <w:pPr>
+        <w:tabs>
+          <w:tab w:val="left" w:pos="2760"/>
+        </w:tabs>
+        <w:rPr>
+          <w:b/>
+        </w:rPr>
+      </w:pPr>
+      <w:r>
+        <w:rPr>
+          <w:b/>
+        </w:rPr>
+        <w:t>CSS Variables:</w:t>
+      </w:r>
+    </w:p>
+    <w:p>
+      <w:pPr>
+        <w:pStyle w:val="NoSpacing"/>
+      </w:pPr>
+      <w:r>
+        <w:t>Css variables are those in which you can changes the color by the single change in the values . e.g in the website the background theme is the  blue and you want to change it to the red so you at the place of the variables changes the single color from blue to red</w:t>
+      </w:r>
+    </w:p>
+    <w:p>
+      <w:pPr>
+        <w:pStyle w:val="NoSpacing"/>
+      </w:pPr>
+      <w:r>
+        <w:t xml:space="preserve">Now we discus about </w:t>
+      </w:r>
+      <w:r>
+        <w:t>that how we use them and where to use them.</w:t>
+      </w:r>
     </w:p>
     <w:sectPr>
       <w:pgSz w:w="11909" w:h="16834"/>
@@ -28674,7 +28885,7 @@
 </file>
 
 <file path=customXml/itemProps1.xml><?xml version="1.0" encoding="utf-8"?>
-<ds:datastoreItem xmlns:ds="http://schemas.openxmlformats.org/officeDocument/2006/customXml" ds:itemID="{DEF10A85-5E20-4AAF-833A-A1B83F8F3199}">
+<ds:datastoreItem xmlns:ds="http://schemas.openxmlformats.org/officeDocument/2006/customXml" ds:itemID="{86965639-CC0E-446A-871B-F1198C691CE8}">
   <ds:schemaRefs>
     <ds:schemaRef ds:uri="http://schemas.openxmlformats.org/officeDocument/2006/bibliography"/>
   </ds:schemaRefs>

</xml_diff>

<commit_message>
adding the local and global variable in the day 18 folder and also one more folder for CSS Media Queries
</commit_message>
<xml_diff>
--- a/Web_Development Notes Scratch to pro.docx
+++ b/Web_Development Notes Scratch to pro.docx
@@ -100,12 +100,7 @@
         <w:ind w:left="-141"/>
       </w:pPr>
       <w:r>
-        <w:t>And the components that are used to design the structure of  website are cal</w:t>
-      </w:r>
-      <w:bookmarkStart w:id="0" w:name="_GoBack"/>
-      <w:bookmarkEnd w:id="0"/>
-      <w:r>
-        <w:t>led the HTML tags</w:t>
+        <w:t>And the components that are used to design the structure of  website are called the HTML tags</w:t>
       </w:r>
     </w:p>
     <w:p>
@@ -430,8 +425,8 @@
           <w:szCs w:val="34"/>
         </w:rPr>
       </w:pPr>
-      <w:bookmarkStart w:id="1" w:name="_y9mzdsyfcrwc" w:colFirst="0" w:colLast="0"/>
-      <w:bookmarkEnd w:id="1"/>
+      <w:bookmarkStart w:id="0" w:name="_y9mzdsyfcrwc" w:colFirst="0" w:colLast="0"/>
+      <w:bookmarkEnd w:id="0"/>
       <w:r>
         <w:rPr>
           <w:rFonts w:ascii="Times New Roman" w:eastAsia="Times New Roman" w:hAnsi="Times New Roman" w:cs="Times New Roman"/>
@@ -464,8 +459,8 @@
           <w:szCs w:val="26"/>
         </w:rPr>
       </w:pPr>
-      <w:bookmarkStart w:id="2" w:name="_sve1thniop04" w:colFirst="0" w:colLast="0"/>
-      <w:bookmarkEnd w:id="2"/>
+      <w:bookmarkStart w:id="1" w:name="_sve1thniop04" w:colFirst="0" w:colLast="0"/>
+      <w:bookmarkEnd w:id="1"/>
       <w:r>
         <w:rPr>
           <w:rFonts w:ascii="Times New Roman" w:eastAsia="Times New Roman" w:hAnsi="Times New Roman" w:cs="Times New Roman"/>
@@ -498,8 +493,8 @@
           <w:color w:val="000000"/>
         </w:rPr>
       </w:pPr>
-      <w:bookmarkStart w:id="3" w:name="_2pyo9tb4dpfu" w:colFirst="0" w:colLast="0"/>
-      <w:bookmarkEnd w:id="3"/>
+      <w:bookmarkStart w:id="2" w:name="_2pyo9tb4dpfu" w:colFirst="0" w:colLast="0"/>
+      <w:bookmarkEnd w:id="2"/>
       <w:r>
         <w:rPr>
           <w:rFonts w:ascii="Times New Roman" w:eastAsia="Times New Roman" w:hAnsi="Times New Roman" w:cs="Times New Roman"/>
@@ -530,8 +525,8 @@
           <w:szCs w:val="20"/>
         </w:rPr>
       </w:pPr>
-      <w:bookmarkStart w:id="4" w:name="_3jfjscjec8qj" w:colFirst="0" w:colLast="0"/>
-      <w:bookmarkEnd w:id="4"/>
+      <w:bookmarkStart w:id="3" w:name="_3jfjscjec8qj" w:colFirst="0" w:colLast="0"/>
+      <w:bookmarkEnd w:id="3"/>
       <w:r>
         <w:rPr>
           <w:rFonts w:ascii="Times New Roman" w:eastAsia="Times New Roman" w:hAnsi="Times New Roman" w:cs="Times New Roman"/>
@@ -568,8 +563,8 @@
           <w:szCs w:val="18"/>
         </w:rPr>
       </w:pPr>
-      <w:bookmarkStart w:id="5" w:name="_b3bvm94c9aer" w:colFirst="0" w:colLast="0"/>
-      <w:bookmarkEnd w:id="5"/>
+      <w:bookmarkStart w:id="4" w:name="_b3bvm94c9aer" w:colFirst="0" w:colLast="0"/>
+      <w:bookmarkEnd w:id="4"/>
       <w:r>
         <w:rPr>
           <w:rFonts w:ascii="Times New Roman" w:eastAsia="Times New Roman" w:hAnsi="Times New Roman" w:cs="Times New Roman"/>
@@ -25167,6 +25162,761 @@
       <w:r>
         <w:t>that how we use them and where to use them.</w:t>
       </w:r>
+    </w:p>
+    <w:p>
+      <w:pPr>
+        <w:shd w:val="clear" w:color="auto" w:fill="00002C"/>
+        <w:spacing w:line="285" w:lineRule="atLeast"/>
+        <w:rPr>
+          <w:rFonts w:ascii="Consolas" w:eastAsia="Times New Roman" w:hAnsi="Consolas" w:cs="Times New Roman"/>
+          <w:color w:val="FFFFFF"/>
+          <w:sz w:val="21"/>
+          <w:szCs w:val="21"/>
+        </w:rPr>
+      </w:pPr>
+      <w:r>
+        <w:rPr>
+          <w:rFonts w:ascii="Consolas" w:eastAsia="Times New Roman" w:hAnsi="Consolas" w:cs="Times New Roman"/>
+          <w:color w:val="FFFFFF"/>
+          <w:sz w:val="21"/>
+          <w:szCs w:val="21"/>
+        </w:rPr>
+        <w:t>     </w:t>
+      </w:r>
+      <w:r>
+        <w:rPr>
+          <w:rFonts w:ascii="Consolas" w:eastAsia="Times New Roman" w:hAnsi="Consolas" w:cs="Times New Roman"/>
+          <w:i/>
+          <w:iCs/>
+          <w:color w:val="838383"/>
+          <w:sz w:val="21"/>
+          <w:szCs w:val="21"/>
+        </w:rPr>
+        <w:t>/* Local variable */</w:t>
+      </w:r>
+    </w:p>
+    <w:p>
+      <w:pPr>
+        <w:shd w:val="clear" w:color="auto" w:fill="00002C"/>
+        <w:spacing w:line="285" w:lineRule="atLeast"/>
+        <w:rPr>
+          <w:rFonts w:ascii="Consolas" w:eastAsia="Times New Roman" w:hAnsi="Consolas" w:cs="Times New Roman"/>
+          <w:color w:val="FFFFFF"/>
+          <w:sz w:val="21"/>
+          <w:szCs w:val="21"/>
+        </w:rPr>
+      </w:pPr>
+      <w:r>
+        <w:rPr>
+          <w:rFonts w:ascii="Consolas" w:eastAsia="Times New Roman" w:hAnsi="Consolas" w:cs="Times New Roman"/>
+          <w:color w:val="FFFFFF"/>
+          <w:sz w:val="21"/>
+          <w:szCs w:val="21"/>
+        </w:rPr>
+        <w:t xml:space="preserve">        </w:t>
+      </w:r>
+      <w:r>
+        <w:rPr>
+          <w:rFonts w:ascii="Consolas" w:eastAsia="Times New Roman" w:hAnsi="Consolas" w:cs="Times New Roman"/>
+          <w:color w:val="FF0077"/>
+          <w:sz w:val="21"/>
+          <w:szCs w:val="21"/>
+        </w:rPr>
+        <w:t>ul</w:t>
+      </w:r>
+      <w:r>
+        <w:rPr>
+          <w:rFonts w:ascii="Consolas" w:eastAsia="Times New Roman" w:hAnsi="Consolas" w:cs="Times New Roman"/>
+          <w:color w:val="FFFFFF"/>
+          <w:sz w:val="21"/>
+          <w:szCs w:val="21"/>
+        </w:rPr>
+        <w:t xml:space="preserve"> </w:t>
+      </w:r>
+      <w:r>
+        <w:rPr>
+          <w:rFonts w:ascii="Consolas" w:eastAsia="Times New Roman" w:hAnsi="Consolas" w:cs="Times New Roman"/>
+          <w:color w:val="FF0062"/>
+          <w:sz w:val="21"/>
+          <w:szCs w:val="21"/>
+        </w:rPr>
+        <w:t>&gt;</w:t>
+      </w:r>
+      <w:r>
+        <w:rPr>
+          <w:rFonts w:ascii="Consolas" w:eastAsia="Times New Roman" w:hAnsi="Consolas" w:cs="Times New Roman"/>
+          <w:color w:val="FFFFFF"/>
+          <w:sz w:val="21"/>
+          <w:szCs w:val="21"/>
+        </w:rPr>
+        <w:t xml:space="preserve"> </w:t>
+      </w:r>
+      <w:r>
+        <w:rPr>
+          <w:rFonts w:ascii="Consolas" w:eastAsia="Times New Roman" w:hAnsi="Consolas" w:cs="Times New Roman"/>
+          <w:color w:val="FF0077"/>
+          <w:sz w:val="21"/>
+          <w:szCs w:val="21"/>
+        </w:rPr>
+        <w:t>li</w:t>
+      </w:r>
+      <w:r>
+        <w:rPr>
+          <w:rFonts w:ascii="Consolas" w:eastAsia="Times New Roman" w:hAnsi="Consolas" w:cs="Times New Roman"/>
+          <w:color w:val="FFFFFF"/>
+          <w:sz w:val="21"/>
+          <w:szCs w:val="21"/>
+        </w:rPr>
+        <w:t>:</w:t>
+      </w:r>
+      <w:r>
+        <w:rPr>
+          <w:rFonts w:ascii="Consolas" w:eastAsia="Times New Roman" w:hAnsi="Consolas" w:cs="Times New Roman"/>
+          <w:color w:val="00FFF2"/>
+          <w:sz w:val="21"/>
+          <w:szCs w:val="21"/>
+        </w:rPr>
+        <w:t>first-child</w:t>
+      </w:r>
+      <w:r>
+        <w:rPr>
+          <w:rFonts w:ascii="Consolas" w:eastAsia="Times New Roman" w:hAnsi="Consolas" w:cs="Times New Roman"/>
+          <w:color w:val="FFFFFF"/>
+          <w:sz w:val="21"/>
+          <w:szCs w:val="21"/>
+        </w:rPr>
+        <w:t xml:space="preserve"> {</w:t>
+      </w:r>
+    </w:p>
+    <w:p>
+      <w:pPr>
+        <w:shd w:val="clear" w:color="auto" w:fill="00002C"/>
+        <w:spacing w:line="285" w:lineRule="atLeast"/>
+        <w:rPr>
+          <w:rFonts w:ascii="Consolas" w:eastAsia="Times New Roman" w:hAnsi="Consolas" w:cs="Times New Roman"/>
+          <w:color w:val="FFFFFF"/>
+          <w:sz w:val="21"/>
+          <w:szCs w:val="21"/>
+        </w:rPr>
+      </w:pPr>
+      <w:r>
+        <w:rPr>
+          <w:rFonts w:ascii="Consolas" w:eastAsia="Times New Roman" w:hAnsi="Consolas" w:cs="Times New Roman"/>
+          <w:color w:val="FFFFFF"/>
+          <w:sz w:val="21"/>
+          <w:szCs w:val="21"/>
+        </w:rPr>
+        <w:t xml:space="preserve">            </w:t>
+      </w:r>
+      <w:r>
+        <w:rPr>
+          <w:rFonts w:ascii="Consolas" w:eastAsia="Times New Roman" w:hAnsi="Consolas" w:cs="Times New Roman"/>
+          <w:color w:val="EEFFFF"/>
+          <w:sz w:val="21"/>
+          <w:szCs w:val="21"/>
+        </w:rPr>
+        <w:t>--color</w:t>
+      </w:r>
+      <w:r>
+        <w:rPr>
+          <w:rFonts w:ascii="Consolas" w:eastAsia="Times New Roman" w:hAnsi="Consolas" w:cs="Times New Roman"/>
+          <w:color w:val="FFFFFF"/>
+          <w:sz w:val="21"/>
+          <w:szCs w:val="21"/>
+        </w:rPr>
+        <w:t xml:space="preserve">: </w:t>
+      </w:r>
+      <w:r>
+        <w:rPr>
+          <w:rFonts w:ascii="Consolas" w:eastAsia="Times New Roman" w:hAnsi="Consolas" w:cs="Times New Roman"/>
+          <w:color w:val="00FFFF"/>
+          <w:sz w:val="21"/>
+          <w:szCs w:val="21"/>
+        </w:rPr>
+        <w:t>rgb</w:t>
+      </w:r>
+      <w:r>
+        <w:rPr>
+          <w:rFonts w:ascii="Consolas" w:eastAsia="Times New Roman" w:hAnsi="Consolas" w:cs="Times New Roman"/>
+          <w:color w:val="FFFFFF"/>
+          <w:sz w:val="21"/>
+          <w:szCs w:val="21"/>
+        </w:rPr>
+        <w:t>(</w:t>
+      </w:r>
+      <w:r>
+        <w:rPr>
+          <w:rFonts w:ascii="Consolas" w:eastAsia="Times New Roman" w:hAnsi="Consolas" w:cs="Times New Roman"/>
+          <w:color w:val="FF7E34"/>
+          <w:sz w:val="21"/>
+          <w:szCs w:val="21"/>
+        </w:rPr>
+        <w:t>92</w:t>
+      </w:r>
+      <w:r>
+        <w:rPr>
+          <w:rFonts w:ascii="Consolas" w:eastAsia="Times New Roman" w:hAnsi="Consolas" w:cs="Times New Roman"/>
+          <w:color w:val="FFFFFF"/>
+          <w:sz w:val="21"/>
+          <w:szCs w:val="21"/>
+        </w:rPr>
+        <w:t xml:space="preserve">, </w:t>
+      </w:r>
+      <w:r>
+        <w:rPr>
+          <w:rFonts w:ascii="Consolas" w:eastAsia="Times New Roman" w:hAnsi="Consolas" w:cs="Times New Roman"/>
+          <w:color w:val="FF7E34"/>
+          <w:sz w:val="21"/>
+          <w:szCs w:val="21"/>
+        </w:rPr>
+        <w:t>82</w:t>
+      </w:r>
+      <w:r>
+        <w:rPr>
+          <w:rFonts w:ascii="Consolas" w:eastAsia="Times New Roman" w:hAnsi="Consolas" w:cs="Times New Roman"/>
+          <w:color w:val="FFFFFF"/>
+          <w:sz w:val="21"/>
+          <w:szCs w:val="21"/>
+        </w:rPr>
+        <w:t xml:space="preserve">, </w:t>
+      </w:r>
+      <w:r>
+        <w:rPr>
+          <w:rFonts w:ascii="Consolas" w:eastAsia="Times New Roman" w:hAnsi="Consolas" w:cs="Times New Roman"/>
+          <w:color w:val="FF7E34"/>
+          <w:sz w:val="21"/>
+          <w:szCs w:val="21"/>
+        </w:rPr>
+        <w:t>66</w:t>
+      </w:r>
+      <w:r>
+        <w:rPr>
+          <w:rFonts w:ascii="Consolas" w:eastAsia="Times New Roman" w:hAnsi="Consolas" w:cs="Times New Roman"/>
+          <w:color w:val="FFFFFF"/>
+          <w:sz w:val="21"/>
+          <w:szCs w:val="21"/>
+        </w:rPr>
+        <w:t>);</w:t>
+      </w:r>
+    </w:p>
+    <w:p>
+      <w:pPr>
+        <w:shd w:val="clear" w:color="auto" w:fill="00002C"/>
+        <w:spacing w:line="285" w:lineRule="atLeast"/>
+        <w:rPr>
+          <w:rFonts w:ascii="Consolas" w:eastAsia="Times New Roman" w:hAnsi="Consolas" w:cs="Times New Roman"/>
+          <w:color w:val="FFFFFF"/>
+          <w:sz w:val="21"/>
+          <w:szCs w:val="21"/>
+        </w:rPr>
+      </w:pPr>
+      <w:r>
+        <w:rPr>
+          <w:rFonts w:ascii="Consolas" w:eastAsia="Times New Roman" w:hAnsi="Consolas" w:cs="Times New Roman"/>
+          <w:color w:val="FFFFFF"/>
+          <w:sz w:val="21"/>
+          <w:szCs w:val="21"/>
+        </w:rPr>
+        <w:t xml:space="preserve">            background-color: </w:t>
+      </w:r>
+      <w:r>
+        <w:rPr>
+          <w:rFonts w:ascii="Consolas" w:eastAsia="Times New Roman" w:hAnsi="Consolas" w:cs="Times New Roman"/>
+          <w:color w:val="00FFFF"/>
+          <w:sz w:val="21"/>
+          <w:szCs w:val="21"/>
+        </w:rPr>
+        <w:t>var</w:t>
+      </w:r>
+      <w:r>
+        <w:rPr>
+          <w:rFonts w:ascii="Consolas" w:eastAsia="Times New Roman" w:hAnsi="Consolas" w:cs="Times New Roman"/>
+          <w:color w:val="FFFFFF"/>
+          <w:sz w:val="21"/>
+          <w:szCs w:val="21"/>
+        </w:rPr>
+        <w:t>(</w:t>
+      </w:r>
+      <w:r>
+        <w:rPr>
+          <w:rFonts w:ascii="Consolas" w:eastAsia="Times New Roman" w:hAnsi="Consolas" w:cs="Times New Roman"/>
+          <w:color w:val="EEFFFF"/>
+          <w:sz w:val="21"/>
+          <w:szCs w:val="21"/>
+        </w:rPr>
+        <w:t>--color</w:t>
+      </w:r>
+      <w:r>
+        <w:rPr>
+          <w:rFonts w:ascii="Consolas" w:eastAsia="Times New Roman" w:hAnsi="Consolas" w:cs="Times New Roman"/>
+          <w:color w:val="FFFFFF"/>
+          <w:sz w:val="21"/>
+          <w:szCs w:val="21"/>
+        </w:rPr>
+        <w:t>);</w:t>
+      </w:r>
+    </w:p>
+    <w:p>
+      <w:pPr>
+        <w:shd w:val="clear" w:color="auto" w:fill="00002C"/>
+        <w:spacing w:line="285" w:lineRule="atLeast"/>
+        <w:rPr>
+          <w:rFonts w:ascii="Consolas" w:eastAsia="Times New Roman" w:hAnsi="Consolas" w:cs="Times New Roman"/>
+          <w:color w:val="FFFFFF"/>
+          <w:sz w:val="21"/>
+          <w:szCs w:val="21"/>
+        </w:rPr>
+      </w:pPr>
+      <w:r>
+        <w:rPr>
+          <w:rFonts w:ascii="Consolas" w:eastAsia="Times New Roman" w:hAnsi="Consolas" w:cs="Times New Roman"/>
+          <w:color w:val="FFFFFF"/>
+          <w:sz w:val="21"/>
+          <w:szCs w:val="21"/>
+        </w:rPr>
+        <w:t xml:space="preserve">            border: </w:t>
+      </w:r>
+      <w:r>
+        <w:rPr>
+          <w:rFonts w:ascii="Consolas" w:eastAsia="Times New Roman" w:hAnsi="Consolas" w:cs="Times New Roman"/>
+          <w:color w:val="FF7E34"/>
+          <w:sz w:val="21"/>
+          <w:szCs w:val="21"/>
+        </w:rPr>
+        <w:t>2</w:t>
+      </w:r>
+      <w:r>
+        <w:rPr>
+          <w:rFonts w:ascii="Consolas" w:eastAsia="Times New Roman" w:hAnsi="Consolas" w:cs="Times New Roman"/>
+          <w:color w:val="82FBFF"/>
+          <w:sz w:val="21"/>
+          <w:szCs w:val="21"/>
+        </w:rPr>
+        <w:t>px</w:t>
+      </w:r>
+      <w:r>
+        <w:rPr>
+          <w:rFonts w:ascii="Consolas" w:eastAsia="Times New Roman" w:hAnsi="Consolas" w:cs="Times New Roman"/>
+          <w:color w:val="FFFFFF"/>
+          <w:sz w:val="21"/>
+          <w:szCs w:val="21"/>
+        </w:rPr>
+        <w:t xml:space="preserve"> </w:t>
+      </w:r>
+      <w:r>
+        <w:rPr>
+          <w:rFonts w:ascii="Consolas" w:eastAsia="Times New Roman" w:hAnsi="Consolas" w:cs="Times New Roman"/>
+          <w:color w:val="FF7E34"/>
+          <w:sz w:val="21"/>
+          <w:szCs w:val="21"/>
+        </w:rPr>
+        <w:t>solid</w:t>
+      </w:r>
+      <w:r>
+        <w:rPr>
+          <w:rFonts w:ascii="Consolas" w:eastAsia="Times New Roman" w:hAnsi="Consolas" w:cs="Times New Roman"/>
+          <w:color w:val="FFFFFF"/>
+          <w:sz w:val="21"/>
+          <w:szCs w:val="21"/>
+        </w:rPr>
+        <w:t xml:space="preserve"> </w:t>
+      </w:r>
+      <w:r>
+        <w:rPr>
+          <w:rFonts w:ascii="Consolas" w:eastAsia="Times New Roman" w:hAnsi="Consolas" w:cs="Times New Roman"/>
+          <w:color w:val="00FFFF"/>
+          <w:sz w:val="21"/>
+          <w:szCs w:val="21"/>
+        </w:rPr>
+        <w:t>var</w:t>
+      </w:r>
+      <w:r>
+        <w:rPr>
+          <w:rFonts w:ascii="Consolas" w:eastAsia="Times New Roman" w:hAnsi="Consolas" w:cs="Times New Roman"/>
+          <w:color w:val="FFFFFF"/>
+          <w:sz w:val="21"/>
+          <w:szCs w:val="21"/>
+        </w:rPr>
+        <w:t>(</w:t>
+      </w:r>
+      <w:r>
+        <w:rPr>
+          <w:rFonts w:ascii="Consolas" w:eastAsia="Times New Roman" w:hAnsi="Consolas" w:cs="Times New Roman"/>
+          <w:color w:val="EEFFFF"/>
+          <w:sz w:val="21"/>
+          <w:szCs w:val="21"/>
+        </w:rPr>
+        <w:t>--seccolor</w:t>
+      </w:r>
+      <w:r>
+        <w:rPr>
+          <w:rFonts w:ascii="Consolas" w:eastAsia="Times New Roman" w:hAnsi="Consolas" w:cs="Times New Roman"/>
+          <w:color w:val="FFFFFF"/>
+          <w:sz w:val="21"/>
+          <w:szCs w:val="21"/>
+        </w:rPr>
+        <w:t>);</w:t>
+      </w:r>
+    </w:p>
+    <w:p>
+      <w:pPr>
+        <w:shd w:val="clear" w:color="auto" w:fill="00002C"/>
+        <w:spacing w:line="285" w:lineRule="atLeast"/>
+        <w:rPr>
+          <w:rFonts w:ascii="Consolas" w:eastAsia="Times New Roman" w:hAnsi="Consolas" w:cs="Times New Roman"/>
+          <w:color w:val="FFFFFF"/>
+          <w:sz w:val="21"/>
+          <w:szCs w:val="21"/>
+        </w:rPr>
+      </w:pPr>
+      <w:r>
+        <w:rPr>
+          <w:rFonts w:ascii="Consolas" w:eastAsia="Times New Roman" w:hAnsi="Consolas" w:cs="Times New Roman"/>
+          <w:color w:val="FFFFFF"/>
+          <w:sz w:val="21"/>
+          <w:szCs w:val="21"/>
+        </w:rPr>
+        <w:t>        }</w:t>
+      </w:r>
+    </w:p>
+    <w:p>
+      <w:pPr>
+        <w:pStyle w:val="NoSpacing"/>
+      </w:pPr>
+      <w:r>
+        <w:t xml:space="preserve">This is the local variable that we made here we mention that the li first child means the first box give the color and border but not that border that is apply by the gloabal var so here inside the global variable we made another variable called local variable. </w:t>
+      </w:r>
+    </w:p>
+    <w:p>
+      <w:pPr>
+        <w:pStyle w:val="NoSpacing"/>
+      </w:pPr>
+      <w:r>
+        <w:t xml:space="preserve"> </w:t>
+      </w:r>
+    </w:p>
+    <w:p>
+      <w:pPr>
+        <w:pStyle w:val="NoSpacing"/>
+      </w:pPr>
+    </w:p>
+    <w:p>
+      <w:pPr>
+        <w:pStyle w:val="NoSpacing"/>
+        <w:rPr>
+          <w:b/>
+        </w:rPr>
+      </w:pPr>
+      <w:r>
+        <w:rPr>
+          <w:b/>
+        </w:rPr>
+        <w:t>Media Quiries:</w:t>
+      </w:r>
+    </w:p>
+    <w:p>
+      <w:pPr>
+        <w:pStyle w:val="NoSpacing"/>
+      </w:pPr>
+    </w:p>
+    <w:p>
+      <w:pPr>
+        <w:pStyle w:val="NoSpacing"/>
+      </w:pPr>
+      <w:r>
+        <w:t>Media quiries are use to make the responsive website in the phone after in the system. We use the media quiries for that.</w:t>
+      </w:r>
+    </w:p>
+    <w:p>
+      <w:pPr>
+        <w:shd w:val="clear" w:color="auto" w:fill="00002C"/>
+        <w:spacing w:line="285" w:lineRule="atLeast"/>
+        <w:rPr>
+          <w:rFonts w:ascii="Consolas" w:eastAsia="Times New Roman" w:hAnsi="Consolas" w:cs="Times New Roman"/>
+          <w:color w:val="FFFFFF"/>
+          <w:sz w:val="21"/>
+          <w:szCs w:val="21"/>
+        </w:rPr>
+      </w:pPr>
+    </w:p>
+    <w:p>
+      <w:pPr>
+        <w:shd w:val="clear" w:color="auto" w:fill="00002C"/>
+        <w:spacing w:line="285" w:lineRule="atLeast"/>
+        <w:rPr>
+          <w:rFonts w:ascii="Consolas" w:eastAsia="Times New Roman" w:hAnsi="Consolas" w:cs="Times New Roman"/>
+          <w:color w:val="FFFFFF"/>
+          <w:sz w:val="21"/>
+          <w:szCs w:val="21"/>
+        </w:rPr>
+      </w:pPr>
+      <w:r>
+        <w:rPr>
+          <w:rFonts w:ascii="Consolas" w:eastAsia="Times New Roman" w:hAnsi="Consolas" w:cs="Times New Roman"/>
+          <w:color w:val="FFFFFF"/>
+          <w:sz w:val="21"/>
+          <w:szCs w:val="21"/>
+        </w:rPr>
+        <w:t>@</w:t>
+      </w:r>
+      <w:r>
+        <w:rPr>
+          <w:rFonts w:ascii="Consolas" w:eastAsia="Times New Roman" w:hAnsi="Consolas" w:cs="Times New Roman"/>
+          <w:color w:val="FF006A"/>
+          <w:sz w:val="21"/>
+          <w:szCs w:val="21"/>
+        </w:rPr>
+        <w:t>media</w:t>
+      </w:r>
+      <w:r>
+        <w:rPr>
+          <w:rFonts w:ascii="Consolas" w:eastAsia="Times New Roman" w:hAnsi="Consolas" w:cs="Times New Roman"/>
+          <w:color w:val="FFFFFF"/>
+          <w:sz w:val="21"/>
+          <w:szCs w:val="21"/>
+        </w:rPr>
+        <w:t xml:space="preserve"> </w:t>
+      </w:r>
+      <w:r>
+        <w:rPr>
+          <w:rFonts w:ascii="Consolas" w:eastAsia="Times New Roman" w:hAnsi="Consolas" w:cs="Times New Roman"/>
+          <w:color w:val="FF0062"/>
+          <w:sz w:val="21"/>
+          <w:szCs w:val="21"/>
+        </w:rPr>
+        <w:t>only</w:t>
+      </w:r>
+      <w:r>
+        <w:rPr>
+          <w:rFonts w:ascii="Consolas" w:eastAsia="Times New Roman" w:hAnsi="Consolas" w:cs="Times New Roman"/>
+          <w:color w:val="FFFFFF"/>
+          <w:sz w:val="21"/>
+          <w:szCs w:val="21"/>
+        </w:rPr>
+        <w:t xml:space="preserve">  </w:t>
+      </w:r>
+      <w:r>
+        <w:rPr>
+          <w:rFonts w:ascii="Consolas" w:eastAsia="Times New Roman" w:hAnsi="Consolas" w:cs="Times New Roman"/>
+          <w:color w:val="FF7E34"/>
+          <w:sz w:val="21"/>
+          <w:szCs w:val="21"/>
+        </w:rPr>
+        <w:t>screen</w:t>
+      </w:r>
+      <w:r>
+        <w:rPr>
+          <w:rFonts w:ascii="Consolas" w:eastAsia="Times New Roman" w:hAnsi="Consolas" w:cs="Times New Roman"/>
+          <w:color w:val="FFFFFF"/>
+          <w:sz w:val="21"/>
+          <w:szCs w:val="21"/>
+        </w:rPr>
+        <w:t xml:space="preserve">  </w:t>
+      </w:r>
+      <w:r>
+        <w:rPr>
+          <w:rFonts w:ascii="Consolas" w:eastAsia="Times New Roman" w:hAnsi="Consolas" w:cs="Times New Roman"/>
+          <w:color w:val="FF0062"/>
+          <w:sz w:val="21"/>
+          <w:szCs w:val="21"/>
+        </w:rPr>
+        <w:t>and</w:t>
+      </w:r>
+      <w:r>
+        <w:rPr>
+          <w:rFonts w:ascii="Consolas" w:eastAsia="Times New Roman" w:hAnsi="Consolas" w:cs="Times New Roman"/>
+          <w:color w:val="FFFFFF"/>
+          <w:sz w:val="21"/>
+          <w:szCs w:val="21"/>
+        </w:rPr>
+        <w:t xml:space="preserve"> (max-width: </w:t>
+      </w:r>
+      <w:r>
+        <w:rPr>
+          <w:rFonts w:ascii="Consolas" w:eastAsia="Times New Roman" w:hAnsi="Consolas" w:cs="Times New Roman"/>
+          <w:color w:val="FF7E34"/>
+          <w:sz w:val="21"/>
+          <w:szCs w:val="21"/>
+        </w:rPr>
+        <w:t>467</w:t>
+      </w:r>
+      <w:r>
+        <w:rPr>
+          <w:rFonts w:ascii="Consolas" w:eastAsia="Times New Roman" w:hAnsi="Consolas" w:cs="Times New Roman"/>
+          <w:color w:val="82FBFF"/>
+          <w:sz w:val="21"/>
+          <w:szCs w:val="21"/>
+        </w:rPr>
+        <w:t>px</w:t>
+      </w:r>
+      <w:r>
+        <w:rPr>
+          <w:rFonts w:ascii="Consolas" w:eastAsia="Times New Roman" w:hAnsi="Consolas" w:cs="Times New Roman"/>
+          <w:color w:val="FFFFFF"/>
+          <w:sz w:val="21"/>
+          <w:szCs w:val="21"/>
+        </w:rPr>
+        <w:t>)</w:t>
+      </w:r>
+    </w:p>
+    <w:p>
+      <w:pPr>
+        <w:shd w:val="clear" w:color="auto" w:fill="00002C"/>
+        <w:spacing w:line="285" w:lineRule="atLeast"/>
+        <w:rPr>
+          <w:rFonts w:ascii="Consolas" w:eastAsia="Times New Roman" w:hAnsi="Consolas" w:cs="Times New Roman"/>
+          <w:color w:val="FFFFFF"/>
+          <w:sz w:val="21"/>
+          <w:szCs w:val="21"/>
+        </w:rPr>
+      </w:pPr>
+      <w:r>
+        <w:rPr>
+          <w:rFonts w:ascii="Consolas" w:eastAsia="Times New Roman" w:hAnsi="Consolas" w:cs="Times New Roman"/>
+          <w:color w:val="FFFFFF"/>
+          <w:sz w:val="21"/>
+          <w:szCs w:val="21"/>
+        </w:rPr>
+        <w:t>{</w:t>
+      </w:r>
+    </w:p>
+    <w:p>
+      <w:pPr>
+        <w:shd w:val="clear" w:color="auto" w:fill="00002C"/>
+        <w:spacing w:line="285" w:lineRule="atLeast"/>
+        <w:rPr>
+          <w:rFonts w:ascii="Consolas" w:eastAsia="Times New Roman" w:hAnsi="Consolas" w:cs="Times New Roman"/>
+          <w:color w:val="FFFFFF"/>
+          <w:sz w:val="21"/>
+          <w:szCs w:val="21"/>
+        </w:rPr>
+      </w:pPr>
+      <w:r>
+        <w:rPr>
+          <w:rFonts w:ascii="Consolas" w:eastAsia="Times New Roman" w:hAnsi="Consolas" w:cs="Times New Roman"/>
+          <w:color w:val="FFFFFF"/>
+          <w:sz w:val="21"/>
+          <w:szCs w:val="21"/>
+        </w:rPr>
+        <w:t xml:space="preserve">    </w:t>
+      </w:r>
+      <w:r>
+        <w:rPr>
+          <w:rFonts w:ascii="Consolas" w:eastAsia="Times New Roman" w:hAnsi="Consolas" w:cs="Times New Roman"/>
+          <w:color w:val="FF0077"/>
+          <w:sz w:val="21"/>
+          <w:szCs w:val="21"/>
+        </w:rPr>
+        <w:t>body</w:t>
+      </w:r>
+      <w:r>
+        <w:rPr>
+          <w:rFonts w:ascii="Consolas" w:eastAsia="Times New Roman" w:hAnsi="Consolas" w:cs="Times New Roman"/>
+          <w:color w:val="FFFFFF"/>
+          <w:sz w:val="21"/>
+          <w:szCs w:val="21"/>
+        </w:rPr>
+        <w:t>{</w:t>
+      </w:r>
+    </w:p>
+    <w:p>
+      <w:pPr>
+        <w:shd w:val="clear" w:color="auto" w:fill="00002C"/>
+        <w:spacing w:line="285" w:lineRule="atLeast"/>
+        <w:rPr>
+          <w:rFonts w:ascii="Consolas" w:eastAsia="Times New Roman" w:hAnsi="Consolas" w:cs="Times New Roman"/>
+          <w:color w:val="FFFFFF"/>
+          <w:sz w:val="21"/>
+          <w:szCs w:val="21"/>
+        </w:rPr>
+      </w:pPr>
+      <w:r>
+        <w:rPr>
+          <w:rFonts w:ascii="Consolas" w:eastAsia="Times New Roman" w:hAnsi="Consolas" w:cs="Times New Roman"/>
+          <w:color w:val="FFFFFF"/>
+          <w:sz w:val="21"/>
+          <w:szCs w:val="21"/>
+        </w:rPr>
+        <w:t xml:space="preserve">        background-color: </w:t>
+      </w:r>
+      <w:r>
+        <w:rPr>
+          <w:rFonts w:ascii="Consolas" w:eastAsia="Times New Roman" w:hAnsi="Consolas" w:cs="Times New Roman"/>
+          <w:color w:val="FF7E34"/>
+          <w:sz w:val="21"/>
+          <w:szCs w:val="21"/>
+        </w:rPr>
+        <w:t>blueviolet</w:t>
+      </w:r>
+      <w:r>
+        <w:rPr>
+          <w:rFonts w:ascii="Consolas" w:eastAsia="Times New Roman" w:hAnsi="Consolas" w:cs="Times New Roman"/>
+          <w:color w:val="FFFFFF"/>
+          <w:sz w:val="21"/>
+          <w:szCs w:val="21"/>
+        </w:rPr>
+        <w:t>;</w:t>
+      </w:r>
+    </w:p>
+    <w:p>
+      <w:pPr>
+        <w:shd w:val="clear" w:color="auto" w:fill="00002C"/>
+        <w:spacing w:line="285" w:lineRule="atLeast"/>
+        <w:rPr>
+          <w:rFonts w:ascii="Consolas" w:eastAsia="Times New Roman" w:hAnsi="Consolas" w:cs="Times New Roman"/>
+          <w:color w:val="FFFFFF"/>
+          <w:sz w:val="21"/>
+          <w:szCs w:val="21"/>
+        </w:rPr>
+      </w:pPr>
+      <w:r>
+        <w:rPr>
+          <w:rFonts w:ascii="Consolas" w:eastAsia="Times New Roman" w:hAnsi="Consolas" w:cs="Times New Roman"/>
+          <w:color w:val="FFFFFF"/>
+          <w:sz w:val="21"/>
+          <w:szCs w:val="21"/>
+        </w:rPr>
+        <w:t>    }</w:t>
+      </w:r>
+    </w:p>
+    <w:p>
+      <w:pPr>
+        <w:shd w:val="clear" w:color="auto" w:fill="00002C"/>
+        <w:spacing w:line="285" w:lineRule="atLeast"/>
+        <w:rPr>
+          <w:rFonts w:ascii="Consolas" w:eastAsia="Times New Roman" w:hAnsi="Consolas" w:cs="Times New Roman"/>
+          <w:color w:val="FFFFFF"/>
+          <w:sz w:val="21"/>
+          <w:szCs w:val="21"/>
+        </w:rPr>
+      </w:pPr>
+      <w:r>
+        <w:rPr>
+          <w:rFonts w:ascii="Consolas" w:eastAsia="Times New Roman" w:hAnsi="Consolas" w:cs="Times New Roman"/>
+          <w:color w:val="FFFFFF"/>
+          <w:sz w:val="21"/>
+          <w:szCs w:val="21"/>
+        </w:rPr>
+        <w:t>}</w:t>
+      </w:r>
+    </w:p>
+    <w:p>
+      <w:pPr>
+        <w:pStyle w:val="NoSpacing"/>
+      </w:pPr>
+      <w:r>
+        <w:t>This is the syntax for using the media quiry this means that if the size or width of the screen is 467 or less then the body color is the blueviolet other wise I mentioned in the main code that is the red. So media quiry is used to provide different type of the responsiveness</w:t>
+      </w:r>
+    </w:p>
+    <w:p>
+      <w:pPr>
+        <w:pStyle w:val="NoSpacing"/>
+      </w:pPr>
+      <w:r>
+        <w:t>If use the min-width then the blueviolet color is apply when the size exceed from the 467 .</w:t>
+      </w:r>
+      <w:bookmarkStart w:id="5" w:name="_GoBack"/>
+      <w:bookmarkEnd w:id="5"/>
     </w:p>
     <w:sectPr>
       <w:pgSz w:w="11909" w:h="16834"/>
@@ -28885,7 +29635,7 @@
 </file>
 
 <file path=customXml/itemProps1.xml><?xml version="1.0" encoding="utf-8"?>
-<ds:datastoreItem xmlns:ds="http://schemas.openxmlformats.org/officeDocument/2006/customXml" ds:itemID="{86965639-CC0E-446A-871B-F1198C691CE8}">
+<ds:datastoreItem xmlns:ds="http://schemas.openxmlformats.org/officeDocument/2006/customXml" ds:itemID="{2473606D-AF46-407E-ABF1-00B7733C87A7}">
   <ds:schemaRefs>
     <ds:schemaRef ds:uri="http://schemas.openxmlformats.org/officeDocument/2006/bibliography"/>
   </ds:schemaRefs>

</xml_diff>